<commit_message>
Close T-L5, retrained A3 and A4, and fill the last report placeholders
T-L5: all five committed P3 checkpoints reproduce every recorded metric
exactly. A3, retrained without the forecast: +4.1 % tail latency, cost
unchanged, all five seeds slower but within seed variation - the agent stays
queue-aware. A4, linear latency penalty: tail latency unchanged, cost +2.1 %;
the D_MAX mask, not the quadratic term, bounds the tail.
</commit_message>
<xml_diff>
--- a/docs/report/Team11_Project_Report_Draft.docx
+++ b/docs/report/Team11_Project_Report_Draft.docx
@@ -15605,7 +15605,7 @@
           <w:sz w:val="16"/>
           <w:szCs w:val="16"/>
         </w:rPr>
-        <w:t xml:space="preserve">tests/       261 tests in 20 files</w:t>
+        <w:t xml:space="preserve">tests/       266 tests in 21 files</w:t>
       </w:r>
     </w:p>
     <w:p>
@@ -16570,13 +16570,13 @@
           <w:b/>
           <w:bCs/>
         </w:rPr>
-        <w:t xml:space="preserve">261 tests in 20 files</w:t>
-      </w:r>
-      <w:r>
-        <w:rPr>
-          <w:rFonts w:ascii="Times New Roman" w:cs="Times New Roman" w:eastAsia="Times New Roman" w:hAnsi="Times New Roman"/>
-        </w:rPr>
-        <w:t xml:space="preserve">, runs on every push in GitHub Actions, and enforces a minimum of 90 % line coverage; measured coverage is 96 %.</w:t>
+        <w:t xml:space="preserve">266 tests in 21 files</w:t>
+      </w:r>
+      <w:r>
+        <w:rPr>
+          <w:rFonts w:ascii="Times New Roman" w:cs="Times New Roman" w:eastAsia="Times New Roman" w:hAnsi="Times New Roman"/>
+        </w:rPr>
+        <w:t xml:space="preserve">, runs on every push in GitHub Actions, and enforces a minimum of 90 % line coverage; measured coverage is 94 %.</w:t>
       </w:r>
     </w:p>
     <w:p>
@@ -20070,10 +20070,8 @@
                 <w:rFonts w:ascii="Times New Roman" w:cs="Times New Roman" w:eastAsia="Times New Roman" w:hAnsi="Times New Roman"/>
                 <w:sz w:val="20"/>
                 <w:szCs w:val="20"/>
-                <w:highlight w:val="yellow"/>
-                <w:highlightCs w:val="yellow"/>
-              </w:rPr>
-              <w:t xml:space="preserve">PENDING</w:t>
+              </w:rPr>
+              <w:t xml:space="preserve">Pass — unit test, and all 5 committed P3 checkpoints reproduce every recorded metric exactly</w:t>
             </w:r>
           </w:p>
         </w:tc>
@@ -34293,7 +34291,7 @@
         <w:rPr>
           <w:rFonts w:ascii="Times New Roman" w:cs="Times New Roman" w:eastAsia="Times New Roman" w:hAnsi="Times New Roman"/>
         </w:rPr>
-        <w:t xml:space="preserve"> This is the third independent route to the ADR-008 conclusion, after the F4 lag diagnostic and the ORACLE gap. The retrained ablation A3 is still owed; the inference-time version reported here points the same way.</w:t>
+        <w:t xml:space="preserve"> This is the third independent route to the ADR-008 conclusion, after the F4 lag diagnostic and the ORACLE gap. Retraining the agent without the forecast (A3, Section 8.10) costs about 4 % of tail latency and nothing in cost — a small, consistent contribution from the forecast, not congestion reasoning.</w:t>
       </w:r>
     </w:p>
     <w:p>
@@ -35188,23 +35186,49 @@
         <w:rPr>
           <w:rFonts w:ascii="Times New Roman" w:cs="Times New Roman" w:eastAsia="Times New Roman" w:hAnsi="Times New Roman"/>
         </w:rPr>
-        <w:t xml:space="preserve">A3 (inference-time) is reported in Section 8.8. </w:t>
-      </w:r>
-      <w:r>
-        <w:rPr>
-          <w:rFonts w:ascii="Times New Roman" w:cs="Times New Roman" w:eastAsia="Times New Roman" w:hAnsi="Times New Roman"/>
-          <w:highlight w:val="yellow"/>
-          <w:highlightCs w:val="yellow"/>
-        </w:rPr>
-        <w:t xml:space="preserve">PENDING: retrained A3 without fill_hat, and A4 with a linear latency penalty.</w:t>
-      </w:r>
-    </w:p>
-    <w:p>
-      <w:pPr>
-        <w:pStyle w:val="Heading3"/>
-      </w:pPr>
-      <w:r>
-        <w:t xml:space="preserve">A5 — estimation error against Gate A</w:t>
+        <w:t xml:space="preserve">Both ablations retrain five DQN seeds from scratch with the Phase 5 configuration — 200,000 steps, the same training windows and reward calibration — changing one thing each: </w:t>
+      </w:r>
+      <w:r>
+        <w:rPr>
+          <w:rFonts w:ascii="Times New Roman" w:cs="Times New Roman" w:eastAsia="Times New Roman" w:hAnsi="Times New Roman"/>
+          <w:b/>
+          <w:bCs/>
+        </w:rPr>
+        <w:t xml:space="preserve">A3</w:t>
+      </w:r>
+      <w:r>
+        <w:rPr>
+          <w:rFonts w:ascii="Times New Roman" w:cs="Times New Roman" w:eastAsia="Times New Roman" w:hAnsi="Times New Roman"/>
+        </w:rPr>
+        <w:t xml:space="preserve"> removes the forecast from the state (the three </w:t>
+      </w:r>
+      <w:r>
+        <w:rPr>
+          <w:rFonts w:ascii="Consolas" w:cs="Consolas" w:eastAsia="Consolas" w:hAnsi="Consolas"/>
+          <w:sz w:val="20"/>
+          <w:szCs w:val="20"/>
+        </w:rPr>
+        <w:t xml:space="preserve">fill_hat</w:t>
+      </w:r>
+      <w:r>
+        <w:rPr>
+          <w:rFonts w:ascii="Times New Roman" w:cs="Times New Roman" w:eastAsia="Times New Roman" w:hAnsi="Times New Roman"/>
+        </w:rPr>
+        <w:t xml:space="preserve"> inputs are constant zero), and </w:t>
+      </w:r>
+      <w:r>
+        <w:rPr>
+          <w:rFonts w:ascii="Times New Roman" w:cs="Times New Roman" w:eastAsia="Times New Roman" w:hAnsi="Times New Roman"/>
+          <w:b/>
+          <w:bCs/>
+        </w:rPr>
+        <w:t xml:space="preserve">A4</w:t>
+      </w:r>
+      <w:r>
+        <w:rPr>
+          <w:rFonts w:ascii="Times New Roman" w:cs="Times New Roman" w:eastAsia="Times New Roman" w:hAnsi="Times New Roman"/>
+        </w:rPr>
+        <w:t xml:space="preserve"> replaces the quadratic latency penalty with a linear one, recalibrated to unit scale. All ten agents are scored through the standard metric path on the same four validation episodes as Phase 5; the test split is not used again.</w:t>
       </w:r>
     </w:p>
     <w:p>
@@ -35221,6 +35245,1655 @@
           <w:szCs w:val="22"/>
         </w:rPr>
         <w:t xml:space="preserve">Table 8.11: </w:t>
+      </w:r>
+      <w:r>
+        <w:rPr>
+          <w:rFonts w:ascii="Times New Roman" w:cs="Times New Roman" w:eastAsia="Times New Roman" w:hAnsi="Times New Roman"/>
+          <w:i/>
+          <w:iCs/>
+          <w:sz w:val="22"/>
+          <w:szCs w:val="22"/>
+        </w:rPr>
+        <w:t xml:space="preserve">Ablations A3 and A4 against the Phase 5 agent, per seed, validation split</w:t>
+      </w:r>
+    </w:p>
+    <w:tbl>
+      <w:tblPr>
+        <w:tblW w:type="dxa" w:w="9026"/>
+        <w:tblBorders>
+          <w:top w:val="single" w:color="auto" w:sz="4"/>
+          <w:left w:val="single" w:color="auto" w:sz="4"/>
+          <w:bottom w:val="single" w:color="auto" w:sz="4"/>
+          <w:right w:val="single" w:color="auto" w:sz="4"/>
+          <w:insideH w:val="single" w:color="auto" w:sz="4"/>
+          <w:insideV w:val="single" w:color="auto" w:sz="4"/>
+        </w:tblBorders>
+      </w:tblPr>
+      <w:tblGrid>
+        <w:gridCol w:w="1303"/>
+        <w:gridCol w:w="1203"/>
+        <w:gridCol w:w="1203"/>
+        <w:gridCol w:w="1203"/>
+        <w:gridCol w:w="1404"/>
+        <w:gridCol w:w="1404"/>
+        <w:gridCol w:w="1306"/>
+      </w:tblGrid>
+      <w:tr>
+        <w:trPr>
+          <w:tblHeader/>
+        </w:trPr>
+        <w:tc>
+          <w:tcPr>
+            <w:tcW w:type="dxa" w:w="1303"/>
+            <w:tcBorders>
+              <w:top w:val="single" w:color="808080" w:sz="4"/>
+              <w:left w:val="single" w:color="808080" w:sz="4"/>
+              <w:bottom w:val="single" w:color="808080" w:sz="4"/>
+              <w:right w:val="single" w:color="808080" w:sz="4"/>
+            </w:tcBorders>
+            <w:shd w:fill="D9E2F3" w:color="auto" w:val="clear"/>
+            <w:tcMar>
+              <w:top w:type="dxa" w:w="40"/>
+              <w:left w:type="dxa" w:w="80"/>
+              <w:bottom w:type="dxa" w:w="40"/>
+              <w:right w:type="dxa" w:w="80"/>
+            </w:tcMar>
+          </w:tcPr>
+          <w:p>
+            <w:pPr>
+              <w:spacing w:after="0"/>
+            </w:pPr>
+            <w:r>
+              <w:rPr>
+                <w:rFonts w:ascii="Times New Roman" w:cs="Times New Roman" w:eastAsia="Times New Roman" w:hAnsi="Times New Roman"/>
+                <w:b/>
+                <w:bCs/>
+                <w:sz w:val="20"/>
+                <w:szCs w:val="20"/>
+              </w:rPr>
+              <w:t xml:space="preserve">Seed</w:t>
+            </w:r>
+          </w:p>
+        </w:tc>
+        <w:tc>
+          <w:tcPr>
+            <w:tcW w:type="dxa" w:w="1203"/>
+            <w:tcBorders>
+              <w:top w:val="single" w:color="808080" w:sz="4"/>
+              <w:left w:val="single" w:color="808080" w:sz="4"/>
+              <w:bottom w:val="single" w:color="808080" w:sz="4"/>
+              <w:right w:val="single" w:color="808080" w:sz="4"/>
+            </w:tcBorders>
+            <w:shd w:fill="D9E2F3" w:color="auto" w:val="clear"/>
+            <w:tcMar>
+              <w:top w:type="dxa" w:w="40"/>
+              <w:left w:type="dxa" w:w="80"/>
+              <w:bottom w:type="dxa" w:w="40"/>
+              <w:right w:type="dxa" w:w="80"/>
+            </w:tcMar>
+          </w:tcPr>
+          <w:p>
+            <w:pPr>
+              <w:spacing w:after="0"/>
+            </w:pPr>
+            <w:r>
+              <w:rPr>
+                <w:rFonts w:ascii="Times New Roman" w:cs="Times New Roman" w:eastAsia="Times New Roman" w:hAnsi="Times New Roman"/>
+                <w:b/>
+                <w:bCs/>
+                <w:sz w:val="20"/>
+                <w:szCs w:val="20"/>
+              </w:rPr>
+              <w:t xml:space="preserve">L-p95 P3</w:t>
+            </w:r>
+          </w:p>
+        </w:tc>
+        <w:tc>
+          <w:tcPr>
+            <w:tcW w:type="dxa" w:w="1203"/>
+            <w:tcBorders>
+              <w:top w:val="single" w:color="808080" w:sz="4"/>
+              <w:left w:val="single" w:color="808080" w:sz="4"/>
+              <w:bottom w:val="single" w:color="808080" w:sz="4"/>
+              <w:right w:val="single" w:color="808080" w:sz="4"/>
+            </w:tcBorders>
+            <w:shd w:fill="D9E2F3" w:color="auto" w:val="clear"/>
+            <w:tcMar>
+              <w:top w:type="dxa" w:w="40"/>
+              <w:left w:type="dxa" w:w="80"/>
+              <w:bottom w:type="dxa" w:w="40"/>
+              <w:right w:type="dxa" w:w="80"/>
+            </w:tcMar>
+          </w:tcPr>
+          <w:p>
+            <w:pPr>
+              <w:spacing w:after="0"/>
+            </w:pPr>
+            <w:r>
+              <w:rPr>
+                <w:rFonts w:ascii="Times New Roman" w:cs="Times New Roman" w:eastAsia="Times New Roman" w:hAnsi="Times New Roman"/>
+                <w:b/>
+                <w:bCs/>
+                <w:sz w:val="20"/>
+                <w:szCs w:val="20"/>
+              </w:rPr>
+              <w:t xml:space="preserve">L-p95 A3</w:t>
+            </w:r>
+          </w:p>
+        </w:tc>
+        <w:tc>
+          <w:tcPr>
+            <w:tcW w:type="dxa" w:w="1203"/>
+            <w:tcBorders>
+              <w:top w:val="single" w:color="808080" w:sz="4"/>
+              <w:left w:val="single" w:color="808080" w:sz="4"/>
+              <w:bottom w:val="single" w:color="808080" w:sz="4"/>
+              <w:right w:val="single" w:color="808080" w:sz="4"/>
+            </w:tcBorders>
+            <w:shd w:fill="D9E2F3" w:color="auto" w:val="clear"/>
+            <w:tcMar>
+              <w:top w:type="dxa" w:w="40"/>
+              <w:left w:type="dxa" w:w="80"/>
+              <w:bottom w:type="dxa" w:w="40"/>
+              <w:right w:type="dxa" w:w="80"/>
+            </w:tcMar>
+          </w:tcPr>
+          <w:p>
+            <w:pPr>
+              <w:spacing w:after="0"/>
+            </w:pPr>
+            <w:r>
+              <w:rPr>
+                <w:rFonts w:ascii="Times New Roman" w:cs="Times New Roman" w:eastAsia="Times New Roman" w:hAnsi="Times New Roman"/>
+                <w:b/>
+                <w:bCs/>
+                <w:sz w:val="20"/>
+                <w:szCs w:val="20"/>
+              </w:rPr>
+              <w:t xml:space="preserve">L-p95 A4</w:t>
+            </w:r>
+          </w:p>
+        </w:tc>
+        <w:tc>
+          <w:tcPr>
+            <w:tcW w:type="dxa" w:w="1404"/>
+            <w:tcBorders>
+              <w:top w:val="single" w:color="808080" w:sz="4"/>
+              <w:left w:val="single" w:color="808080" w:sz="4"/>
+              <w:bottom w:val="single" w:color="808080" w:sz="4"/>
+              <w:right w:val="single" w:color="808080" w:sz="4"/>
+            </w:tcBorders>
+            <w:shd w:fill="D9E2F3" w:color="auto" w:val="clear"/>
+            <w:tcMar>
+              <w:top w:type="dxa" w:w="40"/>
+              <w:left w:type="dxa" w:w="80"/>
+              <w:bottom w:type="dxa" w:w="40"/>
+              <w:right w:type="dxa" w:w="80"/>
+            </w:tcMar>
+          </w:tcPr>
+          <w:p>
+            <w:pPr>
+              <w:spacing w:after="0"/>
+            </w:pPr>
+            <w:r>
+              <w:rPr>
+                <w:rFonts w:ascii="Times New Roman" w:cs="Times New Roman" w:eastAsia="Times New Roman" w:hAnsi="Times New Roman"/>
+                <w:b/>
+                <w:bCs/>
+                <w:sz w:val="20"/>
+                <w:szCs w:val="20"/>
+              </w:rPr>
+              <w:t xml:space="preserve">C-user P3</w:t>
+            </w:r>
+          </w:p>
+        </w:tc>
+        <w:tc>
+          <w:tcPr>
+            <w:tcW w:type="dxa" w:w="1404"/>
+            <w:tcBorders>
+              <w:top w:val="single" w:color="808080" w:sz="4"/>
+              <w:left w:val="single" w:color="808080" w:sz="4"/>
+              <w:bottom w:val="single" w:color="808080" w:sz="4"/>
+              <w:right w:val="single" w:color="808080" w:sz="4"/>
+            </w:tcBorders>
+            <w:shd w:fill="D9E2F3" w:color="auto" w:val="clear"/>
+            <w:tcMar>
+              <w:top w:type="dxa" w:w="40"/>
+              <w:left w:type="dxa" w:w="80"/>
+              <w:bottom w:type="dxa" w:w="40"/>
+              <w:right w:type="dxa" w:w="80"/>
+            </w:tcMar>
+          </w:tcPr>
+          <w:p>
+            <w:pPr>
+              <w:spacing w:after="0"/>
+            </w:pPr>
+            <w:r>
+              <w:rPr>
+                <w:rFonts w:ascii="Times New Roman" w:cs="Times New Roman" w:eastAsia="Times New Roman" w:hAnsi="Times New Roman"/>
+                <w:b/>
+                <w:bCs/>
+                <w:sz w:val="20"/>
+                <w:szCs w:val="20"/>
+              </w:rPr>
+              <w:t xml:space="preserve">C-user A3</w:t>
+            </w:r>
+          </w:p>
+        </w:tc>
+        <w:tc>
+          <w:tcPr>
+            <w:tcW w:type="dxa" w:w="1306"/>
+            <w:tcBorders>
+              <w:top w:val="single" w:color="808080" w:sz="4"/>
+              <w:left w:val="single" w:color="808080" w:sz="4"/>
+              <w:bottom w:val="single" w:color="808080" w:sz="4"/>
+              <w:right w:val="single" w:color="808080" w:sz="4"/>
+            </w:tcBorders>
+            <w:shd w:fill="D9E2F3" w:color="auto" w:val="clear"/>
+            <w:tcMar>
+              <w:top w:type="dxa" w:w="40"/>
+              <w:left w:type="dxa" w:w="80"/>
+              <w:bottom w:type="dxa" w:w="40"/>
+              <w:right w:type="dxa" w:w="80"/>
+            </w:tcMar>
+          </w:tcPr>
+          <w:p>
+            <w:pPr>
+              <w:spacing w:after="0"/>
+            </w:pPr>
+            <w:r>
+              <w:rPr>
+                <w:rFonts w:ascii="Times New Roman" w:cs="Times New Roman" w:eastAsia="Times New Roman" w:hAnsi="Times New Roman"/>
+                <w:b/>
+                <w:bCs/>
+                <w:sz w:val="20"/>
+                <w:szCs w:val="20"/>
+              </w:rPr>
+              <w:t xml:space="preserve">C-user A4</w:t>
+            </w:r>
+          </w:p>
+        </w:tc>
+      </w:tr>
+      <w:tr>
+        <w:tc>
+          <w:tcPr>
+            <w:tcW w:type="dxa" w:w="1303"/>
+            <w:tcBorders>
+              <w:top w:val="single" w:color="808080" w:sz="4"/>
+              <w:left w:val="single" w:color="808080" w:sz="4"/>
+              <w:bottom w:val="single" w:color="808080" w:sz="4"/>
+              <w:right w:val="single" w:color="808080" w:sz="4"/>
+            </w:tcBorders>
+            <w:tcMar>
+              <w:top w:type="dxa" w:w="40"/>
+              <w:left w:type="dxa" w:w="80"/>
+              <w:bottom w:type="dxa" w:w="40"/>
+              <w:right w:type="dxa" w:w="80"/>
+            </w:tcMar>
+          </w:tcPr>
+          <w:p>
+            <w:pPr>
+              <w:spacing w:after="0"/>
+            </w:pPr>
+            <w:r>
+              <w:rPr>
+                <w:rFonts w:ascii="Times New Roman" w:cs="Times New Roman" w:eastAsia="Times New Roman" w:hAnsi="Times New Roman"/>
+                <w:sz w:val="20"/>
+                <w:szCs w:val="20"/>
+              </w:rPr>
+              <w:t xml:space="preserve">0</w:t>
+            </w:r>
+          </w:p>
+        </w:tc>
+        <w:tc>
+          <w:tcPr>
+            <w:tcW w:type="dxa" w:w="1203"/>
+            <w:tcBorders>
+              <w:top w:val="single" w:color="808080" w:sz="4"/>
+              <w:left w:val="single" w:color="808080" w:sz="4"/>
+              <w:bottom w:val="single" w:color="808080" w:sz="4"/>
+              <w:right w:val="single" w:color="808080" w:sz="4"/>
+            </w:tcBorders>
+            <w:tcMar>
+              <w:top w:type="dxa" w:w="40"/>
+              <w:left w:type="dxa" w:w="80"/>
+              <w:bottom w:type="dxa" w:w="40"/>
+              <w:right w:type="dxa" w:w="80"/>
+            </w:tcMar>
+          </w:tcPr>
+          <w:p>
+            <w:pPr>
+              <w:spacing w:after="0"/>
+            </w:pPr>
+            <w:r>
+              <w:rPr>
+                <w:rFonts w:ascii="Times New Roman" w:cs="Times New Roman" w:eastAsia="Times New Roman" w:hAnsi="Times New Roman"/>
+                <w:sz w:val="20"/>
+                <w:szCs w:val="20"/>
+              </w:rPr>
+              <w:t xml:space="preserve">123.5</w:t>
+            </w:r>
+          </w:p>
+        </w:tc>
+        <w:tc>
+          <w:tcPr>
+            <w:tcW w:type="dxa" w:w="1203"/>
+            <w:tcBorders>
+              <w:top w:val="single" w:color="808080" w:sz="4"/>
+              <w:left w:val="single" w:color="808080" w:sz="4"/>
+              <w:bottom w:val="single" w:color="808080" w:sz="4"/>
+              <w:right w:val="single" w:color="808080" w:sz="4"/>
+            </w:tcBorders>
+            <w:tcMar>
+              <w:top w:type="dxa" w:w="40"/>
+              <w:left w:type="dxa" w:w="80"/>
+              <w:bottom w:type="dxa" w:w="40"/>
+              <w:right w:type="dxa" w:w="80"/>
+            </w:tcMar>
+          </w:tcPr>
+          <w:p>
+            <w:pPr>
+              <w:spacing w:after="0"/>
+            </w:pPr>
+            <w:r>
+              <w:rPr>
+                <w:rFonts w:ascii="Times New Roman" w:cs="Times New Roman" w:eastAsia="Times New Roman" w:hAnsi="Times New Roman"/>
+                <w:sz w:val="20"/>
+                <w:szCs w:val="20"/>
+              </w:rPr>
+              <w:t xml:space="preserve">134.5</w:t>
+            </w:r>
+          </w:p>
+        </w:tc>
+        <w:tc>
+          <w:tcPr>
+            <w:tcW w:type="dxa" w:w="1203"/>
+            <w:tcBorders>
+              <w:top w:val="single" w:color="808080" w:sz="4"/>
+              <w:left w:val="single" w:color="808080" w:sz="4"/>
+              <w:bottom w:val="single" w:color="808080" w:sz="4"/>
+              <w:right w:val="single" w:color="808080" w:sz="4"/>
+            </w:tcBorders>
+            <w:tcMar>
+              <w:top w:type="dxa" w:w="40"/>
+              <w:left w:type="dxa" w:w="80"/>
+              <w:bottom w:type="dxa" w:w="40"/>
+              <w:right w:type="dxa" w:w="80"/>
+            </w:tcMar>
+          </w:tcPr>
+          <w:p>
+            <w:pPr>
+              <w:spacing w:after="0"/>
+            </w:pPr>
+            <w:r>
+              <w:rPr>
+                <w:rFonts w:ascii="Times New Roman" w:cs="Times New Roman" w:eastAsia="Times New Roman" w:hAnsi="Times New Roman"/>
+                <w:sz w:val="20"/>
+                <w:szCs w:val="20"/>
+              </w:rPr>
+              <w:t xml:space="preserve">120.5</w:t>
+            </w:r>
+          </w:p>
+        </w:tc>
+        <w:tc>
+          <w:tcPr>
+            <w:tcW w:type="dxa" w:w="1404"/>
+            <w:tcBorders>
+              <w:top w:val="single" w:color="808080" w:sz="4"/>
+              <w:left w:val="single" w:color="808080" w:sz="4"/>
+              <w:bottom w:val="single" w:color="808080" w:sz="4"/>
+              <w:right w:val="single" w:color="808080" w:sz="4"/>
+            </w:tcBorders>
+            <w:tcMar>
+              <w:top w:type="dxa" w:w="40"/>
+              <w:left w:type="dxa" w:w="80"/>
+              <w:bottom w:type="dxa" w:w="40"/>
+              <w:right w:type="dxa" w:w="80"/>
+            </w:tcMar>
+          </w:tcPr>
+          <w:p>
+            <w:pPr>
+              <w:spacing w:after="0"/>
+            </w:pPr>
+            <w:r>
+              <w:rPr>
+                <w:rFonts w:ascii="Times New Roman" w:cs="Times New Roman" w:eastAsia="Times New Roman" w:hAnsi="Times New Roman"/>
+                <w:sz w:val="20"/>
+                <w:szCs w:val="20"/>
+              </w:rPr>
+              <w:t xml:space="preserve">99,886</w:t>
+            </w:r>
+          </w:p>
+        </w:tc>
+        <w:tc>
+          <w:tcPr>
+            <w:tcW w:type="dxa" w:w="1404"/>
+            <w:tcBorders>
+              <w:top w:val="single" w:color="808080" w:sz="4"/>
+              <w:left w:val="single" w:color="808080" w:sz="4"/>
+              <w:bottom w:val="single" w:color="808080" w:sz="4"/>
+              <w:right w:val="single" w:color="808080" w:sz="4"/>
+            </w:tcBorders>
+            <w:tcMar>
+              <w:top w:type="dxa" w:w="40"/>
+              <w:left w:type="dxa" w:w="80"/>
+              <w:bottom w:type="dxa" w:w="40"/>
+              <w:right w:type="dxa" w:w="80"/>
+            </w:tcMar>
+          </w:tcPr>
+          <w:p>
+            <w:pPr>
+              <w:spacing w:after="0"/>
+            </w:pPr>
+            <w:r>
+              <w:rPr>
+                <w:rFonts w:ascii="Times New Roman" w:cs="Times New Roman" w:eastAsia="Times New Roman" w:hAnsi="Times New Roman"/>
+                <w:sz w:val="20"/>
+                <w:szCs w:val="20"/>
+              </w:rPr>
+              <w:t xml:space="preserve">97,643</w:t>
+            </w:r>
+          </w:p>
+        </w:tc>
+        <w:tc>
+          <w:tcPr>
+            <w:tcW w:type="dxa" w:w="1306"/>
+            <w:tcBorders>
+              <w:top w:val="single" w:color="808080" w:sz="4"/>
+              <w:left w:val="single" w:color="808080" w:sz="4"/>
+              <w:bottom w:val="single" w:color="808080" w:sz="4"/>
+              <w:right w:val="single" w:color="808080" w:sz="4"/>
+            </w:tcBorders>
+            <w:tcMar>
+              <w:top w:type="dxa" w:w="40"/>
+              <w:left w:type="dxa" w:w="80"/>
+              <w:bottom w:type="dxa" w:w="40"/>
+              <w:right w:type="dxa" w:w="80"/>
+            </w:tcMar>
+          </w:tcPr>
+          <w:p>
+            <w:pPr>
+              <w:spacing w:after="0"/>
+            </w:pPr>
+            <w:r>
+              <w:rPr>
+                <w:rFonts w:ascii="Times New Roman" w:cs="Times New Roman" w:eastAsia="Times New Roman" w:hAnsi="Times New Roman"/>
+                <w:sz w:val="20"/>
+                <w:szCs w:val="20"/>
+              </w:rPr>
+              <w:t xml:space="preserve">105,808</w:t>
+            </w:r>
+          </w:p>
+        </w:tc>
+      </w:tr>
+      <w:tr>
+        <w:tc>
+          <w:tcPr>
+            <w:tcW w:type="dxa" w:w="1303"/>
+            <w:tcBorders>
+              <w:top w:val="single" w:color="808080" w:sz="4"/>
+              <w:left w:val="single" w:color="808080" w:sz="4"/>
+              <w:bottom w:val="single" w:color="808080" w:sz="4"/>
+              <w:right w:val="single" w:color="808080" w:sz="4"/>
+            </w:tcBorders>
+            <w:tcMar>
+              <w:top w:type="dxa" w:w="40"/>
+              <w:left w:type="dxa" w:w="80"/>
+              <w:bottom w:type="dxa" w:w="40"/>
+              <w:right w:type="dxa" w:w="80"/>
+            </w:tcMar>
+          </w:tcPr>
+          <w:p>
+            <w:pPr>
+              <w:spacing w:after="0"/>
+            </w:pPr>
+            <w:r>
+              <w:rPr>
+                <w:rFonts w:ascii="Times New Roman" w:cs="Times New Roman" w:eastAsia="Times New Roman" w:hAnsi="Times New Roman"/>
+                <w:sz w:val="20"/>
+                <w:szCs w:val="20"/>
+              </w:rPr>
+              <w:t xml:space="preserve">1</w:t>
+            </w:r>
+          </w:p>
+        </w:tc>
+        <w:tc>
+          <w:tcPr>
+            <w:tcW w:type="dxa" w:w="1203"/>
+            <w:tcBorders>
+              <w:top w:val="single" w:color="808080" w:sz="4"/>
+              <w:left w:val="single" w:color="808080" w:sz="4"/>
+              <w:bottom w:val="single" w:color="808080" w:sz="4"/>
+              <w:right w:val="single" w:color="808080" w:sz="4"/>
+            </w:tcBorders>
+            <w:tcMar>
+              <w:top w:type="dxa" w:w="40"/>
+              <w:left w:type="dxa" w:w="80"/>
+              <w:bottom w:type="dxa" w:w="40"/>
+              <w:right w:type="dxa" w:w="80"/>
+            </w:tcMar>
+          </w:tcPr>
+          <w:p>
+            <w:pPr>
+              <w:spacing w:after="0"/>
+            </w:pPr>
+            <w:r>
+              <w:rPr>
+                <w:rFonts w:ascii="Times New Roman" w:cs="Times New Roman" w:eastAsia="Times New Roman" w:hAnsi="Times New Roman"/>
+                <w:sz w:val="20"/>
+                <w:szCs w:val="20"/>
+              </w:rPr>
+              <w:t xml:space="preserve">157.5</w:t>
+            </w:r>
+          </w:p>
+        </w:tc>
+        <w:tc>
+          <w:tcPr>
+            <w:tcW w:type="dxa" w:w="1203"/>
+            <w:tcBorders>
+              <w:top w:val="single" w:color="808080" w:sz="4"/>
+              <w:left w:val="single" w:color="808080" w:sz="4"/>
+              <w:bottom w:val="single" w:color="808080" w:sz="4"/>
+              <w:right w:val="single" w:color="808080" w:sz="4"/>
+            </w:tcBorders>
+            <w:tcMar>
+              <w:top w:type="dxa" w:w="40"/>
+              <w:left w:type="dxa" w:w="80"/>
+              <w:bottom w:type="dxa" w:w="40"/>
+              <w:right w:type="dxa" w:w="80"/>
+            </w:tcMar>
+          </w:tcPr>
+          <w:p>
+            <w:pPr>
+              <w:spacing w:after="0"/>
+            </w:pPr>
+            <w:r>
+              <w:rPr>
+                <w:rFonts w:ascii="Times New Roman" w:cs="Times New Roman" w:eastAsia="Times New Roman" w:hAnsi="Times New Roman"/>
+                <w:sz w:val="20"/>
+                <w:szCs w:val="20"/>
+              </w:rPr>
+              <w:t xml:space="preserve">170.0</w:t>
+            </w:r>
+          </w:p>
+        </w:tc>
+        <w:tc>
+          <w:tcPr>
+            <w:tcW w:type="dxa" w:w="1203"/>
+            <w:tcBorders>
+              <w:top w:val="single" w:color="808080" w:sz="4"/>
+              <w:left w:val="single" w:color="808080" w:sz="4"/>
+              <w:bottom w:val="single" w:color="808080" w:sz="4"/>
+              <w:right w:val="single" w:color="808080" w:sz="4"/>
+            </w:tcBorders>
+            <w:tcMar>
+              <w:top w:type="dxa" w:w="40"/>
+              <w:left w:type="dxa" w:w="80"/>
+              <w:bottom w:type="dxa" w:w="40"/>
+              <w:right w:type="dxa" w:w="80"/>
+            </w:tcMar>
+          </w:tcPr>
+          <w:p>
+            <w:pPr>
+              <w:spacing w:after="0"/>
+            </w:pPr>
+            <w:r>
+              <w:rPr>
+                <w:rFonts w:ascii="Times New Roman" w:cs="Times New Roman" w:eastAsia="Times New Roman" w:hAnsi="Times New Roman"/>
+                <w:sz w:val="20"/>
+                <w:szCs w:val="20"/>
+              </w:rPr>
+              <w:t xml:space="preserve">169.5</w:t>
+            </w:r>
+          </w:p>
+        </w:tc>
+        <w:tc>
+          <w:tcPr>
+            <w:tcW w:type="dxa" w:w="1404"/>
+            <w:tcBorders>
+              <w:top w:val="single" w:color="808080" w:sz="4"/>
+              <w:left w:val="single" w:color="808080" w:sz="4"/>
+              <w:bottom w:val="single" w:color="808080" w:sz="4"/>
+              <w:right w:val="single" w:color="808080" w:sz="4"/>
+            </w:tcBorders>
+            <w:tcMar>
+              <w:top w:type="dxa" w:w="40"/>
+              <w:left w:type="dxa" w:w="80"/>
+              <w:bottom w:type="dxa" w:w="40"/>
+              <w:right w:type="dxa" w:w="80"/>
+            </w:tcMar>
+          </w:tcPr>
+          <w:p>
+            <w:pPr>
+              <w:spacing w:after="0"/>
+            </w:pPr>
+            <w:r>
+              <w:rPr>
+                <w:rFonts w:ascii="Times New Roman" w:cs="Times New Roman" w:eastAsia="Times New Roman" w:hAnsi="Times New Roman"/>
+                <w:sz w:val="20"/>
+                <w:szCs w:val="20"/>
+              </w:rPr>
+              <w:t xml:space="preserve">83,869</w:t>
+            </w:r>
+          </w:p>
+        </w:tc>
+        <w:tc>
+          <w:tcPr>
+            <w:tcW w:type="dxa" w:w="1404"/>
+            <w:tcBorders>
+              <w:top w:val="single" w:color="808080" w:sz="4"/>
+              <w:left w:val="single" w:color="808080" w:sz="4"/>
+              <w:bottom w:val="single" w:color="808080" w:sz="4"/>
+              <w:right w:val="single" w:color="808080" w:sz="4"/>
+            </w:tcBorders>
+            <w:tcMar>
+              <w:top w:type="dxa" w:w="40"/>
+              <w:left w:type="dxa" w:w="80"/>
+              <w:bottom w:type="dxa" w:w="40"/>
+              <w:right w:type="dxa" w:w="80"/>
+            </w:tcMar>
+          </w:tcPr>
+          <w:p>
+            <w:pPr>
+              <w:spacing w:after="0"/>
+            </w:pPr>
+            <w:r>
+              <w:rPr>
+                <w:rFonts w:ascii="Times New Roman" w:cs="Times New Roman" w:eastAsia="Times New Roman" w:hAnsi="Times New Roman"/>
+                <w:sz w:val="20"/>
+                <w:szCs w:val="20"/>
+              </w:rPr>
+              <w:t xml:space="preserve">88,197</w:t>
+            </w:r>
+          </w:p>
+        </w:tc>
+        <w:tc>
+          <w:tcPr>
+            <w:tcW w:type="dxa" w:w="1306"/>
+            <w:tcBorders>
+              <w:top w:val="single" w:color="808080" w:sz="4"/>
+              <w:left w:val="single" w:color="808080" w:sz="4"/>
+              <w:bottom w:val="single" w:color="808080" w:sz="4"/>
+              <w:right w:val="single" w:color="808080" w:sz="4"/>
+            </w:tcBorders>
+            <w:tcMar>
+              <w:top w:type="dxa" w:w="40"/>
+              <w:left w:type="dxa" w:w="80"/>
+              <w:bottom w:type="dxa" w:w="40"/>
+              <w:right w:type="dxa" w:w="80"/>
+            </w:tcMar>
+          </w:tcPr>
+          <w:p>
+            <w:pPr>
+              <w:spacing w:after="0"/>
+            </w:pPr>
+            <w:r>
+              <w:rPr>
+                <w:rFonts w:ascii="Times New Roman" w:cs="Times New Roman" w:eastAsia="Times New Roman" w:hAnsi="Times New Roman"/>
+                <w:sz w:val="20"/>
+                <w:szCs w:val="20"/>
+              </w:rPr>
+              <w:t xml:space="preserve">84,495</w:t>
+            </w:r>
+          </w:p>
+        </w:tc>
+      </w:tr>
+      <w:tr>
+        <w:tc>
+          <w:tcPr>
+            <w:tcW w:type="dxa" w:w="1303"/>
+            <w:tcBorders>
+              <w:top w:val="single" w:color="808080" w:sz="4"/>
+              <w:left w:val="single" w:color="808080" w:sz="4"/>
+              <w:bottom w:val="single" w:color="808080" w:sz="4"/>
+              <w:right w:val="single" w:color="808080" w:sz="4"/>
+            </w:tcBorders>
+            <w:tcMar>
+              <w:top w:type="dxa" w:w="40"/>
+              <w:left w:type="dxa" w:w="80"/>
+              <w:bottom w:type="dxa" w:w="40"/>
+              <w:right w:type="dxa" w:w="80"/>
+            </w:tcMar>
+          </w:tcPr>
+          <w:p>
+            <w:pPr>
+              <w:spacing w:after="0"/>
+            </w:pPr>
+            <w:r>
+              <w:rPr>
+                <w:rFonts w:ascii="Times New Roman" w:cs="Times New Roman" w:eastAsia="Times New Roman" w:hAnsi="Times New Roman"/>
+                <w:sz w:val="20"/>
+                <w:szCs w:val="20"/>
+              </w:rPr>
+              <w:t xml:space="preserve">2</w:t>
+            </w:r>
+          </w:p>
+        </w:tc>
+        <w:tc>
+          <w:tcPr>
+            <w:tcW w:type="dxa" w:w="1203"/>
+            <w:tcBorders>
+              <w:top w:val="single" w:color="808080" w:sz="4"/>
+              <w:left w:val="single" w:color="808080" w:sz="4"/>
+              <w:bottom w:val="single" w:color="808080" w:sz="4"/>
+              <w:right w:val="single" w:color="808080" w:sz="4"/>
+            </w:tcBorders>
+            <w:tcMar>
+              <w:top w:type="dxa" w:w="40"/>
+              <w:left w:type="dxa" w:w="80"/>
+              <w:bottom w:type="dxa" w:w="40"/>
+              <w:right w:type="dxa" w:w="80"/>
+            </w:tcMar>
+          </w:tcPr>
+          <w:p>
+            <w:pPr>
+              <w:spacing w:after="0"/>
+            </w:pPr>
+            <w:r>
+              <w:rPr>
+                <w:rFonts w:ascii="Times New Roman" w:cs="Times New Roman" w:eastAsia="Times New Roman" w:hAnsi="Times New Roman"/>
+                <w:sz w:val="20"/>
+                <w:szCs w:val="20"/>
+              </w:rPr>
+              <w:t xml:space="preserve">152.0</w:t>
+            </w:r>
+          </w:p>
+        </w:tc>
+        <w:tc>
+          <w:tcPr>
+            <w:tcW w:type="dxa" w:w="1203"/>
+            <w:tcBorders>
+              <w:top w:val="single" w:color="808080" w:sz="4"/>
+              <w:left w:val="single" w:color="808080" w:sz="4"/>
+              <w:bottom w:val="single" w:color="808080" w:sz="4"/>
+              <w:right w:val="single" w:color="808080" w:sz="4"/>
+            </w:tcBorders>
+            <w:tcMar>
+              <w:top w:type="dxa" w:w="40"/>
+              <w:left w:type="dxa" w:w="80"/>
+              <w:bottom w:type="dxa" w:w="40"/>
+              <w:right w:type="dxa" w:w="80"/>
+            </w:tcMar>
+          </w:tcPr>
+          <w:p>
+            <w:pPr>
+              <w:spacing w:after="0"/>
+            </w:pPr>
+            <w:r>
+              <w:rPr>
+                <w:rFonts w:ascii="Times New Roman" w:cs="Times New Roman" w:eastAsia="Times New Roman" w:hAnsi="Times New Roman"/>
+                <w:sz w:val="20"/>
+                <w:szCs w:val="20"/>
+              </w:rPr>
+              <w:t xml:space="preserve">156.5</w:t>
+            </w:r>
+          </w:p>
+        </w:tc>
+        <w:tc>
+          <w:tcPr>
+            <w:tcW w:type="dxa" w:w="1203"/>
+            <w:tcBorders>
+              <w:top w:val="single" w:color="808080" w:sz="4"/>
+              <w:left w:val="single" w:color="808080" w:sz="4"/>
+              <w:bottom w:val="single" w:color="808080" w:sz="4"/>
+              <w:right w:val="single" w:color="808080" w:sz="4"/>
+            </w:tcBorders>
+            <w:tcMar>
+              <w:top w:type="dxa" w:w="40"/>
+              <w:left w:type="dxa" w:w="80"/>
+              <w:bottom w:type="dxa" w:w="40"/>
+              <w:right w:type="dxa" w:w="80"/>
+            </w:tcMar>
+          </w:tcPr>
+          <w:p>
+            <w:pPr>
+              <w:spacing w:after="0"/>
+            </w:pPr>
+            <w:r>
+              <w:rPr>
+                <w:rFonts w:ascii="Times New Roman" w:cs="Times New Roman" w:eastAsia="Times New Roman" w:hAnsi="Times New Roman"/>
+                <w:sz w:val="20"/>
+                <w:szCs w:val="20"/>
+              </w:rPr>
+              <w:t xml:space="preserve">147.0</w:t>
+            </w:r>
+          </w:p>
+        </w:tc>
+        <w:tc>
+          <w:tcPr>
+            <w:tcW w:type="dxa" w:w="1404"/>
+            <w:tcBorders>
+              <w:top w:val="single" w:color="808080" w:sz="4"/>
+              <w:left w:val="single" w:color="808080" w:sz="4"/>
+              <w:bottom w:val="single" w:color="808080" w:sz="4"/>
+              <w:right w:val="single" w:color="808080" w:sz="4"/>
+            </w:tcBorders>
+            <w:tcMar>
+              <w:top w:type="dxa" w:w="40"/>
+              <w:left w:type="dxa" w:w="80"/>
+              <w:bottom w:type="dxa" w:w="40"/>
+              <w:right w:type="dxa" w:w="80"/>
+            </w:tcMar>
+          </w:tcPr>
+          <w:p>
+            <w:pPr>
+              <w:spacing w:after="0"/>
+            </w:pPr>
+            <w:r>
+              <w:rPr>
+                <w:rFonts w:ascii="Times New Roman" w:cs="Times New Roman" w:eastAsia="Times New Roman" w:hAnsi="Times New Roman"/>
+                <w:sz w:val="20"/>
+                <w:szCs w:val="20"/>
+              </w:rPr>
+              <w:t xml:space="preserve">84,089</w:t>
+            </w:r>
+          </w:p>
+        </w:tc>
+        <w:tc>
+          <w:tcPr>
+            <w:tcW w:type="dxa" w:w="1404"/>
+            <w:tcBorders>
+              <w:top w:val="single" w:color="808080" w:sz="4"/>
+              <w:left w:val="single" w:color="808080" w:sz="4"/>
+              <w:bottom w:val="single" w:color="808080" w:sz="4"/>
+              <w:right w:val="single" w:color="808080" w:sz="4"/>
+            </w:tcBorders>
+            <w:tcMar>
+              <w:top w:type="dxa" w:w="40"/>
+              <w:left w:type="dxa" w:w="80"/>
+              <w:bottom w:type="dxa" w:w="40"/>
+              <w:right w:type="dxa" w:w="80"/>
+            </w:tcMar>
+          </w:tcPr>
+          <w:p>
+            <w:pPr>
+              <w:spacing w:after="0"/>
+            </w:pPr>
+            <w:r>
+              <w:rPr>
+                <w:rFonts w:ascii="Times New Roman" w:cs="Times New Roman" w:eastAsia="Times New Roman" w:hAnsi="Times New Roman"/>
+                <w:sz w:val="20"/>
+                <w:szCs w:val="20"/>
+              </w:rPr>
+              <w:t xml:space="preserve">82,843</w:t>
+            </w:r>
+          </w:p>
+        </w:tc>
+        <w:tc>
+          <w:tcPr>
+            <w:tcW w:type="dxa" w:w="1306"/>
+            <w:tcBorders>
+              <w:top w:val="single" w:color="808080" w:sz="4"/>
+              <w:left w:val="single" w:color="808080" w:sz="4"/>
+              <w:bottom w:val="single" w:color="808080" w:sz="4"/>
+              <w:right w:val="single" w:color="808080" w:sz="4"/>
+            </w:tcBorders>
+            <w:tcMar>
+              <w:top w:type="dxa" w:w="40"/>
+              <w:left w:type="dxa" w:w="80"/>
+              <w:bottom w:type="dxa" w:w="40"/>
+              <w:right w:type="dxa" w:w="80"/>
+            </w:tcMar>
+          </w:tcPr>
+          <w:p>
+            <w:pPr>
+              <w:spacing w:after="0"/>
+            </w:pPr>
+            <w:r>
+              <w:rPr>
+                <w:rFonts w:ascii="Times New Roman" w:cs="Times New Roman" w:eastAsia="Times New Roman" w:hAnsi="Times New Roman"/>
+                <w:sz w:val="20"/>
+                <w:szCs w:val="20"/>
+              </w:rPr>
+              <w:t xml:space="preserve">84,104</w:t>
+            </w:r>
+          </w:p>
+        </w:tc>
+      </w:tr>
+      <w:tr>
+        <w:tc>
+          <w:tcPr>
+            <w:tcW w:type="dxa" w:w="1303"/>
+            <w:tcBorders>
+              <w:top w:val="single" w:color="808080" w:sz="4"/>
+              <w:left w:val="single" w:color="808080" w:sz="4"/>
+              <w:bottom w:val="single" w:color="808080" w:sz="4"/>
+              <w:right w:val="single" w:color="808080" w:sz="4"/>
+            </w:tcBorders>
+            <w:tcMar>
+              <w:top w:type="dxa" w:w="40"/>
+              <w:left w:type="dxa" w:w="80"/>
+              <w:bottom w:type="dxa" w:w="40"/>
+              <w:right w:type="dxa" w:w="80"/>
+            </w:tcMar>
+          </w:tcPr>
+          <w:p>
+            <w:pPr>
+              <w:spacing w:after="0"/>
+            </w:pPr>
+            <w:r>
+              <w:rPr>
+                <w:rFonts w:ascii="Times New Roman" w:cs="Times New Roman" w:eastAsia="Times New Roman" w:hAnsi="Times New Roman"/>
+                <w:sz w:val="20"/>
+                <w:szCs w:val="20"/>
+              </w:rPr>
+              <w:t xml:space="preserve">3</w:t>
+            </w:r>
+          </w:p>
+        </w:tc>
+        <w:tc>
+          <w:tcPr>
+            <w:tcW w:type="dxa" w:w="1203"/>
+            <w:tcBorders>
+              <w:top w:val="single" w:color="808080" w:sz="4"/>
+              <w:left w:val="single" w:color="808080" w:sz="4"/>
+              <w:bottom w:val="single" w:color="808080" w:sz="4"/>
+              <w:right w:val="single" w:color="808080" w:sz="4"/>
+            </w:tcBorders>
+            <w:tcMar>
+              <w:top w:type="dxa" w:w="40"/>
+              <w:left w:type="dxa" w:w="80"/>
+              <w:bottom w:type="dxa" w:w="40"/>
+              <w:right w:type="dxa" w:w="80"/>
+            </w:tcMar>
+          </w:tcPr>
+          <w:p>
+            <w:pPr>
+              <w:spacing w:after="0"/>
+            </w:pPr>
+            <w:r>
+              <w:rPr>
+                <w:rFonts w:ascii="Times New Roman" w:cs="Times New Roman" w:eastAsia="Times New Roman" w:hAnsi="Times New Roman"/>
+                <w:sz w:val="20"/>
+                <w:szCs w:val="20"/>
+              </w:rPr>
+              <w:t xml:space="preserve">152.0</w:t>
+            </w:r>
+          </w:p>
+        </w:tc>
+        <w:tc>
+          <w:tcPr>
+            <w:tcW w:type="dxa" w:w="1203"/>
+            <w:tcBorders>
+              <w:top w:val="single" w:color="808080" w:sz="4"/>
+              <w:left w:val="single" w:color="808080" w:sz="4"/>
+              <w:bottom w:val="single" w:color="808080" w:sz="4"/>
+              <w:right w:val="single" w:color="808080" w:sz="4"/>
+            </w:tcBorders>
+            <w:tcMar>
+              <w:top w:type="dxa" w:w="40"/>
+              <w:left w:type="dxa" w:w="80"/>
+              <w:bottom w:type="dxa" w:w="40"/>
+              <w:right w:type="dxa" w:w="80"/>
+            </w:tcMar>
+          </w:tcPr>
+          <w:p>
+            <w:pPr>
+              <w:spacing w:after="0"/>
+            </w:pPr>
+            <w:r>
+              <w:rPr>
+                <w:rFonts w:ascii="Times New Roman" w:cs="Times New Roman" w:eastAsia="Times New Roman" w:hAnsi="Times New Roman"/>
+                <w:sz w:val="20"/>
+                <w:szCs w:val="20"/>
+              </w:rPr>
+              <w:t xml:space="preserve">154.0</w:t>
+            </w:r>
+          </w:p>
+        </w:tc>
+        <w:tc>
+          <w:tcPr>
+            <w:tcW w:type="dxa" w:w="1203"/>
+            <w:tcBorders>
+              <w:top w:val="single" w:color="808080" w:sz="4"/>
+              <w:left w:val="single" w:color="808080" w:sz="4"/>
+              <w:bottom w:val="single" w:color="808080" w:sz="4"/>
+              <w:right w:val="single" w:color="808080" w:sz="4"/>
+            </w:tcBorders>
+            <w:tcMar>
+              <w:top w:type="dxa" w:w="40"/>
+              <w:left w:type="dxa" w:w="80"/>
+              <w:bottom w:type="dxa" w:w="40"/>
+              <w:right w:type="dxa" w:w="80"/>
+            </w:tcMar>
+          </w:tcPr>
+          <w:p>
+            <w:pPr>
+              <w:spacing w:after="0"/>
+            </w:pPr>
+            <w:r>
+              <w:rPr>
+                <w:rFonts w:ascii="Times New Roman" w:cs="Times New Roman" w:eastAsia="Times New Roman" w:hAnsi="Times New Roman"/>
+                <w:sz w:val="20"/>
+                <w:szCs w:val="20"/>
+              </w:rPr>
+              <w:t xml:space="preserve">152.0</w:t>
+            </w:r>
+          </w:p>
+        </w:tc>
+        <w:tc>
+          <w:tcPr>
+            <w:tcW w:type="dxa" w:w="1404"/>
+            <w:tcBorders>
+              <w:top w:val="single" w:color="808080" w:sz="4"/>
+              <w:left w:val="single" w:color="808080" w:sz="4"/>
+              <w:bottom w:val="single" w:color="808080" w:sz="4"/>
+              <w:right w:val="single" w:color="808080" w:sz="4"/>
+            </w:tcBorders>
+            <w:tcMar>
+              <w:top w:type="dxa" w:w="40"/>
+              <w:left w:type="dxa" w:w="80"/>
+              <w:bottom w:type="dxa" w:w="40"/>
+              <w:right w:type="dxa" w:w="80"/>
+            </w:tcMar>
+          </w:tcPr>
+          <w:p>
+            <w:pPr>
+              <w:spacing w:after="0"/>
+            </w:pPr>
+            <w:r>
+              <w:rPr>
+                <w:rFonts w:ascii="Times New Roman" w:cs="Times New Roman" w:eastAsia="Times New Roman" w:hAnsi="Times New Roman"/>
+                <w:sz w:val="20"/>
+                <w:szCs w:val="20"/>
+              </w:rPr>
+              <w:t xml:space="preserve">86,786</w:t>
+            </w:r>
+          </w:p>
+        </w:tc>
+        <w:tc>
+          <w:tcPr>
+            <w:tcW w:type="dxa" w:w="1404"/>
+            <w:tcBorders>
+              <w:top w:val="single" w:color="808080" w:sz="4"/>
+              <w:left w:val="single" w:color="808080" w:sz="4"/>
+              <w:bottom w:val="single" w:color="808080" w:sz="4"/>
+              <w:right w:val="single" w:color="808080" w:sz="4"/>
+            </w:tcBorders>
+            <w:tcMar>
+              <w:top w:type="dxa" w:w="40"/>
+              <w:left w:type="dxa" w:w="80"/>
+              <w:bottom w:type="dxa" w:w="40"/>
+              <w:right w:type="dxa" w:w="80"/>
+            </w:tcMar>
+          </w:tcPr>
+          <w:p>
+            <w:pPr>
+              <w:spacing w:after="0"/>
+            </w:pPr>
+            <w:r>
+              <w:rPr>
+                <w:rFonts w:ascii="Times New Roman" w:cs="Times New Roman" w:eastAsia="Times New Roman" w:hAnsi="Times New Roman"/>
+                <w:sz w:val="20"/>
+                <w:szCs w:val="20"/>
+              </w:rPr>
+              <w:t xml:space="preserve">85,285</w:t>
+            </w:r>
+          </w:p>
+        </w:tc>
+        <w:tc>
+          <w:tcPr>
+            <w:tcW w:type="dxa" w:w="1306"/>
+            <w:tcBorders>
+              <w:top w:val="single" w:color="808080" w:sz="4"/>
+              <w:left w:val="single" w:color="808080" w:sz="4"/>
+              <w:bottom w:val="single" w:color="808080" w:sz="4"/>
+              <w:right w:val="single" w:color="808080" w:sz="4"/>
+            </w:tcBorders>
+            <w:tcMar>
+              <w:top w:type="dxa" w:w="40"/>
+              <w:left w:type="dxa" w:w="80"/>
+              <w:bottom w:type="dxa" w:w="40"/>
+              <w:right w:type="dxa" w:w="80"/>
+            </w:tcMar>
+          </w:tcPr>
+          <w:p>
+            <w:pPr>
+              <w:spacing w:after="0"/>
+            </w:pPr>
+            <w:r>
+              <w:rPr>
+                <w:rFonts w:ascii="Times New Roman" w:cs="Times New Roman" w:eastAsia="Times New Roman" w:hAnsi="Times New Roman"/>
+                <w:sz w:val="20"/>
+                <w:szCs w:val="20"/>
+              </w:rPr>
+              <w:t xml:space="preserve">87,122</w:t>
+            </w:r>
+          </w:p>
+        </w:tc>
+      </w:tr>
+      <w:tr>
+        <w:tc>
+          <w:tcPr>
+            <w:tcW w:type="dxa" w:w="1303"/>
+            <w:tcBorders>
+              <w:top w:val="single" w:color="808080" w:sz="4"/>
+              <w:left w:val="single" w:color="808080" w:sz="4"/>
+              <w:bottom w:val="single" w:color="808080" w:sz="4"/>
+              <w:right w:val="single" w:color="808080" w:sz="4"/>
+            </w:tcBorders>
+            <w:tcMar>
+              <w:top w:type="dxa" w:w="40"/>
+              <w:left w:type="dxa" w:w="80"/>
+              <w:bottom w:type="dxa" w:w="40"/>
+              <w:right w:type="dxa" w:w="80"/>
+            </w:tcMar>
+          </w:tcPr>
+          <w:p>
+            <w:pPr>
+              <w:spacing w:after="0"/>
+            </w:pPr>
+            <w:r>
+              <w:rPr>
+                <w:rFonts w:ascii="Times New Roman" w:cs="Times New Roman" w:eastAsia="Times New Roman" w:hAnsi="Times New Roman"/>
+                <w:sz w:val="20"/>
+                <w:szCs w:val="20"/>
+              </w:rPr>
+              <w:t xml:space="preserve">4</w:t>
+            </w:r>
+          </w:p>
+        </w:tc>
+        <w:tc>
+          <w:tcPr>
+            <w:tcW w:type="dxa" w:w="1203"/>
+            <w:tcBorders>
+              <w:top w:val="single" w:color="808080" w:sz="4"/>
+              <w:left w:val="single" w:color="808080" w:sz="4"/>
+              <w:bottom w:val="single" w:color="808080" w:sz="4"/>
+              <w:right w:val="single" w:color="808080" w:sz="4"/>
+            </w:tcBorders>
+            <w:tcMar>
+              <w:top w:type="dxa" w:w="40"/>
+              <w:left w:type="dxa" w:w="80"/>
+              <w:bottom w:type="dxa" w:w="40"/>
+              <w:right w:type="dxa" w:w="80"/>
+            </w:tcMar>
+          </w:tcPr>
+          <w:p>
+            <w:pPr>
+              <w:spacing w:after="0"/>
+            </w:pPr>
+            <w:r>
+              <w:rPr>
+                <w:rFonts w:ascii="Times New Roman" w:cs="Times New Roman" w:eastAsia="Times New Roman" w:hAnsi="Times New Roman"/>
+                <w:sz w:val="20"/>
+                <w:szCs w:val="20"/>
+              </w:rPr>
+              <w:t xml:space="preserve">160.0</w:t>
+            </w:r>
+          </w:p>
+        </w:tc>
+        <w:tc>
+          <w:tcPr>
+            <w:tcW w:type="dxa" w:w="1203"/>
+            <w:tcBorders>
+              <w:top w:val="single" w:color="808080" w:sz="4"/>
+              <w:left w:val="single" w:color="808080" w:sz="4"/>
+              <w:bottom w:val="single" w:color="808080" w:sz="4"/>
+              <w:right w:val="single" w:color="808080" w:sz="4"/>
+            </w:tcBorders>
+            <w:tcMar>
+              <w:top w:type="dxa" w:w="40"/>
+              <w:left w:type="dxa" w:w="80"/>
+              <w:bottom w:type="dxa" w:w="40"/>
+              <w:right w:type="dxa" w:w="80"/>
+            </w:tcMar>
+          </w:tcPr>
+          <w:p>
+            <w:pPr>
+              <w:spacing w:after="0"/>
+            </w:pPr>
+            <w:r>
+              <w:rPr>
+                <w:rFonts w:ascii="Times New Roman" w:cs="Times New Roman" w:eastAsia="Times New Roman" w:hAnsi="Times New Roman"/>
+                <w:sz w:val="20"/>
+                <w:szCs w:val="20"/>
+              </w:rPr>
+              <w:t xml:space="preserve">160.5</w:t>
+            </w:r>
+          </w:p>
+        </w:tc>
+        <w:tc>
+          <w:tcPr>
+            <w:tcW w:type="dxa" w:w="1203"/>
+            <w:tcBorders>
+              <w:top w:val="single" w:color="808080" w:sz="4"/>
+              <w:left w:val="single" w:color="808080" w:sz="4"/>
+              <w:bottom w:val="single" w:color="808080" w:sz="4"/>
+              <w:right w:val="single" w:color="808080" w:sz="4"/>
+            </w:tcBorders>
+            <w:tcMar>
+              <w:top w:type="dxa" w:w="40"/>
+              <w:left w:type="dxa" w:w="80"/>
+              <w:bottom w:type="dxa" w:w="40"/>
+              <w:right w:type="dxa" w:w="80"/>
+            </w:tcMar>
+          </w:tcPr>
+          <w:p>
+            <w:pPr>
+              <w:spacing w:after="0"/>
+            </w:pPr>
+            <w:r>
+              <w:rPr>
+                <w:rFonts w:ascii="Times New Roman" w:cs="Times New Roman" w:eastAsia="Times New Roman" w:hAnsi="Times New Roman"/>
+                <w:sz w:val="20"/>
+                <w:szCs w:val="20"/>
+              </w:rPr>
+              <w:t xml:space="preserve">155.0</w:t>
+            </w:r>
+          </w:p>
+        </w:tc>
+        <w:tc>
+          <w:tcPr>
+            <w:tcW w:type="dxa" w:w="1404"/>
+            <w:tcBorders>
+              <w:top w:val="single" w:color="808080" w:sz="4"/>
+              <w:left w:val="single" w:color="808080" w:sz="4"/>
+              <w:bottom w:val="single" w:color="808080" w:sz="4"/>
+              <w:right w:val="single" w:color="808080" w:sz="4"/>
+            </w:tcBorders>
+            <w:tcMar>
+              <w:top w:type="dxa" w:w="40"/>
+              <w:left w:type="dxa" w:w="80"/>
+              <w:bottom w:type="dxa" w:w="40"/>
+              <w:right w:type="dxa" w:w="80"/>
+            </w:tcMar>
+          </w:tcPr>
+          <w:p>
+            <w:pPr>
+              <w:spacing w:after="0"/>
+            </w:pPr>
+            <w:r>
+              <w:rPr>
+                <w:rFonts w:ascii="Times New Roman" w:cs="Times New Roman" w:eastAsia="Times New Roman" w:hAnsi="Times New Roman"/>
+                <w:sz w:val="20"/>
+                <w:szCs w:val="20"/>
+              </w:rPr>
+              <w:t xml:space="preserve">83,717</w:t>
+            </w:r>
+          </w:p>
+        </w:tc>
+        <w:tc>
+          <w:tcPr>
+            <w:tcW w:type="dxa" w:w="1404"/>
+            <w:tcBorders>
+              <w:top w:val="single" w:color="808080" w:sz="4"/>
+              <w:left w:val="single" w:color="808080" w:sz="4"/>
+              <w:bottom w:val="single" w:color="808080" w:sz="4"/>
+              <w:right w:val="single" w:color="808080" w:sz="4"/>
+            </w:tcBorders>
+            <w:tcMar>
+              <w:top w:type="dxa" w:w="40"/>
+              <w:left w:type="dxa" w:w="80"/>
+              <w:bottom w:type="dxa" w:w="40"/>
+              <w:right w:type="dxa" w:w="80"/>
+            </w:tcMar>
+          </w:tcPr>
+          <w:p>
+            <w:pPr>
+              <w:spacing w:after="0"/>
+            </w:pPr>
+            <w:r>
+              <w:rPr>
+                <w:rFonts w:ascii="Times New Roman" w:cs="Times New Roman" w:eastAsia="Times New Roman" w:hAnsi="Times New Roman"/>
+                <w:sz w:val="20"/>
+                <w:szCs w:val="20"/>
+              </w:rPr>
+              <w:t xml:space="preserve">83,147</w:t>
+            </w:r>
+          </w:p>
+        </w:tc>
+        <w:tc>
+          <w:tcPr>
+            <w:tcW w:type="dxa" w:w="1306"/>
+            <w:tcBorders>
+              <w:top w:val="single" w:color="808080" w:sz="4"/>
+              <w:left w:val="single" w:color="808080" w:sz="4"/>
+              <w:bottom w:val="single" w:color="808080" w:sz="4"/>
+              <w:right w:val="single" w:color="808080" w:sz="4"/>
+            </w:tcBorders>
+            <w:tcMar>
+              <w:top w:type="dxa" w:w="40"/>
+              <w:left w:type="dxa" w:w="80"/>
+              <w:bottom w:type="dxa" w:w="40"/>
+              <w:right w:type="dxa" w:w="80"/>
+            </w:tcMar>
+          </w:tcPr>
+          <w:p>
+            <w:pPr>
+              <w:spacing w:after="0"/>
+            </w:pPr>
+            <w:r>
+              <w:rPr>
+                <w:rFonts w:ascii="Times New Roman" w:cs="Times New Roman" w:eastAsia="Times New Roman" w:hAnsi="Times New Roman"/>
+                <w:sz w:val="20"/>
+                <w:szCs w:val="20"/>
+              </w:rPr>
+              <w:t xml:space="preserve">86,219</w:t>
+            </w:r>
+          </w:p>
+        </w:tc>
+      </w:tr>
+      <w:tr>
+        <w:tc>
+          <w:tcPr>
+            <w:tcW w:type="dxa" w:w="1303"/>
+            <w:tcBorders>
+              <w:top w:val="single" w:color="808080" w:sz="4"/>
+              <w:left w:val="single" w:color="808080" w:sz="4"/>
+              <w:bottom w:val="single" w:color="808080" w:sz="4"/>
+              <w:right w:val="single" w:color="808080" w:sz="4"/>
+            </w:tcBorders>
+            <w:tcMar>
+              <w:top w:type="dxa" w:w="40"/>
+              <w:left w:type="dxa" w:w="80"/>
+              <w:bottom w:type="dxa" w:w="40"/>
+              <w:right w:type="dxa" w:w="80"/>
+            </w:tcMar>
+          </w:tcPr>
+          <w:p>
+            <w:pPr>
+              <w:spacing w:after="0"/>
+            </w:pPr>
+            <w:r>
+              <w:rPr>
+                <w:rFonts w:ascii="Times New Roman" w:cs="Times New Roman" w:eastAsia="Times New Roman" w:hAnsi="Times New Roman"/>
+                <w:b/>
+                <w:bCs/>
+                <w:sz w:val="20"/>
+                <w:szCs w:val="20"/>
+              </w:rPr>
+              <w:t xml:space="preserve">Mean ± sd</w:t>
+            </w:r>
+          </w:p>
+        </w:tc>
+        <w:tc>
+          <w:tcPr>
+            <w:tcW w:type="dxa" w:w="1203"/>
+            <w:tcBorders>
+              <w:top w:val="single" w:color="808080" w:sz="4"/>
+              <w:left w:val="single" w:color="808080" w:sz="4"/>
+              <w:bottom w:val="single" w:color="808080" w:sz="4"/>
+              <w:right w:val="single" w:color="808080" w:sz="4"/>
+            </w:tcBorders>
+            <w:tcMar>
+              <w:top w:type="dxa" w:w="40"/>
+              <w:left w:type="dxa" w:w="80"/>
+              <w:bottom w:type="dxa" w:w="40"/>
+              <w:right w:type="dxa" w:w="80"/>
+            </w:tcMar>
+          </w:tcPr>
+          <w:p>
+            <w:pPr>
+              <w:spacing w:after="0"/>
+            </w:pPr>
+            <w:r>
+              <w:rPr>
+                <w:rFonts w:ascii="Times New Roman" w:cs="Times New Roman" w:eastAsia="Times New Roman" w:hAnsi="Times New Roman"/>
+                <w:b/>
+                <w:bCs/>
+                <w:sz w:val="20"/>
+                <w:szCs w:val="20"/>
+              </w:rPr>
+              <w:t xml:space="preserve">149.0 ± 13.1</w:t>
+            </w:r>
+          </w:p>
+        </w:tc>
+        <w:tc>
+          <w:tcPr>
+            <w:tcW w:type="dxa" w:w="1203"/>
+            <w:tcBorders>
+              <w:top w:val="single" w:color="808080" w:sz="4"/>
+              <w:left w:val="single" w:color="808080" w:sz="4"/>
+              <w:bottom w:val="single" w:color="808080" w:sz="4"/>
+              <w:right w:val="single" w:color="808080" w:sz="4"/>
+            </w:tcBorders>
+            <w:tcMar>
+              <w:top w:type="dxa" w:w="40"/>
+              <w:left w:type="dxa" w:w="80"/>
+              <w:bottom w:type="dxa" w:w="40"/>
+              <w:right w:type="dxa" w:w="80"/>
+            </w:tcMar>
+          </w:tcPr>
+          <w:p>
+            <w:pPr>
+              <w:spacing w:after="0"/>
+            </w:pPr>
+            <w:r>
+              <w:rPr>
+                <w:rFonts w:ascii="Times New Roman" w:cs="Times New Roman" w:eastAsia="Times New Roman" w:hAnsi="Times New Roman"/>
+                <w:b/>
+                <w:bCs/>
+                <w:sz w:val="20"/>
+                <w:szCs w:val="20"/>
+              </w:rPr>
+              <w:t xml:space="preserve">155.1 ± 11.7</w:t>
+            </w:r>
+          </w:p>
+        </w:tc>
+        <w:tc>
+          <w:tcPr>
+            <w:tcW w:type="dxa" w:w="1203"/>
+            <w:tcBorders>
+              <w:top w:val="single" w:color="808080" w:sz="4"/>
+              <w:left w:val="single" w:color="808080" w:sz="4"/>
+              <w:bottom w:val="single" w:color="808080" w:sz="4"/>
+              <w:right w:val="single" w:color="808080" w:sz="4"/>
+            </w:tcBorders>
+            <w:tcMar>
+              <w:top w:type="dxa" w:w="40"/>
+              <w:left w:type="dxa" w:w="80"/>
+              <w:bottom w:type="dxa" w:w="40"/>
+              <w:right w:type="dxa" w:w="80"/>
+            </w:tcMar>
+          </w:tcPr>
+          <w:p>
+            <w:pPr>
+              <w:spacing w:after="0"/>
+            </w:pPr>
+            <w:r>
+              <w:rPr>
+                <w:rFonts w:ascii="Times New Roman" w:cs="Times New Roman" w:eastAsia="Times New Roman" w:hAnsi="Times New Roman"/>
+                <w:b/>
+                <w:bCs/>
+                <w:sz w:val="20"/>
+                <w:szCs w:val="20"/>
+              </w:rPr>
+              <w:t xml:space="preserve">148.8 ± 16.0</w:t>
+            </w:r>
+          </w:p>
+        </w:tc>
+        <w:tc>
+          <w:tcPr>
+            <w:tcW w:type="dxa" w:w="1404"/>
+            <w:tcBorders>
+              <w:top w:val="single" w:color="808080" w:sz="4"/>
+              <w:left w:val="single" w:color="808080" w:sz="4"/>
+              <w:bottom w:val="single" w:color="808080" w:sz="4"/>
+              <w:right w:val="single" w:color="808080" w:sz="4"/>
+            </w:tcBorders>
+            <w:tcMar>
+              <w:top w:type="dxa" w:w="40"/>
+              <w:left w:type="dxa" w:w="80"/>
+              <w:bottom w:type="dxa" w:w="40"/>
+              <w:right w:type="dxa" w:w="80"/>
+            </w:tcMar>
+          </w:tcPr>
+          <w:p>
+            <w:pPr>
+              <w:spacing w:after="0"/>
+            </w:pPr>
+            <w:r>
+              <w:rPr>
+                <w:rFonts w:ascii="Times New Roman" w:cs="Times New Roman" w:eastAsia="Times New Roman" w:hAnsi="Times New Roman"/>
+                <w:b/>
+                <w:bCs/>
+                <w:sz w:val="20"/>
+                <w:szCs w:val="20"/>
+              </w:rPr>
+              <w:t xml:space="preserve">87,669 ± 6,211</w:t>
+            </w:r>
+          </w:p>
+        </w:tc>
+        <w:tc>
+          <w:tcPr>
+            <w:tcW w:type="dxa" w:w="1404"/>
+            <w:tcBorders>
+              <w:top w:val="single" w:color="808080" w:sz="4"/>
+              <w:left w:val="single" w:color="808080" w:sz="4"/>
+              <w:bottom w:val="single" w:color="808080" w:sz="4"/>
+              <w:right w:val="single" w:color="808080" w:sz="4"/>
+            </w:tcBorders>
+            <w:tcMar>
+              <w:top w:type="dxa" w:w="40"/>
+              <w:left w:type="dxa" w:w="80"/>
+              <w:bottom w:type="dxa" w:w="40"/>
+              <w:right w:type="dxa" w:w="80"/>
+            </w:tcMar>
+          </w:tcPr>
+          <w:p>
+            <w:pPr>
+              <w:spacing w:after="0"/>
+            </w:pPr>
+            <w:r>
+              <w:rPr>
+                <w:rFonts w:ascii="Times New Roman" w:cs="Times New Roman" w:eastAsia="Times New Roman" w:hAnsi="Times New Roman"/>
+                <w:b/>
+                <w:bCs/>
+                <w:sz w:val="20"/>
+                <w:szCs w:val="20"/>
+              </w:rPr>
+              <w:t xml:space="preserve">87,423 ± 5,457</w:t>
+            </w:r>
+          </w:p>
+        </w:tc>
+        <w:tc>
+          <w:tcPr>
+            <w:tcW w:type="dxa" w:w="1306"/>
+            <w:tcBorders>
+              <w:top w:val="single" w:color="808080" w:sz="4"/>
+              <w:left w:val="single" w:color="808080" w:sz="4"/>
+              <w:bottom w:val="single" w:color="808080" w:sz="4"/>
+              <w:right w:val="single" w:color="808080" w:sz="4"/>
+            </w:tcBorders>
+            <w:tcMar>
+              <w:top w:type="dxa" w:w="40"/>
+              <w:left w:type="dxa" w:w="80"/>
+              <w:bottom w:type="dxa" w:w="40"/>
+              <w:right w:type="dxa" w:w="80"/>
+            </w:tcMar>
+          </w:tcPr>
+          <w:p>
+            <w:pPr>
+              <w:spacing w:after="0"/>
+            </w:pPr>
+            <w:r>
+              <w:rPr>
+                <w:rFonts w:ascii="Times New Roman" w:cs="Times New Roman" w:eastAsia="Times New Roman" w:hAnsi="Times New Roman"/>
+                <w:b/>
+                <w:bCs/>
+                <w:sz w:val="20"/>
+                <w:szCs w:val="20"/>
+              </w:rPr>
+              <w:t xml:space="preserve">89,550 ± 8,204</w:t>
+            </w:r>
+          </w:p>
+        </w:tc>
+      </w:tr>
+    </w:tbl>
+    <w:p>
+      <w:pPr>
+        <w:spacing w:after="160"/>
+      </w:pPr>
+    </w:p>
+    <w:p>
+      <w:pPr>
+        <w:spacing w:after="120" w:line="336"/>
+        <w:jc w:val="both"/>
+      </w:pPr>
+      <w:r>
+        <w:rPr>
+          <w:rFonts w:ascii="Times New Roman" w:cs="Times New Roman" w:eastAsia="Times New Roman" w:hAnsi="Times New Roman"/>
+        </w:rPr>
+        <w:t xml:space="preserve">Every one of the ten agents produced zero Gate A violations and zero expired orders, and none collapsed (action entropy 0.30–0.97).</w:t>
+      </w:r>
+    </w:p>
+    <w:p>
+      <w:pPr>
+        <w:spacing w:after="120" w:line="336"/>
+        <w:jc w:val="both"/>
+      </w:pPr>
+      <w:r>
+        <w:rPr>
+          <w:rFonts w:ascii="Times New Roman" w:cs="Times New Roman" w:eastAsia="Times New Roman" w:hAnsi="Times New Roman"/>
+          <w:b/>
+          <w:bCs/>
+        </w:rPr>
+        <w:t xml:space="preserve">A3 — the forecast contributes a little, and only to latency.</w:t>
+      </w:r>
+      <w:r>
+        <w:rPr>
+          <w:rFonts w:ascii="Times New Roman" w:cs="Times New Roman" w:eastAsia="Times New Roman" w:hAnsi="Times New Roman"/>
+        </w:rPr>
+        <w:t xml:space="preserve"> Retrained without a forecast, the agent’s tail latency is 4.1 % higher on average (155.1 against 149.0 slots) at an unchanged per-user cost (−0.3 %). The direction is consistent — all five seeds are slower without the forecast, by 0.5 to 12.5 slots — but the mean effect is smaller than the seed-to-seed standard deviation and rests on four validation episodes, so it is suggestive rather than established. The retrained result reverses the sign of the inference-time test in Section 8.8, where zeroing the forecast on an agent trained with it made four of five seeds slightly faster; the retrained comparison is the one the protocol specifies, because an agent trained with the input has never learned to act without it. Either way the effect is a few percent: the verdict remains </w:t>
+      </w:r>
+      <w:r>
+        <w:rPr>
+          <w:rFonts w:ascii="Times New Roman" w:cs="Times New Roman" w:eastAsia="Times New Roman" w:hAnsi="Times New Roman"/>
+          <w:b/>
+          <w:bCs/>
+        </w:rPr>
+        <w:t xml:space="preserve">queue-aware</w:t>
+      </w:r>
+      <w:r>
+        <w:rPr>
+          <w:rFonts w:ascii="Times New Roman" w:cs="Times New Roman" w:eastAsia="Times New Roman" w:hAnsi="Times New Roman"/>
+        </w:rPr>
+        <w:t xml:space="preserve">, with the forecast as a minor secondary input.</w:t>
+      </w:r>
+    </w:p>
+    <w:p>
+      <w:pPr>
+        <w:spacing w:after="120" w:line="336"/>
+        <w:jc w:val="both"/>
+      </w:pPr>
+      <w:r>
+        <w:rPr>
+          <w:rFonts w:ascii="Times New Roman" w:cs="Times New Roman" w:eastAsia="Times New Roman" w:hAnsi="Times New Roman"/>
+          <w:b/>
+          <w:bCs/>
+        </w:rPr>
+        <w:t xml:space="preserve">A4 — the quadratic penalty is not what controls the tail.</w:t>
+      </w:r>
+      <w:r>
+        <w:rPr>
+          <w:rFonts w:ascii="Times New Roman" w:cs="Times New Roman" w:eastAsia="Times New Roman" w:hAnsi="Times New Roman"/>
+        </w:rPr>
+        <w:t xml:space="preserve"> With a linear latency penalty, tail latency is unchanged (148.8 against 149.0 slots) and per-user cost is 2.1 % higher, both well inside seed variation. The tail is already bounded structurally by the D_MAX mask, which forbids waiting past the deadline, so reshaping the latency term leaves little for the reward to do. The quadratic form is retained as specified, but the report does not credit it with the agent’s tail behaviour.</w:t>
+      </w:r>
+    </w:p>
+    <w:p>
+      <w:pPr>
+        <w:pStyle w:val="Heading3"/>
+      </w:pPr>
+      <w:r>
+        <w:t xml:space="preserve">A5 — estimation error against Gate A</w:t>
+      </w:r>
+    </w:p>
+    <w:p>
+      <w:pPr>
+        <w:spacing w:after="200" w:before="60"/>
+        <w:jc w:val="center"/>
+      </w:pPr>
+      <w:r>
+        <w:rPr>
+          <w:rFonts w:ascii="Times New Roman" w:cs="Times New Roman" w:eastAsia="Times New Roman" w:hAnsi="Times New Roman"/>
+          <w:b/>
+          <w:bCs/>
+          <w:sz w:val="22"/>
+          <w:szCs w:val="22"/>
+        </w:rPr>
+        <w:t xml:space="preserve">Table 8.12: </w:t>
       </w:r>
       <w:r>
         <w:rPr>
@@ -35691,7 +37364,7 @@
           <w:sz w:val="22"/>
           <w:szCs w:val="22"/>
         </w:rPr>
-        <w:t xml:space="preserve">Table 8.12: </w:t>
+        <w:t xml:space="preserve">Table 8.13: </w:t>
       </w:r>
       <w:r>
         <w:rPr>
@@ -36644,7 +38317,7 @@
           <w:sz w:val="22"/>
           <w:szCs w:val="22"/>
         </w:rPr>
-        <w:t xml:space="preserve">Table 8.13: </w:t>
+        <w:t xml:space="preserve">Table 8.14: </w:t>
       </w:r>
       <w:r>
         <w:rPr>
@@ -38303,7 +39976,7 @@
                 <w:sz w:val="20"/>
                 <w:szCs w:val="20"/>
               </w:rPr>
-              <w:t xml:space="preserve">Seeds, checksums and configuration hashes pinned; earlier manifests record the parent code revision</w:t>
+              <w:t xml:space="preserve">Seeds, checksums and configuration hashes pinned; all five P3 checkpoints reproduce their recorded metrics exactly (T-L5); earlier manifests record the parent code revision</w:t>
             </w:r>
           </w:p>
         </w:tc>

</xml_diff>

<commit_message>
Record the re-specified A2: the learned forecaster helps P2 on cost
E4 fires P2's quieter-block branch on 0 % of validation blocks, the naive
mean-reverting baseline on 36 %, LightGBM on 67 %. At equal N_MIN LightGBM
trades 2-15 slots of tail latency for 17-23k lovelace less per user, all
significant; on the frontier LightGBM N=4 dominates the naive baseline at
N=8, 12 and 20 and matches ORACLE on cost. Report section 8.10 rewritten;
table captions no longer strand at a page foot.
</commit_message>
<xml_diff>
--- a/docs/report/Team11_Project_Report_Draft.docx
+++ b/docs/report/Team11_Project_Report_Draft.docx
@@ -745,6 +745,7 @@
     </w:p>
     <w:p>
       <w:pPr>
+        <w:keepNext/>
         <w:spacing w:after="200" w:before="60"/>
         <w:jc w:val="center"/>
       </w:pPr>
@@ -2665,6 +2666,7 @@
     </w:p>
     <w:p>
       <w:pPr>
+        <w:keepNext/>
         <w:spacing w:after="200" w:before="60"/>
         <w:jc w:val="center"/>
       </w:pPr>
@@ -3627,6 +3629,7 @@
     </w:p>
     <w:p>
       <w:pPr>
+        <w:keepNext/>
         <w:spacing w:after="200" w:before="60"/>
         <w:jc w:val="center"/>
       </w:pPr>
@@ -4912,6 +4915,7 @@
     </w:p>
     <w:p>
       <w:pPr>
+        <w:keepNext/>
         <w:spacing w:after="200" w:before="60"/>
         <w:jc w:val="center"/>
       </w:pPr>
@@ -5609,6 +5613,7 @@
     </w:p>
     <w:p>
       <w:pPr>
+        <w:keepNext/>
         <w:spacing w:after="200" w:before="60"/>
         <w:jc w:val="center"/>
       </w:pPr>
@@ -7150,6 +7155,7 @@
     </w:p>
     <w:p>
       <w:pPr>
+        <w:keepNext/>
         <w:spacing w:after="200" w:before="60"/>
         <w:jc w:val="center"/>
       </w:pPr>
@@ -7964,6 +7970,7 @@
     </w:p>
     <w:p>
       <w:pPr>
+        <w:keepNext/>
         <w:spacing w:after="200" w:before="60"/>
         <w:jc w:val="center"/>
       </w:pPr>
@@ -8507,6 +8514,7 @@
     </w:p>
     <w:p>
       <w:pPr>
+        <w:keepNext/>
         <w:spacing w:after="200" w:before="60"/>
         <w:jc w:val="center"/>
       </w:pPr>
@@ -9706,6 +9714,7 @@
     </w:p>
     <w:p>
       <w:pPr>
+        <w:keepNext/>
         <w:spacing w:after="200" w:before="60"/>
         <w:jc w:val="center"/>
       </w:pPr>
@@ -10840,6 +10849,7 @@
     </w:p>
     <w:p>
       <w:pPr>
+        <w:keepNext/>
         <w:spacing w:after="200" w:before="60"/>
         <w:jc w:val="center"/>
       </w:pPr>
@@ -12062,6 +12072,7 @@
     </w:p>
     <w:p>
       <w:pPr>
+        <w:keepNext/>
         <w:spacing w:after="200" w:before="60"/>
         <w:jc w:val="center"/>
       </w:pPr>
@@ -12731,6 +12742,7 @@
     </w:p>
     <w:p>
       <w:pPr>
+        <w:keepNext/>
         <w:spacing w:after="200" w:before="60"/>
         <w:jc w:val="center"/>
       </w:pPr>
@@ -13391,6 +13403,7 @@
     </w:p>
     <w:p>
       <w:pPr>
+        <w:keepNext w:val="false"/>
         <w:spacing w:after="200" w:before="60"/>
         <w:jc w:val="center"/>
       </w:pPr>
@@ -13522,7 +13535,21 @@
         <w:rPr>
           <w:rFonts w:ascii="Times New Roman" w:cs="Times New Roman" w:eastAsia="Times New Roman" w:hAnsi="Times New Roman"/>
         </w:rPr>
-        <w:t xml:space="preserve">, the baseline, predicts the mean fill of the last 20 blocks. </w:t>
+        <w:t xml:space="preserve">, the baseline, predicts the mean fill of the last 20 blocks, repeated across the horizon; a second naive baseline, </w:t>
+      </w:r>
+      <w:r>
+        <w:rPr>
+          <w:rFonts w:ascii="Times New Roman" w:cs="Times New Roman" w:eastAsia="Times New Roman" w:hAnsi="Times New Roman"/>
+          <w:b/>
+          <w:bCs/>
+        </w:rPr>
+        <w:t xml:space="preserve">E4b</w:t>
+      </w:r>
+      <w:r>
+        <w:rPr>
+          <w:rFonts w:ascii="Times New Roman" w:cs="Times New Roman" w:eastAsia="Times New Roman" w:hAnsi="Times New Roman"/>
+        </w:rPr>
+        <w:t xml:space="preserve">, decays from the current block toward that mean and was added for ablation A2 (Section 8.10). </w:t>
       </w:r>
       <w:r>
         <w:rPr>
@@ -13941,6 +13968,7 @@
     </w:p>
     <w:p>
       <w:pPr>
+        <w:keepNext/>
         <w:spacing w:after="200" w:before="60"/>
         <w:jc w:val="center"/>
       </w:pPr>
@@ -14751,6 +14779,7 @@
     </w:p>
     <w:p>
       <w:pPr>
+        <w:keepNext w:val="false"/>
         <w:spacing w:after="200" w:before="60"/>
         <w:jc w:val="center"/>
       </w:pPr>
@@ -14875,6 +14904,7 @@
     </w:p>
     <w:p>
       <w:pPr>
+        <w:keepNext w:val="false"/>
         <w:spacing w:after="200" w:before="60"/>
         <w:jc w:val="center"/>
       </w:pPr>
@@ -14948,6 +14978,7 @@
     </w:p>
     <w:p>
       <w:pPr>
+        <w:keepNext w:val="false"/>
         <w:spacing w:after="200" w:before="60"/>
         <w:jc w:val="center"/>
       </w:pPr>
@@ -15032,6 +15063,7 @@
     </w:p>
     <w:p>
       <w:pPr>
+        <w:keepNext w:val="false"/>
         <w:spacing w:after="200" w:before="60"/>
         <w:jc w:val="center"/>
       </w:pPr>
@@ -15105,6 +15137,7 @@
     </w:p>
     <w:p>
       <w:pPr>
+        <w:keepNext w:val="false"/>
         <w:spacing w:after="200" w:before="60"/>
         <w:jc w:val="center"/>
       </w:pPr>
@@ -15178,6 +15211,7 @@
     </w:p>
     <w:p>
       <w:pPr>
+        <w:keepNext w:val="false"/>
         <w:spacing w:after="200" w:before="60"/>
         <w:jc w:val="center"/>
       </w:pPr>
@@ -15262,6 +15296,7 @@
     </w:p>
     <w:p>
       <w:pPr>
+        <w:keepNext w:val="false"/>
         <w:spacing w:after="200" w:before="60"/>
         <w:jc w:val="center"/>
       </w:pPr>
@@ -15372,6 +15407,7 @@
     </w:p>
     <w:p>
       <w:pPr>
+        <w:keepNext w:val="false"/>
         <w:spacing w:after="200" w:before="60"/>
         <w:jc w:val="center"/>
       </w:pPr>
@@ -15605,7 +15641,7 @@
           <w:sz w:val="16"/>
           <w:szCs w:val="16"/>
         </w:rPr>
-        <w:t xml:space="preserve">tests/       266 tests in 21 files</w:t>
+        <w:t xml:space="preserve">tests/       270 tests in 21 files</w:t>
       </w:r>
     </w:p>
     <w:p>
@@ -16570,7 +16606,7 @@
           <w:b/>
           <w:bCs/>
         </w:rPr>
-        <w:t xml:space="preserve">266 tests in 21 files</w:t>
+        <w:t xml:space="preserve">270 tests in 21 files</w:t>
       </w:r>
       <w:r>
         <w:rPr>
@@ -16581,6 +16617,7 @@
     </w:p>
     <w:p>
       <w:pPr>
+        <w:keepNext/>
         <w:spacing w:after="200" w:before="60"/>
         <w:jc w:val="center"/>
       </w:pPr>
@@ -17202,6 +17239,7 @@
     </w:p>
     <w:p>
       <w:pPr>
+        <w:keepNext/>
         <w:spacing w:after="200" w:before="60"/>
         <w:jc w:val="center"/>
       </w:pPr>
@@ -17823,6 +17861,7 @@
     </w:p>
     <w:p>
       <w:pPr>
+        <w:keepNext/>
         <w:spacing w:after="200" w:before="60"/>
         <w:jc w:val="center"/>
       </w:pPr>
@@ -20112,6 +20151,7 @@
     </w:p>
     <w:p>
       <w:pPr>
+        <w:keepNext/>
         <w:spacing w:after="200" w:before="60"/>
         <w:jc w:val="center"/>
       </w:pPr>
@@ -20913,6 +20953,7 @@
     </w:p>
     <w:p>
       <w:pPr>
+        <w:keepNext/>
         <w:spacing w:after="200" w:before="60"/>
         <w:jc w:val="center"/>
       </w:pPr>
@@ -21718,6 +21759,7 @@
     </w:p>
     <w:p>
       <w:pPr>
+        <w:keepNext/>
         <w:spacing w:after="200" w:before="60"/>
         <w:jc w:val="center"/>
       </w:pPr>
@@ -22610,6 +22652,7 @@
     </w:p>
     <w:p>
       <w:pPr>
+        <w:keepNext/>
         <w:spacing w:after="200" w:before="60"/>
         <w:jc w:val="center"/>
       </w:pPr>
@@ -23334,6 +23377,7 @@
     </w:p>
     <w:p>
       <w:pPr>
+        <w:keepNext w:val="false"/>
         <w:spacing w:after="200" w:before="60"/>
         <w:jc w:val="center"/>
       </w:pPr>
@@ -23407,6 +23451,7 @@
     </w:p>
     <w:p>
       <w:pPr>
+        <w:keepNext w:val="false"/>
         <w:spacing w:after="200" w:before="60"/>
         <w:jc w:val="center"/>
       </w:pPr>
@@ -23551,6 +23596,7 @@
     </w:p>
     <w:p>
       <w:pPr>
+        <w:keepNext/>
         <w:spacing w:after="200" w:before="60"/>
         <w:jc w:val="center"/>
       </w:pPr>
@@ -23938,6 +23984,7 @@
     </w:p>
     <w:p>
       <w:pPr>
+        <w:keepNext/>
         <w:spacing w:after="200" w:before="60"/>
         <w:jc w:val="center"/>
       </w:pPr>
@@ -24668,6 +24715,7 @@
     </w:p>
     <w:p>
       <w:pPr>
+        <w:keepNext w:val="false"/>
         <w:spacing w:after="200" w:before="60"/>
         <w:jc w:val="center"/>
       </w:pPr>
@@ -24796,6 +24844,7 @@
     </w:p>
     <w:p>
       <w:pPr>
+        <w:keepNext/>
         <w:spacing w:after="200" w:before="60"/>
         <w:jc w:val="center"/>
       </w:pPr>
@@ -26597,6 +26646,7 @@
     </w:p>
     <w:p>
       <w:pPr>
+        <w:keepNext/>
         <w:spacing w:after="200" w:before="60"/>
         <w:jc w:val="center"/>
       </w:pPr>
@@ -28394,6 +28444,7 @@
     </w:p>
     <w:p>
       <w:pPr>
+        <w:keepNext/>
         <w:spacing w:after="200" w:before="60"/>
         <w:jc w:val="center"/>
       </w:pPr>
@@ -30275,6 +30326,7 @@
     </w:p>
     <w:p>
       <w:pPr>
+        <w:keepNext/>
         <w:spacing w:after="200" w:before="60"/>
         <w:jc w:val="center"/>
       </w:pPr>
@@ -31750,6 +31802,7 @@
     </w:p>
     <w:p>
       <w:pPr>
+        <w:keepNext/>
         <w:spacing w:after="200" w:before="60"/>
         <w:jc w:val="center"/>
       </w:pPr>
@@ -33172,6 +33225,7 @@
     </w:p>
     <w:p>
       <w:pPr>
+        <w:keepNext w:val="false"/>
         <w:spacing w:after="200" w:before="60"/>
         <w:jc w:val="center"/>
       </w:pPr>
@@ -33253,7 +33307,21 @@
         <w:rPr>
           <w:rFonts w:ascii="Times New Roman" w:cs="Times New Roman" w:eastAsia="Times New Roman" w:hAnsi="Times New Roman"/>
         </w:rPr>
-        <w:t xml:space="preserve"> Against E1 it is significantly faster at every rate (23.2 slots at matched) for a modest extra cost (6,884 lovelace); against E2 it is 40,500 lovelace cheaper for 35.8 more slots. Nothing dominates it at the light or matched rate. The ORACLE point sits almost on top of P2: a perfect next-block forecast is worth 1 slot at the matched rate and nothing measurable at the heavy rate — the fourth independent confirmation that forecasting congestion has little to offer on this chain.</w:t>
+        <w:t xml:space="preserve"> Against E1 it is significantly faster at every rate (23.2 slots at matched) for a modest extra cost (6,884 lovelace); against E2 it is 40,500 lovelace cheaper for 35.8 more slots. Nothing dominates it at the light or matched rate. The ORACLE point sits almost on top of P2: a perfect next-block forecast is worth 1 slot at the matched rate and nothing measurable at the heavy rate — the fourth independent confirmation that forecasting congestion has little to offer </w:t>
+      </w:r>
+      <w:r>
+        <w:rPr>
+          <w:rFonts w:ascii="Times New Roman" w:cs="Times New Roman" w:eastAsia="Times New Roman" w:hAnsi="Times New Roman"/>
+          <w:i/>
+          <w:iCs/>
+        </w:rPr>
+        <w:t xml:space="preserve">latency</w:t>
+      </w:r>
+      <w:r>
+        <w:rPr>
+          <w:rFonts w:ascii="Times New Roman" w:cs="Times New Roman" w:eastAsia="Times New Roman" w:hAnsi="Times New Roman"/>
+        </w:rPr>
+        <w:t xml:space="preserve"> on this chain. Ablation A2 (Section 8.10) shows where a forecast does matter: in how cheaply P2 can buy larger batches.</w:t>
       </w:r>
     </w:p>
     <w:p>
@@ -33270,6 +33338,7 @@
     </w:p>
     <w:p>
       <w:pPr>
+        <w:keepNext/>
         <w:spacing w:after="200" w:before="60"/>
         <w:jc w:val="center"/>
       </w:pPr>
@@ -34076,6 +34145,7 @@
     </w:p>
     <w:p>
       <w:pPr>
+        <w:keepNext w:val="false"/>
         <w:spacing w:after="200" w:before="60"/>
         <w:jc w:val="center"/>
       </w:pPr>
@@ -34183,6 +34253,7 @@
     </w:p>
     <w:p>
       <w:pPr>
+        <w:keepNext w:val="false"/>
         <w:spacing w:after="200" w:before="60"/>
         <w:jc w:val="center"/>
       </w:pPr>
@@ -34356,6 +34427,7 @@
     </w:p>
     <w:p>
       <w:pPr>
+        <w:keepNext w:val="false"/>
         <w:spacing w:after="200" w:before="60"/>
         <w:jc w:val="center"/>
       </w:pPr>
@@ -34464,6 +34536,7 @@
     </w:p>
     <w:p>
       <w:pPr>
+        <w:keepNext/>
         <w:spacing w:after="200" w:before="60"/>
         <w:jc w:val="center"/>
       </w:pPr>
@@ -35154,7 +35227,7 @@
         <w:pStyle w:val="Heading3"/>
       </w:pPr>
       <w:r>
-        <w:t xml:space="preserve">A2 — moving-average versus learned forecaster</w:t>
+        <w:t xml:space="preserve">A2 — naive versus learned forecaster, re-specified</w:t>
       </w:r>
     </w:p>
     <w:p>
@@ -35166,15 +35239,7 @@
         <w:rPr>
           <w:rFonts w:ascii="Times New Roman" w:cs="Times New Roman" w:eastAsia="Times New Roman" w:hAnsi="Times New Roman"/>
         </w:rPr>
-        <w:t xml:space="preserve">As specified, A2 is confounded. P2 driven by E4 is identical to greedy at every N_MIN, because a moving average is flat across the forecast horizon, so the “quieter block predicted” condition can never fire. A2 therefore compares a horizon-varying forecast with a flat one rather than a strong forecast with a weak one; answering the intended question needs a naive baseline that varies across the horizon. This is reported as an open item rather than reinterpreted.</w:t>
-      </w:r>
-    </w:p>
-    <w:p>
-      <w:pPr>
-        <w:pStyle w:val="Heading3"/>
-      </w:pPr>
-      <w:r>
-        <w:t xml:space="preserve">A3 and A4 — agent ablations</w:t>
+        <w:t xml:space="preserve">As first run, A2 was confounded. P2 driven by E4 was identical to greedy at every N_MIN, because a moving average is flat across the forecast horizon and the “quieter block predicted” condition compares equal numbers, so it never fires. That compared a flat forecast with a varying one, not a naive forecast with a learned one.</w:t>
       </w:r>
     </w:p>
     <w:p>
@@ -35186,7 +35251,7 @@
         <w:rPr>
           <w:rFonts w:ascii="Times New Roman" w:cs="Times New Roman" w:eastAsia="Times New Roman" w:hAnsi="Times New Roman"/>
         </w:rPr>
-        <w:t xml:space="preserve">Both ablations retrain five DQN seeds from scratch with the Phase 5 configuration — 200,000 steps, the same training windows and reward calibration — changing one thing each: </w:t>
+        <w:t xml:space="preserve">A2 was therefore re-specified with a second naive baseline, </w:t>
       </w:r>
       <w:r>
         <w:rPr>
@@ -35194,13 +35259,13 @@
           <w:b/>
           <w:bCs/>
         </w:rPr>
-        <w:t xml:space="preserve">A3</w:t>
-      </w:r>
-      <w:r>
-        <w:rPr>
-          <w:rFonts w:ascii="Times New Roman" w:cs="Times New Roman" w:eastAsia="Times New Roman" w:hAnsi="Times New Roman"/>
-        </w:rPr>
-        <w:t xml:space="preserve"> removes the forecast from the state (the three </w:t>
+        <w:t xml:space="preserve">E4b (mean-reverting)</w:t>
+      </w:r>
+      <w:r>
+        <w:rPr>
+          <w:rFonts w:ascii="Times New Roman" w:cs="Times New Roman" w:eastAsia="Times New Roman" w:hAnsi="Times New Roman"/>
+        </w:rPr>
+        <w:t xml:space="preserve">: </w:t>
       </w:r>
       <w:r>
         <w:rPr>
@@ -35208,31 +35273,32 @@
           <w:sz w:val="20"/>
           <w:szCs w:val="20"/>
         </w:rPr>
-        <w:t xml:space="preserve">fill_hat</w:t>
-      </w:r>
-      <w:r>
-        <w:rPr>
-          <w:rFonts w:ascii="Times New Roman" w:cs="Times New Roman" w:eastAsia="Times New Roman" w:hAnsi="Times New Roman"/>
-        </w:rPr>
-        <w:t xml:space="preserve"> inputs are constant zero), and </w:t>
-      </w:r>
-      <w:r>
-        <w:rPr>
-          <w:rFonts w:ascii="Times New Roman" w:cs="Times New Roman" w:eastAsia="Times New Roman" w:hAnsi="Times New Roman"/>
-          <w:b/>
-          <w:bCs/>
-        </w:rPr>
-        <w:t xml:space="preserve">A4</w:t>
-      </w:r>
-      <w:r>
-        <w:rPr>
-          <w:rFonts w:ascii="Times New Roman" w:cs="Times New Roman" w:eastAsia="Times New Roman" w:hAnsi="Times New Roman"/>
-        </w:rPr>
-        <w:t xml:space="preserve"> replaces the quadratic latency penalty with a linear one, recalibrated to unit scale. All ten agents are scored through the standard metric path on the same four validation episodes as Phase 5; the test split is not used again.</w:t>
-      </w:r>
-    </w:p>
-    <w:p>
-      <w:pPr>
+        <w:t xml:space="preserve">fill_hat(t+h) = m_t + φ^h · (fill_t − m_t)</w:t>
+      </w:r>
+      <w:r>
+        <w:rPr>
+          <w:rFonts w:ascii="Times New Roman" w:cs="Times New Roman" w:eastAsia="Times New Roman" w:hAnsi="Times New Roman"/>
+        </w:rPr>
+        <w:t xml:space="preserve">, where </w:t>
+      </w:r>
+      <w:r>
+        <w:rPr>
+          <w:rFonts w:ascii="Consolas" w:cs="Consolas" w:eastAsia="Consolas" w:hAnsi="Consolas"/>
+          <w:sz w:val="20"/>
+          <w:szCs w:val="20"/>
+        </w:rPr>
+        <w:t xml:space="preserve">m_t</w:t>
+      </w:r>
+      <w:r>
+        <w:rPr>
+          <w:rFonts w:ascii="Times New Roman" w:cs="Times New Roman" w:eastAsia="Times New Roman" w:hAnsi="Times New Roman"/>
+        </w:rPr>
+        <w:t xml:space="preserve"> is E4’s 20-block rolling mean and φ the lag-1 autocorrelation of the deviation from it, fitted on the training split. It is as naive as E4 — one fitted number — but varies across the horizon. The configuration was committed before the run, and it used the same 12 validation episodes at the matched rate as the original Phase 4 ablations.</w:t>
+      </w:r>
+    </w:p>
+    <w:p>
+      <w:pPr>
+        <w:keepNext/>
         <w:spacing w:after="200" w:before="60"/>
         <w:jc w:val="center"/>
       </w:pPr>
@@ -35245,6 +35311,2424 @@
           <w:szCs w:val="22"/>
         </w:rPr>
         <w:t xml:space="preserve">Table 8.11: </w:t>
+      </w:r>
+      <w:r>
+        <w:rPr>
+          <w:rFonts w:ascii="Times New Roman" w:cs="Times New Roman" w:eastAsia="Times New Roman" w:hAnsi="Times New Roman"/>
+          <w:i/>
+          <w:iCs/>
+          <w:sz w:val="22"/>
+          <w:szCs w:val="22"/>
+        </w:rPr>
+        <w:t xml:space="preserve">Forecasters on the validation split — whether each can make P2’s quieter-block branch fire</w:t>
+      </w:r>
+    </w:p>
+    <w:tbl>
+      <w:tblPr>
+        <w:tblW w:type="dxa" w:w="9026"/>
+        <w:tblBorders>
+          <w:top w:val="single" w:color="auto" w:sz="4"/>
+          <w:left w:val="single" w:color="auto" w:sz="4"/>
+          <w:bottom w:val="single" w:color="auto" w:sz="4"/>
+          <w:right w:val="single" w:color="auto" w:sz="4"/>
+          <w:insideH w:val="single" w:color="auto" w:sz="4"/>
+          <w:insideV w:val="single" w:color="auto" w:sz="4"/>
+        </w:tblBorders>
+      </w:tblPr>
+      <w:tblGrid>
+        <w:gridCol w:w="3309"/>
+        <w:gridCol w:w="1905"/>
+        <w:gridCol w:w="1905"/>
+        <w:gridCol w:w="1907"/>
+      </w:tblGrid>
+      <w:tr>
+        <w:trPr>
+          <w:tblHeader/>
+        </w:trPr>
+        <w:tc>
+          <w:tcPr>
+            <w:tcW w:type="dxa" w:w="3309"/>
+            <w:tcBorders>
+              <w:top w:val="single" w:color="808080" w:sz="4"/>
+              <w:left w:val="single" w:color="808080" w:sz="4"/>
+              <w:bottom w:val="single" w:color="808080" w:sz="4"/>
+              <w:right w:val="single" w:color="808080" w:sz="4"/>
+            </w:tcBorders>
+            <w:shd w:fill="D9E2F3" w:color="auto" w:val="clear"/>
+            <w:tcMar>
+              <w:top w:type="dxa" w:w="40"/>
+              <w:left w:type="dxa" w:w="80"/>
+              <w:bottom w:type="dxa" w:w="40"/>
+              <w:right w:type="dxa" w:w="80"/>
+            </w:tcMar>
+          </w:tcPr>
+          <w:p>
+            <w:pPr>
+              <w:spacing w:after="0"/>
+            </w:pPr>
+            <w:r>
+              <w:rPr>
+                <w:rFonts w:ascii="Times New Roman" w:cs="Times New Roman" w:eastAsia="Times New Roman" w:hAnsi="Times New Roman"/>
+                <w:b/>
+                <w:bCs/>
+                <w:sz w:val="20"/>
+                <w:szCs w:val="20"/>
+              </w:rPr>
+              <w:t xml:space="preserve">Forecaster</w:t>
+            </w:r>
+          </w:p>
+        </w:tc>
+        <w:tc>
+          <w:tcPr>
+            <w:tcW w:type="dxa" w:w="1905"/>
+            <w:tcBorders>
+              <w:top w:val="single" w:color="808080" w:sz="4"/>
+              <w:left w:val="single" w:color="808080" w:sz="4"/>
+              <w:bottom w:val="single" w:color="808080" w:sz="4"/>
+              <w:right w:val="single" w:color="808080" w:sz="4"/>
+            </w:tcBorders>
+            <w:shd w:fill="D9E2F3" w:color="auto" w:val="clear"/>
+            <w:tcMar>
+              <w:top w:type="dxa" w:w="40"/>
+              <w:left w:type="dxa" w:w="80"/>
+              <w:bottom w:type="dxa" w:w="40"/>
+              <w:right w:type="dxa" w:w="80"/>
+            </w:tcMar>
+          </w:tcPr>
+          <w:p>
+            <w:pPr>
+              <w:spacing w:after="0"/>
+            </w:pPr>
+            <w:r>
+              <w:rPr>
+                <w:rFonts w:ascii="Times New Roman" w:cs="Times New Roman" w:eastAsia="Times New Roman" w:hAnsi="Times New Roman"/>
+                <w:b/>
+                <w:bCs/>
+                <w:sz w:val="20"/>
+                <w:szCs w:val="20"/>
+              </w:rPr>
+              <w:t xml:space="preserve">Branch fires</w:t>
+            </w:r>
+          </w:p>
+        </w:tc>
+        <w:tc>
+          <w:tcPr>
+            <w:tcW w:type="dxa" w:w="1905"/>
+            <w:tcBorders>
+              <w:top w:val="single" w:color="808080" w:sz="4"/>
+              <w:left w:val="single" w:color="808080" w:sz="4"/>
+              <w:bottom w:val="single" w:color="808080" w:sz="4"/>
+              <w:right w:val="single" w:color="808080" w:sz="4"/>
+            </w:tcBorders>
+            <w:shd w:fill="D9E2F3" w:color="auto" w:val="clear"/>
+            <w:tcMar>
+              <w:top w:type="dxa" w:w="40"/>
+              <w:left w:type="dxa" w:w="80"/>
+              <w:bottom w:type="dxa" w:w="40"/>
+              <w:right w:type="dxa" w:w="80"/>
+            </w:tcMar>
+          </w:tcPr>
+          <w:p>
+            <w:pPr>
+              <w:spacing w:after="0"/>
+            </w:pPr>
+            <w:r>
+              <w:rPr>
+                <w:rFonts w:ascii="Times New Roman" w:cs="Times New Roman" w:eastAsia="Times New Roman" w:hAnsi="Times New Roman"/>
+                <w:b/>
+                <w:bCs/>
+                <w:sz w:val="20"/>
+                <w:szCs w:val="20"/>
+              </w:rPr>
+              <w:t xml:space="preserve">MAE t+1</w:t>
+            </w:r>
+          </w:p>
+        </w:tc>
+        <w:tc>
+          <w:tcPr>
+            <w:tcW w:type="dxa" w:w="1907"/>
+            <w:tcBorders>
+              <w:top w:val="single" w:color="808080" w:sz="4"/>
+              <w:left w:val="single" w:color="808080" w:sz="4"/>
+              <w:bottom w:val="single" w:color="808080" w:sz="4"/>
+              <w:right w:val="single" w:color="808080" w:sz="4"/>
+            </w:tcBorders>
+            <w:shd w:fill="D9E2F3" w:color="auto" w:val="clear"/>
+            <w:tcMar>
+              <w:top w:type="dxa" w:w="40"/>
+              <w:left w:type="dxa" w:w="80"/>
+              <w:bottom w:type="dxa" w:w="40"/>
+              <w:right w:type="dxa" w:w="80"/>
+            </w:tcMar>
+          </w:tcPr>
+          <w:p>
+            <w:pPr>
+              <w:spacing w:after="0"/>
+            </w:pPr>
+            <w:r>
+              <w:rPr>
+                <w:rFonts w:ascii="Times New Roman" w:cs="Times New Roman" w:eastAsia="Times New Roman" w:hAnsi="Times New Roman"/>
+                <w:b/>
+                <w:bCs/>
+                <w:sz w:val="20"/>
+                <w:szCs w:val="20"/>
+              </w:rPr>
+              <w:t xml:space="preserve">Directional accuracy</w:t>
+            </w:r>
+          </w:p>
+        </w:tc>
+      </w:tr>
+      <w:tr>
+        <w:tc>
+          <w:tcPr>
+            <w:tcW w:type="dxa" w:w="3309"/>
+            <w:tcBorders>
+              <w:top w:val="single" w:color="808080" w:sz="4"/>
+              <w:left w:val="single" w:color="808080" w:sz="4"/>
+              <w:bottom w:val="single" w:color="808080" w:sz="4"/>
+              <w:right w:val="single" w:color="808080" w:sz="4"/>
+            </w:tcBorders>
+            <w:tcMar>
+              <w:top w:type="dxa" w:w="40"/>
+              <w:left w:type="dxa" w:w="80"/>
+              <w:bottom w:type="dxa" w:w="40"/>
+              <w:right w:type="dxa" w:w="80"/>
+            </w:tcMar>
+          </w:tcPr>
+          <w:p>
+            <w:pPr>
+              <w:spacing w:after="0"/>
+            </w:pPr>
+            <w:r>
+              <w:rPr>
+                <w:rFonts w:ascii="Times New Roman" w:cs="Times New Roman" w:eastAsia="Times New Roman" w:hAnsi="Times New Roman"/>
+                <w:sz w:val="20"/>
+                <w:szCs w:val="20"/>
+              </w:rPr>
+              <w:t xml:space="preserve">E4 moving average (flat)</w:t>
+            </w:r>
+          </w:p>
+        </w:tc>
+        <w:tc>
+          <w:tcPr>
+            <w:tcW w:type="dxa" w:w="1905"/>
+            <w:tcBorders>
+              <w:top w:val="single" w:color="808080" w:sz="4"/>
+              <w:left w:val="single" w:color="808080" w:sz="4"/>
+              <w:bottom w:val="single" w:color="808080" w:sz="4"/>
+              <w:right w:val="single" w:color="808080" w:sz="4"/>
+            </w:tcBorders>
+            <w:tcMar>
+              <w:top w:type="dxa" w:w="40"/>
+              <w:left w:type="dxa" w:w="80"/>
+              <w:bottom w:type="dxa" w:w="40"/>
+              <w:right w:type="dxa" w:w="80"/>
+            </w:tcMar>
+          </w:tcPr>
+          <w:p>
+            <w:pPr>
+              <w:spacing w:after="0"/>
+            </w:pPr>
+            <w:r>
+              <w:rPr>
+                <w:rFonts w:ascii="Times New Roman" w:cs="Times New Roman" w:eastAsia="Times New Roman" w:hAnsi="Times New Roman"/>
+                <w:b/>
+                <w:bCs/>
+                <w:sz w:val="20"/>
+                <w:szCs w:val="20"/>
+              </w:rPr>
+              <w:t xml:space="preserve">0.0 %</w:t>
+            </w:r>
+          </w:p>
+        </w:tc>
+        <w:tc>
+          <w:tcPr>
+            <w:tcW w:type="dxa" w:w="1905"/>
+            <w:tcBorders>
+              <w:top w:val="single" w:color="808080" w:sz="4"/>
+              <w:left w:val="single" w:color="808080" w:sz="4"/>
+              <w:bottom w:val="single" w:color="808080" w:sz="4"/>
+              <w:right w:val="single" w:color="808080" w:sz="4"/>
+            </w:tcBorders>
+            <w:tcMar>
+              <w:top w:type="dxa" w:w="40"/>
+              <w:left w:type="dxa" w:w="80"/>
+              <w:bottom w:type="dxa" w:w="40"/>
+              <w:right w:type="dxa" w:w="80"/>
+            </w:tcMar>
+          </w:tcPr>
+          <w:p>
+            <w:pPr>
+              <w:spacing w:after="0"/>
+            </w:pPr>
+            <w:r>
+              <w:rPr>
+                <w:rFonts w:ascii="Times New Roman" w:cs="Times New Roman" w:eastAsia="Times New Roman" w:hAnsi="Times New Roman"/>
+                <w:sz w:val="20"/>
+                <w:szCs w:val="20"/>
+              </w:rPr>
+              <w:t xml:space="preserve">0.0586</w:t>
+            </w:r>
+          </w:p>
+        </w:tc>
+        <w:tc>
+          <w:tcPr>
+            <w:tcW w:type="dxa" w:w="1907"/>
+            <w:tcBorders>
+              <w:top w:val="single" w:color="808080" w:sz="4"/>
+              <w:left w:val="single" w:color="808080" w:sz="4"/>
+              <w:bottom w:val="single" w:color="808080" w:sz="4"/>
+              <w:right w:val="single" w:color="808080" w:sz="4"/>
+            </w:tcBorders>
+            <w:tcMar>
+              <w:top w:type="dxa" w:w="40"/>
+              <w:left w:type="dxa" w:w="80"/>
+              <w:bottom w:type="dxa" w:w="40"/>
+              <w:right w:type="dxa" w:w="80"/>
+            </w:tcMar>
+          </w:tcPr>
+          <w:p>
+            <w:pPr>
+              <w:spacing w:after="0"/>
+            </w:pPr>
+            <w:r>
+              <w:rPr>
+                <w:rFonts w:ascii="Times New Roman" w:cs="Times New Roman" w:eastAsia="Times New Roman" w:hAnsi="Times New Roman"/>
+                <w:sz w:val="20"/>
+                <w:szCs w:val="20"/>
+              </w:rPr>
+              <w:t xml:space="preserve">0.712</w:t>
+            </w:r>
+          </w:p>
+        </w:tc>
+      </w:tr>
+      <w:tr>
+        <w:tc>
+          <w:tcPr>
+            <w:tcW w:type="dxa" w:w="3309"/>
+            <w:tcBorders>
+              <w:top w:val="single" w:color="808080" w:sz="4"/>
+              <w:left w:val="single" w:color="808080" w:sz="4"/>
+              <w:bottom w:val="single" w:color="808080" w:sz="4"/>
+              <w:right w:val="single" w:color="808080" w:sz="4"/>
+            </w:tcBorders>
+            <w:tcMar>
+              <w:top w:type="dxa" w:w="40"/>
+              <w:left w:type="dxa" w:w="80"/>
+              <w:bottom w:type="dxa" w:w="40"/>
+              <w:right w:type="dxa" w:w="80"/>
+            </w:tcMar>
+          </w:tcPr>
+          <w:p>
+            <w:pPr>
+              <w:spacing w:after="0"/>
+            </w:pPr>
+            <w:r>
+              <w:rPr>
+                <w:rFonts w:ascii="Times New Roman" w:cs="Times New Roman" w:eastAsia="Times New Roman" w:hAnsi="Times New Roman"/>
+                <w:sz w:val="20"/>
+                <w:szCs w:val="20"/>
+              </w:rPr>
+              <w:t xml:space="preserve">E4b mean-reverting (φ = 0.084)</w:t>
+            </w:r>
+          </w:p>
+        </w:tc>
+        <w:tc>
+          <w:tcPr>
+            <w:tcW w:type="dxa" w:w="1905"/>
+            <w:tcBorders>
+              <w:top w:val="single" w:color="808080" w:sz="4"/>
+              <w:left w:val="single" w:color="808080" w:sz="4"/>
+              <w:bottom w:val="single" w:color="808080" w:sz="4"/>
+              <w:right w:val="single" w:color="808080" w:sz="4"/>
+            </w:tcBorders>
+            <w:tcMar>
+              <w:top w:type="dxa" w:w="40"/>
+              <w:left w:type="dxa" w:w="80"/>
+              <w:bottom w:type="dxa" w:w="40"/>
+              <w:right w:type="dxa" w:w="80"/>
+            </w:tcMar>
+          </w:tcPr>
+          <w:p>
+            <w:pPr>
+              <w:spacing w:after="0"/>
+            </w:pPr>
+            <w:r>
+              <w:rPr>
+                <w:rFonts w:ascii="Times New Roman" w:cs="Times New Roman" w:eastAsia="Times New Roman" w:hAnsi="Times New Roman"/>
+                <w:sz w:val="20"/>
+                <w:szCs w:val="20"/>
+              </w:rPr>
+              <w:t xml:space="preserve">36.2 %</w:t>
+            </w:r>
+          </w:p>
+        </w:tc>
+        <w:tc>
+          <w:tcPr>
+            <w:tcW w:type="dxa" w:w="1905"/>
+            <w:tcBorders>
+              <w:top w:val="single" w:color="808080" w:sz="4"/>
+              <w:left w:val="single" w:color="808080" w:sz="4"/>
+              <w:bottom w:val="single" w:color="808080" w:sz="4"/>
+              <w:right w:val="single" w:color="808080" w:sz="4"/>
+            </w:tcBorders>
+            <w:tcMar>
+              <w:top w:type="dxa" w:w="40"/>
+              <w:left w:type="dxa" w:w="80"/>
+              <w:bottom w:type="dxa" w:w="40"/>
+              <w:right w:type="dxa" w:w="80"/>
+            </w:tcMar>
+          </w:tcPr>
+          <w:p>
+            <w:pPr>
+              <w:spacing w:after="0"/>
+            </w:pPr>
+            <w:r>
+              <w:rPr>
+                <w:rFonts w:ascii="Times New Roman" w:cs="Times New Roman" w:eastAsia="Times New Roman" w:hAnsi="Times New Roman"/>
+                <w:sz w:val="20"/>
+                <w:szCs w:val="20"/>
+              </w:rPr>
+              <w:t xml:space="preserve">0.0582</w:t>
+            </w:r>
+          </w:p>
+        </w:tc>
+        <w:tc>
+          <w:tcPr>
+            <w:tcW w:type="dxa" w:w="1907"/>
+            <w:tcBorders>
+              <w:top w:val="single" w:color="808080" w:sz="4"/>
+              <w:left w:val="single" w:color="808080" w:sz="4"/>
+              <w:bottom w:val="single" w:color="808080" w:sz="4"/>
+              <w:right w:val="single" w:color="808080" w:sz="4"/>
+            </w:tcBorders>
+            <w:tcMar>
+              <w:top w:type="dxa" w:w="40"/>
+              <w:left w:type="dxa" w:w="80"/>
+              <w:bottom w:type="dxa" w:w="40"/>
+              <w:right w:type="dxa" w:w="80"/>
+            </w:tcMar>
+          </w:tcPr>
+          <w:p>
+            <w:pPr>
+              <w:spacing w:after="0"/>
+            </w:pPr>
+            <w:r>
+              <w:rPr>
+                <w:rFonts w:ascii="Times New Roman" w:cs="Times New Roman" w:eastAsia="Times New Roman" w:hAnsi="Times New Roman"/>
+                <w:sz w:val="20"/>
+                <w:szCs w:val="20"/>
+              </w:rPr>
+              <w:t xml:space="preserve">0.712</w:t>
+            </w:r>
+          </w:p>
+        </w:tc>
+      </w:tr>
+      <w:tr>
+        <w:tc>
+          <w:tcPr>
+            <w:tcW w:type="dxa" w:w="3309"/>
+            <w:tcBorders>
+              <w:top w:val="single" w:color="808080" w:sz="4"/>
+              <w:left w:val="single" w:color="808080" w:sz="4"/>
+              <w:bottom w:val="single" w:color="808080" w:sz="4"/>
+              <w:right w:val="single" w:color="808080" w:sz="4"/>
+            </w:tcBorders>
+            <w:tcMar>
+              <w:top w:type="dxa" w:w="40"/>
+              <w:left w:type="dxa" w:w="80"/>
+              <w:bottom w:type="dxa" w:w="40"/>
+              <w:right w:type="dxa" w:w="80"/>
+            </w:tcMar>
+          </w:tcPr>
+          <w:p>
+            <w:pPr>
+              <w:spacing w:after="0"/>
+            </w:pPr>
+            <w:r>
+              <w:rPr>
+                <w:rFonts w:ascii="Times New Roman" w:cs="Times New Roman" w:eastAsia="Times New Roman" w:hAnsi="Times New Roman"/>
+                <w:sz w:val="20"/>
+                <w:szCs w:val="20"/>
+              </w:rPr>
+              <w:t xml:space="preserve">P1 LightGBM</w:t>
+            </w:r>
+          </w:p>
+        </w:tc>
+        <w:tc>
+          <w:tcPr>
+            <w:tcW w:type="dxa" w:w="1905"/>
+            <w:tcBorders>
+              <w:top w:val="single" w:color="808080" w:sz="4"/>
+              <w:left w:val="single" w:color="808080" w:sz="4"/>
+              <w:bottom w:val="single" w:color="808080" w:sz="4"/>
+              <w:right w:val="single" w:color="808080" w:sz="4"/>
+            </w:tcBorders>
+            <w:tcMar>
+              <w:top w:type="dxa" w:w="40"/>
+              <w:left w:type="dxa" w:w="80"/>
+              <w:bottom w:type="dxa" w:w="40"/>
+              <w:right w:type="dxa" w:w="80"/>
+            </w:tcMar>
+          </w:tcPr>
+          <w:p>
+            <w:pPr>
+              <w:spacing w:after="0"/>
+            </w:pPr>
+            <w:r>
+              <w:rPr>
+                <w:rFonts w:ascii="Times New Roman" w:cs="Times New Roman" w:eastAsia="Times New Roman" w:hAnsi="Times New Roman"/>
+                <w:sz w:val="20"/>
+                <w:szCs w:val="20"/>
+              </w:rPr>
+              <w:t xml:space="preserve">67.4 %</w:t>
+            </w:r>
+          </w:p>
+        </w:tc>
+        <w:tc>
+          <w:tcPr>
+            <w:tcW w:type="dxa" w:w="1905"/>
+            <w:tcBorders>
+              <w:top w:val="single" w:color="808080" w:sz="4"/>
+              <w:left w:val="single" w:color="808080" w:sz="4"/>
+              <w:bottom w:val="single" w:color="808080" w:sz="4"/>
+              <w:right w:val="single" w:color="808080" w:sz="4"/>
+            </w:tcBorders>
+            <w:tcMar>
+              <w:top w:type="dxa" w:w="40"/>
+              <w:left w:type="dxa" w:w="80"/>
+              <w:bottom w:type="dxa" w:w="40"/>
+              <w:right w:type="dxa" w:w="80"/>
+            </w:tcMar>
+          </w:tcPr>
+          <w:p>
+            <w:pPr>
+              <w:spacing w:after="0"/>
+            </w:pPr>
+            <w:r>
+              <w:rPr>
+                <w:rFonts w:ascii="Times New Roman" w:cs="Times New Roman" w:eastAsia="Times New Roman" w:hAnsi="Times New Roman"/>
+                <w:b/>
+                <w:bCs/>
+                <w:sz w:val="20"/>
+                <w:szCs w:val="20"/>
+              </w:rPr>
+              <w:t xml:space="preserve">0.0530</w:t>
+            </w:r>
+          </w:p>
+        </w:tc>
+        <w:tc>
+          <w:tcPr>
+            <w:tcW w:type="dxa" w:w="1907"/>
+            <w:tcBorders>
+              <w:top w:val="single" w:color="808080" w:sz="4"/>
+              <w:left w:val="single" w:color="808080" w:sz="4"/>
+              <w:bottom w:val="single" w:color="808080" w:sz="4"/>
+              <w:right w:val="single" w:color="808080" w:sz="4"/>
+            </w:tcBorders>
+            <w:tcMar>
+              <w:top w:type="dxa" w:w="40"/>
+              <w:left w:type="dxa" w:w="80"/>
+              <w:bottom w:type="dxa" w:w="40"/>
+              <w:right w:type="dxa" w:w="80"/>
+            </w:tcMar>
+          </w:tcPr>
+          <w:p>
+            <w:pPr>
+              <w:spacing w:after="0"/>
+            </w:pPr>
+            <w:r>
+              <w:rPr>
+                <w:rFonts w:ascii="Times New Roman" w:cs="Times New Roman" w:eastAsia="Times New Roman" w:hAnsi="Times New Roman"/>
+                <w:b/>
+                <w:bCs/>
+                <w:sz w:val="20"/>
+                <w:szCs w:val="20"/>
+              </w:rPr>
+              <w:t xml:space="preserve">0.740</w:t>
+            </w:r>
+          </w:p>
+        </w:tc>
+      </w:tr>
+      <w:tr>
+        <w:tc>
+          <w:tcPr>
+            <w:tcW w:type="dxa" w:w="3309"/>
+            <w:tcBorders>
+              <w:top w:val="single" w:color="808080" w:sz="4"/>
+              <w:left w:val="single" w:color="808080" w:sz="4"/>
+              <w:bottom w:val="single" w:color="808080" w:sz="4"/>
+              <w:right w:val="single" w:color="808080" w:sz="4"/>
+            </w:tcBorders>
+            <w:tcMar>
+              <w:top w:type="dxa" w:w="40"/>
+              <w:left w:type="dxa" w:w="80"/>
+              <w:bottom w:type="dxa" w:w="40"/>
+              <w:right w:type="dxa" w:w="80"/>
+            </w:tcMar>
+          </w:tcPr>
+          <w:p>
+            <w:pPr>
+              <w:spacing w:after="0"/>
+            </w:pPr>
+            <w:r>
+              <w:rPr>
+                <w:rFonts w:ascii="Times New Roman" w:cs="Times New Roman" w:eastAsia="Times New Roman" w:hAnsi="Times New Roman"/>
+                <w:sz w:val="20"/>
+                <w:szCs w:val="20"/>
+              </w:rPr>
+              <w:t xml:space="preserve">ORACLE</w:t>
+            </w:r>
+          </w:p>
+        </w:tc>
+        <w:tc>
+          <w:tcPr>
+            <w:tcW w:type="dxa" w:w="1905"/>
+            <w:tcBorders>
+              <w:top w:val="single" w:color="808080" w:sz="4"/>
+              <w:left w:val="single" w:color="808080" w:sz="4"/>
+              <w:bottom w:val="single" w:color="808080" w:sz="4"/>
+              <w:right w:val="single" w:color="808080" w:sz="4"/>
+            </w:tcBorders>
+            <w:tcMar>
+              <w:top w:type="dxa" w:w="40"/>
+              <w:left w:type="dxa" w:w="80"/>
+              <w:bottom w:type="dxa" w:w="40"/>
+              <w:right w:type="dxa" w:w="80"/>
+            </w:tcMar>
+          </w:tcPr>
+          <w:p>
+            <w:pPr>
+              <w:spacing w:after="0"/>
+            </w:pPr>
+            <w:r>
+              <w:rPr>
+                <w:rFonts w:ascii="Times New Roman" w:cs="Times New Roman" w:eastAsia="Times New Roman" w:hAnsi="Times New Roman"/>
+                <w:sz w:val="20"/>
+                <w:szCs w:val="20"/>
+              </w:rPr>
+              <w:t xml:space="preserve">64.7 %</w:t>
+            </w:r>
+          </w:p>
+        </w:tc>
+        <w:tc>
+          <w:tcPr>
+            <w:tcW w:type="dxa" w:w="1905"/>
+            <w:tcBorders>
+              <w:top w:val="single" w:color="808080" w:sz="4"/>
+              <w:left w:val="single" w:color="808080" w:sz="4"/>
+              <w:bottom w:val="single" w:color="808080" w:sz="4"/>
+              <w:right w:val="single" w:color="808080" w:sz="4"/>
+            </w:tcBorders>
+            <w:tcMar>
+              <w:top w:type="dxa" w:w="40"/>
+              <w:left w:type="dxa" w:w="80"/>
+              <w:bottom w:type="dxa" w:w="40"/>
+              <w:right w:type="dxa" w:w="80"/>
+            </w:tcMar>
+          </w:tcPr>
+          <w:p>
+            <w:pPr>
+              <w:spacing w:after="0"/>
+            </w:pPr>
+            <w:r>
+              <w:rPr>
+                <w:rFonts w:ascii="Times New Roman" w:cs="Times New Roman" w:eastAsia="Times New Roman" w:hAnsi="Times New Roman"/>
+                <w:sz w:val="20"/>
+                <w:szCs w:val="20"/>
+              </w:rPr>
+              <w:t xml:space="preserve">0</w:t>
+            </w:r>
+          </w:p>
+        </w:tc>
+        <w:tc>
+          <w:tcPr>
+            <w:tcW w:type="dxa" w:w="1907"/>
+            <w:tcBorders>
+              <w:top w:val="single" w:color="808080" w:sz="4"/>
+              <w:left w:val="single" w:color="808080" w:sz="4"/>
+              <w:bottom w:val="single" w:color="808080" w:sz="4"/>
+              <w:right w:val="single" w:color="808080" w:sz="4"/>
+            </w:tcBorders>
+            <w:tcMar>
+              <w:top w:type="dxa" w:w="40"/>
+              <w:left w:type="dxa" w:w="80"/>
+              <w:bottom w:type="dxa" w:w="40"/>
+              <w:right w:type="dxa" w:w="80"/>
+            </w:tcMar>
+          </w:tcPr>
+          <w:p>
+            <w:pPr>
+              <w:spacing w:after="0"/>
+            </w:pPr>
+            <w:r>
+              <w:rPr>
+                <w:rFonts w:ascii="Times New Roman" w:cs="Times New Roman" w:eastAsia="Times New Roman" w:hAnsi="Times New Roman"/>
+                <w:sz w:val="20"/>
+                <w:szCs w:val="20"/>
+              </w:rPr>
+              <w:t xml:space="preserve">1.000</w:t>
+            </w:r>
+          </w:p>
+        </w:tc>
+      </w:tr>
+    </w:tbl>
+    <w:p>
+      <w:pPr>
+        <w:spacing w:after="160"/>
+      </w:pPr>
+    </w:p>
+    <w:p>
+      <w:pPr>
+        <w:spacing w:after="120" w:line="336"/>
+        <w:jc w:val="both"/>
+      </w:pPr>
+      <w:r>
+        <w:rPr>
+          <w:rFonts w:ascii="Times New Roman" w:cs="Times New Roman" w:eastAsia="Times New Roman" w:hAnsi="Times New Roman"/>
+        </w:rPr>
+        <w:t xml:space="preserve">The zero for E4 confirms the confound directly. The fitted φ is small — deviations from the recent level barely persist — so E4b’s forecasts stay close to the level, but they still vary enough for the branch to fire on about a third of blocks.</w:t>
+      </w:r>
+    </w:p>
+    <w:p>
+      <w:pPr>
+        <w:keepNext/>
+        <w:spacing w:after="200" w:before="60"/>
+        <w:jc w:val="center"/>
+      </w:pPr>
+      <w:r>
+        <w:rPr>
+          <w:rFonts w:ascii="Times New Roman" w:cs="Times New Roman" w:eastAsia="Times New Roman" w:hAnsi="Times New Roman"/>
+          <w:b/>
+          <w:bCs/>
+          <w:sz w:val="22"/>
+          <w:szCs w:val="22"/>
+        </w:rPr>
+        <w:t xml:space="preserve">Table 8.12: </w:t>
+      </w:r>
+      <w:r>
+        <w:rPr>
+          <w:rFonts w:ascii="Times New Roman" w:cs="Times New Roman" w:eastAsia="Times New Roman" w:hAnsi="Times New Roman"/>
+          <w:i/>
+          <w:iCs/>
+          <w:sz w:val="22"/>
+          <w:szCs w:val="22"/>
+        </w:rPr>
+        <w:t xml:space="preserve">P2 by forecaster across N_MIN — median over 12 paired validation episodes (L-p95 slots / C-user lovelace)</w:t>
+      </w:r>
+    </w:p>
+    <w:tbl>
+      <w:tblPr>
+        <w:tblW w:type="dxa" w:w="9026"/>
+        <w:tblBorders>
+          <w:top w:val="single" w:color="auto" w:sz="4"/>
+          <w:left w:val="single" w:color="auto" w:sz="4"/>
+          <w:bottom w:val="single" w:color="auto" w:sz="4"/>
+          <w:right w:val="single" w:color="auto" w:sz="4"/>
+          <w:insideH w:val="single" w:color="auto" w:sz="4"/>
+          <w:insideV w:val="single" w:color="auto" w:sz="4"/>
+        </w:tblBorders>
+      </w:tblPr>
+      <w:tblGrid>
+        <w:gridCol w:w="1002"/>
+        <w:gridCol w:w="2005"/>
+        <w:gridCol w:w="2005"/>
+        <w:gridCol w:w="2005"/>
+        <w:gridCol w:w="2009"/>
+      </w:tblGrid>
+      <w:tr>
+        <w:trPr>
+          <w:tblHeader/>
+        </w:trPr>
+        <w:tc>
+          <w:tcPr>
+            <w:tcW w:type="dxa" w:w="1002"/>
+            <w:tcBorders>
+              <w:top w:val="single" w:color="808080" w:sz="4"/>
+              <w:left w:val="single" w:color="808080" w:sz="4"/>
+              <w:bottom w:val="single" w:color="808080" w:sz="4"/>
+              <w:right w:val="single" w:color="808080" w:sz="4"/>
+            </w:tcBorders>
+            <w:shd w:fill="D9E2F3" w:color="auto" w:val="clear"/>
+            <w:tcMar>
+              <w:top w:type="dxa" w:w="40"/>
+              <w:left w:type="dxa" w:w="80"/>
+              <w:bottom w:type="dxa" w:w="40"/>
+              <w:right w:type="dxa" w:w="80"/>
+            </w:tcMar>
+          </w:tcPr>
+          <w:p>
+            <w:pPr>
+              <w:spacing w:after="0"/>
+            </w:pPr>
+            <w:r>
+              <w:rPr>
+                <w:rFonts w:ascii="Times New Roman" w:cs="Times New Roman" w:eastAsia="Times New Roman" w:hAnsi="Times New Roman"/>
+                <w:b/>
+                <w:bCs/>
+                <w:sz w:val="20"/>
+                <w:szCs w:val="20"/>
+              </w:rPr>
+              <w:t xml:space="preserve">N_MIN</w:t>
+            </w:r>
+          </w:p>
+        </w:tc>
+        <w:tc>
+          <w:tcPr>
+            <w:tcW w:type="dxa" w:w="2005"/>
+            <w:tcBorders>
+              <w:top w:val="single" w:color="808080" w:sz="4"/>
+              <w:left w:val="single" w:color="808080" w:sz="4"/>
+              <w:bottom w:val="single" w:color="808080" w:sz="4"/>
+              <w:right w:val="single" w:color="808080" w:sz="4"/>
+            </w:tcBorders>
+            <w:shd w:fill="D9E2F3" w:color="auto" w:val="clear"/>
+            <w:tcMar>
+              <w:top w:type="dxa" w:w="40"/>
+              <w:left w:type="dxa" w:w="80"/>
+              <w:bottom w:type="dxa" w:w="40"/>
+              <w:right w:type="dxa" w:w="80"/>
+            </w:tcMar>
+          </w:tcPr>
+          <w:p>
+            <w:pPr>
+              <w:spacing w:after="0"/>
+            </w:pPr>
+            <w:r>
+              <w:rPr>
+                <w:rFonts w:ascii="Times New Roman" w:cs="Times New Roman" w:eastAsia="Times New Roman" w:hAnsi="Times New Roman"/>
+                <w:b/>
+                <w:bCs/>
+                <w:sz w:val="20"/>
+                <w:szCs w:val="20"/>
+              </w:rPr>
+              <w:t xml:space="preserve">E4b naive</w:t>
+            </w:r>
+          </w:p>
+        </w:tc>
+        <w:tc>
+          <w:tcPr>
+            <w:tcW w:type="dxa" w:w="2005"/>
+            <w:tcBorders>
+              <w:top w:val="single" w:color="808080" w:sz="4"/>
+              <w:left w:val="single" w:color="808080" w:sz="4"/>
+              <w:bottom w:val="single" w:color="808080" w:sz="4"/>
+              <w:right w:val="single" w:color="808080" w:sz="4"/>
+            </w:tcBorders>
+            <w:shd w:fill="D9E2F3" w:color="auto" w:val="clear"/>
+            <w:tcMar>
+              <w:top w:type="dxa" w:w="40"/>
+              <w:left w:type="dxa" w:w="80"/>
+              <w:bottom w:type="dxa" w:w="40"/>
+              <w:right w:type="dxa" w:w="80"/>
+            </w:tcMar>
+          </w:tcPr>
+          <w:p>
+            <w:pPr>
+              <w:spacing w:after="0"/>
+            </w:pPr>
+            <w:r>
+              <w:rPr>
+                <w:rFonts w:ascii="Times New Roman" w:cs="Times New Roman" w:eastAsia="Times New Roman" w:hAnsi="Times New Roman"/>
+                <w:b/>
+                <w:bCs/>
+                <w:sz w:val="20"/>
+                <w:szCs w:val="20"/>
+              </w:rPr>
+              <w:t xml:space="preserve">P1 LightGBM</w:t>
+            </w:r>
+          </w:p>
+        </w:tc>
+        <w:tc>
+          <w:tcPr>
+            <w:tcW w:type="dxa" w:w="2005"/>
+            <w:tcBorders>
+              <w:top w:val="single" w:color="808080" w:sz="4"/>
+              <w:left w:val="single" w:color="808080" w:sz="4"/>
+              <w:bottom w:val="single" w:color="808080" w:sz="4"/>
+              <w:right w:val="single" w:color="808080" w:sz="4"/>
+            </w:tcBorders>
+            <w:shd w:fill="D9E2F3" w:color="auto" w:val="clear"/>
+            <w:tcMar>
+              <w:top w:type="dxa" w:w="40"/>
+              <w:left w:type="dxa" w:w="80"/>
+              <w:bottom w:type="dxa" w:w="40"/>
+              <w:right w:type="dxa" w:w="80"/>
+            </w:tcMar>
+          </w:tcPr>
+          <w:p>
+            <w:pPr>
+              <w:spacing w:after="0"/>
+            </w:pPr>
+            <w:r>
+              <w:rPr>
+                <w:rFonts w:ascii="Times New Roman" w:cs="Times New Roman" w:eastAsia="Times New Roman" w:hAnsi="Times New Roman"/>
+                <w:b/>
+                <w:bCs/>
+                <w:sz w:val="20"/>
+                <w:szCs w:val="20"/>
+              </w:rPr>
+              <w:t xml:space="preserve">ORACLE</w:t>
+            </w:r>
+          </w:p>
+        </w:tc>
+        <w:tc>
+          <w:tcPr>
+            <w:tcW w:type="dxa" w:w="2009"/>
+            <w:tcBorders>
+              <w:top w:val="single" w:color="808080" w:sz="4"/>
+              <w:left w:val="single" w:color="808080" w:sz="4"/>
+              <w:bottom w:val="single" w:color="808080" w:sz="4"/>
+              <w:right w:val="single" w:color="808080" w:sz="4"/>
+            </w:tcBorders>
+            <w:shd w:fill="D9E2F3" w:color="auto" w:val="clear"/>
+            <w:tcMar>
+              <w:top w:type="dxa" w:w="40"/>
+              <w:left w:type="dxa" w:w="80"/>
+              <w:bottom w:type="dxa" w:w="40"/>
+              <w:right w:type="dxa" w:w="80"/>
+            </w:tcMar>
+          </w:tcPr>
+          <w:p>
+            <w:pPr>
+              <w:spacing w:after="0"/>
+            </w:pPr>
+            <w:r>
+              <w:rPr>
+                <w:rFonts w:ascii="Times New Roman" w:cs="Times New Roman" w:eastAsia="Times New Roman" w:hAnsi="Times New Roman"/>
+                <w:b/>
+                <w:bCs/>
+                <w:sz w:val="20"/>
+                <w:szCs w:val="20"/>
+              </w:rPr>
+              <w:t xml:space="preserve">E4 flat</w:t>
+            </w:r>
+          </w:p>
+        </w:tc>
+      </w:tr>
+      <w:tr>
+        <w:tc>
+          <w:tcPr>
+            <w:tcW w:type="dxa" w:w="1002"/>
+            <w:tcBorders>
+              <w:top w:val="single" w:color="808080" w:sz="4"/>
+              <w:left w:val="single" w:color="808080" w:sz="4"/>
+              <w:bottom w:val="single" w:color="808080" w:sz="4"/>
+              <w:right w:val="single" w:color="808080" w:sz="4"/>
+            </w:tcBorders>
+            <w:tcMar>
+              <w:top w:type="dxa" w:w="40"/>
+              <w:left w:type="dxa" w:w="80"/>
+              <w:bottom w:type="dxa" w:w="40"/>
+              <w:right w:type="dxa" w:w="80"/>
+            </w:tcMar>
+          </w:tcPr>
+          <w:p>
+            <w:pPr>
+              <w:spacing w:after="0"/>
+            </w:pPr>
+            <w:r>
+              <w:rPr>
+                <w:rFonts w:ascii="Times New Roman" w:cs="Times New Roman" w:eastAsia="Times New Roman" w:hAnsi="Times New Roman"/>
+                <w:sz w:val="20"/>
+                <w:szCs w:val="20"/>
+              </w:rPr>
+              <w:t xml:space="preserve">1</w:t>
+            </w:r>
+          </w:p>
+        </w:tc>
+        <w:tc>
+          <w:tcPr>
+            <w:tcW w:type="dxa" w:w="2005"/>
+            <w:tcBorders>
+              <w:top w:val="single" w:color="808080" w:sz="4"/>
+              <w:left w:val="single" w:color="808080" w:sz="4"/>
+              <w:bottom w:val="single" w:color="808080" w:sz="4"/>
+              <w:right w:val="single" w:color="808080" w:sz="4"/>
+            </w:tcBorders>
+            <w:tcMar>
+              <w:top w:type="dxa" w:w="40"/>
+              <w:left w:type="dxa" w:w="80"/>
+              <w:bottom w:type="dxa" w:w="40"/>
+              <w:right w:type="dxa" w:w="80"/>
+            </w:tcMar>
+          </w:tcPr>
+          <w:p>
+            <w:pPr>
+              <w:spacing w:after="0"/>
+            </w:pPr>
+            <w:r>
+              <w:rPr>
+                <w:rFonts w:ascii="Times New Roman" w:cs="Times New Roman" w:eastAsia="Times New Roman" w:hAnsi="Times New Roman"/>
+                <w:sz w:val="20"/>
+                <w:szCs w:val="20"/>
+              </w:rPr>
+              <w:t xml:space="preserve">120.5 / 151,557</w:t>
+            </w:r>
+          </w:p>
+        </w:tc>
+        <w:tc>
+          <w:tcPr>
+            <w:tcW w:type="dxa" w:w="2005"/>
+            <w:tcBorders>
+              <w:top w:val="single" w:color="808080" w:sz="4"/>
+              <w:left w:val="single" w:color="808080" w:sz="4"/>
+              <w:bottom w:val="single" w:color="808080" w:sz="4"/>
+              <w:right w:val="single" w:color="808080" w:sz="4"/>
+            </w:tcBorders>
+            <w:tcMar>
+              <w:top w:type="dxa" w:w="40"/>
+              <w:left w:type="dxa" w:w="80"/>
+              <w:bottom w:type="dxa" w:w="40"/>
+              <w:right w:type="dxa" w:w="80"/>
+            </w:tcMar>
+          </w:tcPr>
+          <w:p>
+            <w:pPr>
+              <w:spacing w:after="0"/>
+            </w:pPr>
+            <w:r>
+              <w:rPr>
+                <w:rFonts w:ascii="Times New Roman" w:cs="Times New Roman" w:eastAsia="Times New Roman" w:hAnsi="Times New Roman"/>
+                <w:sz w:val="20"/>
+                <w:szCs w:val="20"/>
+              </w:rPr>
+              <w:t xml:space="preserve">120.5 / 151,557</w:t>
+            </w:r>
+          </w:p>
+        </w:tc>
+        <w:tc>
+          <w:tcPr>
+            <w:tcW w:type="dxa" w:w="2005"/>
+            <w:tcBorders>
+              <w:top w:val="single" w:color="808080" w:sz="4"/>
+              <w:left w:val="single" w:color="808080" w:sz="4"/>
+              <w:bottom w:val="single" w:color="808080" w:sz="4"/>
+              <w:right w:val="single" w:color="808080" w:sz="4"/>
+            </w:tcBorders>
+            <w:tcMar>
+              <w:top w:type="dxa" w:w="40"/>
+              <w:left w:type="dxa" w:w="80"/>
+              <w:bottom w:type="dxa" w:w="40"/>
+              <w:right w:type="dxa" w:w="80"/>
+            </w:tcMar>
+          </w:tcPr>
+          <w:p>
+            <w:pPr>
+              <w:spacing w:after="0"/>
+            </w:pPr>
+            <w:r>
+              <w:rPr>
+                <w:rFonts w:ascii="Times New Roman" w:cs="Times New Roman" w:eastAsia="Times New Roman" w:hAnsi="Times New Roman"/>
+                <w:sz w:val="20"/>
+                <w:szCs w:val="20"/>
+              </w:rPr>
+              <w:t xml:space="preserve">120.0 / 151,557</w:t>
+            </w:r>
+          </w:p>
+        </w:tc>
+        <w:tc>
+          <w:tcPr>
+            <w:tcW w:type="dxa" w:w="2009"/>
+            <w:tcBorders>
+              <w:top w:val="single" w:color="808080" w:sz="4"/>
+              <w:left w:val="single" w:color="808080" w:sz="4"/>
+              <w:bottom w:val="single" w:color="808080" w:sz="4"/>
+              <w:right w:val="single" w:color="808080" w:sz="4"/>
+            </w:tcBorders>
+            <w:tcMar>
+              <w:top w:type="dxa" w:w="40"/>
+              <w:left w:type="dxa" w:w="80"/>
+              <w:bottom w:type="dxa" w:w="40"/>
+              <w:right w:type="dxa" w:w="80"/>
+            </w:tcMar>
+          </w:tcPr>
+          <w:p>
+            <w:pPr>
+              <w:spacing w:after="0"/>
+            </w:pPr>
+            <w:r>
+              <w:rPr>
+                <w:rFonts w:ascii="Times New Roman" w:cs="Times New Roman" w:eastAsia="Times New Roman" w:hAnsi="Times New Roman"/>
+                <w:sz w:val="20"/>
+                <w:szCs w:val="20"/>
+              </w:rPr>
+              <w:t xml:space="preserve">120.5 / 151,557</w:t>
+            </w:r>
+          </w:p>
+        </w:tc>
+      </w:tr>
+      <w:tr>
+        <w:tc>
+          <w:tcPr>
+            <w:tcW w:type="dxa" w:w="1002"/>
+            <w:tcBorders>
+              <w:top w:val="single" w:color="808080" w:sz="4"/>
+              <w:left w:val="single" w:color="808080" w:sz="4"/>
+              <w:bottom w:val="single" w:color="808080" w:sz="4"/>
+              <w:right w:val="single" w:color="808080" w:sz="4"/>
+            </w:tcBorders>
+            <w:tcMar>
+              <w:top w:type="dxa" w:w="40"/>
+              <w:left w:type="dxa" w:w="80"/>
+              <w:bottom w:type="dxa" w:w="40"/>
+              <w:right w:type="dxa" w:w="80"/>
+            </w:tcMar>
+          </w:tcPr>
+          <w:p>
+            <w:pPr>
+              <w:spacing w:after="0"/>
+            </w:pPr>
+            <w:r>
+              <w:rPr>
+                <w:rFonts w:ascii="Times New Roman" w:cs="Times New Roman" w:eastAsia="Times New Roman" w:hAnsi="Times New Roman"/>
+                <w:sz w:val="20"/>
+                <w:szCs w:val="20"/>
+              </w:rPr>
+              <w:t xml:space="preserve">4</w:t>
+            </w:r>
+          </w:p>
+        </w:tc>
+        <w:tc>
+          <w:tcPr>
+            <w:tcW w:type="dxa" w:w="2005"/>
+            <w:tcBorders>
+              <w:top w:val="single" w:color="808080" w:sz="4"/>
+              <w:left w:val="single" w:color="808080" w:sz="4"/>
+              <w:bottom w:val="single" w:color="808080" w:sz="4"/>
+              <w:right w:val="single" w:color="808080" w:sz="4"/>
+            </w:tcBorders>
+            <w:tcMar>
+              <w:top w:type="dxa" w:w="40"/>
+              <w:left w:type="dxa" w:w="80"/>
+              <w:bottom w:type="dxa" w:w="40"/>
+              <w:right w:type="dxa" w:w="80"/>
+            </w:tcMar>
+          </w:tcPr>
+          <w:p>
+            <w:pPr>
+              <w:spacing w:after="0"/>
+            </w:pPr>
+            <w:r>
+              <w:rPr>
+                <w:rFonts w:ascii="Times New Roman" w:cs="Times New Roman" w:eastAsia="Times New Roman" w:hAnsi="Times New Roman"/>
+                <w:sz w:val="20"/>
+                <w:szCs w:val="20"/>
+              </w:rPr>
+              <w:t xml:space="preserve">123.5 / 137,596</w:t>
+            </w:r>
+          </w:p>
+        </w:tc>
+        <w:tc>
+          <w:tcPr>
+            <w:tcW w:type="dxa" w:w="2005"/>
+            <w:tcBorders>
+              <w:top w:val="single" w:color="808080" w:sz="4"/>
+              <w:left w:val="single" w:color="808080" w:sz="4"/>
+              <w:bottom w:val="single" w:color="808080" w:sz="4"/>
+              <w:right w:val="single" w:color="808080" w:sz="4"/>
+            </w:tcBorders>
+            <w:tcMar>
+              <w:top w:type="dxa" w:w="40"/>
+              <w:left w:type="dxa" w:w="80"/>
+              <w:bottom w:type="dxa" w:w="40"/>
+              <w:right w:type="dxa" w:w="80"/>
+            </w:tcMar>
+          </w:tcPr>
+          <w:p>
+            <w:pPr>
+              <w:spacing w:after="0"/>
+            </w:pPr>
+            <w:r>
+              <w:rPr>
+                <w:rFonts w:ascii="Times New Roman" w:cs="Times New Roman" w:eastAsia="Times New Roman" w:hAnsi="Times New Roman"/>
+                <w:sz w:val="20"/>
+                <w:szCs w:val="20"/>
+              </w:rPr>
+              <w:t xml:space="preserve">127.0 / 120,945</w:t>
+            </w:r>
+          </w:p>
+        </w:tc>
+        <w:tc>
+          <w:tcPr>
+            <w:tcW w:type="dxa" w:w="2005"/>
+            <w:tcBorders>
+              <w:top w:val="single" w:color="808080" w:sz="4"/>
+              <w:left w:val="single" w:color="808080" w:sz="4"/>
+              <w:bottom w:val="single" w:color="808080" w:sz="4"/>
+              <w:right w:val="single" w:color="808080" w:sz="4"/>
+            </w:tcBorders>
+            <w:tcMar>
+              <w:top w:type="dxa" w:w="40"/>
+              <w:left w:type="dxa" w:w="80"/>
+              <w:bottom w:type="dxa" w:w="40"/>
+              <w:right w:type="dxa" w:w="80"/>
+            </w:tcMar>
+          </w:tcPr>
+          <w:p>
+            <w:pPr>
+              <w:spacing w:after="0"/>
+            </w:pPr>
+            <w:r>
+              <w:rPr>
+                <w:rFonts w:ascii="Times New Roman" w:cs="Times New Roman" w:eastAsia="Times New Roman" w:hAnsi="Times New Roman"/>
+                <w:sz w:val="20"/>
+                <w:szCs w:val="20"/>
+              </w:rPr>
+              <w:t xml:space="preserve">124.5 / 120,608</w:t>
+            </w:r>
+          </w:p>
+        </w:tc>
+        <w:tc>
+          <w:tcPr>
+            <w:tcW w:type="dxa" w:w="2009"/>
+            <w:tcBorders>
+              <w:top w:val="single" w:color="808080" w:sz="4"/>
+              <w:left w:val="single" w:color="808080" w:sz="4"/>
+              <w:bottom w:val="single" w:color="808080" w:sz="4"/>
+              <w:right w:val="single" w:color="808080" w:sz="4"/>
+            </w:tcBorders>
+            <w:tcMar>
+              <w:top w:type="dxa" w:w="40"/>
+              <w:left w:type="dxa" w:w="80"/>
+              <w:bottom w:type="dxa" w:w="40"/>
+              <w:right w:type="dxa" w:w="80"/>
+            </w:tcMar>
+          </w:tcPr>
+          <w:p>
+            <w:pPr>
+              <w:spacing w:after="0"/>
+            </w:pPr>
+            <w:r>
+              <w:rPr>
+                <w:rFonts w:ascii="Times New Roman" w:cs="Times New Roman" w:eastAsia="Times New Roman" w:hAnsi="Times New Roman"/>
+                <w:sz w:val="20"/>
+                <w:szCs w:val="20"/>
+              </w:rPr>
+              <w:t xml:space="preserve">120.5 / 151,557</w:t>
+            </w:r>
+          </w:p>
+        </w:tc>
+      </w:tr>
+      <w:tr>
+        <w:tc>
+          <w:tcPr>
+            <w:tcW w:type="dxa" w:w="1002"/>
+            <w:tcBorders>
+              <w:top w:val="single" w:color="808080" w:sz="4"/>
+              <w:left w:val="single" w:color="808080" w:sz="4"/>
+              <w:bottom w:val="single" w:color="808080" w:sz="4"/>
+              <w:right w:val="single" w:color="808080" w:sz="4"/>
+            </w:tcBorders>
+            <w:tcMar>
+              <w:top w:type="dxa" w:w="40"/>
+              <w:left w:type="dxa" w:w="80"/>
+              <w:bottom w:type="dxa" w:w="40"/>
+              <w:right w:type="dxa" w:w="80"/>
+            </w:tcMar>
+          </w:tcPr>
+          <w:p>
+            <w:pPr>
+              <w:spacing w:after="0"/>
+            </w:pPr>
+            <w:r>
+              <w:rPr>
+                <w:rFonts w:ascii="Times New Roman" w:cs="Times New Roman" w:eastAsia="Times New Roman" w:hAnsi="Times New Roman"/>
+                <w:sz w:val="20"/>
+                <w:szCs w:val="20"/>
+              </w:rPr>
+              <w:t xml:space="preserve">8</w:t>
+            </w:r>
+          </w:p>
+        </w:tc>
+        <w:tc>
+          <w:tcPr>
+            <w:tcW w:type="dxa" w:w="2005"/>
+            <w:tcBorders>
+              <w:top w:val="single" w:color="808080" w:sz="4"/>
+              <w:left w:val="single" w:color="808080" w:sz="4"/>
+              <w:bottom w:val="single" w:color="808080" w:sz="4"/>
+              <w:right w:val="single" w:color="808080" w:sz="4"/>
+            </w:tcBorders>
+            <w:tcMar>
+              <w:top w:type="dxa" w:w="40"/>
+              <w:left w:type="dxa" w:w="80"/>
+              <w:bottom w:type="dxa" w:w="40"/>
+              <w:right w:type="dxa" w:w="80"/>
+            </w:tcMar>
+          </w:tcPr>
+          <w:p>
+            <w:pPr>
+              <w:spacing w:after="0"/>
+            </w:pPr>
+            <w:r>
+              <w:rPr>
+                <w:rFonts w:ascii="Times New Roman" w:cs="Times New Roman" w:eastAsia="Times New Roman" w:hAnsi="Times New Roman"/>
+                <w:sz w:val="20"/>
+                <w:szCs w:val="20"/>
+              </w:rPr>
+              <w:t xml:space="preserve">134.3 / 127,523</w:t>
+            </w:r>
+          </w:p>
+        </w:tc>
+        <w:tc>
+          <w:tcPr>
+            <w:tcW w:type="dxa" w:w="2005"/>
+            <w:tcBorders>
+              <w:top w:val="single" w:color="808080" w:sz="4"/>
+              <w:left w:val="single" w:color="808080" w:sz="4"/>
+              <w:bottom w:val="single" w:color="808080" w:sz="4"/>
+              <w:right w:val="single" w:color="808080" w:sz="4"/>
+            </w:tcBorders>
+            <w:tcMar>
+              <w:top w:type="dxa" w:w="40"/>
+              <w:left w:type="dxa" w:w="80"/>
+              <w:bottom w:type="dxa" w:w="40"/>
+              <w:right w:type="dxa" w:w="80"/>
+            </w:tcMar>
+          </w:tcPr>
+          <w:p>
+            <w:pPr>
+              <w:spacing w:after="0"/>
+            </w:pPr>
+            <w:r>
+              <w:rPr>
+                <w:rFonts w:ascii="Times New Roman" w:cs="Times New Roman" w:eastAsia="Times New Roman" w:hAnsi="Times New Roman"/>
+                <w:sz w:val="20"/>
+                <w:szCs w:val="20"/>
+              </w:rPr>
+              <w:t xml:space="preserve">142.5 / 108,672</w:t>
+            </w:r>
+          </w:p>
+        </w:tc>
+        <w:tc>
+          <w:tcPr>
+            <w:tcW w:type="dxa" w:w="2005"/>
+            <w:tcBorders>
+              <w:top w:val="single" w:color="808080" w:sz="4"/>
+              <w:left w:val="single" w:color="808080" w:sz="4"/>
+              <w:bottom w:val="single" w:color="808080" w:sz="4"/>
+              <w:right w:val="single" w:color="808080" w:sz="4"/>
+            </w:tcBorders>
+            <w:tcMar>
+              <w:top w:type="dxa" w:w="40"/>
+              <w:left w:type="dxa" w:w="80"/>
+              <w:bottom w:type="dxa" w:w="40"/>
+              <w:right w:type="dxa" w:w="80"/>
+            </w:tcMar>
+          </w:tcPr>
+          <w:p>
+            <w:pPr>
+              <w:spacing w:after="0"/>
+            </w:pPr>
+            <w:r>
+              <w:rPr>
+                <w:rFonts w:ascii="Times New Roman" w:cs="Times New Roman" w:eastAsia="Times New Roman" w:hAnsi="Times New Roman"/>
+                <w:sz w:val="20"/>
+                <w:szCs w:val="20"/>
+              </w:rPr>
+              <w:t xml:space="preserve">135.0 / 108,217</w:t>
+            </w:r>
+          </w:p>
+        </w:tc>
+        <w:tc>
+          <w:tcPr>
+            <w:tcW w:type="dxa" w:w="2009"/>
+            <w:tcBorders>
+              <w:top w:val="single" w:color="808080" w:sz="4"/>
+              <w:left w:val="single" w:color="808080" w:sz="4"/>
+              <w:bottom w:val="single" w:color="808080" w:sz="4"/>
+              <w:right w:val="single" w:color="808080" w:sz="4"/>
+            </w:tcBorders>
+            <w:tcMar>
+              <w:top w:type="dxa" w:w="40"/>
+              <w:left w:type="dxa" w:w="80"/>
+              <w:bottom w:type="dxa" w:w="40"/>
+              <w:right w:type="dxa" w:w="80"/>
+            </w:tcMar>
+          </w:tcPr>
+          <w:p>
+            <w:pPr>
+              <w:spacing w:after="0"/>
+            </w:pPr>
+            <w:r>
+              <w:rPr>
+                <w:rFonts w:ascii="Times New Roman" w:cs="Times New Roman" w:eastAsia="Times New Roman" w:hAnsi="Times New Roman"/>
+                <w:sz w:val="20"/>
+                <w:szCs w:val="20"/>
+              </w:rPr>
+              <w:t xml:space="preserve">120.5 / 151,557</w:t>
+            </w:r>
+          </w:p>
+        </w:tc>
+      </w:tr>
+      <w:tr>
+        <w:tc>
+          <w:tcPr>
+            <w:tcW w:type="dxa" w:w="1002"/>
+            <w:tcBorders>
+              <w:top w:val="single" w:color="808080" w:sz="4"/>
+              <w:left w:val="single" w:color="808080" w:sz="4"/>
+              <w:bottom w:val="single" w:color="808080" w:sz="4"/>
+              <w:right w:val="single" w:color="808080" w:sz="4"/>
+            </w:tcBorders>
+            <w:tcMar>
+              <w:top w:type="dxa" w:w="40"/>
+              <w:left w:type="dxa" w:w="80"/>
+              <w:bottom w:type="dxa" w:w="40"/>
+              <w:right w:type="dxa" w:w="80"/>
+            </w:tcMar>
+          </w:tcPr>
+          <w:p>
+            <w:pPr>
+              <w:spacing w:after="0"/>
+            </w:pPr>
+            <w:r>
+              <w:rPr>
+                <w:rFonts w:ascii="Times New Roman" w:cs="Times New Roman" w:eastAsia="Times New Roman" w:hAnsi="Times New Roman"/>
+                <w:sz w:val="20"/>
+                <w:szCs w:val="20"/>
+              </w:rPr>
+              <w:t xml:space="preserve">12</w:t>
+            </w:r>
+          </w:p>
+        </w:tc>
+        <w:tc>
+          <w:tcPr>
+            <w:tcW w:type="dxa" w:w="2005"/>
+            <w:tcBorders>
+              <w:top w:val="single" w:color="808080" w:sz="4"/>
+              <w:left w:val="single" w:color="808080" w:sz="4"/>
+              <w:bottom w:val="single" w:color="808080" w:sz="4"/>
+              <w:right w:val="single" w:color="808080" w:sz="4"/>
+            </w:tcBorders>
+            <w:tcMar>
+              <w:top w:type="dxa" w:w="40"/>
+              <w:left w:type="dxa" w:w="80"/>
+              <w:bottom w:type="dxa" w:w="40"/>
+              <w:right w:type="dxa" w:w="80"/>
+            </w:tcMar>
+          </w:tcPr>
+          <w:p>
+            <w:pPr>
+              <w:spacing w:after="0"/>
+            </w:pPr>
+            <w:r>
+              <w:rPr>
+                <w:rFonts w:ascii="Times New Roman" w:cs="Times New Roman" w:eastAsia="Times New Roman" w:hAnsi="Times New Roman"/>
+                <w:sz w:val="20"/>
+                <w:szCs w:val="20"/>
+              </w:rPr>
+              <w:t xml:space="preserve">143.4 / 124,229</w:t>
+            </w:r>
+          </w:p>
+        </w:tc>
+        <w:tc>
+          <w:tcPr>
+            <w:tcW w:type="dxa" w:w="2005"/>
+            <w:tcBorders>
+              <w:top w:val="single" w:color="808080" w:sz="4"/>
+              <w:left w:val="single" w:color="808080" w:sz="4"/>
+              <w:bottom w:val="single" w:color="808080" w:sz="4"/>
+              <w:right w:val="single" w:color="808080" w:sz="4"/>
+            </w:tcBorders>
+            <w:tcMar>
+              <w:top w:type="dxa" w:w="40"/>
+              <w:left w:type="dxa" w:w="80"/>
+              <w:bottom w:type="dxa" w:w="40"/>
+              <w:right w:type="dxa" w:w="80"/>
+            </w:tcMar>
+          </w:tcPr>
+          <w:p>
+            <w:pPr>
+              <w:spacing w:after="0"/>
+            </w:pPr>
+            <w:r>
+              <w:rPr>
+                <w:rFonts w:ascii="Times New Roman" w:cs="Times New Roman" w:eastAsia="Times New Roman" w:hAnsi="Times New Roman"/>
+                <w:sz w:val="20"/>
+                <w:szCs w:val="20"/>
+              </w:rPr>
+              <w:t xml:space="preserve">156.5 / 103,841</w:t>
+            </w:r>
+          </w:p>
+        </w:tc>
+        <w:tc>
+          <w:tcPr>
+            <w:tcW w:type="dxa" w:w="2005"/>
+            <w:tcBorders>
+              <w:top w:val="single" w:color="808080" w:sz="4"/>
+              <w:left w:val="single" w:color="808080" w:sz="4"/>
+              <w:bottom w:val="single" w:color="808080" w:sz="4"/>
+              <w:right w:val="single" w:color="808080" w:sz="4"/>
+            </w:tcBorders>
+            <w:tcMar>
+              <w:top w:type="dxa" w:w="40"/>
+              <w:left w:type="dxa" w:w="80"/>
+              <w:bottom w:type="dxa" w:w="40"/>
+              <w:right w:type="dxa" w:w="80"/>
+            </w:tcMar>
+          </w:tcPr>
+          <w:p>
+            <w:pPr>
+              <w:spacing w:after="0"/>
+            </w:pPr>
+            <w:r>
+              <w:rPr>
+                <w:rFonts w:ascii="Times New Roman" w:cs="Times New Roman" w:eastAsia="Times New Roman" w:hAnsi="Times New Roman"/>
+                <w:sz w:val="20"/>
+                <w:szCs w:val="20"/>
+              </w:rPr>
+              <w:t xml:space="preserve">143.5 / 103,184</w:t>
+            </w:r>
+          </w:p>
+        </w:tc>
+        <w:tc>
+          <w:tcPr>
+            <w:tcW w:type="dxa" w:w="2009"/>
+            <w:tcBorders>
+              <w:top w:val="single" w:color="808080" w:sz="4"/>
+              <w:left w:val="single" w:color="808080" w:sz="4"/>
+              <w:bottom w:val="single" w:color="808080" w:sz="4"/>
+              <w:right w:val="single" w:color="808080" w:sz="4"/>
+            </w:tcBorders>
+            <w:tcMar>
+              <w:top w:type="dxa" w:w="40"/>
+              <w:left w:type="dxa" w:w="80"/>
+              <w:bottom w:type="dxa" w:w="40"/>
+              <w:right w:type="dxa" w:w="80"/>
+            </w:tcMar>
+          </w:tcPr>
+          <w:p>
+            <w:pPr>
+              <w:spacing w:after="0"/>
+            </w:pPr>
+            <w:r>
+              <w:rPr>
+                <w:rFonts w:ascii="Times New Roman" w:cs="Times New Roman" w:eastAsia="Times New Roman" w:hAnsi="Times New Roman"/>
+                <w:sz w:val="20"/>
+                <w:szCs w:val="20"/>
+              </w:rPr>
+              <w:t xml:space="preserve">120.5 / 151,557</w:t>
+            </w:r>
+          </w:p>
+        </w:tc>
+      </w:tr>
+      <w:tr>
+        <w:tc>
+          <w:tcPr>
+            <w:tcW w:type="dxa" w:w="1002"/>
+            <w:tcBorders>
+              <w:top w:val="single" w:color="808080" w:sz="4"/>
+              <w:left w:val="single" w:color="808080" w:sz="4"/>
+              <w:bottom w:val="single" w:color="808080" w:sz="4"/>
+              <w:right w:val="single" w:color="808080" w:sz="4"/>
+            </w:tcBorders>
+            <w:tcMar>
+              <w:top w:type="dxa" w:w="40"/>
+              <w:left w:type="dxa" w:w="80"/>
+              <w:bottom w:type="dxa" w:w="40"/>
+              <w:right w:type="dxa" w:w="80"/>
+            </w:tcMar>
+          </w:tcPr>
+          <w:p>
+            <w:pPr>
+              <w:spacing w:after="0"/>
+            </w:pPr>
+            <w:r>
+              <w:rPr>
+                <w:rFonts w:ascii="Times New Roman" w:cs="Times New Roman" w:eastAsia="Times New Roman" w:hAnsi="Times New Roman"/>
+                <w:sz w:val="20"/>
+                <w:szCs w:val="20"/>
+              </w:rPr>
+              <w:t xml:space="preserve">20</w:t>
+            </w:r>
+          </w:p>
+        </w:tc>
+        <w:tc>
+          <w:tcPr>
+            <w:tcW w:type="dxa" w:w="2005"/>
+            <w:tcBorders>
+              <w:top w:val="single" w:color="808080" w:sz="4"/>
+              <w:left w:val="single" w:color="808080" w:sz="4"/>
+              <w:bottom w:val="single" w:color="808080" w:sz="4"/>
+              <w:right w:val="single" w:color="808080" w:sz="4"/>
+            </w:tcBorders>
+            <w:tcMar>
+              <w:top w:type="dxa" w:w="40"/>
+              <w:left w:type="dxa" w:w="80"/>
+              <w:bottom w:type="dxa" w:w="40"/>
+              <w:right w:type="dxa" w:w="80"/>
+            </w:tcMar>
+          </w:tcPr>
+          <w:p>
+            <w:pPr>
+              <w:spacing w:after="0"/>
+            </w:pPr>
+            <w:r>
+              <w:rPr>
+                <w:rFonts w:ascii="Times New Roman" w:cs="Times New Roman" w:eastAsia="Times New Roman" w:hAnsi="Times New Roman"/>
+                <w:sz w:val="20"/>
+                <w:szCs w:val="20"/>
+              </w:rPr>
+              <w:t xml:space="preserve">149.5 / 122,915</w:t>
+            </w:r>
+          </w:p>
+        </w:tc>
+        <w:tc>
+          <w:tcPr>
+            <w:tcW w:type="dxa" w:w="2005"/>
+            <w:tcBorders>
+              <w:top w:val="single" w:color="808080" w:sz="4"/>
+              <w:left w:val="single" w:color="808080" w:sz="4"/>
+              <w:bottom w:val="single" w:color="808080" w:sz="4"/>
+              <w:right w:val="single" w:color="808080" w:sz="4"/>
+            </w:tcBorders>
+            <w:tcMar>
+              <w:top w:type="dxa" w:w="40"/>
+              <w:left w:type="dxa" w:w="80"/>
+              <w:bottom w:type="dxa" w:w="40"/>
+              <w:right w:type="dxa" w:w="80"/>
+            </w:tcMar>
+          </w:tcPr>
+          <w:p>
+            <w:pPr>
+              <w:spacing w:after="0"/>
+            </w:pPr>
+            <w:r>
+              <w:rPr>
+                <w:rFonts w:ascii="Times New Roman" w:cs="Times New Roman" w:eastAsia="Times New Roman" w:hAnsi="Times New Roman"/>
+                <w:sz w:val="20"/>
+                <w:szCs w:val="20"/>
+              </w:rPr>
+              <w:t xml:space="preserve">165.5 / 101,747</w:t>
+            </w:r>
+          </w:p>
+        </w:tc>
+        <w:tc>
+          <w:tcPr>
+            <w:tcW w:type="dxa" w:w="2005"/>
+            <w:tcBorders>
+              <w:top w:val="single" w:color="808080" w:sz="4"/>
+              <w:left w:val="single" w:color="808080" w:sz="4"/>
+              <w:bottom w:val="single" w:color="808080" w:sz="4"/>
+              <w:right w:val="single" w:color="808080" w:sz="4"/>
+            </w:tcBorders>
+            <w:tcMar>
+              <w:top w:type="dxa" w:w="40"/>
+              <w:left w:type="dxa" w:w="80"/>
+              <w:bottom w:type="dxa" w:w="40"/>
+              <w:right w:type="dxa" w:w="80"/>
+            </w:tcMar>
+          </w:tcPr>
+          <w:p>
+            <w:pPr>
+              <w:spacing w:after="0"/>
+            </w:pPr>
+            <w:r>
+              <w:rPr>
+                <w:rFonts w:ascii="Times New Roman" w:cs="Times New Roman" w:eastAsia="Times New Roman" w:hAnsi="Times New Roman"/>
+                <w:sz w:val="20"/>
+                <w:szCs w:val="20"/>
+              </w:rPr>
+              <w:t xml:space="preserve">148.5 / 101,064</w:t>
+            </w:r>
+          </w:p>
+        </w:tc>
+        <w:tc>
+          <w:tcPr>
+            <w:tcW w:type="dxa" w:w="2009"/>
+            <w:tcBorders>
+              <w:top w:val="single" w:color="808080" w:sz="4"/>
+              <w:left w:val="single" w:color="808080" w:sz="4"/>
+              <w:bottom w:val="single" w:color="808080" w:sz="4"/>
+              <w:right w:val="single" w:color="808080" w:sz="4"/>
+            </w:tcBorders>
+            <w:tcMar>
+              <w:top w:type="dxa" w:w="40"/>
+              <w:left w:type="dxa" w:w="80"/>
+              <w:bottom w:type="dxa" w:w="40"/>
+              <w:right w:type="dxa" w:w="80"/>
+            </w:tcMar>
+          </w:tcPr>
+          <w:p>
+            <w:pPr>
+              <w:spacing w:after="0"/>
+            </w:pPr>
+            <w:r>
+              <w:rPr>
+                <w:rFonts w:ascii="Times New Roman" w:cs="Times New Roman" w:eastAsia="Times New Roman" w:hAnsi="Times New Roman"/>
+                <w:sz w:val="20"/>
+                <w:szCs w:val="20"/>
+              </w:rPr>
+              <w:t xml:space="preserve">120.5 / 151,557</w:t>
+            </w:r>
+          </w:p>
+        </w:tc>
+      </w:tr>
+    </w:tbl>
+    <w:p>
+      <w:pPr>
+        <w:spacing w:after="160"/>
+      </w:pPr>
+    </w:p>
+    <w:p>
+      <w:pPr>
+        <w:keepNext/>
+        <w:spacing w:after="200" w:before="60"/>
+        <w:jc w:val="center"/>
+      </w:pPr>
+      <w:r>
+        <w:rPr>
+          <w:rFonts w:ascii="Times New Roman" w:cs="Times New Roman" w:eastAsia="Times New Roman" w:hAnsi="Times New Roman"/>
+          <w:b/>
+          <w:bCs/>
+          <w:sz w:val="22"/>
+          <w:szCs w:val="22"/>
+        </w:rPr>
+        <w:t xml:space="preserve">Table 8.13: </w:t>
+      </w:r>
+      <w:r>
+        <w:rPr>
+          <w:rFonts w:ascii="Times New Roman" w:cs="Times New Roman" w:eastAsia="Times New Roman" w:hAnsi="Times New Roman"/>
+          <w:i/>
+          <w:iCs/>
+          <w:sz w:val="22"/>
+          <w:szCs w:val="22"/>
+        </w:rPr>
+        <w:t xml:space="preserve">A2 — P2 on LightGBM minus P2 on E4b, paired over 12 episodes, Holm–Bonferroni across the family</w:t>
+      </w:r>
+    </w:p>
+    <w:tbl>
+      <w:tblPr>
+        <w:tblW w:type="dxa" w:w="9026"/>
+        <w:tblBorders>
+          <w:top w:val="single" w:color="auto" w:sz="4"/>
+          <w:left w:val="single" w:color="auto" w:sz="4"/>
+          <w:bottom w:val="single" w:color="auto" w:sz="4"/>
+          <w:right w:val="single" w:color="auto" w:sz="4"/>
+          <w:insideH w:val="single" w:color="auto" w:sz="4"/>
+          <w:insideV w:val="single" w:color="auto" w:sz="4"/>
+        </w:tblBorders>
+      </w:tblPr>
+      <w:tblGrid>
+        <w:gridCol w:w="1404"/>
+        <w:gridCol w:w="3810"/>
+        <w:gridCol w:w="3812"/>
+      </w:tblGrid>
+      <w:tr>
+        <w:trPr>
+          <w:tblHeader/>
+        </w:trPr>
+        <w:tc>
+          <w:tcPr>
+            <w:tcW w:type="dxa" w:w="1404"/>
+            <w:tcBorders>
+              <w:top w:val="single" w:color="808080" w:sz="4"/>
+              <w:left w:val="single" w:color="808080" w:sz="4"/>
+              <w:bottom w:val="single" w:color="808080" w:sz="4"/>
+              <w:right w:val="single" w:color="808080" w:sz="4"/>
+            </w:tcBorders>
+            <w:shd w:fill="D9E2F3" w:color="auto" w:val="clear"/>
+            <w:tcMar>
+              <w:top w:type="dxa" w:w="40"/>
+              <w:left w:type="dxa" w:w="80"/>
+              <w:bottom w:type="dxa" w:w="40"/>
+              <w:right w:type="dxa" w:w="80"/>
+            </w:tcMar>
+          </w:tcPr>
+          <w:p>
+            <w:pPr>
+              <w:spacing w:after="0"/>
+            </w:pPr>
+            <w:r>
+              <w:rPr>
+                <w:rFonts w:ascii="Times New Roman" w:cs="Times New Roman" w:eastAsia="Times New Roman" w:hAnsi="Times New Roman"/>
+                <w:b/>
+                <w:bCs/>
+                <w:sz w:val="20"/>
+                <w:szCs w:val="20"/>
+              </w:rPr>
+              <w:t xml:space="preserve">N_MIN</w:t>
+            </w:r>
+          </w:p>
+        </w:tc>
+        <w:tc>
+          <w:tcPr>
+            <w:tcW w:type="dxa" w:w="3810"/>
+            <w:tcBorders>
+              <w:top w:val="single" w:color="808080" w:sz="4"/>
+              <w:left w:val="single" w:color="808080" w:sz="4"/>
+              <w:bottom w:val="single" w:color="808080" w:sz="4"/>
+              <w:right w:val="single" w:color="808080" w:sz="4"/>
+            </w:tcBorders>
+            <w:shd w:fill="D9E2F3" w:color="auto" w:val="clear"/>
+            <w:tcMar>
+              <w:top w:type="dxa" w:w="40"/>
+              <w:left w:type="dxa" w:w="80"/>
+              <w:bottom w:type="dxa" w:w="40"/>
+              <w:right w:type="dxa" w:w="80"/>
+            </w:tcMar>
+          </w:tcPr>
+          <w:p>
+            <w:pPr>
+              <w:spacing w:after="0"/>
+            </w:pPr>
+            <w:r>
+              <w:rPr>
+                <w:rFonts w:ascii="Times New Roman" w:cs="Times New Roman" w:eastAsia="Times New Roman" w:hAnsi="Times New Roman"/>
+                <w:b/>
+                <w:bCs/>
+                <w:sz w:val="20"/>
+                <w:szCs w:val="20"/>
+              </w:rPr>
+              <w:t xml:space="preserve">L-p95 difference [95 % CI]</w:t>
+            </w:r>
+          </w:p>
+        </w:tc>
+        <w:tc>
+          <w:tcPr>
+            <w:tcW w:type="dxa" w:w="3812"/>
+            <w:tcBorders>
+              <w:top w:val="single" w:color="808080" w:sz="4"/>
+              <w:left w:val="single" w:color="808080" w:sz="4"/>
+              <w:bottom w:val="single" w:color="808080" w:sz="4"/>
+              <w:right w:val="single" w:color="808080" w:sz="4"/>
+            </w:tcBorders>
+            <w:shd w:fill="D9E2F3" w:color="auto" w:val="clear"/>
+            <w:tcMar>
+              <w:top w:type="dxa" w:w="40"/>
+              <w:left w:type="dxa" w:w="80"/>
+              <w:bottom w:type="dxa" w:w="40"/>
+              <w:right w:type="dxa" w:w="80"/>
+            </w:tcMar>
+          </w:tcPr>
+          <w:p>
+            <w:pPr>
+              <w:spacing w:after="0"/>
+            </w:pPr>
+            <w:r>
+              <w:rPr>
+                <w:rFonts w:ascii="Times New Roman" w:cs="Times New Roman" w:eastAsia="Times New Roman" w:hAnsi="Times New Roman"/>
+                <w:b/>
+                <w:bCs/>
+                <w:sz w:val="20"/>
+                <w:szCs w:val="20"/>
+              </w:rPr>
+              <w:t xml:space="preserve">C-user difference [95 % CI]</w:t>
+            </w:r>
+          </w:p>
+        </w:tc>
+      </w:tr>
+      <w:tr>
+        <w:tc>
+          <w:tcPr>
+            <w:tcW w:type="dxa" w:w="1404"/>
+            <w:tcBorders>
+              <w:top w:val="single" w:color="808080" w:sz="4"/>
+              <w:left w:val="single" w:color="808080" w:sz="4"/>
+              <w:bottom w:val="single" w:color="808080" w:sz="4"/>
+              <w:right w:val="single" w:color="808080" w:sz="4"/>
+            </w:tcBorders>
+            <w:tcMar>
+              <w:top w:type="dxa" w:w="40"/>
+              <w:left w:type="dxa" w:w="80"/>
+              <w:bottom w:type="dxa" w:w="40"/>
+              <w:right w:type="dxa" w:w="80"/>
+            </w:tcMar>
+          </w:tcPr>
+          <w:p>
+            <w:pPr>
+              <w:spacing w:after="0"/>
+            </w:pPr>
+            <w:r>
+              <w:rPr>
+                <w:rFonts w:ascii="Times New Roman" w:cs="Times New Roman" w:eastAsia="Times New Roman" w:hAnsi="Times New Roman"/>
+                <w:sz w:val="20"/>
+                <w:szCs w:val="20"/>
+              </w:rPr>
+              <w:t xml:space="preserve">1</w:t>
+            </w:r>
+          </w:p>
+        </w:tc>
+        <w:tc>
+          <w:tcPr>
+            <w:tcW w:type="dxa" w:w="3810"/>
+            <w:tcBorders>
+              <w:top w:val="single" w:color="808080" w:sz="4"/>
+              <w:left w:val="single" w:color="808080" w:sz="4"/>
+              <w:bottom w:val="single" w:color="808080" w:sz="4"/>
+              <w:right w:val="single" w:color="808080" w:sz="4"/>
+            </w:tcBorders>
+            <w:tcMar>
+              <w:top w:type="dxa" w:w="40"/>
+              <w:left w:type="dxa" w:w="80"/>
+              <w:bottom w:type="dxa" w:w="40"/>
+              <w:right w:type="dxa" w:w="80"/>
+            </w:tcMar>
+          </w:tcPr>
+          <w:p>
+            <w:pPr>
+              <w:spacing w:after="0"/>
+            </w:pPr>
+            <w:r>
+              <w:rPr>
+                <w:rFonts w:ascii="Times New Roman" w:cs="Times New Roman" w:eastAsia="Times New Roman" w:hAnsi="Times New Roman"/>
+                <w:sz w:val="20"/>
+                <w:szCs w:val="20"/>
+              </w:rPr>
+              <w:t xml:space="preserve">0.0 [0.0, 0.0]</w:t>
+            </w:r>
+          </w:p>
+        </w:tc>
+        <w:tc>
+          <w:tcPr>
+            <w:tcW w:type="dxa" w:w="3812"/>
+            <w:tcBorders>
+              <w:top w:val="single" w:color="808080" w:sz="4"/>
+              <w:left w:val="single" w:color="808080" w:sz="4"/>
+              <w:bottom w:val="single" w:color="808080" w:sz="4"/>
+              <w:right w:val="single" w:color="808080" w:sz="4"/>
+            </w:tcBorders>
+            <w:tcMar>
+              <w:top w:type="dxa" w:w="40"/>
+              <w:left w:type="dxa" w:w="80"/>
+              <w:bottom w:type="dxa" w:w="40"/>
+              <w:right w:type="dxa" w:w="80"/>
+            </w:tcMar>
+          </w:tcPr>
+          <w:p>
+            <w:pPr>
+              <w:spacing w:after="0"/>
+            </w:pPr>
+            <w:r>
+              <w:rPr>
+                <w:rFonts w:ascii="Times New Roman" w:cs="Times New Roman" w:eastAsia="Times New Roman" w:hAnsi="Times New Roman"/>
+                <w:sz w:val="20"/>
+                <w:szCs w:val="20"/>
+              </w:rPr>
+              <w:t xml:space="preserve">0 [0, 0]</w:t>
+            </w:r>
+          </w:p>
+        </w:tc>
+      </w:tr>
+      <w:tr>
+        <w:tc>
+          <w:tcPr>
+            <w:tcW w:type="dxa" w:w="1404"/>
+            <w:tcBorders>
+              <w:top w:val="single" w:color="808080" w:sz="4"/>
+              <w:left w:val="single" w:color="808080" w:sz="4"/>
+              <w:bottom w:val="single" w:color="808080" w:sz="4"/>
+              <w:right w:val="single" w:color="808080" w:sz="4"/>
+            </w:tcBorders>
+            <w:tcMar>
+              <w:top w:type="dxa" w:w="40"/>
+              <w:left w:type="dxa" w:w="80"/>
+              <w:bottom w:type="dxa" w:w="40"/>
+              <w:right w:type="dxa" w:w="80"/>
+            </w:tcMar>
+          </w:tcPr>
+          <w:p>
+            <w:pPr>
+              <w:spacing w:after="0"/>
+            </w:pPr>
+            <w:r>
+              <w:rPr>
+                <w:rFonts w:ascii="Times New Roman" w:cs="Times New Roman" w:eastAsia="Times New Roman" w:hAnsi="Times New Roman"/>
+                <w:sz w:val="20"/>
+                <w:szCs w:val="20"/>
+              </w:rPr>
+              <w:t xml:space="preserve">4</w:t>
+            </w:r>
+          </w:p>
+        </w:tc>
+        <w:tc>
+          <w:tcPr>
+            <w:tcW w:type="dxa" w:w="3810"/>
+            <w:tcBorders>
+              <w:top w:val="single" w:color="808080" w:sz="4"/>
+              <w:left w:val="single" w:color="808080" w:sz="4"/>
+              <w:bottom w:val="single" w:color="808080" w:sz="4"/>
+              <w:right w:val="single" w:color="808080" w:sz="4"/>
+            </w:tcBorders>
+            <w:tcMar>
+              <w:top w:type="dxa" w:w="40"/>
+              <w:left w:type="dxa" w:w="80"/>
+              <w:bottom w:type="dxa" w:w="40"/>
+              <w:right w:type="dxa" w:w="80"/>
+            </w:tcMar>
+          </w:tcPr>
+          <w:p>
+            <w:pPr>
+              <w:spacing w:after="0"/>
+            </w:pPr>
+            <w:r>
+              <w:rPr>
+                <w:rFonts w:ascii="Times New Roman" w:cs="Times New Roman" w:eastAsia="Times New Roman" w:hAnsi="Times New Roman"/>
+                <w:sz w:val="20"/>
+                <w:szCs w:val="20"/>
+              </w:rPr>
+              <w:t xml:space="preserve">+2.0 [+1.5, +3.0] *</w:t>
+            </w:r>
+          </w:p>
+        </w:tc>
+        <w:tc>
+          <w:tcPr>
+            <w:tcW w:type="dxa" w:w="3812"/>
+            <w:tcBorders>
+              <w:top w:val="single" w:color="808080" w:sz="4"/>
+              <w:left w:val="single" w:color="808080" w:sz="4"/>
+              <w:bottom w:val="single" w:color="808080" w:sz="4"/>
+              <w:right w:val="single" w:color="808080" w:sz="4"/>
+            </w:tcBorders>
+            <w:tcMar>
+              <w:top w:type="dxa" w:w="40"/>
+              <w:left w:type="dxa" w:w="80"/>
+              <w:bottom w:type="dxa" w:w="40"/>
+              <w:right w:type="dxa" w:w="80"/>
+            </w:tcMar>
+          </w:tcPr>
+          <w:p>
+            <w:pPr>
+              <w:spacing w:after="0"/>
+            </w:pPr>
+            <w:r>
+              <w:rPr>
+                <w:rFonts w:ascii="Times New Roman" w:cs="Times New Roman" w:eastAsia="Times New Roman" w:hAnsi="Times New Roman"/>
+                <w:sz w:val="20"/>
+                <w:szCs w:val="20"/>
+              </w:rPr>
+              <w:t xml:space="preserve">−17,186 [−20,785, −14,489] *</w:t>
+            </w:r>
+          </w:p>
+        </w:tc>
+      </w:tr>
+      <w:tr>
+        <w:tc>
+          <w:tcPr>
+            <w:tcW w:type="dxa" w:w="1404"/>
+            <w:tcBorders>
+              <w:top w:val="single" w:color="808080" w:sz="4"/>
+              <w:left w:val="single" w:color="808080" w:sz="4"/>
+              <w:bottom w:val="single" w:color="808080" w:sz="4"/>
+              <w:right w:val="single" w:color="808080" w:sz="4"/>
+            </w:tcBorders>
+            <w:tcMar>
+              <w:top w:type="dxa" w:w="40"/>
+              <w:left w:type="dxa" w:w="80"/>
+              <w:bottom w:type="dxa" w:w="40"/>
+              <w:right w:type="dxa" w:w="80"/>
+            </w:tcMar>
+          </w:tcPr>
+          <w:p>
+            <w:pPr>
+              <w:spacing w:after="0"/>
+            </w:pPr>
+            <w:r>
+              <w:rPr>
+                <w:rFonts w:ascii="Times New Roman" w:cs="Times New Roman" w:eastAsia="Times New Roman" w:hAnsi="Times New Roman"/>
+                <w:sz w:val="20"/>
+                <w:szCs w:val="20"/>
+              </w:rPr>
+              <w:t xml:space="preserve">8</w:t>
+            </w:r>
+          </w:p>
+        </w:tc>
+        <w:tc>
+          <w:tcPr>
+            <w:tcW w:type="dxa" w:w="3810"/>
+            <w:tcBorders>
+              <w:top w:val="single" w:color="808080" w:sz="4"/>
+              <w:left w:val="single" w:color="808080" w:sz="4"/>
+              <w:bottom w:val="single" w:color="808080" w:sz="4"/>
+              <w:right w:val="single" w:color="808080" w:sz="4"/>
+            </w:tcBorders>
+            <w:tcMar>
+              <w:top w:type="dxa" w:w="40"/>
+              <w:left w:type="dxa" w:w="80"/>
+              <w:bottom w:type="dxa" w:w="40"/>
+              <w:right w:type="dxa" w:w="80"/>
+            </w:tcMar>
+          </w:tcPr>
+          <w:p>
+            <w:pPr>
+              <w:spacing w:after="0"/>
+            </w:pPr>
+            <w:r>
+              <w:rPr>
+                <w:rFonts w:ascii="Times New Roman" w:cs="Times New Roman" w:eastAsia="Times New Roman" w:hAnsi="Times New Roman"/>
+                <w:sz w:val="20"/>
+                <w:szCs w:val="20"/>
+              </w:rPr>
+              <w:t xml:space="preserve">+7.2 [+6.0, +9.0] *</w:t>
+            </w:r>
+          </w:p>
+        </w:tc>
+        <w:tc>
+          <w:tcPr>
+            <w:tcW w:type="dxa" w:w="3812"/>
+            <w:tcBorders>
+              <w:top w:val="single" w:color="808080" w:sz="4"/>
+              <w:left w:val="single" w:color="808080" w:sz="4"/>
+              <w:bottom w:val="single" w:color="808080" w:sz="4"/>
+              <w:right w:val="single" w:color="808080" w:sz="4"/>
+            </w:tcBorders>
+            <w:tcMar>
+              <w:top w:type="dxa" w:w="40"/>
+              <w:left w:type="dxa" w:w="80"/>
+              <w:bottom w:type="dxa" w:w="40"/>
+              <w:right w:type="dxa" w:w="80"/>
+            </w:tcMar>
+          </w:tcPr>
+          <w:p>
+            <w:pPr>
+              <w:spacing w:after="0"/>
+            </w:pPr>
+            <w:r>
+              <w:rPr>
+                <w:rFonts w:ascii="Times New Roman" w:cs="Times New Roman" w:eastAsia="Times New Roman" w:hAnsi="Times New Roman"/>
+                <w:sz w:val="20"/>
+                <w:szCs w:val="20"/>
+              </w:rPr>
+              <w:t xml:space="preserve">−21,348 [−25,858, −17,395] *</w:t>
+            </w:r>
+          </w:p>
+        </w:tc>
+      </w:tr>
+      <w:tr>
+        <w:tc>
+          <w:tcPr>
+            <w:tcW w:type="dxa" w:w="1404"/>
+            <w:tcBorders>
+              <w:top w:val="single" w:color="808080" w:sz="4"/>
+              <w:left w:val="single" w:color="808080" w:sz="4"/>
+              <w:bottom w:val="single" w:color="808080" w:sz="4"/>
+              <w:right w:val="single" w:color="808080" w:sz="4"/>
+            </w:tcBorders>
+            <w:tcMar>
+              <w:top w:type="dxa" w:w="40"/>
+              <w:left w:type="dxa" w:w="80"/>
+              <w:bottom w:type="dxa" w:w="40"/>
+              <w:right w:type="dxa" w:w="80"/>
+            </w:tcMar>
+          </w:tcPr>
+          <w:p>
+            <w:pPr>
+              <w:spacing w:after="0"/>
+            </w:pPr>
+            <w:r>
+              <w:rPr>
+                <w:rFonts w:ascii="Times New Roman" w:cs="Times New Roman" w:eastAsia="Times New Roman" w:hAnsi="Times New Roman"/>
+                <w:sz w:val="20"/>
+                <w:szCs w:val="20"/>
+              </w:rPr>
+              <w:t xml:space="preserve">12</w:t>
+            </w:r>
+          </w:p>
+        </w:tc>
+        <w:tc>
+          <w:tcPr>
+            <w:tcW w:type="dxa" w:w="3810"/>
+            <w:tcBorders>
+              <w:top w:val="single" w:color="808080" w:sz="4"/>
+              <w:left w:val="single" w:color="808080" w:sz="4"/>
+              <w:bottom w:val="single" w:color="808080" w:sz="4"/>
+              <w:right w:val="single" w:color="808080" w:sz="4"/>
+            </w:tcBorders>
+            <w:tcMar>
+              <w:top w:type="dxa" w:w="40"/>
+              <w:left w:type="dxa" w:w="80"/>
+              <w:bottom w:type="dxa" w:w="40"/>
+              <w:right w:type="dxa" w:w="80"/>
+            </w:tcMar>
+          </w:tcPr>
+          <w:p>
+            <w:pPr>
+              <w:spacing w:after="0"/>
+            </w:pPr>
+            <w:r>
+              <w:rPr>
+                <w:rFonts w:ascii="Times New Roman" w:cs="Times New Roman" w:eastAsia="Times New Roman" w:hAnsi="Times New Roman"/>
+                <w:sz w:val="20"/>
+                <w:szCs w:val="20"/>
+              </w:rPr>
+              <w:t xml:space="preserve">+13.0 [+10.4, +15.7] *</w:t>
+            </w:r>
+          </w:p>
+        </w:tc>
+        <w:tc>
+          <w:tcPr>
+            <w:tcW w:type="dxa" w:w="3812"/>
+            <w:tcBorders>
+              <w:top w:val="single" w:color="808080" w:sz="4"/>
+              <w:left w:val="single" w:color="808080" w:sz="4"/>
+              <w:bottom w:val="single" w:color="808080" w:sz="4"/>
+              <w:right w:val="single" w:color="808080" w:sz="4"/>
+            </w:tcBorders>
+            <w:tcMar>
+              <w:top w:type="dxa" w:w="40"/>
+              <w:left w:type="dxa" w:w="80"/>
+              <w:bottom w:type="dxa" w:w="40"/>
+              <w:right w:type="dxa" w:w="80"/>
+            </w:tcMar>
+          </w:tcPr>
+          <w:p>
+            <w:pPr>
+              <w:spacing w:after="0"/>
+            </w:pPr>
+            <w:r>
+              <w:rPr>
+                <w:rFonts w:ascii="Times New Roman" w:cs="Times New Roman" w:eastAsia="Times New Roman" w:hAnsi="Times New Roman"/>
+                <w:sz w:val="20"/>
+                <w:szCs w:val="20"/>
+              </w:rPr>
+              <w:t xml:space="preserve">−22,582 [−27,817, −18,148] *</w:t>
+            </w:r>
+          </w:p>
+        </w:tc>
+      </w:tr>
+      <w:tr>
+        <w:tc>
+          <w:tcPr>
+            <w:tcW w:type="dxa" w:w="1404"/>
+            <w:tcBorders>
+              <w:top w:val="single" w:color="808080" w:sz="4"/>
+              <w:left w:val="single" w:color="808080" w:sz="4"/>
+              <w:bottom w:val="single" w:color="808080" w:sz="4"/>
+              <w:right w:val="single" w:color="808080" w:sz="4"/>
+            </w:tcBorders>
+            <w:tcMar>
+              <w:top w:type="dxa" w:w="40"/>
+              <w:left w:type="dxa" w:w="80"/>
+              <w:bottom w:type="dxa" w:w="40"/>
+              <w:right w:type="dxa" w:w="80"/>
+            </w:tcMar>
+          </w:tcPr>
+          <w:p>
+            <w:pPr>
+              <w:spacing w:after="0"/>
+            </w:pPr>
+            <w:r>
+              <w:rPr>
+                <w:rFonts w:ascii="Times New Roman" w:cs="Times New Roman" w:eastAsia="Times New Roman" w:hAnsi="Times New Roman"/>
+                <w:sz w:val="20"/>
+                <w:szCs w:val="20"/>
+              </w:rPr>
+              <w:t xml:space="preserve">20</w:t>
+            </w:r>
+          </w:p>
+        </w:tc>
+        <w:tc>
+          <w:tcPr>
+            <w:tcW w:type="dxa" w:w="3810"/>
+            <w:tcBorders>
+              <w:top w:val="single" w:color="808080" w:sz="4"/>
+              <w:left w:val="single" w:color="808080" w:sz="4"/>
+              <w:bottom w:val="single" w:color="808080" w:sz="4"/>
+              <w:right w:val="single" w:color="808080" w:sz="4"/>
+            </w:tcBorders>
+            <w:tcMar>
+              <w:top w:type="dxa" w:w="40"/>
+              <w:left w:type="dxa" w:w="80"/>
+              <w:bottom w:type="dxa" w:w="40"/>
+              <w:right w:type="dxa" w:w="80"/>
+            </w:tcMar>
+          </w:tcPr>
+          <w:p>
+            <w:pPr>
+              <w:spacing w:after="0"/>
+            </w:pPr>
+            <w:r>
+              <w:rPr>
+                <w:rFonts w:ascii="Times New Roman" w:cs="Times New Roman" w:eastAsia="Times New Roman" w:hAnsi="Times New Roman"/>
+                <w:sz w:val="20"/>
+                <w:szCs w:val="20"/>
+              </w:rPr>
+              <w:t xml:space="preserve">+15.0 [+12.0, +18.5] *</w:t>
+            </w:r>
+          </w:p>
+        </w:tc>
+        <w:tc>
+          <w:tcPr>
+            <w:tcW w:type="dxa" w:w="3812"/>
+            <w:tcBorders>
+              <w:top w:val="single" w:color="808080" w:sz="4"/>
+              <w:left w:val="single" w:color="808080" w:sz="4"/>
+              <w:bottom w:val="single" w:color="808080" w:sz="4"/>
+              <w:right w:val="single" w:color="808080" w:sz="4"/>
+            </w:tcBorders>
+            <w:tcMar>
+              <w:top w:type="dxa" w:w="40"/>
+              <w:left w:type="dxa" w:w="80"/>
+              <w:bottom w:type="dxa" w:w="40"/>
+              <w:right w:type="dxa" w:w="80"/>
+            </w:tcMar>
+          </w:tcPr>
+          <w:p>
+            <w:pPr>
+              <w:spacing w:after="0"/>
+            </w:pPr>
+            <w:r>
+              <w:rPr>
+                <w:rFonts w:ascii="Times New Roman" w:cs="Times New Roman" w:eastAsia="Times New Roman" w:hAnsi="Times New Roman"/>
+                <w:sz w:val="20"/>
+                <w:szCs w:val="20"/>
+              </w:rPr>
+              <w:t xml:space="preserve">−23,332 [−28,872, −18,627] *</w:t>
+            </w:r>
+          </w:p>
+        </w:tc>
+      </w:tr>
+    </w:tbl>
+    <w:p>
+      <w:pPr>
+        <w:spacing w:after="160"/>
+      </w:pPr>
+    </w:p>
+    <w:p>
+      <w:pPr>
+        <w:spacing w:after="120" w:line="336"/>
+        <w:jc w:val="both"/>
+      </w:pPr>
+      <w:r>
+        <w:rPr>
+          <w:rFonts w:ascii="Times New Roman" w:cs="Times New Roman" w:eastAsia="Times New Roman" w:hAnsi="Times New Roman"/>
+          <w:b/>
+          <w:bCs/>
+        </w:rPr>
+        <w:t xml:space="preserve">At equal N_MIN the two forecasters do not produce a better and a worse policy; they produce different operating points.</w:t>
+      </w:r>
+      <w:r>
+        <w:rPr>
+          <w:rFonts w:ascii="Times New Roman" w:cs="Times New Roman" w:eastAsia="Times New Roman" w:hAnsi="Times New Roman"/>
+        </w:rPr>
+        <w:t xml:space="preserve"> LightGBM lets the branch fire about twice as often, so P2 waits more, builds batches 26–47 % larger, and trades 2–15 slots of tail latency for 17,000–23,000 lovelace less per user — every difference significant. Equal N_MIN is therefore not a like-for-like comparison, and the question A2 asks is answered by the frontier instead.</w:t>
+      </w:r>
+    </w:p>
+    <w:p>
+      <w:pPr>
+        <w:spacing w:after="120" w:line="336"/>
+        <w:jc w:val="both"/>
+      </w:pPr>
+      <w:r>
+        <w:rPr>
+          <w:rFonts w:ascii="Times New Roman" w:cs="Times New Roman" w:eastAsia="Times New Roman" w:hAnsi="Times New Roman"/>
+          <w:b/>
+          <w:bCs/>
+        </w:rPr>
+        <w:t xml:space="preserve">On the frontier, the learned forecaster helps the policy.</w:t>
+      </w:r>
+      <w:r>
+        <w:rPr>
+          <w:rFonts w:ascii="Times New Roman" w:cs="Times New Roman" w:eastAsia="Times New Roman" w:hAnsi="Times New Roman"/>
+        </w:rPr>
+        <w:t xml:space="preserve"> LightGBM at N_MIN = 4 (127.0 slots, 120,945 lovelace) is at least as fast and cheaper than E4b at N_MIN = 8, 12 and 20, so it dominates three of E4b’s five points; no LightGBM point is dominated by E4b. E4b cannot reach below about 123,000 lovelace at any setting, because its weak reversion rarely justifies a long wait, while LightGBM reaches 101,747. LightGBM also matches ORACLE on per-user cost at every N_MIN, to within 0.7 %; its gap to ORACLE is in tail latency (up to 17 slots at N_MIN = 20), consistent with the lagging forecast of F4.</w:t>
+      </w:r>
+    </w:p>
+    <w:p>
+      <w:pPr>
+        <w:spacing w:after="120" w:line="336"/>
+        <w:jc w:val="both"/>
+      </w:pPr>
+      <w:r>
+        <w:rPr>
+          <w:rFonts w:ascii="Times New Roman" w:cs="Times New Roman" w:eastAsia="Times New Roman" w:hAnsi="Times New Roman"/>
+        </w:rPr>
+        <w:t xml:space="preserve">The answer to A2 is therefore </w:t>
+      </w:r>
+      <w:r>
+        <w:rPr>
+          <w:rFonts w:ascii="Times New Roman" w:cs="Times New Roman" w:eastAsia="Times New Roman" w:hAnsi="Times New Roman"/>
+          <w:b/>
+          <w:bCs/>
+        </w:rPr>
+        <w:t xml:space="preserve">yes, but only for cost</w:t>
+      </w:r>
+      <w:r>
+        <w:rPr>
+          <w:rFonts w:ascii="Times New Roman" w:cs="Times New Roman" w:eastAsia="Times New Roman" w:hAnsi="Times New Roman"/>
+        </w:rPr>
+        <w:t xml:space="preserve">: a learned forecaster lets P2 buy larger batches more cheaply than a naive one, while contributing nothing to latency — the same division A1, A3 and the test-split ORACLE gap each point to. The frontier comparison rests on medians over 12 validation episodes and is descriptive; the equal-N_MIN paired tests are the formal result.</w:t>
+      </w:r>
+    </w:p>
+    <w:p>
+      <w:pPr>
+        <w:pStyle w:val="Heading3"/>
+      </w:pPr>
+      <w:r>
+        <w:t xml:space="preserve">A3 and A4 — agent ablations</w:t>
+      </w:r>
+    </w:p>
+    <w:p>
+      <w:pPr>
+        <w:spacing w:after="120" w:line="336"/>
+        <w:jc w:val="both"/>
+      </w:pPr>
+      <w:r>
+        <w:rPr>
+          <w:rFonts w:ascii="Times New Roman" w:cs="Times New Roman" w:eastAsia="Times New Roman" w:hAnsi="Times New Roman"/>
+        </w:rPr>
+        <w:t xml:space="preserve">Both ablations retrain five DQN seeds from scratch with the Phase 5 configuration — 200,000 steps, the same training windows and reward calibration — changing one thing each: </w:t>
+      </w:r>
+      <w:r>
+        <w:rPr>
+          <w:rFonts w:ascii="Times New Roman" w:cs="Times New Roman" w:eastAsia="Times New Roman" w:hAnsi="Times New Roman"/>
+          <w:b/>
+          <w:bCs/>
+        </w:rPr>
+        <w:t xml:space="preserve">A3</w:t>
+      </w:r>
+      <w:r>
+        <w:rPr>
+          <w:rFonts w:ascii="Times New Roman" w:cs="Times New Roman" w:eastAsia="Times New Roman" w:hAnsi="Times New Roman"/>
+        </w:rPr>
+        <w:t xml:space="preserve"> removes the forecast from the state (the three </w:t>
+      </w:r>
+      <w:r>
+        <w:rPr>
+          <w:rFonts w:ascii="Consolas" w:cs="Consolas" w:eastAsia="Consolas" w:hAnsi="Consolas"/>
+          <w:sz w:val="20"/>
+          <w:szCs w:val="20"/>
+        </w:rPr>
+        <w:t xml:space="preserve">fill_hat</w:t>
+      </w:r>
+      <w:r>
+        <w:rPr>
+          <w:rFonts w:ascii="Times New Roman" w:cs="Times New Roman" w:eastAsia="Times New Roman" w:hAnsi="Times New Roman"/>
+        </w:rPr>
+        <w:t xml:space="preserve"> inputs are constant zero), and </w:t>
+      </w:r>
+      <w:r>
+        <w:rPr>
+          <w:rFonts w:ascii="Times New Roman" w:cs="Times New Roman" w:eastAsia="Times New Roman" w:hAnsi="Times New Roman"/>
+          <w:b/>
+          <w:bCs/>
+        </w:rPr>
+        <w:t xml:space="preserve">A4</w:t>
+      </w:r>
+      <w:r>
+        <w:rPr>
+          <w:rFonts w:ascii="Times New Roman" w:cs="Times New Roman" w:eastAsia="Times New Roman" w:hAnsi="Times New Roman"/>
+        </w:rPr>
+        <w:t xml:space="preserve"> replaces the quadratic latency penalty with a linear one, recalibrated to unit scale. All ten agents are scored through the standard metric path on the same four validation episodes as Phase 5; the test split is not used again.</w:t>
+      </w:r>
+    </w:p>
+    <w:p>
+      <w:pPr>
+        <w:keepNext/>
+        <w:spacing w:after="200" w:before="60"/>
+        <w:jc w:val="center"/>
+      </w:pPr>
+      <w:r>
+        <w:rPr>
+          <w:rFonts w:ascii="Times New Roman" w:cs="Times New Roman" w:eastAsia="Times New Roman" w:hAnsi="Times New Roman"/>
+          <w:b/>
+          <w:bCs/>
+          <w:sz w:val="22"/>
+          <w:szCs w:val="22"/>
+        </w:rPr>
+        <w:t xml:space="preserve">Table 8.14: </w:t>
       </w:r>
       <w:r>
         <w:rPr>
@@ -36882,6 +39366,7 @@
     </w:p>
     <w:p>
       <w:pPr>
+        <w:keepNext/>
         <w:spacing w:after="200" w:before="60"/>
         <w:jc w:val="center"/>
       </w:pPr>
@@ -36893,7 +39378,7 @@
           <w:sz w:val="22"/>
           <w:szCs w:val="22"/>
         </w:rPr>
-        <w:t xml:space="preserve">Table 8.12: </w:t>
+        <w:t xml:space="preserve">Table 8.15: </w:t>
       </w:r>
       <w:r>
         <w:rPr>
@@ -37353,6 +39838,7 @@
     </w:p>
     <w:p>
       <w:pPr>
+        <w:keepNext/>
         <w:spacing w:after="200" w:before="60"/>
         <w:jc w:val="center"/>
       </w:pPr>
@@ -37364,7 +39850,7 @@
           <w:sz w:val="22"/>
           <w:szCs w:val="22"/>
         </w:rPr>
-        <w:t xml:space="preserve">Table 8.13: </w:t>
+        <w:t xml:space="preserve">Table 8.16: </w:t>
       </w:r>
       <w:r>
         <w:rPr>
@@ -38306,6 +40792,7 @@
     </w:p>
     <w:p>
       <w:pPr>
+        <w:keepNext/>
         <w:spacing w:after="200" w:before="60"/>
         <w:jc w:val="center"/>
       </w:pPr>
@@ -38317,7 +40804,7 @@
           <w:sz w:val="22"/>
           <w:szCs w:val="22"/>
         </w:rPr>
-        <w:t xml:space="preserve">Table 8.14: </w:t>
+        <w:t xml:space="preserve">Table 8.17: </w:t>
       </w:r>
       <w:r>
         <w:rPr>
@@ -39376,6 +41863,7 @@
     </w:p>
     <w:p>
       <w:pPr>
+        <w:keepNext/>
         <w:spacing w:after="200" w:before="60"/>
         <w:jc w:val="center"/>
       </w:pPr>

</xml_diff>

<commit_message>
Add phase 7 to the report: on-chain design, implementation, tests, status
New sections 5.11 (validator rules, pass-through fee, fee-adjusted pool
invariant, time-locked mint policy), 6.11-6.13 (Aiken validators, fee-settling
transaction builder, live batcher), 7.5 (on-chain and live-mode tests) and
8.12 (demonstration status, with deployment, T-O6 and D4 calibration marked
pending). Chapter 9 gains the contribution and the limitation; threats to
validity renumbered to 8.13. Corrects the live-forecast rationale, which
contradicted ablation A2.
</commit_message>
<xml_diff>
--- a/docs/report/Team11_Project_Report_Draft.docx
+++ b/docs/report/Team11_Project_Report_Draft.docx
@@ -680,16 +680,50 @@
       <w:r>
         <w:rPr>
           <w:rFonts w:ascii="Times New Roman" w:cs="Times New Roman" w:eastAsia="Times New Roman" w:hAnsi="Times New Roman"/>
+        </w:rPr>
+        <w:t xml:space="preserve">The project also delivers a minimal on-chain DEX for the Cardano preprod test network: Aiken validators that enforce each user’s slippage floor and a </w:t>
+      </w:r>
+      <w:r>
+        <w:rPr>
+          <w:rFonts w:ascii="Times New Roman" w:cs="Times New Roman" w:eastAsia="Times New Roman" w:hAnsi="Times New Roman"/>
           <w:b/>
           <w:bCs/>
         </w:rPr>
+        <w:t xml:space="preserve">pass-through batcher fee</w:t>
+      </w:r>
+      <w:r>
+        <w:rPr>
+          <w:rFonts w:ascii="Times New Roman" w:cs="Times New Roman" w:eastAsia="Times New Roman" w:hAnsi="Times New Roman"/>
+        </w:rPr>
+        <w:t xml:space="preserve">, so the amortization the policies optimise reaches users rather than the operator, together with a live batcher that runs the simulator’s decision loop against the chain. Both are built and tested offline. </w:t>
+      </w:r>
+      <w:r>
+        <w:rPr>
+          <w:rFonts w:ascii="Times New Roman" w:cs="Times New Roman" w:eastAsia="Times New Roman" w:hAnsi="Times New Roman"/>
+          <w:highlight w:val="yellow"/>
+          <w:highlightCs w:val="yellow"/>
+        </w:rPr>
+        <w:t xml:space="preserve">PENDING: preprod deployment and the end-to-end swap</w:t>
+      </w:r>
+    </w:p>
+    <w:p>
+      <w:pPr>
+        <w:spacing w:after="120" w:line="336"/>
+        <w:jc w:val="both"/>
+      </w:pPr>
+      <w:r>
+        <w:rPr>
+          <w:rFonts w:ascii="Times New Roman" w:cs="Times New Roman" w:eastAsia="Times New Roman" w:hAnsi="Times New Roman"/>
+          <w:b/>
+          <w:bCs/>
+        </w:rPr>
         <w:t xml:space="preserve">Keywords:</w:t>
       </w:r>
       <w:r>
         <w:rPr>
           <w:rFonts w:ascii="Times New Roman" w:cs="Times New Roman" w:eastAsia="Times New Roman" w:hAnsi="Times New Roman"/>
         </w:rPr>
-        <w:t xml:space="preserve"> Cardano, eUTXO, decentralized exchange, transaction batching, reinforcement learning, DQN, LightGBM, discrete-event simulation.</w:t>
+        <w:t xml:space="preserve"> Cardano, eUTXO, decentralized exchange, transaction batching, reinforcement learning, DQN, LightGBM, discrete-event simulation, Aiken, Plutus.</w:t>
       </w:r>
     </w:p>
     <w:p>
@@ -1938,6 +1972,130 @@
                 <w:sz w:val="20"/>
                 <w:szCs w:val="20"/>
               </w:rPr>
+              <w:t xml:space="preserve">NFT</w:t>
+            </w:r>
+          </w:p>
+        </w:tc>
+        <w:tc>
+          <w:tcPr>
+            <w:tcW w:type="dxa" w:w="6820"/>
+            <w:tcBorders>
+              <w:top w:val="single" w:color="808080" w:sz="4"/>
+              <w:left w:val="single" w:color="808080" w:sz="4"/>
+              <w:bottom w:val="single" w:color="808080" w:sz="4"/>
+              <w:right w:val="single" w:color="808080" w:sz="4"/>
+            </w:tcBorders>
+            <w:tcMar>
+              <w:top w:type="dxa" w:w="40"/>
+              <w:left w:type="dxa" w:w="80"/>
+              <w:bottom w:type="dxa" w:w="40"/>
+              <w:right w:type="dxa" w:w="80"/>
+            </w:tcMar>
+          </w:tcPr>
+          <w:p>
+            <w:pPr>
+              <w:spacing w:after="0"/>
+            </w:pPr>
+            <w:r>
+              <w:rPr>
+                <w:rFonts w:ascii="Times New Roman" w:cs="Times New Roman" w:eastAsia="Times New Roman" w:hAnsi="Times New Roman"/>
+                <w:sz w:val="20"/>
+                <w:szCs w:val="20"/>
+              </w:rPr>
+              <w:t xml:space="preserve">Non-Fungible Token (here, the token that identifies the pool)</w:t>
+            </w:r>
+          </w:p>
+        </w:tc>
+      </w:tr>
+      <w:tr>
+        <w:tc>
+          <w:tcPr>
+            <w:tcW w:type="dxa" w:w="2206"/>
+            <w:tcBorders>
+              <w:top w:val="single" w:color="808080" w:sz="4"/>
+              <w:left w:val="single" w:color="808080" w:sz="4"/>
+              <w:bottom w:val="single" w:color="808080" w:sz="4"/>
+              <w:right w:val="single" w:color="808080" w:sz="4"/>
+            </w:tcBorders>
+            <w:tcMar>
+              <w:top w:type="dxa" w:w="40"/>
+              <w:left w:type="dxa" w:w="80"/>
+              <w:bottom w:type="dxa" w:w="40"/>
+              <w:right w:type="dxa" w:w="80"/>
+            </w:tcMar>
+          </w:tcPr>
+          <w:p>
+            <w:pPr>
+              <w:spacing w:after="0"/>
+            </w:pPr>
+            <w:r>
+              <w:rPr>
+                <w:rFonts w:ascii="Times New Roman" w:cs="Times New Roman" w:eastAsia="Times New Roman" w:hAnsi="Times New Roman"/>
+                <w:sz w:val="20"/>
+                <w:szCs w:val="20"/>
+              </w:rPr>
+              <w:t xml:space="preserve">Plutus V3</w:t>
+            </w:r>
+          </w:p>
+        </w:tc>
+        <w:tc>
+          <w:tcPr>
+            <w:tcW w:type="dxa" w:w="6820"/>
+            <w:tcBorders>
+              <w:top w:val="single" w:color="808080" w:sz="4"/>
+              <w:left w:val="single" w:color="808080" w:sz="4"/>
+              <w:bottom w:val="single" w:color="808080" w:sz="4"/>
+              <w:right w:val="single" w:color="808080" w:sz="4"/>
+            </w:tcBorders>
+            <w:tcMar>
+              <w:top w:type="dxa" w:w="40"/>
+              <w:left w:type="dxa" w:w="80"/>
+              <w:bottom w:type="dxa" w:w="40"/>
+              <w:right w:type="dxa" w:w="80"/>
+            </w:tcMar>
+          </w:tcPr>
+          <w:p>
+            <w:pPr>
+              <w:spacing w:after="0"/>
+            </w:pPr>
+            <w:r>
+              <w:rPr>
+                <w:rFonts w:ascii="Times New Roman" w:cs="Times New Roman" w:eastAsia="Times New Roman" w:hAnsi="Times New Roman"/>
+                <w:sz w:val="20"/>
+                <w:szCs w:val="20"/>
+              </w:rPr>
+              <w:t xml:space="preserve">The Cardano smart-contract execution language targeted by Aiken</w:t>
+            </w:r>
+          </w:p>
+        </w:tc>
+      </w:tr>
+      <w:tr>
+        <w:tc>
+          <w:tcPr>
+            <w:tcW w:type="dxa" w:w="2206"/>
+            <w:tcBorders>
+              <w:top w:val="single" w:color="808080" w:sz="4"/>
+              <w:left w:val="single" w:color="808080" w:sz="4"/>
+              <w:bottom w:val="single" w:color="808080" w:sz="4"/>
+              <w:right w:val="single" w:color="808080" w:sz="4"/>
+            </w:tcBorders>
+            <w:tcMar>
+              <w:top w:type="dxa" w:w="40"/>
+              <w:left w:type="dxa" w:w="80"/>
+              <w:bottom w:type="dxa" w:w="40"/>
+              <w:right w:type="dxa" w:w="80"/>
+            </w:tcMar>
+          </w:tcPr>
+          <w:p>
+            <w:pPr>
+              <w:spacing w:after="0"/>
+            </w:pPr>
+            <w:r>
+              <w:rPr>
+                <w:rFonts w:ascii="Times New Roman" w:cs="Times New Roman" w:eastAsia="Times New Roman" w:hAnsi="Times New Roman"/>
+                <w:sz w:val="20"/>
+                <w:szCs w:val="20"/>
+              </w:rPr>
               <w:t xml:space="preserve">PPO</w:t>
             </w:r>
           </w:p>
@@ -3295,7 +3453,7 @@
         <w:rPr>
           <w:rFonts w:ascii="Times New Roman" w:cs="Times New Roman" w:eastAsia="Times New Roman" w:hAnsi="Times New Roman"/>
         </w:rPr>
-        <w:t xml:space="preserve">Every reported result is produced in a simulator that replays real mainnet blocks. Its assumptions are stated in Section 5.9 and their effect on validity is discussed in Section 8.12.</w:t>
+        <w:t xml:space="preserve">Every reported result is produced in a simulator that replays real mainnet blocks. Its assumptions are stated in Section 5.9 and their effect on validity is discussed in Section 8.13.</w:t>
       </w:r>
     </w:p>
     <w:p>
@@ -9607,7 +9765,7 @@
                 <w:sz w:val="20"/>
                 <w:szCs w:val="20"/>
               </w:rPr>
-              <w:t xml:space="preserve">Tx building / on-chain (optional)</w:t>
+              <w:t xml:space="preserve">Tx building (Phase 7)</w:t>
             </w:r>
           </w:p>
         </w:tc>
@@ -9637,7 +9795,7 @@
                 <w:sz w:val="20"/>
                 <w:szCs w:val="20"/>
               </w:rPr>
-              <w:t xml:space="preserve">PyCardano, Aiken</w:t>
+              <w:t xml:space="preserve">PyCardano 0.14</w:t>
             </w:r>
           </w:p>
         </w:tc>
@@ -9667,7 +9825,99 @@
                 <w:sz w:val="20"/>
                 <w:szCs w:val="20"/>
               </w:rPr>
-              <w:t xml:space="preserve">Pure-Python transaction building; modern Cardano contract language</w:t>
+              <w:t xml:space="preserve">Builds, balances and signs transactions in pure Python and submits through Blockfrost; no Cardano node required</w:t>
+            </w:r>
+          </w:p>
+        </w:tc>
+      </w:tr>
+      <w:tr>
+        <w:tc>
+          <w:tcPr>
+            <w:tcW w:type="dxa" w:w="1805"/>
+            <w:tcBorders>
+              <w:top w:val="single" w:color="808080" w:sz="4"/>
+              <w:left w:val="single" w:color="808080" w:sz="4"/>
+              <w:bottom w:val="single" w:color="808080" w:sz="4"/>
+              <w:right w:val="single" w:color="808080" w:sz="4"/>
+            </w:tcBorders>
+            <w:tcMar>
+              <w:top w:type="dxa" w:w="40"/>
+              <w:left w:type="dxa" w:w="80"/>
+              <w:bottom w:type="dxa" w:w="40"/>
+              <w:right w:type="dxa" w:w="80"/>
+            </w:tcMar>
+          </w:tcPr>
+          <w:p>
+            <w:pPr>
+              <w:spacing w:after="0"/>
+            </w:pPr>
+            <w:r>
+              <w:rPr>
+                <w:rFonts w:ascii="Times New Roman" w:cs="Times New Roman" w:eastAsia="Times New Roman" w:hAnsi="Times New Roman"/>
+                <w:sz w:val="20"/>
+                <w:szCs w:val="20"/>
+              </w:rPr>
+              <w:t xml:space="preserve">On-chain (Phase 7)</w:t>
+            </w:r>
+          </w:p>
+        </w:tc>
+        <w:tc>
+          <w:tcPr>
+            <w:tcW w:type="dxa" w:w="2808"/>
+            <w:tcBorders>
+              <w:top w:val="single" w:color="808080" w:sz="4"/>
+              <w:left w:val="single" w:color="808080" w:sz="4"/>
+              <w:bottom w:val="single" w:color="808080" w:sz="4"/>
+              <w:right w:val="single" w:color="808080" w:sz="4"/>
+            </w:tcBorders>
+            <w:tcMar>
+              <w:top w:type="dxa" w:w="40"/>
+              <w:left w:type="dxa" w:w="80"/>
+              <w:bottom w:type="dxa" w:w="40"/>
+              <w:right w:type="dxa" w:w="80"/>
+            </w:tcMar>
+          </w:tcPr>
+          <w:p>
+            <w:pPr>
+              <w:spacing w:after="0"/>
+            </w:pPr>
+            <w:r>
+              <w:rPr>
+                <w:rFonts w:ascii="Times New Roman" w:cs="Times New Roman" w:eastAsia="Times New Roman" w:hAnsi="Times New Roman"/>
+                <w:sz w:val="20"/>
+                <w:szCs w:val="20"/>
+              </w:rPr>
+              <w:t xml:space="preserve">Aiken v1.1.23, stdlib v3.1.0</w:t>
+            </w:r>
+          </w:p>
+        </w:tc>
+        <w:tc>
+          <w:tcPr>
+            <w:tcW w:type="dxa" w:w="4413"/>
+            <w:tcBorders>
+              <w:top w:val="single" w:color="808080" w:sz="4"/>
+              <w:left w:val="single" w:color="808080" w:sz="4"/>
+              <w:bottom w:val="single" w:color="808080" w:sz="4"/>
+              <w:right w:val="single" w:color="808080" w:sz="4"/>
+            </w:tcBorders>
+            <w:tcMar>
+              <w:top w:type="dxa" w:w="40"/>
+              <w:left w:type="dxa" w:w="80"/>
+              <w:bottom w:type="dxa" w:w="40"/>
+              <w:right w:type="dxa" w:w="80"/>
+            </w:tcMar>
+          </w:tcPr>
+          <w:p>
+            <w:pPr>
+              <w:spacing w:after="0"/>
+            </w:pPr>
+            <w:r>
+              <w:rPr>
+                <w:rFonts w:ascii="Times New Roman" w:cs="Times New Roman" w:eastAsia="Times New Roman" w:hAnsi="Times New Roman"/>
+                <w:sz w:val="20"/>
+                <w:szCs w:val="20"/>
+              </w:rPr>
+              <w:t xml:space="preserve">Compiles to Plutus V3 with a built-in unit-test runner; the language Minswap V2 itself is written in</w:t>
             </w:r>
           </w:p>
         </w:tc>
@@ -15434,19 +15684,938 @@
     </w:p>
     <w:p>
       <w:pPr>
-        <w:pStyle w:val="Heading1"/>
-        <w:pageBreakBefore/>
-      </w:pPr>
-      <w:r>
-        <w:t xml:space="preserve">Chapter 6: Implementation</w:t>
-      </w:r>
-    </w:p>
-    <w:p>
-      <w:pPr>
         <w:pStyle w:val="Heading2"/>
       </w:pPr>
       <w:r>
-        <w:t xml:space="preserve">6.1 Repository Structure</w:t>
+        <w:t xml:space="preserve">5.11 On-Chain DEX Design</w:t>
+      </w:r>
+    </w:p>
+    <w:p>
+      <w:pPr>
+        <w:spacing w:after="120" w:line="336"/>
+        <w:jc w:val="both"/>
+      </w:pPr>
+      <w:r>
+        <w:rPr>
+          <w:rFonts w:ascii="Times New Roman" w:cs="Times New Roman" w:eastAsia="Times New Roman" w:hAnsi="Times New Roman"/>
+        </w:rPr>
+        <w:t xml:space="preserve">Deployed DEXes bind their orders to their own validators and license their batchers, so a third-party batcher cannot serve them (ADR-003). The project therefore defines the smallest DEX that lets a batcher be demonstrated on the preprod test network: two Aiken validators compiled to Plutus V3, both parameterised by the batcher’s key hash. The batcher is </w:t>
+      </w:r>
+      <w:r>
+        <w:rPr>
+          <w:rFonts w:ascii="Times New Roman" w:cs="Times New Roman" w:eastAsia="Times New Roman" w:hAnsi="Times New Roman"/>
+          <w:b/>
+          <w:bCs/>
+        </w:rPr>
+        <w:t xml:space="preserve">untrusted for correctness</w:t>
+      </w:r>
+      <w:r>
+        <w:rPr>
+          <w:rFonts w:ascii="Times New Roman" w:cs="Times New Roman" w:eastAsia="Times New Roman" w:hAnsi="Times New Roman"/>
+        </w:rPr>
+        <w:t xml:space="preserve">: the validators, not the batcher, decide whether a user was treated fairly.</w:t>
+      </w:r>
+    </w:p>
+    <w:p>
+      <w:pPr>
+        <w:keepNext/>
+        <w:spacing w:after="200" w:before="60"/>
+        <w:jc w:val="center"/>
+      </w:pPr>
+      <w:r>
+        <w:rPr>
+          <w:rFonts w:ascii="Times New Roman" w:cs="Times New Roman" w:eastAsia="Times New Roman" w:hAnsi="Times New Roman"/>
+          <w:b/>
+          <w:bCs/>
+          <w:sz w:val="22"/>
+          <w:szCs w:val="22"/>
+        </w:rPr>
+        <w:t xml:space="preserve">Table 5.5: </w:t>
+      </w:r>
+      <w:r>
+        <w:rPr>
+          <w:rFonts w:ascii="Times New Roman" w:cs="Times New Roman" w:eastAsia="Times New Roman" w:hAnsi="Times New Roman"/>
+          <w:i/>
+          <w:iCs/>
+          <w:sz w:val="22"/>
+          <w:szCs w:val="22"/>
+        </w:rPr>
+        <w:t xml:space="preserve">Rules enforced on chain</w:t>
+      </w:r>
+    </w:p>
+    <w:tbl>
+      <w:tblPr>
+        <w:tblW w:type="dxa" w:w="9026"/>
+        <w:tblBorders>
+          <w:top w:val="single" w:color="auto" w:sz="4"/>
+          <w:left w:val="single" w:color="auto" w:sz="4"/>
+          <w:bottom w:val="single" w:color="auto" w:sz="4"/>
+          <w:right w:val="single" w:color="auto" w:sz="4"/>
+          <w:insideH w:val="single" w:color="auto" w:sz="4"/>
+          <w:insideV w:val="single" w:color="auto" w:sz="4"/>
+        </w:tblBorders>
+      </w:tblPr>
+      <w:tblGrid>
+        <w:gridCol w:w="2206"/>
+        <w:gridCol w:w="5215"/>
+        <w:gridCol w:w="1605"/>
+      </w:tblGrid>
+      <w:tr>
+        <w:trPr>
+          <w:tblHeader/>
+        </w:trPr>
+        <w:tc>
+          <w:tcPr>
+            <w:tcW w:type="dxa" w:w="2206"/>
+            <w:tcBorders>
+              <w:top w:val="single" w:color="808080" w:sz="4"/>
+              <w:left w:val="single" w:color="808080" w:sz="4"/>
+              <w:bottom w:val="single" w:color="808080" w:sz="4"/>
+              <w:right w:val="single" w:color="808080" w:sz="4"/>
+            </w:tcBorders>
+            <w:shd w:fill="D9E2F3" w:color="auto" w:val="clear"/>
+            <w:tcMar>
+              <w:top w:type="dxa" w:w="40"/>
+              <w:left w:type="dxa" w:w="80"/>
+              <w:bottom w:type="dxa" w:w="40"/>
+              <w:right w:type="dxa" w:w="80"/>
+            </w:tcMar>
+          </w:tcPr>
+          <w:p>
+            <w:pPr>
+              <w:spacing w:after="0"/>
+            </w:pPr>
+            <w:r>
+              <w:rPr>
+                <w:rFonts w:ascii="Times New Roman" w:cs="Times New Roman" w:eastAsia="Times New Roman" w:hAnsi="Times New Roman"/>
+                <w:b/>
+                <w:bCs/>
+                <w:sz w:val="20"/>
+                <w:szCs w:val="20"/>
+              </w:rPr>
+              <w:t xml:space="preserve">Validator</w:t>
+            </w:r>
+          </w:p>
+        </w:tc>
+        <w:tc>
+          <w:tcPr>
+            <w:tcW w:type="dxa" w:w="5215"/>
+            <w:tcBorders>
+              <w:top w:val="single" w:color="808080" w:sz="4"/>
+              <w:left w:val="single" w:color="808080" w:sz="4"/>
+              <w:bottom w:val="single" w:color="808080" w:sz="4"/>
+              <w:right w:val="single" w:color="808080" w:sz="4"/>
+            </w:tcBorders>
+            <w:shd w:fill="D9E2F3" w:color="auto" w:val="clear"/>
+            <w:tcMar>
+              <w:top w:type="dxa" w:w="40"/>
+              <w:left w:type="dxa" w:w="80"/>
+              <w:bottom w:type="dxa" w:w="40"/>
+              <w:right w:type="dxa" w:w="80"/>
+            </w:tcMar>
+          </w:tcPr>
+          <w:p>
+            <w:pPr>
+              <w:spacing w:after="0"/>
+            </w:pPr>
+            <w:r>
+              <w:rPr>
+                <w:rFonts w:ascii="Times New Roman" w:cs="Times New Roman" w:eastAsia="Times New Roman" w:hAnsi="Times New Roman"/>
+                <w:b/>
+                <w:bCs/>
+                <w:sz w:val="20"/>
+                <w:szCs w:val="20"/>
+              </w:rPr>
+              <w:t xml:space="preserve">Rule</w:t>
+            </w:r>
+          </w:p>
+        </w:tc>
+        <w:tc>
+          <w:tcPr>
+            <w:tcW w:type="dxa" w:w="1605"/>
+            <w:tcBorders>
+              <w:top w:val="single" w:color="808080" w:sz="4"/>
+              <w:left w:val="single" w:color="808080" w:sz="4"/>
+              <w:bottom w:val="single" w:color="808080" w:sz="4"/>
+              <w:right w:val="single" w:color="808080" w:sz="4"/>
+            </w:tcBorders>
+            <w:shd w:fill="D9E2F3" w:color="auto" w:val="clear"/>
+            <w:tcMar>
+              <w:top w:type="dxa" w:w="40"/>
+              <w:left w:type="dxa" w:w="80"/>
+              <w:bottom w:type="dxa" w:w="40"/>
+              <w:right w:type="dxa" w:w="80"/>
+            </w:tcMar>
+          </w:tcPr>
+          <w:p>
+            <w:pPr>
+              <w:spacing w:after="0"/>
+            </w:pPr>
+            <w:r>
+              <w:rPr>
+                <w:rFonts w:ascii="Times New Roman" w:cs="Times New Roman" w:eastAsia="Times New Roman" w:hAnsi="Times New Roman"/>
+                <w:b/>
+                <w:bCs/>
+                <w:sz w:val="20"/>
+                <w:szCs w:val="20"/>
+              </w:rPr>
+              <w:t xml:space="preserve">Test</w:t>
+            </w:r>
+          </w:p>
+        </w:tc>
+      </w:tr>
+      <w:tr>
+        <w:tc>
+          <w:tcPr>
+            <w:tcW w:type="dxa" w:w="2206"/>
+            <w:tcBorders>
+              <w:top w:val="single" w:color="808080" w:sz="4"/>
+              <w:left w:val="single" w:color="808080" w:sz="4"/>
+              <w:bottom w:val="single" w:color="808080" w:sz="4"/>
+              <w:right w:val="single" w:color="808080" w:sz="4"/>
+            </w:tcBorders>
+            <w:tcMar>
+              <w:top w:type="dxa" w:w="40"/>
+              <w:left w:type="dxa" w:w="80"/>
+              <w:bottom w:type="dxa" w:w="40"/>
+              <w:right w:type="dxa" w:w="80"/>
+            </w:tcMar>
+          </w:tcPr>
+          <w:p>
+            <w:pPr>
+              <w:spacing w:after="0"/>
+            </w:pPr>
+            <w:r>
+              <w:rPr>
+                <w:rFonts w:ascii="Times New Roman" w:cs="Times New Roman" w:eastAsia="Times New Roman" w:hAnsi="Times New Roman"/>
+                <w:sz w:val="20"/>
+                <w:szCs w:val="20"/>
+              </w:rPr>
+              <w:t xml:space="preserve">order.ak — Cancel</w:t>
+            </w:r>
+          </w:p>
+        </w:tc>
+        <w:tc>
+          <w:tcPr>
+            <w:tcW w:type="dxa" w:w="5215"/>
+            <w:tcBorders>
+              <w:top w:val="single" w:color="808080" w:sz="4"/>
+              <w:left w:val="single" w:color="808080" w:sz="4"/>
+              <w:bottom w:val="single" w:color="808080" w:sz="4"/>
+              <w:right w:val="single" w:color="808080" w:sz="4"/>
+            </w:tcBorders>
+            <w:tcMar>
+              <w:top w:type="dxa" w:w="40"/>
+              <w:left w:type="dxa" w:w="80"/>
+              <w:bottom w:type="dxa" w:w="40"/>
+              <w:right w:type="dxa" w:w="80"/>
+            </w:tcMar>
+          </w:tcPr>
+          <w:p>
+            <w:pPr>
+              <w:spacing w:after="0"/>
+            </w:pPr>
+            <w:r>
+              <w:rPr>
+                <w:rFonts w:ascii="Times New Roman" w:cs="Times New Roman" w:eastAsia="Times New Roman" w:hAnsi="Times New Roman"/>
+                <w:sz w:val="20"/>
+                <w:szCs w:val="20"/>
+              </w:rPr>
+              <w:t xml:space="preserve">The order’s owner has signed; they can always reclaim an unbatched order</w:t>
+            </w:r>
+          </w:p>
+        </w:tc>
+        <w:tc>
+          <w:tcPr>
+            <w:tcW w:type="dxa" w:w="1605"/>
+            <w:tcBorders>
+              <w:top w:val="single" w:color="808080" w:sz="4"/>
+              <w:left w:val="single" w:color="808080" w:sz="4"/>
+              <w:bottom w:val="single" w:color="808080" w:sz="4"/>
+              <w:right w:val="single" w:color="808080" w:sz="4"/>
+            </w:tcBorders>
+            <w:tcMar>
+              <w:top w:type="dxa" w:w="40"/>
+              <w:left w:type="dxa" w:w="80"/>
+              <w:bottom w:type="dxa" w:w="40"/>
+              <w:right w:type="dxa" w:w="80"/>
+            </w:tcMar>
+          </w:tcPr>
+          <w:p>
+            <w:pPr>
+              <w:spacing w:after="0"/>
+            </w:pPr>
+            <w:r>
+              <w:rPr>
+                <w:rFonts w:ascii="Times New Roman" w:cs="Times New Roman" w:eastAsia="Times New Roman" w:hAnsi="Times New Roman"/>
+                <w:sz w:val="20"/>
+                <w:szCs w:val="20"/>
+              </w:rPr>
+              <w:t xml:space="preserve">T-O1</w:t>
+            </w:r>
+          </w:p>
+        </w:tc>
+      </w:tr>
+      <w:tr>
+        <w:tc>
+          <w:tcPr>
+            <w:tcW w:type="dxa" w:w="2206"/>
+            <w:tcBorders>
+              <w:top w:val="single" w:color="808080" w:sz="4"/>
+              <w:left w:val="single" w:color="808080" w:sz="4"/>
+              <w:bottom w:val="single" w:color="808080" w:sz="4"/>
+              <w:right w:val="single" w:color="808080" w:sz="4"/>
+            </w:tcBorders>
+            <w:tcMar>
+              <w:top w:type="dxa" w:w="40"/>
+              <w:left w:type="dxa" w:w="80"/>
+              <w:bottom w:type="dxa" w:w="40"/>
+              <w:right w:type="dxa" w:w="80"/>
+            </w:tcMar>
+          </w:tcPr>
+          <w:p>
+            <w:pPr>
+              <w:spacing w:after="0"/>
+            </w:pPr>
+            <w:r>
+              <w:rPr>
+                <w:rFonts w:ascii="Times New Roman" w:cs="Times New Roman" w:eastAsia="Times New Roman" w:hAnsi="Times New Roman"/>
+                <w:sz w:val="20"/>
+                <w:szCs w:val="20"/>
+              </w:rPr>
+              <w:t xml:space="preserve">order.ak — Execute</w:t>
+            </w:r>
+          </w:p>
+        </w:tc>
+        <w:tc>
+          <w:tcPr>
+            <w:tcW w:type="dxa" w:w="5215"/>
+            <w:tcBorders>
+              <w:top w:val="single" w:color="808080" w:sz="4"/>
+              <w:left w:val="single" w:color="808080" w:sz="4"/>
+              <w:bottom w:val="single" w:color="808080" w:sz="4"/>
+              <w:right w:val="single" w:color="808080" w:sz="4"/>
+            </w:tcBorders>
+            <w:tcMar>
+              <w:top w:type="dxa" w:w="40"/>
+              <w:left w:type="dxa" w:w="80"/>
+              <w:bottom w:type="dxa" w:w="40"/>
+              <w:right w:type="dxa" w:w="80"/>
+            </w:tcMar>
+          </w:tcPr>
+          <w:p>
+            <w:pPr>
+              <w:spacing w:after="0"/>
+            </w:pPr>
+            <w:r>
+              <w:rPr>
+                <w:rFonts w:ascii="Times New Roman" w:cs="Times New Roman" w:eastAsia="Times New Roman" w:hAnsi="Times New Roman"/>
+                <w:sz w:val="20"/>
+                <w:szCs w:val="20"/>
+              </w:rPr>
+              <w:t xml:space="preserve">Only the authorised batcher key executes</w:t>
+            </w:r>
+          </w:p>
+        </w:tc>
+        <w:tc>
+          <w:tcPr>
+            <w:tcW w:type="dxa" w:w="1605"/>
+            <w:tcBorders>
+              <w:top w:val="single" w:color="808080" w:sz="4"/>
+              <w:left w:val="single" w:color="808080" w:sz="4"/>
+              <w:bottom w:val="single" w:color="808080" w:sz="4"/>
+              <w:right w:val="single" w:color="808080" w:sz="4"/>
+            </w:tcBorders>
+            <w:tcMar>
+              <w:top w:type="dxa" w:w="40"/>
+              <w:left w:type="dxa" w:w="80"/>
+              <w:bottom w:type="dxa" w:w="40"/>
+              <w:right w:type="dxa" w:w="80"/>
+            </w:tcMar>
+          </w:tcPr>
+          <w:p>
+            <w:pPr>
+              <w:spacing w:after="0"/>
+            </w:pPr>
+            <w:r>
+              <w:rPr>
+                <w:rFonts w:ascii="Times New Roman" w:cs="Times New Roman" w:eastAsia="Times New Roman" w:hAnsi="Times New Roman"/>
+                <w:sz w:val="20"/>
+                <w:szCs w:val="20"/>
+              </w:rPr>
+              <w:t xml:space="preserve">T-O3</w:t>
+            </w:r>
+          </w:p>
+        </w:tc>
+      </w:tr>
+      <w:tr>
+        <w:tc>
+          <w:tcPr>
+            <w:tcW w:type="dxa" w:w="2206"/>
+            <w:tcBorders>
+              <w:top w:val="single" w:color="808080" w:sz="4"/>
+              <w:left w:val="single" w:color="808080" w:sz="4"/>
+              <w:bottom w:val="single" w:color="808080" w:sz="4"/>
+              <w:right w:val="single" w:color="808080" w:sz="4"/>
+            </w:tcBorders>
+            <w:tcMar>
+              <w:top w:type="dxa" w:w="40"/>
+              <w:left w:type="dxa" w:w="80"/>
+              <w:bottom w:type="dxa" w:w="40"/>
+              <w:right w:type="dxa" w:w="80"/>
+            </w:tcMar>
+          </w:tcPr>
+          <w:p>
+            <w:pPr>
+              <w:spacing w:after="0"/>
+            </w:pPr>
+            <w:r>
+              <w:rPr>
+                <w:rFonts w:ascii="Times New Roman" w:cs="Times New Roman" w:eastAsia="Times New Roman" w:hAnsi="Times New Roman"/>
+                <w:sz w:val="20"/>
+                <w:szCs w:val="20"/>
+              </w:rPr>
+              <w:t xml:space="preserve">order.ak — Execute</w:t>
+            </w:r>
+          </w:p>
+        </w:tc>
+        <w:tc>
+          <w:tcPr>
+            <w:tcW w:type="dxa" w:w="5215"/>
+            <w:tcBorders>
+              <w:top w:val="single" w:color="808080" w:sz="4"/>
+              <w:left w:val="single" w:color="808080" w:sz="4"/>
+              <w:bottom w:val="single" w:color="808080" w:sz="4"/>
+              <w:right w:val="single" w:color="808080" w:sz="4"/>
+            </w:tcBorders>
+            <w:tcMar>
+              <w:top w:type="dxa" w:w="40"/>
+              <w:left w:type="dxa" w:w="80"/>
+              <w:bottom w:type="dxa" w:w="40"/>
+              <w:right w:type="dxa" w:w="80"/>
+            </w:tcMar>
+          </w:tcPr>
+          <w:p>
+            <w:pPr>
+              <w:spacing w:after="0"/>
+            </w:pPr>
+            <w:r>
+              <w:rPr>
+                <w:rFonts w:ascii="Times New Roman" w:cs="Times New Roman" w:eastAsia="Times New Roman" w:hAnsi="Times New Roman"/>
+                <w:sz w:val="20"/>
+                <w:szCs w:val="20"/>
+              </w:rPr>
+              <w:t xml:space="preserve">The user is paid at least </w:t>
+            </w:r>
+            <w:r>
+              <w:rPr>
+                <w:rFonts w:ascii="Consolas" w:cs="Consolas" w:eastAsia="Consolas" w:hAnsi="Consolas"/>
+                <w:sz w:val="20"/>
+                <w:szCs w:val="20"/>
+              </w:rPr>
+              <w:t xml:space="preserve">min_out</w:t>
+            </w:r>
+            <w:r>
+              <w:rPr>
+                <w:rFonts w:ascii="Times New Roman" w:cs="Times New Roman" w:eastAsia="Times New Roman" w:hAnsi="Times New Roman"/>
+                <w:sz w:val="20"/>
+                <w:szCs w:val="20"/>
+              </w:rPr>
+              <w:t xml:space="preserve"> of the output asset, at the return address in the datum</w:t>
+            </w:r>
+          </w:p>
+        </w:tc>
+        <w:tc>
+          <w:tcPr>
+            <w:tcW w:type="dxa" w:w="1605"/>
+            <w:tcBorders>
+              <w:top w:val="single" w:color="808080" w:sz="4"/>
+              <w:left w:val="single" w:color="808080" w:sz="4"/>
+              <w:bottom w:val="single" w:color="808080" w:sz="4"/>
+              <w:right w:val="single" w:color="808080" w:sz="4"/>
+            </w:tcBorders>
+            <w:tcMar>
+              <w:top w:type="dxa" w:w="40"/>
+              <w:left w:type="dxa" w:w="80"/>
+              <w:bottom w:type="dxa" w:w="40"/>
+              <w:right w:type="dxa" w:w="80"/>
+            </w:tcMar>
+          </w:tcPr>
+          <w:p>
+            <w:pPr>
+              <w:spacing w:after="0"/>
+            </w:pPr>
+            <w:r>
+              <w:rPr>
+                <w:rFonts w:ascii="Times New Roman" w:cs="Times New Roman" w:eastAsia="Times New Roman" w:hAnsi="Times New Roman"/>
+                <w:sz w:val="20"/>
+                <w:szCs w:val="20"/>
+              </w:rPr>
+              <w:t xml:space="preserve">T-O2</w:t>
+            </w:r>
+          </w:p>
+        </w:tc>
+      </w:tr>
+      <w:tr>
+        <w:tc>
+          <w:tcPr>
+            <w:tcW w:type="dxa" w:w="2206"/>
+            <w:tcBorders>
+              <w:top w:val="single" w:color="808080" w:sz="4"/>
+              <w:left w:val="single" w:color="808080" w:sz="4"/>
+              <w:bottom w:val="single" w:color="808080" w:sz="4"/>
+              <w:right w:val="single" w:color="808080" w:sz="4"/>
+            </w:tcBorders>
+            <w:tcMar>
+              <w:top w:type="dxa" w:w="40"/>
+              <w:left w:type="dxa" w:w="80"/>
+              <w:bottom w:type="dxa" w:w="40"/>
+              <w:right w:type="dxa" w:w="80"/>
+            </w:tcMar>
+          </w:tcPr>
+          <w:p>
+            <w:pPr>
+              <w:spacing w:after="0"/>
+            </w:pPr>
+            <w:r>
+              <w:rPr>
+                <w:rFonts w:ascii="Times New Roman" w:cs="Times New Roman" w:eastAsia="Times New Roman" w:hAnsi="Times New Roman"/>
+                <w:sz w:val="20"/>
+                <w:szCs w:val="20"/>
+              </w:rPr>
+              <w:t xml:space="preserve">order.ak — Execute</w:t>
+            </w:r>
+          </w:p>
+        </w:tc>
+        <w:tc>
+          <w:tcPr>
+            <w:tcW w:type="dxa" w:w="5215"/>
+            <w:tcBorders>
+              <w:top w:val="single" w:color="808080" w:sz="4"/>
+              <w:left w:val="single" w:color="808080" w:sz="4"/>
+              <w:bottom w:val="single" w:color="808080" w:sz="4"/>
+              <w:right w:val="single" w:color="808080" w:sz="4"/>
+            </w:tcBorders>
+            <w:tcMar>
+              <w:top w:type="dxa" w:w="40"/>
+              <w:left w:type="dxa" w:w="80"/>
+              <w:bottom w:type="dxa" w:w="40"/>
+              <w:right w:type="dxa" w:w="80"/>
+            </w:tcMar>
+          </w:tcPr>
+          <w:p>
+            <w:pPr>
+              <w:spacing w:after="0"/>
+            </w:pPr>
+            <w:r>
+              <w:rPr>
+                <w:rFonts w:ascii="Times New Roman" w:cs="Times New Roman" w:eastAsia="Times New Roman" w:hAnsi="Times New Roman"/>
+                <w:sz w:val="20"/>
+                <w:szCs w:val="20"/>
+              </w:rPr>
+              <w:t xml:space="preserve">At most </w:t>
+            </w:r>
+            <w:r>
+              <w:rPr>
+                <w:rFonts w:ascii="Consolas" w:cs="Consolas" w:eastAsia="Consolas" w:hAnsi="Consolas"/>
+                <w:sz w:val="20"/>
+                <w:szCs w:val="20"/>
+              </w:rPr>
+              <w:t xml:space="preserve">fee / n + margin</w:t>
+            </w:r>
+            <w:r>
+              <w:rPr>
+                <w:rFonts w:ascii="Times New Roman" w:cs="Times New Roman" w:eastAsia="Times New Roman" w:hAnsi="Times New Roman"/>
+                <w:sz w:val="20"/>
+                <w:szCs w:val="20"/>
+              </w:rPr>
+              <w:t xml:space="preserve"> lovelace is kept back from the user, where </w:t>
+            </w:r>
+            <w:r>
+              <w:rPr>
+                <w:rFonts w:ascii="Consolas" w:cs="Consolas" w:eastAsia="Consolas" w:hAnsi="Consolas"/>
+                <w:sz w:val="20"/>
+                <w:szCs w:val="20"/>
+              </w:rPr>
+              <w:t xml:space="preserve">n</w:t>
+            </w:r>
+            <w:r>
+              <w:rPr>
+                <w:rFonts w:ascii="Times New Roman" w:cs="Times New Roman" w:eastAsia="Times New Roman" w:hAnsi="Times New Roman"/>
+                <w:sz w:val="20"/>
+                <w:szCs w:val="20"/>
+              </w:rPr>
+              <w:t xml:space="preserve"> is the number of orders in the batch</w:t>
+            </w:r>
+          </w:p>
+        </w:tc>
+        <w:tc>
+          <w:tcPr>
+            <w:tcW w:type="dxa" w:w="1605"/>
+            <w:tcBorders>
+              <w:top w:val="single" w:color="808080" w:sz="4"/>
+              <w:left w:val="single" w:color="808080" w:sz="4"/>
+              <w:bottom w:val="single" w:color="808080" w:sz="4"/>
+              <w:right w:val="single" w:color="808080" w:sz="4"/>
+            </w:tcBorders>
+            <w:tcMar>
+              <w:top w:type="dxa" w:w="40"/>
+              <w:left w:type="dxa" w:w="80"/>
+              <w:bottom w:type="dxa" w:w="40"/>
+              <w:right w:type="dxa" w:w="80"/>
+            </w:tcMar>
+          </w:tcPr>
+          <w:p>
+            <w:pPr>
+              <w:spacing w:after="0"/>
+            </w:pPr>
+            <w:r>
+              <w:rPr>
+                <w:rFonts w:ascii="Times New Roman" w:cs="Times New Roman" w:eastAsia="Times New Roman" w:hAnsi="Times New Roman"/>
+                <w:sz w:val="20"/>
+                <w:szCs w:val="20"/>
+              </w:rPr>
+              <w:t xml:space="preserve">T-O5</w:t>
+            </w:r>
+          </w:p>
+        </w:tc>
+      </w:tr>
+      <w:tr>
+        <w:tc>
+          <w:tcPr>
+            <w:tcW w:type="dxa" w:w="2206"/>
+            <w:tcBorders>
+              <w:top w:val="single" w:color="808080" w:sz="4"/>
+              <w:left w:val="single" w:color="808080" w:sz="4"/>
+              <w:bottom w:val="single" w:color="808080" w:sz="4"/>
+              <w:right w:val="single" w:color="808080" w:sz="4"/>
+            </w:tcBorders>
+            <w:tcMar>
+              <w:top w:type="dxa" w:w="40"/>
+              <w:left w:type="dxa" w:w="80"/>
+              <w:bottom w:type="dxa" w:w="40"/>
+              <w:right w:type="dxa" w:w="80"/>
+            </w:tcMar>
+          </w:tcPr>
+          <w:p>
+            <w:pPr>
+              <w:spacing w:after="0"/>
+            </w:pPr>
+            <w:r>
+              <w:rPr>
+                <w:rFonts w:ascii="Times New Roman" w:cs="Times New Roman" w:eastAsia="Times New Roman" w:hAnsi="Times New Roman"/>
+                <w:sz w:val="20"/>
+                <w:szCs w:val="20"/>
+              </w:rPr>
+              <w:t xml:space="preserve">order.ak — Execute</w:t>
+            </w:r>
+          </w:p>
+        </w:tc>
+        <w:tc>
+          <w:tcPr>
+            <w:tcW w:type="dxa" w:w="5215"/>
+            <w:tcBorders>
+              <w:top w:val="single" w:color="808080" w:sz="4"/>
+              <w:left w:val="single" w:color="808080" w:sz="4"/>
+              <w:bottom w:val="single" w:color="808080" w:sz="4"/>
+              <w:right w:val="single" w:color="808080" w:sz="4"/>
+            </w:tcBorders>
+            <w:tcMar>
+              <w:top w:type="dxa" w:w="40"/>
+              <w:left w:type="dxa" w:w="80"/>
+              <w:bottom w:type="dxa" w:w="40"/>
+              <w:right w:type="dxa" w:w="80"/>
+            </w:tcMar>
+          </w:tcPr>
+          <w:p>
+            <w:pPr>
+              <w:spacing w:after="0"/>
+            </w:pPr>
+            <w:r>
+              <w:rPr>
+                <w:rFonts w:ascii="Times New Roman" w:cs="Times New Roman" w:eastAsia="Times New Roman" w:hAnsi="Times New Roman"/>
+                <w:sz w:val="20"/>
+                <w:szCs w:val="20"/>
+              </w:rPr>
+              <w:t xml:space="preserve">The payout carries the order’s own output reference as its datum, so one payment cannot satisfy two orders</w:t>
+            </w:r>
+          </w:p>
+        </w:tc>
+        <w:tc>
+          <w:tcPr>
+            <w:tcW w:type="dxa" w:w="1605"/>
+            <w:tcBorders>
+              <w:top w:val="single" w:color="808080" w:sz="4"/>
+              <w:left w:val="single" w:color="808080" w:sz="4"/>
+              <w:bottom w:val="single" w:color="808080" w:sz="4"/>
+              <w:right w:val="single" w:color="808080" w:sz="4"/>
+            </w:tcBorders>
+            <w:tcMar>
+              <w:top w:type="dxa" w:w="40"/>
+              <w:left w:type="dxa" w:w="80"/>
+              <w:bottom w:type="dxa" w:w="40"/>
+              <w:right w:type="dxa" w:w="80"/>
+            </w:tcMar>
+          </w:tcPr>
+          <w:p>
+            <w:pPr>
+              <w:spacing w:after="0"/>
+            </w:pPr>
+            <w:r>
+              <w:rPr>
+                <w:rFonts w:ascii="Times New Roman" w:cs="Times New Roman" w:eastAsia="Times New Roman" w:hAnsi="Times New Roman"/>
+                <w:sz w:val="20"/>
+                <w:szCs w:val="20"/>
+              </w:rPr>
+              <w:t xml:space="preserve">Double satisfaction</w:t>
+            </w:r>
+          </w:p>
+        </w:tc>
+      </w:tr>
+      <w:tr>
+        <w:tc>
+          <w:tcPr>
+            <w:tcW w:type="dxa" w:w="2206"/>
+            <w:tcBorders>
+              <w:top w:val="single" w:color="808080" w:sz="4"/>
+              <w:left w:val="single" w:color="808080" w:sz="4"/>
+              <w:bottom w:val="single" w:color="808080" w:sz="4"/>
+              <w:right w:val="single" w:color="808080" w:sz="4"/>
+            </w:tcBorders>
+            <w:tcMar>
+              <w:top w:type="dxa" w:w="40"/>
+              <w:left w:type="dxa" w:w="80"/>
+              <w:bottom w:type="dxa" w:w="40"/>
+              <w:right w:type="dxa" w:w="80"/>
+            </w:tcMar>
+          </w:tcPr>
+          <w:p>
+            <w:pPr>
+              <w:spacing w:after="0"/>
+            </w:pPr>
+            <w:r>
+              <w:rPr>
+                <w:rFonts w:ascii="Times New Roman" w:cs="Times New Roman" w:eastAsia="Times New Roman" w:hAnsi="Times New Roman"/>
+                <w:sz w:val="20"/>
+                <w:szCs w:val="20"/>
+              </w:rPr>
+              <w:t xml:space="preserve">pool.ak</w:t>
+            </w:r>
+          </w:p>
+        </w:tc>
+        <w:tc>
+          <w:tcPr>
+            <w:tcW w:type="dxa" w:w="5215"/>
+            <w:tcBorders>
+              <w:top w:val="single" w:color="808080" w:sz="4"/>
+              <w:left w:val="single" w:color="808080" w:sz="4"/>
+              <w:bottom w:val="single" w:color="808080" w:sz="4"/>
+              <w:right w:val="single" w:color="808080" w:sz="4"/>
+            </w:tcBorders>
+            <w:tcMar>
+              <w:top w:type="dxa" w:w="40"/>
+              <w:left w:type="dxa" w:w="80"/>
+              <w:bottom w:type="dxa" w:w="40"/>
+              <w:right w:type="dxa" w:w="80"/>
+            </w:tcMar>
+          </w:tcPr>
+          <w:p>
+            <w:pPr>
+              <w:spacing w:after="0"/>
+            </w:pPr>
+            <w:r>
+              <w:rPr>
+                <w:rFonts w:ascii="Times New Roman" w:cs="Times New Roman" w:eastAsia="Times New Roman" w:hAnsi="Times New Roman"/>
+                <w:sz w:val="20"/>
+                <w:szCs w:val="20"/>
+              </w:rPr>
+              <w:t xml:space="preserve">Batcher-signed; exactly one continuing pool output, still holding the pool NFT; pool parameters unchanged</w:t>
+            </w:r>
+          </w:p>
+        </w:tc>
+        <w:tc>
+          <w:tcPr>
+            <w:tcW w:type="dxa" w:w="1605"/>
+            <w:tcBorders>
+              <w:top w:val="single" w:color="808080" w:sz="4"/>
+              <w:left w:val="single" w:color="808080" w:sz="4"/>
+              <w:bottom w:val="single" w:color="808080" w:sz="4"/>
+              <w:right w:val="single" w:color="808080" w:sz="4"/>
+            </w:tcBorders>
+            <w:tcMar>
+              <w:top w:type="dxa" w:w="40"/>
+              <w:left w:type="dxa" w:w="80"/>
+              <w:bottom w:type="dxa" w:w="40"/>
+              <w:right w:type="dxa" w:w="80"/>
+            </w:tcMar>
+          </w:tcPr>
+          <w:p>
+            <w:pPr>
+              <w:spacing w:after="0"/>
+            </w:pPr>
+            <w:r>
+              <w:rPr>
+                <w:rFonts w:ascii="Times New Roman" w:cs="Times New Roman" w:eastAsia="Times New Roman" w:hAnsi="Times New Roman"/>
+                <w:sz w:val="20"/>
+                <w:szCs w:val="20"/>
+              </w:rPr>
+              <w:t xml:space="preserve">T-O4</w:t>
+            </w:r>
+          </w:p>
+        </w:tc>
+      </w:tr>
+      <w:tr>
+        <w:tc>
+          <w:tcPr>
+            <w:tcW w:type="dxa" w:w="2206"/>
+            <w:tcBorders>
+              <w:top w:val="single" w:color="808080" w:sz="4"/>
+              <w:left w:val="single" w:color="808080" w:sz="4"/>
+              <w:bottom w:val="single" w:color="808080" w:sz="4"/>
+              <w:right w:val="single" w:color="808080" w:sz="4"/>
+            </w:tcBorders>
+            <w:tcMar>
+              <w:top w:type="dxa" w:w="40"/>
+              <w:left w:type="dxa" w:w="80"/>
+              <w:bottom w:type="dxa" w:w="40"/>
+              <w:right w:type="dxa" w:w="80"/>
+            </w:tcMar>
+          </w:tcPr>
+          <w:p>
+            <w:pPr>
+              <w:spacing w:after="0"/>
+            </w:pPr>
+            <w:r>
+              <w:rPr>
+                <w:rFonts w:ascii="Times New Roman" w:cs="Times New Roman" w:eastAsia="Times New Roman" w:hAnsi="Times New Roman"/>
+                <w:sz w:val="20"/>
+                <w:szCs w:val="20"/>
+              </w:rPr>
+              <w:t xml:space="preserve">pool.ak</w:t>
+            </w:r>
+          </w:p>
+        </w:tc>
+        <w:tc>
+          <w:tcPr>
+            <w:tcW w:type="dxa" w:w="5215"/>
+            <w:tcBorders>
+              <w:top w:val="single" w:color="808080" w:sz="4"/>
+              <w:left w:val="single" w:color="808080" w:sz="4"/>
+              <w:bottom w:val="single" w:color="808080" w:sz="4"/>
+              <w:right w:val="single" w:color="808080" w:sz="4"/>
+            </w:tcBorders>
+            <w:tcMar>
+              <w:top w:type="dxa" w:w="40"/>
+              <w:left w:type="dxa" w:w="80"/>
+              <w:bottom w:type="dxa" w:w="40"/>
+              <w:right w:type="dxa" w:w="80"/>
+            </w:tcMar>
+          </w:tcPr>
+          <w:p>
+            <w:pPr>
+              <w:spacing w:after="0"/>
+            </w:pPr>
+            <w:r>
+              <w:rPr>
+                <w:rFonts w:ascii="Times New Roman" w:cs="Times New Roman" w:eastAsia="Times New Roman" w:hAnsi="Times New Roman"/>
+                <w:sz w:val="20"/>
+                <w:szCs w:val="20"/>
+              </w:rPr>
+              <w:t xml:space="preserve">After fees on each asset’s net inflow, the constant product does not decrease</w:t>
+            </w:r>
+          </w:p>
+        </w:tc>
+        <w:tc>
+          <w:tcPr>
+            <w:tcW w:type="dxa" w:w="1605"/>
+            <w:tcBorders>
+              <w:top w:val="single" w:color="808080" w:sz="4"/>
+              <w:left w:val="single" w:color="808080" w:sz="4"/>
+              <w:bottom w:val="single" w:color="808080" w:sz="4"/>
+              <w:right w:val="single" w:color="808080" w:sz="4"/>
+            </w:tcBorders>
+            <w:tcMar>
+              <w:top w:type="dxa" w:w="40"/>
+              <w:left w:type="dxa" w:w="80"/>
+              <w:bottom w:type="dxa" w:w="40"/>
+              <w:right w:type="dxa" w:w="80"/>
+            </w:tcMar>
+          </w:tcPr>
+          <w:p>
+            <w:pPr>
+              <w:spacing w:after="0"/>
+            </w:pPr>
+            <w:r>
+              <w:rPr>
+                <w:rFonts w:ascii="Times New Roman" w:cs="Times New Roman" w:eastAsia="Times New Roman" w:hAnsi="Times New Roman"/>
+                <w:sz w:val="20"/>
+                <w:szCs w:val="20"/>
+              </w:rPr>
+              <w:t xml:space="preserve">T-O4</w:t>
+            </w:r>
+          </w:p>
+        </w:tc>
+      </w:tr>
+    </w:tbl>
+    <w:p>
+      <w:pPr>
+        <w:spacing w:after="160"/>
+      </w:pPr>
+    </w:p>
+    <w:p>
+      <w:pPr>
+        <w:pStyle w:val="Heading3"/>
+      </w:pPr>
+      <w:r>
+        <w:t xml:space="preserve">5.11.1 The pass-through fee</w:t>
+      </w:r>
+    </w:p>
+    <w:p>
+      <w:pPr>
+        <w:spacing w:after="120" w:line="336"/>
+        <w:jc w:val="both"/>
+      </w:pPr>
+      <w:r>
+        <w:rPr>
+          <w:rFonts w:ascii="Times New Roman" w:cs="Times New Roman" w:eastAsia="Times New Roman" w:hAnsi="Times New Roman"/>
+        </w:rPr>
+        <w:t xml:space="preserve">On a flat-fee DEX each order pays a fixed batcher fee, so a larger batch lowers the operator’s cost but not the user’s. Here the order validator reads the actual transaction fee and counts the order inputs, and allows the batcher to keep only </w:t>
+      </w:r>
+      <w:r>
+        <w:rPr>
+          <w:rFonts w:ascii="Consolas" w:cs="Consolas" w:eastAsia="Consolas" w:hAnsi="Consolas"/>
+          <w:sz w:val="20"/>
+          <w:szCs w:val="20"/>
+        </w:rPr>
+        <w:t xml:space="preserve">fee / n + margin</w:t>
+      </w:r>
+      <w:r>
+        <w:rPr>
+          <w:rFonts w:ascii="Times New Roman" w:cs="Times New Roman" w:eastAsia="Times New Roman" w:hAnsi="Times New Roman"/>
+        </w:rPr>
+        <w:t xml:space="preserve"> from each user (ADR-006). </w:t>
+      </w:r>
+      <w:r>
+        <w:rPr>
+          <w:rFonts w:ascii="Times New Roman" w:cs="Times New Roman" w:eastAsia="Times New Roman" w:hAnsi="Times New Roman"/>
+          <w:b/>
+          <w:bCs/>
+        </w:rPr>
+        <w:t xml:space="preserve">The amortization that the policies optimise is thereby delivered to users by the ledger, not by the operator’s goodwill</w:t>
+      </w:r>
+      <w:r>
+        <w:rPr>
+          <w:rFonts w:ascii="Times New Roman" w:cs="Times New Roman" w:eastAsia="Times New Roman" w:hAnsi="Times New Roman"/>
+        </w:rPr>
+        <w:t xml:space="preserve">, and the per-user cost C-user measures something a user actually pays.</w:t>
+      </w:r>
+    </w:p>
+    <w:p>
+      <w:pPr>
+        <w:pStyle w:val="Heading3"/>
+      </w:pPr>
+      <w:r>
+        <w:t xml:space="preserve">5.11.2 The pool invariant</w:t>
       </w:r>
     </w:p>
     <w:p>
@@ -15461,7 +16630,7 @@
           <w:sz w:val="16"/>
           <w:szCs w:val="16"/>
         </w:rPr>
-        <w:t xml:space="preserve">src/batcher/</w:t>
+        <w:t xml:space="preserve">inflow_x   = max(x_new - x, 0)        inflow_y   = max(y_new - y, 0)</w:t>
       </w:r>
     </w:p>
     <w:p>
@@ -15476,7 +16645,7 @@
           <w:sz w:val="16"/>
           <w:szCs w:val="16"/>
         </w:rPr>
-        <w:t xml:space="preserve">  config/    protocol.py (constants), params.py (tunables), settings.py (preprod guard)</w:t>
+        <w:t xml:space="preserve">adjusted_x = x_new * 10000 - inflow_x * fee_bps</w:t>
       </w:r>
     </w:p>
     <w:p>
@@ -15491,7 +16660,99 @@
           <w:sz w:val="16"/>
           <w:szCs w:val="16"/>
         </w:rPr>
-        <w:t xml:space="preserve">  data/      sources.py (Koios client), collector.py (resumable M1), features.py</w:t>
+        <w:t xml:space="preserve">adjusted_y = y_new * 10000 - inflow_y * fee_bps</w:t>
+      </w:r>
+    </w:p>
+    <w:p>
+      <w:pPr>
+        <w:shd w:fill="F4F4F4" w:color="auto" w:val="clear"/>
+        <w:spacing w:after="160" w:line="240"/>
+        <w:ind w:left="200"/>
+      </w:pPr>
+      <w:r>
+        <w:rPr>
+          <w:rFonts w:ascii="Consolas" w:cs="Consolas" w:eastAsia="Consolas" w:hAnsi="Consolas"/>
+          <w:sz w:val="16"/>
+          <w:szCs w:val="16"/>
+        </w:rPr>
+        <w:t xml:space="preserve">valid      = adjusted_x * adjusted_y &gt;= x * y * 10000 * 10000</w:t>
+      </w:r>
+    </w:p>
+    <w:p>
+      <w:pPr>
+        <w:spacing w:after="120" w:line="336"/>
+        <w:jc w:val="both"/>
+      </w:pPr>
+      <w:r>
+        <w:rPr>
+          <w:rFonts w:ascii="Times New Roman" w:cs="Times New Roman" w:eastAsia="Times New Roman" w:hAnsi="Times New Roman"/>
+        </w:rPr>
+        <w:t xml:space="preserve">The fee is charged on the </w:t>
+      </w:r>
+      <w:r>
+        <w:rPr>
+          <w:rFonts w:ascii="Times New Roman" w:cs="Times New Roman" w:eastAsia="Times New Roman" w:hAnsi="Times New Roman"/>
+          <w:b/>
+          <w:bCs/>
+        </w:rPr>
+        <w:t xml:space="preserve">net</w:t>
+      </w:r>
+      <w:r>
+        <w:rPr>
+          <w:rFonts w:ascii="Times New Roman" w:cs="Times New Roman" w:eastAsia="Times New Roman" w:hAnsi="Times New Roman"/>
+        </w:rPr>
+        <w:t xml:space="preserve"> inflow of each asset, so a batch can net buy and sell orders together and still never extract value from the pool.</w:t>
+      </w:r>
+    </w:p>
+    <w:p>
+      <w:pPr>
+        <w:pStyle w:val="Heading3"/>
+      </w:pPr>
+      <w:r>
+        <w:t xml:space="preserve">5.11.3 A pool identity that cannot be forged</w:t>
+      </w:r>
+    </w:p>
+    <w:p>
+      <w:pPr>
+        <w:spacing w:after="120" w:line="336"/>
+        <w:jc w:val="both"/>
+      </w:pPr>
+      <w:r>
+        <w:rPr>
+          <w:rFonts w:ascii="Times New Roman" w:cs="Times New Roman" w:eastAsia="Times New Roman" w:hAnsi="Times New Roman"/>
+        </w:rPr>
+        <w:t xml:space="preserve">The pool token and the pool NFT are minted under a native-script policy that requires the batcher’s signature </w:t>
+      </w:r>
+      <w:r>
+        <w:rPr>
+          <w:rFonts w:ascii="Times New Roman" w:cs="Times New Roman" w:eastAsia="Times New Roman" w:hAnsi="Times New Roman"/>
+          <w:b/>
+          <w:bCs/>
+        </w:rPr>
+        <w:t xml:space="preserve">and</w:t>
+      </w:r>
+      <w:r>
+        <w:rPr>
+          <w:rFonts w:ascii="Times New Roman" w:cs="Times New Roman" w:eastAsia="Times New Roman" w:hAnsi="Times New Roman"/>
+        </w:rPr>
+        <w:t xml:space="preserve"> a validity bound: nothing can be minted after a slot fixed at deployment. Once that slot passes, no second pool NFT can exist, so the NFT that identifies the pool is unique by construction rather than by the batcher’s good behaviour.</w:t>
+      </w:r>
+    </w:p>
+    <w:p>
+      <w:pPr>
+        <w:pStyle w:val="Heading1"/>
+        <w:pageBreakBefore/>
+      </w:pPr>
+      <w:r>
+        <w:t xml:space="preserve">Chapter 6: Implementation</w:t>
+      </w:r>
+    </w:p>
+    <w:p>
+      <w:pPr>
+        <w:pStyle w:val="Heading2"/>
+      </w:pPr>
+      <w:r>
+        <w:t xml:space="preserve">6.1 Repository Structure</w:t>
       </w:r>
     </w:p>
     <w:p>
@@ -15506,7 +16767,7 @@
           <w:sz w:val="16"/>
           <w:szCs w:val="16"/>
         </w:rPr>
-        <w:t xml:space="preserve">  build/     estimator.py (size, execution units, fee, Gate A, Gate B)</w:t>
+        <w:t xml:space="preserve">src/batcher/</w:t>
       </w:r>
     </w:p>
     <w:p>
@@ -15521,7 +16782,7 @@
           <w:sz w:val="16"/>
           <w:szCs w:val="16"/>
         </w:rPr>
-        <w:t xml:space="preserve">  queue/     manager.py (FIFO order queue, M3)</w:t>
+        <w:t xml:space="preserve">  config/    protocol.py (constants), params.py (tunables), settings.py (preprod guard)</w:t>
       </w:r>
     </w:p>
     <w:p>
@@ -15536,7 +16797,7 @@
           <w:sz w:val="16"/>
           <w:szCs w:val="16"/>
         </w:rPr>
-        <w:t xml:space="preserve">  forecast/  baseline.py (E4), lgbm.py (P1), evaluate.py</w:t>
+        <w:t xml:space="preserve">  data/      sources.py (Koios client), collector.py (resumable M1), features.py</w:t>
       </w:r>
     </w:p>
     <w:p>
@@ -15551,7 +16812,7 @@
           <w:sz w:val="16"/>
           <w:szCs w:val="16"/>
         </w:rPr>
-        <w:t xml:space="preserve">  policy/    base.py (interfaces), static.py (E1-E3, NULL), optimizer.py (P2, ORACLE)</w:t>
+        <w:t xml:space="preserve">  build/     estimator.py (fee, Gate A, Gate B), submitter.py, tx_builder.py</w:t>
       </w:r>
     </w:p>
     <w:p>
@@ -15566,7 +16827,7 @@
           <w:sz w:val="16"/>
           <w:szCs w:val="16"/>
         </w:rPr>
-        <w:t xml:space="preserve">  sim/       env.py (event loop), mempool.py, orders.py (D2), episodes.py, gym_env.py</w:t>
+        <w:t xml:space="preserve">  queue/     manager.py (FIFO order queue, M3)</w:t>
       </w:r>
     </w:p>
     <w:p>
@@ -15581,7 +16842,7 @@
           <w:sz w:val="16"/>
           <w:szCs w:val="16"/>
         </w:rPr>
-        <w:t xml:space="preserve">  eval/      metrics.py, stats.py, plots.py, manifest.py, rl_diagnostics.py</w:t>
+        <w:t xml:space="preserve">  forecast/  baseline.py (E4), lgbm.py (P1), evaluate.py</w:t>
       </w:r>
     </w:p>
     <w:p>
@@ -15596,7 +16857,7 @@
           <w:sz w:val="16"/>
           <w:szCs w:val="16"/>
         </w:rPr>
-        <w:t xml:space="preserve">scripts/     collect, verify_dataset, analyze_congestion, train_forecaster,</w:t>
+        <w:t xml:space="preserve">  policy/    base.py (interfaces), static.py (E1-E3, NULL), optimizer.py (P2, ORACLE)</w:t>
       </w:r>
     </w:p>
     <w:p>
@@ -15611,7 +16872,7 @@
           <w:sz w:val="16"/>
           <w:szCs w:val="16"/>
         </w:rPr>
-        <w:t xml:space="preserve">             tune_baselines, evaluate, train_rl, evaluate_rl,</w:t>
+        <w:t xml:space="preserve">  sim/       env.py (event loop), mempool.py, orders.py (D2), episodes.py, gym_env.py</w:t>
       </w:r>
     </w:p>
     <w:p>
@@ -15626,7 +16887,97 @@
           <w:sz w:val="16"/>
           <w:szCs w:val="16"/>
         </w:rPr>
+        <w:t xml:space="preserve">  eval/      metrics.py, stats.py, plots.py, manifest.py, rl_diagnostics.py</w:t>
+      </w:r>
+    </w:p>
+    <w:p>
+      <w:pPr>
+        <w:shd w:fill="F4F4F4" w:color="auto" w:val="clear"/>
+        <w:spacing w:after="0" w:line="240"/>
+        <w:ind w:left="200"/>
+      </w:pPr>
+      <w:r>
+        <w:rPr>
+          <w:rFonts w:ascii="Consolas" w:cs="Consolas" w:eastAsia="Consolas" w:hAnsi="Consolas"/>
+          <w:sz w:val="16"/>
+          <w:szCs w:val="16"/>
+        </w:rPr>
+        <w:t xml:space="preserve">scripts/     collect, verify_dataset, analyze_congestion, train_forecaster,</w:t>
+      </w:r>
+    </w:p>
+    <w:p>
+      <w:pPr>
+        <w:shd w:fill="F4F4F4" w:color="auto" w:val="clear"/>
+        <w:spacing w:after="0" w:line="240"/>
+        <w:ind w:left="200"/>
+      </w:pPr>
+      <w:r>
+        <w:rPr>
+          <w:rFonts w:ascii="Consolas" w:cs="Consolas" w:eastAsia="Consolas" w:hAnsi="Consolas"/>
+          <w:sz w:val="16"/>
+          <w:szCs w:val="16"/>
+        </w:rPr>
+        <w:t xml:space="preserve">             tune_baselines, evaluate, train_rl, evaluate_rl,</w:t>
+      </w:r>
+    </w:p>
+    <w:p>
+      <w:pPr>
+        <w:shd w:fill="F4F4F4" w:color="auto" w:val="clear"/>
+        <w:spacing w:after="0" w:line="240"/>
+        <w:ind w:left="200"/>
+      </w:pPr>
+      <w:r>
+        <w:rPr>
+          <w:rFonts w:ascii="Consolas" w:cs="Consolas" w:eastAsia="Consolas" w:hAnsi="Consolas"/>
+          <w:sz w:val="16"/>
+          <w:szCs w:val="16"/>
+        </w:rPr>
         <w:t xml:space="preserve">             final_evaluation, run_stats, make_figures, ...</w:t>
+      </w:r>
+    </w:p>
+    <w:p>
+      <w:pPr>
+        <w:shd w:fill="F4F4F4" w:color="auto" w:val="clear"/>
+        <w:spacing w:after="0" w:line="240"/>
+        <w:ind w:left="200"/>
+      </w:pPr>
+      <w:r>
+        <w:rPr>
+          <w:rFonts w:ascii="Consolas" w:cs="Consolas" w:eastAsia="Consolas" w:hAnsi="Consolas"/>
+          <w:sz w:val="16"/>
+          <w:szCs w:val="16"/>
+        </w:rPr>
+        <w:t xml:space="preserve">  onchain/   datums.py, blueprint.py, deployment.py (Phase 7)</w:t>
+      </w:r>
+    </w:p>
+    <w:p>
+      <w:pPr>
+        <w:shd w:fill="F4F4F4" w:color="auto" w:val="clear"/>
+        <w:spacing w:after="0" w:line="240"/>
+        <w:ind w:left="200"/>
+      </w:pPr>
+      <w:r>
+        <w:rPr>
+          <w:rFonts w:ascii="Consolas" w:cs="Consolas" w:eastAsia="Consolas" w:hAnsi="Consolas"/>
+          <w:sz w:val="16"/>
+          <w:szCs w:val="16"/>
+        </w:rPr>
+        <w:t xml:space="preserve">  live/      chain.py, daemon.py (Phase 7 live batcher)</w:t>
+      </w:r>
+    </w:p>
+    <w:p>
+      <w:pPr>
+        <w:shd w:fill="F4F4F4" w:color="auto" w:val="clear"/>
+        <w:spacing w:after="0" w:line="240"/>
+        <w:ind w:left="200"/>
+      </w:pPr>
+      <w:r>
+        <w:rPr>
+          <w:rFonts w:ascii="Consolas" w:cs="Consolas" w:eastAsia="Consolas" w:hAnsi="Consolas"/>
+          <w:sz w:val="16"/>
+          <w:szCs w:val="16"/>
+        </w:rPr>
+        <w:t xml:space="preserve">onchain/     Aiken: validators/order.ak, validators/pool.ak, plutus.json</w:t>
       </w:r>
     </w:p>
     <w:p>
@@ -15641,7 +16992,7 @@
           <w:sz w:val="16"/>
           <w:szCs w:val="16"/>
         </w:rPr>
-        <w:t xml:space="preserve">tests/       270 tests in 21 files</w:t>
+        <w:t xml:space="preserve">tests/       339 Python tests in 26 files; 16 Aiken tests in onchain/</w:t>
       </w:r>
     </w:p>
     <w:p>
@@ -16546,16 +17897,838 @@
     </w:p>
     <w:p>
       <w:pPr>
+        <w:pStyle w:val="Heading2"/>
+      </w:pPr>
+      <w:r>
+        <w:t xml:space="preserve">6.11 On-Chain Validators</w:t>
+      </w:r>
+    </w:p>
+    <w:p>
+      <w:pPr>
         <w:spacing w:after="120" w:line="336"/>
         <w:jc w:val="both"/>
       </w:pPr>
       <w:r>
         <w:rPr>
           <w:rFonts w:ascii="Times New Roman" w:cs="Times New Roman" w:eastAsia="Times New Roman" w:hAnsi="Times New Roman"/>
-          <w:highlight w:val="yellow"/>
-          <w:highlightCs w:val="yellow"/>
-        </w:rPr>
-        <w:t xml:space="preserve">Section 6.11 on on-chain validators applies only if the optional Phase 7 live demonstration is completed.</w:t>
+        </w:rPr>
+        <w:t xml:space="preserve">The validators are written in Aiken v1.1.23 against stdlib v3.1.0 and compile to Plutus V3 scripts of 944 bytes (order) and 864 bytes (pool). The core of the order validator is short enough to read in full:</w:t>
+      </w:r>
+    </w:p>
+    <w:p>
+      <w:pPr>
+        <w:shd w:fill="F4F4F4" w:color="auto" w:val="clear"/>
+        <w:spacing w:after="0" w:line="240"/>
+        <w:ind w:left="200"/>
+      </w:pPr>
+      <w:r>
+        <w:rPr>
+          <w:rFonts w:ascii="Consolas" w:cs="Consolas" w:eastAsia="Consolas" w:hAnsi="Consolas"/>
+          <w:sz w:val="16"/>
+          <w:szCs w:val="16"/>
+        </w:rPr>
+        <w:t xml:space="preserve">Execute -&gt; {</w:t>
+      </w:r>
+    </w:p>
+    <w:p>
+      <w:pPr>
+        <w:shd w:fill="F4F4F4" w:color="auto" w:val="clear"/>
+        <w:spacing w:after="0" w:line="240"/>
+        <w:ind w:left="200"/>
+      </w:pPr>
+      <w:r>
+        <w:rPr>
+          <w:rFonts w:ascii="Consolas" w:cs="Consolas" w:eastAsia="Consolas" w:hAnsi="Consolas"/>
+          <w:sz w:val="16"/>
+          <w:szCs w:val="16"/>
+        </w:rPr>
+        <w:t xml:space="preserve">  expect Some(own_input) = transaction.find_input(self.inputs, own_ref)</w:t>
+      </w:r>
+    </w:p>
+    <w:p>
+      <w:pPr>
+        <w:shd w:fill="F4F4F4" w:color="auto" w:val="clear"/>
+        <w:spacing w:after="0" w:line="240"/>
+        <w:ind w:left="200"/>
+      </w:pPr>
+      <w:r>
+        <w:rPr>
+          <w:rFonts w:ascii="Consolas" w:cs="Consolas" w:eastAsia="Consolas" w:hAnsi="Consolas"/>
+          <w:sz w:val="16"/>
+          <w:szCs w:val="16"/>
+        </w:rPr>
+        <w:t xml:space="preserve">  let own_credential = own_input.output.address.payment_credential</w:t>
+      </w:r>
+    </w:p>
+    <w:p>
+      <w:pPr>
+        <w:shd w:fill="F4F4F4" w:color="auto" w:val="clear"/>
+        <w:spacing w:after="0" w:line="240"/>
+        <w:ind w:left="200"/>
+      </w:pPr>
+      <w:r>
+        <w:rPr>
+          <w:rFonts w:ascii="Consolas" w:cs="Consolas" w:eastAsia="Consolas" w:hAnsi="Consolas"/>
+          <w:sz w:val="16"/>
+          <w:szCs w:val="16"/>
+        </w:rPr>
+        <w:t xml:space="preserve">  let n = list.count(self.inputs,</w:t>
+      </w:r>
+    </w:p>
+    <w:p>
+      <w:pPr>
+        <w:shd w:fill="F4F4F4" w:color="auto" w:val="clear"/>
+        <w:spacing w:after="0" w:line="240"/>
+        <w:ind w:left="200"/>
+      </w:pPr>
+      <w:r>
+        <w:rPr>
+          <w:rFonts w:ascii="Consolas" w:cs="Consolas" w:eastAsia="Consolas" w:hAnsi="Consolas"/>
+          <w:sz w:val="16"/>
+          <w:szCs w:val="16"/>
+        </w:rPr>
+        <w:t xml:space="preserve">            fn(input) { input.output.address.payment_credential == own_credential })</w:t>
+      </w:r>
+    </w:p>
+    <w:p>
+      <w:pPr>
+        <w:shd w:fill="F4F4F4" w:color="auto" w:val="clear"/>
+        <w:spacing w:after="0" w:line="240"/>
+        <w:ind w:left="200"/>
+      </w:pPr>
+      <w:r>
+        <w:rPr>
+          <w:rFonts w:ascii="Consolas" w:cs="Consolas" w:eastAsia="Consolas" w:hAnsi="Consolas"/>
+          <w:sz w:val="16"/>
+          <w:szCs w:val="16"/>
+        </w:rPr>
+        <w:t xml:space="preserve">  let charge = self.fee / n + request.margin      // ADR-006: pass-through fee</w:t>
+      </w:r>
+    </w:p>
+    <w:p>
+      <w:pPr>
+        <w:shd w:fill="F4F4F4" w:color="auto" w:val="clear"/>
+        <w:spacing w:after="0" w:line="240"/>
+        <w:ind w:left="200"/>
+      </w:pPr>
+      <w:r>
+        <w:rPr>
+          <w:rFonts w:ascii="Consolas" w:cs="Consolas" w:eastAsia="Consolas" w:hAnsi="Consolas"/>
+          <w:sz w:val="16"/>
+          <w:szCs w:val="16"/>
+        </w:rPr>
+        <w:t xml:space="preserve"> </w:t>
+      </w:r>
+    </w:p>
+    <w:p>
+      <w:pPr>
+        <w:shd w:fill="F4F4F4" w:color="auto" w:val="clear"/>
+        <w:spacing w:after="0" w:line="240"/>
+        <w:ind w:left="200"/>
+      </w:pPr>
+      <w:r>
+        <w:rPr>
+          <w:rFonts w:ascii="Consolas" w:cs="Consolas" w:eastAsia="Consolas" w:hAnsi="Consolas"/>
+          <w:sz w:val="16"/>
+          <w:szCs w:val="16"/>
+        </w:rPr>
+        <w:t xml:space="preserve">  let tag: Data = own_ref                           // against double satisfaction</w:t>
+      </w:r>
+    </w:p>
+    <w:p>
+      <w:pPr>
+        <w:shd w:fill="F4F4F4" w:color="auto" w:val="clear"/>
+        <w:spacing w:after="0" w:line="240"/>
+        <w:ind w:left="200"/>
+      </w:pPr>
+      <w:r>
+        <w:rPr>
+          <w:rFonts w:ascii="Consolas" w:cs="Consolas" w:eastAsia="Consolas" w:hAnsi="Consolas"/>
+          <w:sz w:val="16"/>
+          <w:szCs w:val="16"/>
+        </w:rPr>
+        <w:t xml:space="preserve">  expect Some(payout) = list.find(self.outputs, fn(output) {</w:t>
+      </w:r>
+    </w:p>
+    <w:p>
+      <w:pPr>
+        <w:shd w:fill="F4F4F4" w:color="auto" w:val="clear"/>
+        <w:spacing w:after="0" w:line="240"/>
+        <w:ind w:left="200"/>
+      </w:pPr>
+      <w:r>
+        <w:rPr>
+          <w:rFonts w:ascii="Consolas" w:cs="Consolas" w:eastAsia="Consolas" w:hAnsi="Consolas"/>
+          <w:sz w:val="16"/>
+          <w:szCs w:val="16"/>
+        </w:rPr>
+        <w:t xml:space="preserve">    output.address == request.return_address &amp;&amp; output.datum == InlineDatum(tag) })</w:t>
+      </w:r>
+    </w:p>
+    <w:p>
+      <w:pPr>
+        <w:shd w:fill="F4F4F4" w:color="auto" w:val="clear"/>
+        <w:spacing w:after="0" w:line="240"/>
+        <w:ind w:left="200"/>
+      </w:pPr>
+      <w:r>
+        <w:rPr>
+          <w:rFonts w:ascii="Consolas" w:cs="Consolas" w:eastAsia="Consolas" w:hAnsi="Consolas"/>
+          <w:sz w:val="16"/>
+          <w:szCs w:val="16"/>
+        </w:rPr>
+        <w:t xml:space="preserve"> </w:t>
+      </w:r>
+    </w:p>
+    <w:p>
+      <w:pPr>
+        <w:shd w:fill="F4F4F4" w:color="auto" w:val="clear"/>
+        <w:spacing w:after="0" w:line="240"/>
+        <w:ind w:left="200"/>
+      </w:pPr>
+      <w:r>
+        <w:rPr>
+          <w:rFonts w:ascii="Consolas" w:cs="Consolas" w:eastAsia="Consolas" w:hAnsi="Consolas"/>
+          <w:sz w:val="16"/>
+          <w:szCs w:val="16"/>
+        </w:rPr>
+        <w:t xml:space="preserve">  let user_made_whole = when request.direction is {</w:t>
+      </w:r>
+    </w:p>
+    <w:p>
+      <w:pPr>
+        <w:shd w:fill="F4F4F4" w:color="auto" w:val="clear"/>
+        <w:spacing w:after="0" w:line="240"/>
+        <w:ind w:left="200"/>
+      </w:pPr>
+      <w:r>
+        <w:rPr>
+          <w:rFonts w:ascii="Consolas" w:cs="Consolas" w:eastAsia="Consolas" w:hAnsi="Consolas"/>
+          <w:sz w:val="16"/>
+          <w:szCs w:val="16"/>
+        </w:rPr>
+        <w:t xml:space="preserve">    AtoB -&gt; paid_token &gt;= request.min_out</w:t>
+      </w:r>
+    </w:p>
+    <w:p>
+      <w:pPr>
+        <w:shd w:fill="F4F4F4" w:color="auto" w:val="clear"/>
+        <w:spacing w:after="0" w:line="240"/>
+        <w:ind w:left="200"/>
+      </w:pPr>
+      <w:r>
+        <w:rPr>
+          <w:rFonts w:ascii="Consolas" w:cs="Consolas" w:eastAsia="Consolas" w:hAnsi="Consolas"/>
+          <w:sz w:val="16"/>
+          <w:szCs w:val="16"/>
+        </w:rPr>
+        <w:t xml:space="preserve">              &amp;&amp; paid_lovelace &gt;= deposit - request.amount_in - charge</w:t>
+      </w:r>
+    </w:p>
+    <w:p>
+      <w:pPr>
+        <w:shd w:fill="F4F4F4" w:color="auto" w:val="clear"/>
+        <w:spacing w:after="0" w:line="240"/>
+        <w:ind w:left="200"/>
+      </w:pPr>
+      <w:r>
+        <w:rPr>
+          <w:rFonts w:ascii="Consolas" w:cs="Consolas" w:eastAsia="Consolas" w:hAnsi="Consolas"/>
+          <w:sz w:val="16"/>
+          <w:szCs w:val="16"/>
+        </w:rPr>
+        <w:t xml:space="preserve">    BtoA -&gt; paid_lovelace &gt;= deposit + request.min_out - charge</w:t>
+      </w:r>
+    </w:p>
+    <w:p>
+      <w:pPr>
+        <w:shd w:fill="F4F4F4" w:color="auto" w:val="clear"/>
+        <w:spacing w:after="0" w:line="240"/>
+        <w:ind w:left="200"/>
+      </w:pPr>
+      <w:r>
+        <w:rPr>
+          <w:rFonts w:ascii="Consolas" w:cs="Consolas" w:eastAsia="Consolas" w:hAnsi="Consolas"/>
+          <w:sz w:val="16"/>
+          <w:szCs w:val="16"/>
+        </w:rPr>
+        <w:t xml:space="preserve">  }</w:t>
+      </w:r>
+    </w:p>
+    <w:p>
+      <w:pPr>
+        <w:shd w:fill="F4F4F4" w:color="auto" w:val="clear"/>
+        <w:spacing w:after="0" w:line="240"/>
+        <w:ind w:left="200"/>
+      </w:pPr>
+      <w:r>
+        <w:rPr>
+          <w:rFonts w:ascii="Consolas" w:cs="Consolas" w:eastAsia="Consolas" w:hAnsi="Consolas"/>
+          <w:sz w:val="16"/>
+          <w:szCs w:val="16"/>
+        </w:rPr>
+        <w:t xml:space="preserve">  and { list.has(self.extra_signatories, batcher), user_made_whole }</w:t>
+      </w:r>
+    </w:p>
+    <w:p>
+      <w:pPr>
+        <w:shd w:fill="F4F4F4" w:color="auto" w:val="clear"/>
+        <w:spacing w:after="160" w:line="240"/>
+        <w:ind w:left="200"/>
+      </w:pPr>
+      <w:r>
+        <w:rPr>
+          <w:rFonts w:ascii="Consolas" w:cs="Consolas" w:eastAsia="Consolas" w:hAnsi="Consolas"/>
+          <w:sz w:val="16"/>
+          <w:szCs w:val="16"/>
+        </w:rPr>
+        <w:t xml:space="preserve">}</w:t>
+      </w:r>
+    </w:p>
+    <w:p>
+      <w:pPr>
+        <w:spacing w:after="120" w:line="336"/>
+        <w:jc w:val="both"/>
+      </w:pPr>
+      <w:r>
+        <w:rPr>
+          <w:rFonts w:ascii="Times New Roman" w:cs="Times New Roman" w:eastAsia="Times New Roman" w:hAnsi="Times New Roman"/>
+        </w:rPr>
+        <w:t xml:space="preserve">The compiler writes a blueprint, </w:t>
+      </w:r>
+      <w:r>
+        <w:rPr>
+          <w:rFonts w:ascii="Consolas" w:cs="Consolas" w:eastAsia="Consolas" w:hAnsi="Consolas"/>
+          <w:sz w:val="20"/>
+          <w:szCs w:val="20"/>
+        </w:rPr>
+        <w:t xml:space="preserve">plutus.json</w:t>
+      </w:r>
+      <w:r>
+        <w:rPr>
+          <w:rFonts w:ascii="Times New Roman" w:cs="Times New Roman" w:eastAsia="Times New Roman" w:hAnsi="Times New Roman"/>
+        </w:rPr>
+        <w:t xml:space="preserve">, describing every datum and redeemer. The Python side mirrors those types as PyCardano Plutus data, and a test checks every constructor index and field order against the blueprint, so the two cannot drift: a mis-encoded datum is not a type error anywhere, only a transaction rejected on chain without explanation. A second test checks that PyCardano derives the same script hashes the compiler recorded. Parameters — the batcher key, the pool token — are applied with </w:t>
+      </w:r>
+      <w:r>
+        <w:rPr>
+          <w:rFonts w:ascii="Consolas" w:cs="Consolas" w:eastAsia="Consolas" w:hAnsi="Consolas"/>
+          <w:sz w:val="20"/>
+          <w:szCs w:val="20"/>
+        </w:rPr>
+        <w:t xml:space="preserve">aiken blueprint apply</w:t>
+      </w:r>
+      <w:r>
+        <w:rPr>
+          <w:rFonts w:ascii="Times New Roman" w:cs="Times New Roman" w:eastAsia="Times New Roman" w:hAnsi="Times New Roman"/>
+        </w:rPr>
+        <w:t xml:space="preserve">, the compiler that produced the code, rather than by editing scripts in Python.</w:t>
+      </w:r>
+    </w:p>
+    <w:p>
+      <w:pPr>
+        <w:spacing w:after="120" w:line="336"/>
+        <w:jc w:val="both"/>
+      </w:pPr>
+      <w:r>
+        <w:rPr>
+          <w:rFonts w:ascii="Times New Roman" w:cs="Times New Roman" w:eastAsia="Times New Roman" w:hAnsi="Times New Roman"/>
+        </w:rPr>
+        <w:t xml:space="preserve">One defect is worth recording. The first order validator bound its datum to a local variable named </w:t>
+      </w:r>
+      <w:r>
+        <w:rPr>
+          <w:rFonts w:ascii="Consolas" w:cs="Consolas" w:eastAsia="Consolas" w:hAnsi="Consolas"/>
+          <w:sz w:val="20"/>
+          <w:szCs w:val="20"/>
+        </w:rPr>
+        <w:t xml:space="preserve">order</w:t>
+      </w:r>
+      <w:r>
+        <w:rPr>
+          <w:rFonts w:ascii="Times New Roman" w:cs="Times New Roman" w:eastAsia="Times New Roman" w:hAnsi="Times New Roman"/>
+        </w:rPr>
+        <w:t xml:space="preserve">, the validator’s own name. It failed to compile with </w:t>
+      </w:r>
+      <w:r>
+        <w:rPr>
+          <w:rFonts w:ascii="Times New Roman" w:cs="Times New Roman" w:eastAsia="Times New Roman" w:hAnsi="Times New Roman"/>
+          <w:b/>
+          <w:bCs/>
+        </w:rPr>
+        <w:t xml:space="preserve">no diagnostic at all</w:t>
+      </w:r>
+      <w:r>
+        <w:rPr>
+          <w:rFonts w:ascii="Times New Roman" w:cs="Times New Roman" w:eastAsia="Times New Roman" w:hAnsi="Times New Roman"/>
+        </w:rPr>
+        <w:t xml:space="preserve">, because the compiler prints errors only to an interactive terminal; the cause was found by compiling halves of the file.</w:t>
+      </w:r>
+    </w:p>
+    <w:p>
+      <w:pPr>
+        <w:pStyle w:val="Heading2"/>
+      </w:pPr>
+      <w:r>
+        <w:t xml:space="preserve">6.12 Transaction Building</w:t>
+      </w:r>
+    </w:p>
+    <w:p>
+      <w:pPr>
+        <w:spacing w:after="120" w:line="336"/>
+        <w:jc w:val="both"/>
+      </w:pPr>
+      <w:r>
+        <w:rPr>
+          <w:rFonts w:ascii="Times New Roman" w:cs="Times New Roman" w:eastAsia="Times New Roman" w:hAnsi="Times New Roman"/>
+        </w:rPr>
+        <w:t xml:space="preserve">Live batching is </w:t>
+      </w:r>
+      <w:r>
+        <w:rPr>
+          <w:rFonts w:ascii="Times New Roman" w:cs="Times New Roman" w:eastAsia="Times New Roman" w:hAnsi="Times New Roman"/>
+          <w:b/>
+          <w:bCs/>
+        </w:rPr>
+        <w:t xml:space="preserve">planned before it is built</w:t>
+      </w:r>
+      <w:r>
+        <w:rPr>
+          <w:rFonts w:ascii="Times New Roman" w:cs="Times New Roman" w:eastAsia="Times New Roman" w:hAnsi="Times New Roman"/>
+        </w:rPr>
+        <w:t xml:space="preserve">. </w:t>
+      </w:r>
+      <w:r>
+        <w:rPr>
+          <w:rFonts w:ascii="Consolas" w:cs="Consolas" w:eastAsia="Consolas" w:hAnsi="Consolas"/>
+          <w:sz w:val="20"/>
+          <w:szCs w:val="20"/>
+        </w:rPr>
+        <w:t xml:space="preserve">plan_batch</w:t>
+      </w:r>
+      <w:r>
+        <w:rPr>
+          <w:rFonts w:ascii="Times New Roman" w:cs="Times New Roman" w:eastAsia="Times New Roman" w:hAnsi="Times New Roman"/>
+        </w:rPr>
+        <w:t xml:space="preserve"> takes queued orders oldest first, quotes each against the pool with the constant-product formula, and drops any order the pool cannot fill at its </w:t>
+      </w:r>
+      <w:r>
+        <w:rPr>
+          <w:rFonts w:ascii="Consolas" w:cs="Consolas" w:eastAsia="Consolas" w:hAnsi="Consolas"/>
+          <w:sz w:val="20"/>
+          <w:szCs w:val="20"/>
+        </w:rPr>
+        <w:t xml:space="preserve">min_out</w:t>
+      </w:r>
+      <w:r>
+        <w:rPr>
+          <w:rFonts w:ascii="Times New Roman" w:cs="Times New Roman" w:eastAsia="Times New Roman" w:hAnsi="Times New Roman"/>
+        </w:rPr>
+        <w:t xml:space="preserve"> — then recomputes everyone’s fee share for the smaller batch, since </w:t>
+      </w:r>
+      <w:r>
+        <w:rPr>
+          <w:rFonts w:ascii="Consolas" w:cs="Consolas" w:eastAsia="Consolas" w:hAnsi="Consolas"/>
+          <w:sz w:val="20"/>
+          <w:szCs w:val="20"/>
+        </w:rPr>
+        <w:t xml:space="preserve">n</w:t>
+      </w:r>
+      <w:r>
+        <w:rPr>
+          <w:rFonts w:ascii="Times New Roman" w:cs="Times New Roman" w:eastAsia="Times New Roman" w:hAnsi="Times New Roman"/>
+        </w:rPr>
+        <w:t xml:space="preserve"> has changed. It re-checks Gate A and raises on a violation, and it imports </w:t>
+      </w:r>
+      <w:r>
+        <w:rPr>
+          <w:rFonts w:ascii="Consolas" w:cs="Consolas" w:eastAsia="Consolas" w:hAnsi="Consolas"/>
+          <w:sz w:val="20"/>
+          <w:szCs w:val="20"/>
+        </w:rPr>
+        <w:t xml:space="preserve">gate_a</w:t>
+      </w:r>
+      <w:r>
+        <w:rPr>
+          <w:rFonts w:ascii="Times New Roman" w:cs="Times New Roman" w:eastAsia="Times New Roman" w:hAnsi="Times New Roman"/>
+        </w:rPr>
+        <w:t xml:space="preserve"> and </w:t>
+      </w:r>
+      <w:r>
+        <w:rPr>
+          <w:rFonts w:ascii="Consolas" w:cs="Consolas" w:eastAsia="Consolas" w:hAnsi="Consolas"/>
+          <w:sz w:val="20"/>
+          <w:szCs w:val="20"/>
+        </w:rPr>
+        <w:t xml:space="preserve">fee_lovelace</w:t>
+      </w:r>
+      <w:r>
+        <w:rPr>
+          <w:rFonts w:ascii="Times New Roman" w:cs="Times New Roman" w:eastAsia="Times New Roman" w:hAnsi="Times New Roman"/>
+        </w:rPr>
+        <w:t xml:space="preserve"> from the same estimator the simulator uses, a property tested by object identity (T-N6).</w:t>
+      </w:r>
+    </w:p>
+    <w:p>
+      <w:pPr>
+        <w:spacing w:after="120" w:line="336"/>
+        <w:jc w:val="both"/>
+      </w:pPr>
+      <w:r>
+        <w:rPr>
+          <w:rFonts w:ascii="Times New Roman" w:cs="Times New Roman" w:eastAsia="Times New Roman" w:hAnsi="Times New Roman"/>
+        </w:rPr>
+        <w:t xml:space="preserve">Building the transaction with PyCardano adds one subtlety. Users are charged for the fee the plan assumed, but </w:t>
+      </w:r>
+      <w:r>
+        <w:rPr>
+          <w:rFonts w:ascii="Consolas" w:cs="Consolas" w:eastAsia="Consolas" w:hAnsi="Consolas"/>
+          <w:sz w:val="20"/>
+          <w:szCs w:val="20"/>
+        </w:rPr>
+        <w:t xml:space="preserve">order.ak</w:t>
+      </w:r>
+      <w:r>
+        <w:rPr>
+          <w:rFonts w:ascii="Times New Roman" w:cs="Times New Roman" w:eastAsia="Times New Roman" w:hAnsi="Times New Roman"/>
+        </w:rPr>
+        <w:t xml:space="preserve"> checks against the fee the transaction </w:t>
+      </w:r>
+      <w:r>
+        <w:rPr>
+          <w:rFonts w:ascii="Times New Roman" w:cs="Times New Roman" w:eastAsia="Times New Roman" w:hAnsi="Times New Roman"/>
+          <w:b/>
+          <w:bCs/>
+        </w:rPr>
+        <w:t xml:space="preserve">actually</w:t>
+      </w:r>
+      <w:r>
+        <w:rPr>
+          <w:rFonts w:ascii="Times New Roman" w:cs="Times New Roman" w:eastAsia="Times New Roman" w:hAnsi="Times New Roman"/>
+        </w:rPr>
+        <w:t xml:space="preserve"> carries; if the built fee came in lower, users would have been overcharged and the batch rejected. The builder therefore settles the fee before returning:</w:t>
+      </w:r>
+    </w:p>
+    <w:p>
+      <w:pPr>
+        <w:shd w:fill="F4F4F4" w:color="auto" w:val="clear"/>
+        <w:spacing w:after="0" w:line="240"/>
+        <w:ind w:left="200"/>
+      </w:pPr>
+      <w:r>
+        <w:rPr>
+          <w:rFonts w:ascii="Consolas" w:cs="Consolas" w:eastAsia="Consolas" w:hAnsi="Consolas"/>
+          <w:sz w:val="16"/>
+          <w:szCs w:val="16"/>
+        </w:rPr>
+        <w:t xml:space="preserve">plan = plan_batch(queued, x, y, deployment.fee_bps)</w:t>
+      </w:r>
+    </w:p>
+    <w:p>
+      <w:pPr>
+        <w:shd w:fill="F4F4F4" w:color="auto" w:val="clear"/>
+        <w:spacing w:after="0" w:line="240"/>
+        <w:ind w:left="200"/>
+      </w:pPr>
+      <w:r>
+        <w:rPr>
+          <w:rFonts w:ascii="Consolas" w:cs="Consolas" w:eastAsia="Consolas" w:hAnsi="Consolas"/>
+          <w:sz w:val="16"/>
+          <w:szCs w:val="16"/>
+        </w:rPr>
+        <w:t xml:space="preserve">for _ in range(MAX_FEE_ROUNDS):</w:t>
+      </w:r>
+    </w:p>
+    <w:p>
+      <w:pPr>
+        <w:shd w:fill="F4F4F4" w:color="auto" w:val="clear"/>
+        <w:spacing w:after="0" w:line="240"/>
+        <w:ind w:left="200"/>
+      </w:pPr>
+      <w:r>
+        <w:rPr>
+          <w:rFonts w:ascii="Consolas" w:cs="Consolas" w:eastAsia="Consolas" w:hAnsi="Consolas"/>
+          <w:sz w:val="16"/>
+          <w:szCs w:val="16"/>
+        </w:rPr>
+        <w:t xml:space="preserve">    tx = _assemble(context, batcher_skey, deployment, scripts, pool_utxo, by_ref, plan, ttl)</w:t>
+      </w:r>
+    </w:p>
+    <w:p>
+      <w:pPr>
+        <w:shd w:fill="F4F4F4" w:color="auto" w:val="clear"/>
+        <w:spacing w:after="0" w:line="240"/>
+        <w:ind w:left="200"/>
+      </w:pPr>
+      <w:r>
+        <w:rPr>
+          <w:rFonts w:ascii="Consolas" w:cs="Consolas" w:eastAsia="Consolas" w:hAnsi="Consolas"/>
+          <w:sz w:val="16"/>
+          <w:szCs w:val="16"/>
+        </w:rPr>
+        <w:t xml:space="preserve">    fee = tx.transaction_body.fee</w:t>
+      </w:r>
+    </w:p>
+    <w:p>
+      <w:pPr>
+        <w:shd w:fill="F4F4F4" w:color="auto" w:val="clear"/>
+        <w:spacing w:after="0" w:line="240"/>
+        <w:ind w:left="200"/>
+      </w:pPr>
+      <w:r>
+        <w:rPr>
+          <w:rFonts w:ascii="Consolas" w:cs="Consolas" w:eastAsia="Consolas" w:hAnsi="Consolas"/>
+          <w:sz w:val="16"/>
+          <w:szCs w:val="16"/>
+        </w:rPr>
+        <w:t xml:space="preserve">    if plan.network_fee &lt;= fee &lt;= plan.network_fee + FEE_TOLERANCE_LOVELACE:</w:t>
+      </w:r>
+    </w:p>
+    <w:p>
+      <w:pPr>
+        <w:shd w:fill="F4F4F4" w:color="auto" w:val="clear"/>
+        <w:spacing w:after="0" w:line="240"/>
+        <w:ind w:left="200"/>
+      </w:pPr>
+      <w:r>
+        <w:rPr>
+          <w:rFonts w:ascii="Consolas" w:cs="Consolas" w:eastAsia="Consolas" w:hAnsi="Consolas"/>
+          <w:sz w:val="16"/>
+          <w:szCs w:val="16"/>
+        </w:rPr>
+        <w:t xml:space="preserve">        return _measure(tx, plan, ttl)</w:t>
+      </w:r>
+    </w:p>
+    <w:p>
+      <w:pPr>
+        <w:shd w:fill="F4F4F4" w:color="auto" w:val="clear"/>
+        <w:spacing w:after="0" w:line="240"/>
+        <w:ind w:left="200"/>
+      </w:pPr>
+      <w:r>
+        <w:rPr>
+          <w:rFonts w:ascii="Consolas" w:cs="Consolas" w:eastAsia="Consolas" w:hAnsi="Consolas"/>
+          <w:sz w:val="16"/>
+          <w:szCs w:val="16"/>
+        </w:rPr>
+        <w:t xml:space="preserve">    # Charge users for the fee this transaction actually carries, then rebuild.</w:t>
+      </w:r>
+    </w:p>
+    <w:p>
+      <w:pPr>
+        <w:shd w:fill="F4F4F4" w:color="auto" w:val="clear"/>
+        <w:spacing w:after="160" w:line="240"/>
+        <w:ind w:left="200"/>
+      </w:pPr>
+      <w:r>
+        <w:rPr>
+          <w:rFonts w:ascii="Consolas" w:cs="Consolas" w:eastAsia="Consolas" w:hAnsi="Consolas"/>
+          <w:sz w:val="16"/>
+          <w:szCs w:val="16"/>
+        </w:rPr>
+        <w:t xml:space="preserve">    plan = plan_batch(queued, x, y, deployment.fee_bps, network_fee=fee)</w:t>
+      </w:r>
+    </w:p>
+    <w:p>
+      <w:pPr>
+        <w:spacing w:after="120" w:line="336"/>
+        <w:jc w:val="both"/>
+      </w:pPr>
+      <w:r>
+        <w:rPr>
+          <w:rFonts w:ascii="Times New Roman" w:cs="Times New Roman" w:eastAsia="Times New Roman" w:hAnsi="Times New Roman"/>
+        </w:rPr>
+        <w:t xml:space="preserve">Deployment is derived deterministically from the batcher key and the minting deadline. The committed deployment record holds hashes only; on load the scripts are re-derived and checked against it, so rebuilding the validators with different code after deploying fails loudly instead of producing scripts that cannot spend the deployed pool. Every script that can submit a transaction is a </w:t>
+      </w:r>
+      <w:r>
+        <w:rPr>
+          <w:rFonts w:ascii="Times New Roman" w:cs="Times New Roman" w:eastAsia="Times New Roman" w:hAnsi="Times New Roman"/>
+          <w:b/>
+          <w:bCs/>
+        </w:rPr>
+        <w:t xml:space="preserve">dry run unless `--submit` is given</w:t>
+      </w:r>
+      <w:r>
+        <w:rPr>
+          <w:rFonts w:ascii="Times New Roman" w:cs="Times New Roman" w:eastAsia="Times New Roman" w:hAnsi="Times New Roman"/>
+        </w:rPr>
+        <w:t xml:space="preserve">.</w:t>
+      </w:r>
+    </w:p>
+    <w:p>
+      <w:pPr>
+        <w:pStyle w:val="Heading2"/>
+      </w:pPr>
+      <w:r>
+        <w:t xml:space="preserve">6.13 The Live Batcher</w:t>
+      </w:r>
+    </w:p>
+    <w:p>
+      <w:pPr>
+        <w:spacing w:after="120" w:line="336"/>
+        <w:jc w:val="both"/>
+      </w:pPr>
+      <w:r>
+        <w:rPr>
+          <w:rFonts w:ascii="Consolas" w:cs="Consolas" w:eastAsia="Consolas" w:hAnsi="Consolas"/>
+          <w:sz w:val="20"/>
+          <w:szCs w:val="20"/>
+        </w:rPr>
+        <w:t xml:space="preserve">scripts/run_batcher.py</w:t>
+      </w:r>
+      <w:r>
+        <w:rPr>
+          <w:rFonts w:ascii="Times New Roman" w:cs="Times New Roman" w:eastAsia="Times New Roman" w:hAnsi="Times New Roman"/>
+        </w:rPr>
+        <w:t xml:space="preserve"> runs the simulator’s control loop against preprod through a narrow chain interface, so the whole loop is testable against a fake. Each new block it resolves any batch in flight (included, expired, or still waiting); while the pool is held </w:t>
+      </w:r>
+      <w:r>
+        <w:rPr>
+          <w:rFonts w:ascii="Times New Roman" w:cs="Times New Roman" w:eastAsia="Times New Roman" w:hAnsi="Times New Roman"/>
+          <w:b/>
+          <w:bCs/>
+        </w:rPr>
+        <w:t xml:space="preserve">no decision is made</w:t>
+      </w:r>
+      <w:r>
+        <w:rPr>
+          <w:rFonts w:ascii="Times New Roman" w:cs="Times New Roman" w:eastAsia="Times New Roman" w:hAnsi="Times New Roman"/>
+        </w:rPr>
+        <w:t xml:space="preserve">; otherwise it reads the queue and the pool, forms the same </w:t>
+      </w:r>
+      <w:r>
+        <w:rPr>
+          <w:rFonts w:ascii="Consolas" w:cs="Consolas" w:eastAsia="Consolas" w:hAnsi="Consolas"/>
+          <w:sz w:val="20"/>
+          <w:szCs w:val="20"/>
+        </w:rPr>
+        <w:t xml:space="preserve">Observation</w:t>
+      </w:r>
+      <w:r>
+        <w:rPr>
+          <w:rFonts w:ascii="Times New Roman" w:cs="Times New Roman" w:eastAsia="Times New Roman" w:hAnsi="Times New Roman"/>
+        </w:rPr>
+        <w:t xml:space="preserve"> the simulator builds, asks the policy, and repairs the decision with the simulator’s own structural rules — the very function object, not a copy. The forecast in live mode is E4 over real recent blocks: the learned forecaster needs a 20-block feature history the first version of the loop does not maintain. Since ablation A2 found LightGBM does help P2 on cost, running it live is listed as future work.</w:t>
+      </w:r>
+    </w:p>
+    <w:p>
+      <w:pPr>
+        <w:pStyle w:val="ListParagraph"/>
+        <w:numPr>
+          <w:ilvl w:val="0"/>
+          <w:numId w:val="2"/>
+        </w:numPr>
+        <w:spacing w:after="60" w:line="312"/>
+      </w:pPr>
+      <w:r>
+        <w:rPr>
+          <w:rFonts w:ascii="Times New Roman" w:cs="Times New Roman" w:eastAsia="Times New Roman" w:hAnsi="Times New Roman"/>
+          <w:b/>
+          <w:bCs/>
+        </w:rPr>
+        <w:t xml:space="preserve">Shadow mode</w:t>
+      </w:r>
+      <w:r>
+        <w:rPr>
+          <w:rFonts w:ascii="Times New Roman" w:cs="Times New Roman" w:eastAsia="Times New Roman" w:hAnsi="Times New Roman"/>
+        </w:rPr>
+        <w:t xml:space="preserve"> is the default: the batcher decides and builds and signs the exact batch it would send, then logs it without submitting. A policy can be watched on live traffic before it is trusted with the key.</w:t>
+      </w:r>
+    </w:p>
+    <w:p>
+      <w:pPr>
+        <w:pStyle w:val="ListParagraph"/>
+        <w:numPr>
+          <w:ilvl w:val="0"/>
+          <w:numId w:val="2"/>
+        </w:numPr>
+        <w:spacing w:after="60" w:line="312"/>
+      </w:pPr>
+      <w:r>
+        <w:rPr>
+          <w:rFonts w:ascii="Times New Roman" w:cs="Times New Roman" w:eastAsia="Times New Roman" w:hAnsi="Times New Roman"/>
+          <w:b/>
+          <w:bCs/>
+        </w:rPr>
+        <w:t xml:space="preserve">A lagging API</w:t>
+      </w:r>
+      <w:r>
+        <w:rPr>
+          <w:rFonts w:ascii="Times New Roman" w:cs="Times New Roman" w:eastAsia="Times New Roman" w:hAnsi="Times New Roman"/>
+        </w:rPr>
+        <w:t xml:space="preserve"> can still show the pool UTxO that the batcher’s own confirmed batch spent; the loop recognises it and waits rather than building a transaction that would be rejected.</w:t>
+      </w:r>
+    </w:p>
+    <w:p>
+      <w:pPr>
+        <w:pStyle w:val="ListParagraph"/>
+        <w:numPr>
+          <w:ilvl w:val="0"/>
+          <w:numId w:val="2"/>
+        </w:numPr>
+        <w:spacing w:after="60" w:line="312"/>
+      </w:pPr>
+      <w:r>
+        <w:rPr>
+          <w:rFonts w:ascii="Times New Roman" w:cs="Times New Roman" w:eastAsia="Times New Roman" w:hAnsi="Times New Roman"/>
+          <w:b/>
+          <w:bCs/>
+        </w:rPr>
+        <w:t xml:space="preserve">Rejected submissions</w:t>
+      </w:r>
+      <w:r>
+        <w:rPr>
+          <w:rFonts w:ascii="Times New Roman" w:cs="Times New Roman" w:eastAsia="Times New Roman" w:hAnsi="Times New Roman"/>
+        </w:rPr>
+        <w:t xml:space="preserve"> are logged and counted, and leave the pool free; a Gate A violation, being a defect, stops the daemon.</w:t>
+      </w:r>
+    </w:p>
+    <w:p>
+      <w:pPr>
+        <w:pStyle w:val="ListParagraph"/>
+        <w:numPr>
+          <w:ilvl w:val="0"/>
+          <w:numId w:val="2"/>
+        </w:numPr>
+        <w:spacing w:after="60" w:line="312"/>
+      </w:pPr>
+      <w:r>
+        <w:rPr>
+          <w:rFonts w:ascii="Times New Roman" w:cs="Times New Roman" w:eastAsia="Times New Roman" w:hAnsi="Times New Roman"/>
+          <w:b/>
+          <w:bCs/>
+        </w:rPr>
+        <w:t xml:space="preserve">Shutdown</w:t>
+      </w:r>
+      <w:r>
+        <w:rPr>
+          <w:rFonts w:ascii="Times New Roman" w:cs="Times New Roman" w:eastAsia="Times New Roman" w:hAnsi="Times New Roman"/>
+        </w:rPr>
+        <w:t xml:space="preserve"> is only clean with the pool free: a stop request waits for any batch in flight to resolve and starts no new batch.</w:t>
+      </w:r>
+    </w:p>
+    <w:p>
+      <w:pPr>
+        <w:pStyle w:val="ListParagraph"/>
+        <w:numPr>
+          <w:ilvl w:val="0"/>
+          <w:numId w:val="2"/>
+        </w:numPr>
+        <w:spacing w:after="60" w:line="312"/>
+      </w:pPr>
+      <w:r>
+        <w:rPr>
+          <w:rFonts w:ascii="Times New Roman" w:cs="Times New Roman" w:eastAsia="Times New Roman" w:hAnsi="Times New Roman"/>
+          <w:b/>
+          <w:bCs/>
+        </w:rPr>
+        <w:t xml:space="preserve">Safety:</w:t>
+      </w:r>
+      <w:r>
+        <w:rPr>
+          <w:rFonts w:ascii="Times New Roman" w:cs="Times New Roman" w:eastAsia="Times New Roman" w:hAnsi="Times New Roman"/>
+        </w:rPr>
+        <w:t xml:space="preserve"> the settings guard makes mainnet unreachable, keys are generated outside the repository and refused inside it, and the pre-commit secret scan was extended to the JSON key files PyCardano writes, proven on a real generated key.</w:t>
       </w:r>
     </w:p>
     <w:p>
@@ -16606,13 +18779,27 @@
           <w:b/>
           <w:bCs/>
         </w:rPr>
-        <w:t xml:space="preserve">270 tests in 21 files</w:t>
-      </w:r>
-      <w:r>
-        <w:rPr>
-          <w:rFonts w:ascii="Times New Roman" w:cs="Times New Roman" w:eastAsia="Times New Roman" w:hAnsi="Times New Roman"/>
-        </w:rPr>
-        <w:t xml:space="preserve">, runs on every push in GitHub Actions, and enforces a minimum of 90 % line coverage; measured coverage is 94 %.</w:t>
+        <w:t xml:space="preserve">339 Python tests in 26 files</w:t>
+      </w:r>
+      <w:r>
+        <w:rPr>
+          <w:rFonts w:ascii="Times New Roman" w:cs="Times New Roman" w:eastAsia="Times New Roman" w:hAnsi="Times New Roman"/>
+        </w:rPr>
+        <w:t xml:space="preserve"> and </w:t>
+      </w:r>
+      <w:r>
+        <w:rPr>
+          <w:rFonts w:ascii="Times New Roman" w:cs="Times New Roman" w:eastAsia="Times New Roman" w:hAnsi="Times New Roman"/>
+          <w:b/>
+          <w:bCs/>
+        </w:rPr>
+        <w:t xml:space="preserve">16 Aiken tests</w:t>
+      </w:r>
+      <w:r>
+        <w:rPr>
+          <w:rFonts w:ascii="Times New Roman" w:cs="Times New Roman" w:eastAsia="Times New Roman" w:hAnsi="Times New Roman"/>
+        </w:rPr>
+        <w:t xml:space="preserve"> for the validators; the Python suite runs on every push in GitHub Actions and enforces a minimum of 90 % line coverage, and measured coverage is 94.6 %.</w:t>
       </w:r>
     </w:p>
     <w:p>
@@ -20948,7 +23135,19 @@
         <w:pStyle w:val="Heading2"/>
       </w:pPr>
       <w:r>
-        <w:t xml:space="preserve">7.5 Defects Found by Testing</w:t>
+        <w:t xml:space="preserve">7.5 On-Chain and Live-Mode Tests</w:t>
+      </w:r>
+    </w:p>
+    <w:p>
+      <w:pPr>
+        <w:spacing w:after="120" w:line="336"/>
+        <w:jc w:val="both"/>
+      </w:pPr>
+      <w:r>
+        <w:rPr>
+          <w:rFonts w:ascii="Times New Roman" w:cs="Times New Roman" w:eastAsia="Times New Roman" w:hAnsi="Times New Roman"/>
+        </w:rPr>
+        <w:t xml:space="preserve">Phase 7 moves the batcher from a simulator onto a real ledger, where a mistake costs a rejected transaction or, worse, a user short-changed by a buggy batcher. Everything that can be checked without submitting a transaction is checked offline: the validators in Aiken’s own test runner, and the Python side against a fake chain context on which PyCardano still performs its real coin selection, balancing and fee calculation.</w:t>
       </w:r>
     </w:p>
     <w:p>
@@ -20966,6 +23165,1422 @@
           <w:szCs w:val="22"/>
         </w:rPr>
         <w:t xml:space="preserve">Table 7.5: </w:t>
+      </w:r>
+      <w:r>
+        <w:rPr>
+          <w:rFonts w:ascii="Times New Roman" w:cs="Times New Roman" w:eastAsia="Times New Roman" w:hAnsi="Times New Roman"/>
+          <w:i/>
+          <w:iCs/>
+          <w:sz w:val="22"/>
+          <w:szCs w:val="22"/>
+        </w:rPr>
+        <w:t xml:space="preserve">On-chain and live-mode tests</w:t>
+      </w:r>
+    </w:p>
+    <w:tbl>
+      <w:tblPr>
+        <w:tblW w:type="dxa" w:w="9026"/>
+        <w:tblBorders>
+          <w:top w:val="single" w:color="auto" w:sz="4"/>
+          <w:left w:val="single" w:color="auto" w:sz="4"/>
+          <w:bottom w:val="single" w:color="auto" w:sz="4"/>
+          <w:right w:val="single" w:color="auto" w:sz="4"/>
+          <w:insideH w:val="single" w:color="auto" w:sz="4"/>
+          <w:insideV w:val="single" w:color="auto" w:sz="4"/>
+        </w:tblBorders>
+      </w:tblPr>
+      <w:tblGrid>
+        <w:gridCol w:w="902"/>
+        <w:gridCol w:w="6117"/>
+        <w:gridCol w:w="2007"/>
+      </w:tblGrid>
+      <w:tr>
+        <w:trPr>
+          <w:tblHeader/>
+        </w:trPr>
+        <w:tc>
+          <w:tcPr>
+            <w:tcW w:type="dxa" w:w="902"/>
+            <w:tcBorders>
+              <w:top w:val="single" w:color="808080" w:sz="4"/>
+              <w:left w:val="single" w:color="808080" w:sz="4"/>
+              <w:bottom w:val="single" w:color="808080" w:sz="4"/>
+              <w:right w:val="single" w:color="808080" w:sz="4"/>
+            </w:tcBorders>
+            <w:shd w:fill="D9E2F3" w:color="auto" w:val="clear"/>
+            <w:tcMar>
+              <w:top w:type="dxa" w:w="40"/>
+              <w:left w:type="dxa" w:w="80"/>
+              <w:bottom w:type="dxa" w:w="40"/>
+              <w:right w:type="dxa" w:w="80"/>
+            </w:tcMar>
+          </w:tcPr>
+          <w:p>
+            <w:pPr>
+              <w:spacing w:after="0"/>
+            </w:pPr>
+            <w:r>
+              <w:rPr>
+                <w:rFonts w:ascii="Times New Roman" w:cs="Times New Roman" w:eastAsia="Times New Roman" w:hAnsi="Times New Roman"/>
+                <w:b/>
+                <w:bCs/>
+                <w:sz w:val="20"/>
+                <w:szCs w:val="20"/>
+              </w:rPr>
+              <w:t xml:space="preserve">ID</w:t>
+            </w:r>
+          </w:p>
+        </w:tc>
+        <w:tc>
+          <w:tcPr>
+            <w:tcW w:type="dxa" w:w="6117"/>
+            <w:tcBorders>
+              <w:top w:val="single" w:color="808080" w:sz="4"/>
+              <w:left w:val="single" w:color="808080" w:sz="4"/>
+              <w:bottom w:val="single" w:color="808080" w:sz="4"/>
+              <w:right w:val="single" w:color="808080" w:sz="4"/>
+            </w:tcBorders>
+            <w:shd w:fill="D9E2F3" w:color="auto" w:val="clear"/>
+            <w:tcMar>
+              <w:top w:type="dxa" w:w="40"/>
+              <w:left w:type="dxa" w:w="80"/>
+              <w:bottom w:type="dxa" w:w="40"/>
+              <w:right w:type="dxa" w:w="80"/>
+            </w:tcMar>
+          </w:tcPr>
+          <w:p>
+            <w:pPr>
+              <w:spacing w:after="0"/>
+            </w:pPr>
+            <w:r>
+              <w:rPr>
+                <w:rFonts w:ascii="Times New Roman" w:cs="Times New Roman" w:eastAsia="Times New Roman" w:hAnsi="Times New Roman"/>
+                <w:b/>
+                <w:bCs/>
+                <w:sz w:val="20"/>
+                <w:szCs w:val="20"/>
+              </w:rPr>
+              <w:t xml:space="preserve">Test</w:t>
+            </w:r>
+          </w:p>
+        </w:tc>
+        <w:tc>
+          <w:tcPr>
+            <w:tcW w:type="dxa" w:w="2007"/>
+            <w:tcBorders>
+              <w:top w:val="single" w:color="808080" w:sz="4"/>
+              <w:left w:val="single" w:color="808080" w:sz="4"/>
+              <w:bottom w:val="single" w:color="808080" w:sz="4"/>
+              <w:right w:val="single" w:color="808080" w:sz="4"/>
+            </w:tcBorders>
+            <w:shd w:fill="D9E2F3" w:color="auto" w:val="clear"/>
+            <w:tcMar>
+              <w:top w:type="dxa" w:w="40"/>
+              <w:left w:type="dxa" w:w="80"/>
+              <w:bottom w:type="dxa" w:w="40"/>
+              <w:right w:type="dxa" w:w="80"/>
+            </w:tcMar>
+          </w:tcPr>
+          <w:p>
+            <w:pPr>
+              <w:spacing w:after="0"/>
+            </w:pPr>
+            <w:r>
+              <w:rPr>
+                <w:rFonts w:ascii="Times New Roman" w:cs="Times New Roman" w:eastAsia="Times New Roman" w:hAnsi="Times New Roman"/>
+                <w:b/>
+                <w:bCs/>
+                <w:sz w:val="20"/>
+                <w:szCs w:val="20"/>
+              </w:rPr>
+              <w:t xml:space="preserve">Result</w:t>
+            </w:r>
+          </w:p>
+        </w:tc>
+      </w:tr>
+      <w:tr>
+        <w:tc>
+          <w:tcPr>
+            <w:tcW w:type="dxa" w:w="902"/>
+            <w:tcBorders>
+              <w:top w:val="single" w:color="808080" w:sz="4"/>
+              <w:left w:val="single" w:color="808080" w:sz="4"/>
+              <w:bottom w:val="single" w:color="808080" w:sz="4"/>
+              <w:right w:val="single" w:color="808080" w:sz="4"/>
+            </w:tcBorders>
+            <w:tcMar>
+              <w:top w:type="dxa" w:w="40"/>
+              <w:left w:type="dxa" w:w="80"/>
+              <w:bottom w:type="dxa" w:w="40"/>
+              <w:right w:type="dxa" w:w="80"/>
+            </w:tcMar>
+          </w:tcPr>
+          <w:p>
+            <w:pPr>
+              <w:spacing w:after="0"/>
+            </w:pPr>
+            <w:r>
+              <w:rPr>
+                <w:rFonts w:ascii="Times New Roman" w:cs="Times New Roman" w:eastAsia="Times New Roman" w:hAnsi="Times New Roman"/>
+                <w:sz w:val="20"/>
+                <w:szCs w:val="20"/>
+              </w:rPr>
+              <w:t xml:space="preserve">T-O1</w:t>
+            </w:r>
+          </w:p>
+        </w:tc>
+        <w:tc>
+          <w:tcPr>
+            <w:tcW w:type="dxa" w:w="6117"/>
+            <w:tcBorders>
+              <w:top w:val="single" w:color="808080" w:sz="4"/>
+              <w:left w:val="single" w:color="808080" w:sz="4"/>
+              <w:bottom w:val="single" w:color="808080" w:sz="4"/>
+              <w:right w:val="single" w:color="808080" w:sz="4"/>
+            </w:tcBorders>
+            <w:tcMar>
+              <w:top w:type="dxa" w:w="40"/>
+              <w:left w:type="dxa" w:w="80"/>
+              <w:bottom w:type="dxa" w:w="40"/>
+              <w:right w:type="dxa" w:w="80"/>
+            </w:tcMar>
+          </w:tcPr>
+          <w:p>
+            <w:pPr>
+              <w:spacing w:after="0"/>
+            </w:pPr>
+            <w:r>
+              <w:rPr>
+                <w:rFonts w:ascii="Times New Roman" w:cs="Times New Roman" w:eastAsia="Times New Roman" w:hAnsi="Times New Roman"/>
+                <w:sz w:val="20"/>
+                <w:szCs w:val="20"/>
+              </w:rPr>
+              <w:t xml:space="preserve">The owner can cancel an order; a stranger or the batcher cannot</w:t>
+            </w:r>
+          </w:p>
+        </w:tc>
+        <w:tc>
+          <w:tcPr>
+            <w:tcW w:type="dxa" w:w="2007"/>
+            <w:tcBorders>
+              <w:top w:val="single" w:color="808080" w:sz="4"/>
+              <w:left w:val="single" w:color="808080" w:sz="4"/>
+              <w:bottom w:val="single" w:color="808080" w:sz="4"/>
+              <w:right w:val="single" w:color="808080" w:sz="4"/>
+            </w:tcBorders>
+            <w:tcMar>
+              <w:top w:type="dxa" w:w="40"/>
+              <w:left w:type="dxa" w:w="80"/>
+              <w:bottom w:type="dxa" w:w="40"/>
+              <w:right w:type="dxa" w:w="80"/>
+            </w:tcMar>
+          </w:tcPr>
+          <w:p>
+            <w:pPr>
+              <w:spacing w:after="0"/>
+            </w:pPr>
+            <w:r>
+              <w:rPr>
+                <w:rFonts w:ascii="Times New Roman" w:cs="Times New Roman" w:eastAsia="Times New Roman" w:hAnsi="Times New Roman"/>
+                <w:sz w:val="20"/>
+                <w:szCs w:val="20"/>
+              </w:rPr>
+              <w:t xml:space="preserve">Pass (Aiken)</w:t>
+            </w:r>
+          </w:p>
+        </w:tc>
+      </w:tr>
+      <w:tr>
+        <w:tc>
+          <w:tcPr>
+            <w:tcW w:type="dxa" w:w="902"/>
+            <w:tcBorders>
+              <w:top w:val="single" w:color="808080" w:sz="4"/>
+              <w:left w:val="single" w:color="808080" w:sz="4"/>
+              <w:bottom w:val="single" w:color="808080" w:sz="4"/>
+              <w:right w:val="single" w:color="808080" w:sz="4"/>
+            </w:tcBorders>
+            <w:tcMar>
+              <w:top w:type="dxa" w:w="40"/>
+              <w:left w:type="dxa" w:w="80"/>
+              <w:bottom w:type="dxa" w:w="40"/>
+              <w:right w:type="dxa" w:w="80"/>
+            </w:tcMar>
+          </w:tcPr>
+          <w:p>
+            <w:pPr>
+              <w:spacing w:after="0"/>
+            </w:pPr>
+            <w:r>
+              <w:rPr>
+                <w:rFonts w:ascii="Times New Roman" w:cs="Times New Roman" w:eastAsia="Times New Roman" w:hAnsi="Times New Roman"/>
+                <w:sz w:val="20"/>
+                <w:szCs w:val="20"/>
+              </w:rPr>
+              <w:t xml:space="preserve">T-O2</w:t>
+            </w:r>
+          </w:p>
+        </w:tc>
+        <w:tc>
+          <w:tcPr>
+            <w:tcW w:type="dxa" w:w="6117"/>
+            <w:tcBorders>
+              <w:top w:val="single" w:color="808080" w:sz="4"/>
+              <w:left w:val="single" w:color="808080" w:sz="4"/>
+              <w:bottom w:val="single" w:color="808080" w:sz="4"/>
+              <w:right w:val="single" w:color="808080" w:sz="4"/>
+            </w:tcBorders>
+            <w:tcMar>
+              <w:top w:type="dxa" w:w="40"/>
+              <w:left w:type="dxa" w:w="80"/>
+              <w:bottom w:type="dxa" w:w="40"/>
+              <w:right w:type="dxa" w:w="80"/>
+            </w:tcMar>
+          </w:tcPr>
+          <w:p>
+            <w:pPr>
+              <w:spacing w:after="0"/>
+            </w:pPr>
+            <w:r>
+              <w:rPr>
+                <w:rFonts w:ascii="Times New Roman" w:cs="Times New Roman" w:eastAsia="Times New Roman" w:hAnsi="Times New Roman"/>
+                <w:sz w:val="20"/>
+                <w:szCs w:val="20"/>
+              </w:rPr>
+              <w:t xml:space="preserve">A payout below </w:t>
+            </w:r>
+            <w:r>
+              <w:rPr>
+                <w:rFonts w:ascii="Consolas" w:cs="Consolas" w:eastAsia="Consolas" w:hAnsi="Consolas"/>
+                <w:sz w:val="20"/>
+                <w:szCs w:val="20"/>
+              </w:rPr>
+              <w:t xml:space="preserve">min_out</w:t>
+            </w:r>
+            <w:r>
+              <w:rPr>
+                <w:rFonts w:ascii="Times New Roman" w:cs="Times New Roman" w:eastAsia="Times New Roman" w:hAnsi="Times New Roman"/>
+                <w:sz w:val="20"/>
+                <w:szCs w:val="20"/>
+              </w:rPr>
+              <w:t xml:space="preserve">, or paid to any other address, is rejected</w:t>
+            </w:r>
+          </w:p>
+        </w:tc>
+        <w:tc>
+          <w:tcPr>
+            <w:tcW w:type="dxa" w:w="2007"/>
+            <w:tcBorders>
+              <w:top w:val="single" w:color="808080" w:sz="4"/>
+              <w:left w:val="single" w:color="808080" w:sz="4"/>
+              <w:bottom w:val="single" w:color="808080" w:sz="4"/>
+              <w:right w:val="single" w:color="808080" w:sz="4"/>
+            </w:tcBorders>
+            <w:tcMar>
+              <w:top w:type="dxa" w:w="40"/>
+              <w:left w:type="dxa" w:w="80"/>
+              <w:bottom w:type="dxa" w:w="40"/>
+              <w:right w:type="dxa" w:w="80"/>
+            </w:tcMar>
+          </w:tcPr>
+          <w:p>
+            <w:pPr>
+              <w:spacing w:after="0"/>
+            </w:pPr>
+            <w:r>
+              <w:rPr>
+                <w:rFonts w:ascii="Times New Roman" w:cs="Times New Roman" w:eastAsia="Times New Roman" w:hAnsi="Times New Roman"/>
+                <w:sz w:val="20"/>
+                <w:szCs w:val="20"/>
+              </w:rPr>
+              <w:t xml:space="preserve">Pass (Aiken)</w:t>
+            </w:r>
+          </w:p>
+        </w:tc>
+      </w:tr>
+      <w:tr>
+        <w:tc>
+          <w:tcPr>
+            <w:tcW w:type="dxa" w:w="902"/>
+            <w:tcBorders>
+              <w:top w:val="single" w:color="808080" w:sz="4"/>
+              <w:left w:val="single" w:color="808080" w:sz="4"/>
+              <w:bottom w:val="single" w:color="808080" w:sz="4"/>
+              <w:right w:val="single" w:color="808080" w:sz="4"/>
+            </w:tcBorders>
+            <w:tcMar>
+              <w:top w:type="dxa" w:w="40"/>
+              <w:left w:type="dxa" w:w="80"/>
+              <w:bottom w:type="dxa" w:w="40"/>
+              <w:right w:type="dxa" w:w="80"/>
+            </w:tcMar>
+          </w:tcPr>
+          <w:p>
+            <w:pPr>
+              <w:spacing w:after="0"/>
+            </w:pPr>
+            <w:r>
+              <w:rPr>
+                <w:rFonts w:ascii="Times New Roman" w:cs="Times New Roman" w:eastAsia="Times New Roman" w:hAnsi="Times New Roman"/>
+                <w:sz w:val="20"/>
+                <w:szCs w:val="20"/>
+              </w:rPr>
+              <w:t xml:space="preserve">T-O3</w:t>
+            </w:r>
+          </w:p>
+        </w:tc>
+        <w:tc>
+          <w:tcPr>
+            <w:tcW w:type="dxa" w:w="6117"/>
+            <w:tcBorders>
+              <w:top w:val="single" w:color="808080" w:sz="4"/>
+              <w:left w:val="single" w:color="808080" w:sz="4"/>
+              <w:bottom w:val="single" w:color="808080" w:sz="4"/>
+              <w:right w:val="single" w:color="808080" w:sz="4"/>
+            </w:tcBorders>
+            <w:tcMar>
+              <w:top w:type="dxa" w:w="40"/>
+              <w:left w:type="dxa" w:w="80"/>
+              <w:bottom w:type="dxa" w:w="40"/>
+              <w:right w:type="dxa" w:w="80"/>
+            </w:tcMar>
+          </w:tcPr>
+          <w:p>
+            <w:pPr>
+              <w:spacing w:after="0"/>
+            </w:pPr>
+            <w:r>
+              <w:rPr>
+                <w:rFonts w:ascii="Times New Roman" w:cs="Times New Roman" w:eastAsia="Times New Roman" w:hAnsi="Times New Roman"/>
+                <w:sz w:val="20"/>
+                <w:szCs w:val="20"/>
+              </w:rPr>
+              <w:t xml:space="preserve">A batch signed by any key but the batcher’s is rejected</w:t>
+            </w:r>
+          </w:p>
+        </w:tc>
+        <w:tc>
+          <w:tcPr>
+            <w:tcW w:type="dxa" w:w="2007"/>
+            <w:tcBorders>
+              <w:top w:val="single" w:color="808080" w:sz="4"/>
+              <w:left w:val="single" w:color="808080" w:sz="4"/>
+              <w:bottom w:val="single" w:color="808080" w:sz="4"/>
+              <w:right w:val="single" w:color="808080" w:sz="4"/>
+            </w:tcBorders>
+            <w:tcMar>
+              <w:top w:type="dxa" w:w="40"/>
+              <w:left w:type="dxa" w:w="80"/>
+              <w:bottom w:type="dxa" w:w="40"/>
+              <w:right w:type="dxa" w:w="80"/>
+            </w:tcMar>
+          </w:tcPr>
+          <w:p>
+            <w:pPr>
+              <w:spacing w:after="0"/>
+            </w:pPr>
+            <w:r>
+              <w:rPr>
+                <w:rFonts w:ascii="Times New Roman" w:cs="Times New Roman" w:eastAsia="Times New Roman" w:hAnsi="Times New Roman"/>
+                <w:sz w:val="20"/>
+                <w:szCs w:val="20"/>
+              </w:rPr>
+              <w:t xml:space="preserve">Pass (Aiken)</w:t>
+            </w:r>
+          </w:p>
+        </w:tc>
+      </w:tr>
+      <w:tr>
+        <w:tc>
+          <w:tcPr>
+            <w:tcW w:type="dxa" w:w="902"/>
+            <w:tcBorders>
+              <w:top w:val="single" w:color="808080" w:sz="4"/>
+              <w:left w:val="single" w:color="808080" w:sz="4"/>
+              <w:bottom w:val="single" w:color="808080" w:sz="4"/>
+              <w:right w:val="single" w:color="808080" w:sz="4"/>
+            </w:tcBorders>
+            <w:tcMar>
+              <w:top w:type="dxa" w:w="40"/>
+              <w:left w:type="dxa" w:w="80"/>
+              <w:bottom w:type="dxa" w:w="40"/>
+              <w:right w:type="dxa" w:w="80"/>
+            </w:tcMar>
+          </w:tcPr>
+          <w:p>
+            <w:pPr>
+              <w:spacing w:after="0"/>
+            </w:pPr>
+            <w:r>
+              <w:rPr>
+                <w:rFonts w:ascii="Times New Roman" w:cs="Times New Roman" w:eastAsia="Times New Roman" w:hAnsi="Times New Roman"/>
+                <w:sz w:val="20"/>
+                <w:szCs w:val="20"/>
+              </w:rPr>
+              <w:t xml:space="preserve">T-O4</w:t>
+            </w:r>
+          </w:p>
+        </w:tc>
+        <w:tc>
+          <w:tcPr>
+            <w:tcW w:type="dxa" w:w="6117"/>
+            <w:tcBorders>
+              <w:top w:val="single" w:color="808080" w:sz="4"/>
+              <w:left w:val="single" w:color="808080" w:sz="4"/>
+              <w:bottom w:val="single" w:color="808080" w:sz="4"/>
+              <w:right w:val="single" w:color="808080" w:sz="4"/>
+            </w:tcBorders>
+            <w:tcMar>
+              <w:top w:type="dxa" w:w="40"/>
+              <w:left w:type="dxa" w:w="80"/>
+              <w:bottom w:type="dxa" w:w="40"/>
+              <w:right w:type="dxa" w:w="80"/>
+            </w:tcMar>
+          </w:tcPr>
+          <w:p>
+            <w:pPr>
+              <w:spacing w:after="0"/>
+            </w:pPr>
+            <w:r>
+              <w:rPr>
+                <w:rFonts w:ascii="Times New Roman" w:cs="Times New Roman" w:eastAsia="Times New Roman" w:hAnsi="Times New Roman"/>
+                <w:sz w:val="20"/>
+                <w:szCs w:val="20"/>
+              </w:rPr>
+              <w:t xml:space="preserve">A fair swap is accepted; ignoring the fee, losing the NFT, rewriting pool parameters or a non-batcher signer is rejected</w:t>
+            </w:r>
+          </w:p>
+        </w:tc>
+        <w:tc>
+          <w:tcPr>
+            <w:tcW w:type="dxa" w:w="2007"/>
+            <w:tcBorders>
+              <w:top w:val="single" w:color="808080" w:sz="4"/>
+              <w:left w:val="single" w:color="808080" w:sz="4"/>
+              <w:bottom w:val="single" w:color="808080" w:sz="4"/>
+              <w:right w:val="single" w:color="808080" w:sz="4"/>
+            </w:tcBorders>
+            <w:tcMar>
+              <w:top w:type="dxa" w:w="40"/>
+              <w:left w:type="dxa" w:w="80"/>
+              <w:bottom w:type="dxa" w:w="40"/>
+              <w:right w:type="dxa" w:w="80"/>
+            </w:tcMar>
+          </w:tcPr>
+          <w:p>
+            <w:pPr>
+              <w:spacing w:after="0"/>
+            </w:pPr>
+            <w:r>
+              <w:rPr>
+                <w:rFonts w:ascii="Times New Roman" w:cs="Times New Roman" w:eastAsia="Times New Roman" w:hAnsi="Times New Roman"/>
+                <w:sz w:val="20"/>
+                <w:szCs w:val="20"/>
+              </w:rPr>
+              <w:t xml:space="preserve">Pass (Aiken)</w:t>
+            </w:r>
+          </w:p>
+        </w:tc>
+      </w:tr>
+      <w:tr>
+        <w:tc>
+          <w:tcPr>
+            <w:tcW w:type="dxa" w:w="902"/>
+            <w:tcBorders>
+              <w:top w:val="single" w:color="808080" w:sz="4"/>
+              <w:left w:val="single" w:color="808080" w:sz="4"/>
+              <w:bottom w:val="single" w:color="808080" w:sz="4"/>
+              <w:right w:val="single" w:color="808080" w:sz="4"/>
+            </w:tcBorders>
+            <w:tcMar>
+              <w:top w:type="dxa" w:w="40"/>
+              <w:left w:type="dxa" w:w="80"/>
+              <w:bottom w:type="dxa" w:w="40"/>
+              <w:right w:type="dxa" w:w="80"/>
+            </w:tcMar>
+          </w:tcPr>
+          <w:p>
+            <w:pPr>
+              <w:spacing w:after="0"/>
+            </w:pPr>
+            <w:r>
+              <w:rPr>
+                <w:rFonts w:ascii="Times New Roman" w:cs="Times New Roman" w:eastAsia="Times New Roman" w:hAnsi="Times New Roman"/>
+                <w:sz w:val="20"/>
+                <w:szCs w:val="20"/>
+              </w:rPr>
+              <w:t xml:space="preserve">T-O5</w:t>
+            </w:r>
+          </w:p>
+        </w:tc>
+        <w:tc>
+          <w:tcPr>
+            <w:tcW w:type="dxa" w:w="6117"/>
+            <w:tcBorders>
+              <w:top w:val="single" w:color="808080" w:sz="4"/>
+              <w:left w:val="single" w:color="808080" w:sz="4"/>
+              <w:bottom w:val="single" w:color="808080" w:sz="4"/>
+              <w:right w:val="single" w:color="808080" w:sz="4"/>
+            </w:tcBorders>
+            <w:tcMar>
+              <w:top w:type="dxa" w:w="40"/>
+              <w:left w:type="dxa" w:w="80"/>
+              <w:bottom w:type="dxa" w:w="40"/>
+              <w:right w:type="dxa" w:w="80"/>
+            </w:tcMar>
+          </w:tcPr>
+          <w:p>
+            <w:pPr>
+              <w:spacing w:after="0"/>
+            </w:pPr>
+            <w:r>
+              <w:rPr>
+                <w:rFonts w:ascii="Consolas" w:cs="Consolas" w:eastAsia="Consolas" w:hAnsi="Consolas"/>
+                <w:sz w:val="20"/>
+                <w:szCs w:val="20"/>
+              </w:rPr>
+              <w:t xml:space="preserve">fee / n + margin</w:t>
+            </w:r>
+            <w:r>
+              <w:rPr>
+                <w:rFonts w:ascii="Times New Roman" w:cs="Times New Roman" w:eastAsia="Times New Roman" w:hAnsi="Times New Roman"/>
+                <w:sz w:val="20"/>
+                <w:szCs w:val="20"/>
+              </w:rPr>
+              <w:t xml:space="preserve"> is accepted, one lovelace more is rejected, and the allowed share halves when n = 2</w:t>
+            </w:r>
+          </w:p>
+        </w:tc>
+        <w:tc>
+          <w:tcPr>
+            <w:tcW w:type="dxa" w:w="2007"/>
+            <w:tcBorders>
+              <w:top w:val="single" w:color="808080" w:sz="4"/>
+              <w:left w:val="single" w:color="808080" w:sz="4"/>
+              <w:bottom w:val="single" w:color="808080" w:sz="4"/>
+              <w:right w:val="single" w:color="808080" w:sz="4"/>
+            </w:tcBorders>
+            <w:tcMar>
+              <w:top w:type="dxa" w:w="40"/>
+              <w:left w:type="dxa" w:w="80"/>
+              <w:bottom w:type="dxa" w:w="40"/>
+              <w:right w:type="dxa" w:w="80"/>
+            </w:tcMar>
+          </w:tcPr>
+          <w:p>
+            <w:pPr>
+              <w:spacing w:after="0"/>
+            </w:pPr>
+            <w:r>
+              <w:rPr>
+                <w:rFonts w:ascii="Times New Roman" w:cs="Times New Roman" w:eastAsia="Times New Roman" w:hAnsi="Times New Roman"/>
+                <w:sz w:val="20"/>
+                <w:szCs w:val="20"/>
+              </w:rPr>
+              <w:t xml:space="preserve">Pass (Aiken)</w:t>
+            </w:r>
+          </w:p>
+        </w:tc>
+      </w:tr>
+      <w:tr>
+        <w:tc>
+          <w:tcPr>
+            <w:tcW w:type="dxa" w:w="902"/>
+            <w:tcBorders>
+              <w:top w:val="single" w:color="808080" w:sz="4"/>
+              <w:left w:val="single" w:color="808080" w:sz="4"/>
+              <w:bottom w:val="single" w:color="808080" w:sz="4"/>
+              <w:right w:val="single" w:color="808080" w:sz="4"/>
+            </w:tcBorders>
+            <w:tcMar>
+              <w:top w:type="dxa" w:w="40"/>
+              <w:left w:type="dxa" w:w="80"/>
+              <w:bottom w:type="dxa" w:w="40"/>
+              <w:right w:type="dxa" w:w="80"/>
+            </w:tcMar>
+          </w:tcPr>
+          <w:p>
+            <w:pPr>
+              <w:spacing w:after="0"/>
+            </w:pPr>
+            <w:r>
+              <w:rPr>
+                <w:rFonts w:ascii="Times New Roman" w:cs="Times New Roman" w:eastAsia="Times New Roman" w:hAnsi="Times New Roman"/>
+                <w:sz w:val="20"/>
+                <w:szCs w:val="20"/>
+              </w:rPr>
+              <w:t xml:space="preserve">—</w:t>
+            </w:r>
+          </w:p>
+        </w:tc>
+        <w:tc>
+          <w:tcPr>
+            <w:tcW w:type="dxa" w:w="6117"/>
+            <w:tcBorders>
+              <w:top w:val="single" w:color="808080" w:sz="4"/>
+              <w:left w:val="single" w:color="808080" w:sz="4"/>
+              <w:bottom w:val="single" w:color="808080" w:sz="4"/>
+              <w:right w:val="single" w:color="808080" w:sz="4"/>
+            </w:tcBorders>
+            <w:tcMar>
+              <w:top w:type="dxa" w:w="40"/>
+              <w:left w:type="dxa" w:w="80"/>
+              <w:bottom w:type="dxa" w:w="40"/>
+              <w:right w:type="dxa" w:w="80"/>
+            </w:tcMar>
+          </w:tcPr>
+          <w:p>
+            <w:pPr>
+              <w:spacing w:after="0"/>
+            </w:pPr>
+            <w:r>
+              <w:rPr>
+                <w:rFonts w:ascii="Times New Roman" w:cs="Times New Roman" w:eastAsia="Times New Roman" w:hAnsi="Times New Roman"/>
+                <w:sz w:val="20"/>
+                <w:szCs w:val="20"/>
+              </w:rPr>
+              <w:t xml:space="preserve">One payout cannot satisfy two orders (double satisfaction)</w:t>
+            </w:r>
+          </w:p>
+        </w:tc>
+        <w:tc>
+          <w:tcPr>
+            <w:tcW w:type="dxa" w:w="2007"/>
+            <w:tcBorders>
+              <w:top w:val="single" w:color="808080" w:sz="4"/>
+              <w:left w:val="single" w:color="808080" w:sz="4"/>
+              <w:bottom w:val="single" w:color="808080" w:sz="4"/>
+              <w:right w:val="single" w:color="808080" w:sz="4"/>
+            </w:tcBorders>
+            <w:tcMar>
+              <w:top w:type="dxa" w:w="40"/>
+              <w:left w:type="dxa" w:w="80"/>
+              <w:bottom w:type="dxa" w:w="40"/>
+              <w:right w:type="dxa" w:w="80"/>
+            </w:tcMar>
+          </w:tcPr>
+          <w:p>
+            <w:pPr>
+              <w:spacing w:after="0"/>
+            </w:pPr>
+            <w:r>
+              <w:rPr>
+                <w:rFonts w:ascii="Times New Roman" w:cs="Times New Roman" w:eastAsia="Times New Roman" w:hAnsi="Times New Roman"/>
+                <w:sz w:val="20"/>
+                <w:szCs w:val="20"/>
+              </w:rPr>
+              <w:t xml:space="preserve">Pass (Aiken)</w:t>
+            </w:r>
+          </w:p>
+        </w:tc>
+      </w:tr>
+      <w:tr>
+        <w:tc>
+          <w:tcPr>
+            <w:tcW w:type="dxa" w:w="902"/>
+            <w:tcBorders>
+              <w:top w:val="single" w:color="808080" w:sz="4"/>
+              <w:left w:val="single" w:color="808080" w:sz="4"/>
+              <w:bottom w:val="single" w:color="808080" w:sz="4"/>
+              <w:right w:val="single" w:color="808080" w:sz="4"/>
+            </w:tcBorders>
+            <w:tcMar>
+              <w:top w:type="dxa" w:w="40"/>
+              <w:left w:type="dxa" w:w="80"/>
+              <w:bottom w:type="dxa" w:w="40"/>
+              <w:right w:type="dxa" w:w="80"/>
+            </w:tcMar>
+          </w:tcPr>
+          <w:p>
+            <w:pPr>
+              <w:spacing w:after="0"/>
+            </w:pPr>
+            <w:r>
+              <w:rPr>
+                <w:rFonts w:ascii="Times New Roman" w:cs="Times New Roman" w:eastAsia="Times New Roman" w:hAnsi="Times New Roman"/>
+                <w:sz w:val="20"/>
+                <w:szCs w:val="20"/>
+              </w:rPr>
+              <w:t xml:space="preserve">—</w:t>
+            </w:r>
+          </w:p>
+        </w:tc>
+        <w:tc>
+          <w:tcPr>
+            <w:tcW w:type="dxa" w:w="6117"/>
+            <w:tcBorders>
+              <w:top w:val="single" w:color="808080" w:sz="4"/>
+              <w:left w:val="single" w:color="808080" w:sz="4"/>
+              <w:bottom w:val="single" w:color="808080" w:sz="4"/>
+              <w:right w:val="single" w:color="808080" w:sz="4"/>
+            </w:tcBorders>
+            <w:tcMar>
+              <w:top w:type="dxa" w:w="40"/>
+              <w:left w:type="dxa" w:w="80"/>
+              <w:bottom w:type="dxa" w:w="40"/>
+              <w:right w:type="dxa" w:w="80"/>
+            </w:tcMar>
+          </w:tcPr>
+          <w:p>
+            <w:pPr>
+              <w:spacing w:after="0"/>
+            </w:pPr>
+            <w:r>
+              <w:rPr>
+                <w:rFonts w:ascii="Times New Roman" w:cs="Times New Roman" w:eastAsia="Times New Roman" w:hAnsi="Times New Roman"/>
+                <w:sz w:val="20"/>
+                <w:szCs w:val="20"/>
+              </w:rPr>
+              <w:t xml:space="preserve">Every Python datum matches the compiled blueprint; PyCardano’s script hashes match the compiler’s</w:t>
+            </w:r>
+          </w:p>
+        </w:tc>
+        <w:tc>
+          <w:tcPr>
+            <w:tcW w:type="dxa" w:w="2007"/>
+            <w:tcBorders>
+              <w:top w:val="single" w:color="808080" w:sz="4"/>
+              <w:left w:val="single" w:color="808080" w:sz="4"/>
+              <w:bottom w:val="single" w:color="808080" w:sz="4"/>
+              <w:right w:val="single" w:color="808080" w:sz="4"/>
+            </w:tcBorders>
+            <w:tcMar>
+              <w:top w:type="dxa" w:w="40"/>
+              <w:left w:type="dxa" w:w="80"/>
+              <w:bottom w:type="dxa" w:w="40"/>
+              <w:right w:type="dxa" w:w="80"/>
+            </w:tcMar>
+          </w:tcPr>
+          <w:p>
+            <w:pPr>
+              <w:spacing w:after="0"/>
+            </w:pPr>
+            <w:r>
+              <w:rPr>
+                <w:rFonts w:ascii="Times New Roman" w:cs="Times New Roman" w:eastAsia="Times New Roman" w:hAnsi="Times New Roman"/>
+                <w:sz w:val="20"/>
+                <w:szCs w:val="20"/>
+              </w:rPr>
+              <w:t xml:space="preserve">Pass</w:t>
+            </w:r>
+          </w:p>
+        </w:tc>
+      </w:tr>
+      <w:tr>
+        <w:tc>
+          <w:tcPr>
+            <w:tcW w:type="dxa" w:w="902"/>
+            <w:tcBorders>
+              <w:top w:val="single" w:color="808080" w:sz="4"/>
+              <w:left w:val="single" w:color="808080" w:sz="4"/>
+              <w:bottom w:val="single" w:color="808080" w:sz="4"/>
+              <w:right w:val="single" w:color="808080" w:sz="4"/>
+            </w:tcBorders>
+            <w:tcMar>
+              <w:top w:type="dxa" w:w="40"/>
+              <w:left w:type="dxa" w:w="80"/>
+              <w:bottom w:type="dxa" w:w="40"/>
+              <w:right w:type="dxa" w:w="80"/>
+            </w:tcMar>
+          </w:tcPr>
+          <w:p>
+            <w:pPr>
+              <w:spacing w:after="0"/>
+            </w:pPr>
+            <w:r>
+              <w:rPr>
+                <w:rFonts w:ascii="Times New Roman" w:cs="Times New Roman" w:eastAsia="Times New Roman" w:hAnsi="Times New Roman"/>
+                <w:sz w:val="20"/>
+                <w:szCs w:val="20"/>
+              </w:rPr>
+              <w:t xml:space="preserve">T-N6</w:t>
+            </w:r>
+          </w:p>
+        </w:tc>
+        <w:tc>
+          <w:tcPr>
+            <w:tcW w:type="dxa" w:w="6117"/>
+            <w:tcBorders>
+              <w:top w:val="single" w:color="808080" w:sz="4"/>
+              <w:left w:val="single" w:color="808080" w:sz="4"/>
+              <w:bottom w:val="single" w:color="808080" w:sz="4"/>
+              <w:right w:val="single" w:color="808080" w:sz="4"/>
+            </w:tcBorders>
+            <w:tcMar>
+              <w:top w:type="dxa" w:w="40"/>
+              <w:left w:type="dxa" w:w="80"/>
+              <w:bottom w:type="dxa" w:w="40"/>
+              <w:right w:type="dxa" w:w="80"/>
+            </w:tcMar>
+          </w:tcPr>
+          <w:p>
+            <w:pPr>
+              <w:spacing w:after="0"/>
+            </w:pPr>
+            <w:r>
+              <w:rPr>
+                <w:rFonts w:ascii="Times New Roman" w:cs="Times New Roman" w:eastAsia="Times New Roman" w:hAnsi="Times New Roman"/>
+                <w:sz w:val="20"/>
+                <w:szCs w:val="20"/>
+              </w:rPr>
+              <w:t xml:space="preserve">The live planner uses the simulator’s </w:t>
+            </w:r>
+            <w:r>
+              <w:rPr>
+                <w:rFonts w:ascii="Consolas" w:cs="Consolas" w:eastAsia="Consolas" w:hAnsi="Consolas"/>
+                <w:sz w:val="20"/>
+                <w:szCs w:val="20"/>
+              </w:rPr>
+              <w:t xml:space="preserve">gate_a</w:t>
+            </w:r>
+            <w:r>
+              <w:rPr>
+                <w:rFonts w:ascii="Times New Roman" w:cs="Times New Roman" w:eastAsia="Times New Roman" w:hAnsi="Times New Roman"/>
+                <w:sz w:val="20"/>
+                <w:szCs w:val="20"/>
+              </w:rPr>
+              <w:t xml:space="preserve"> and </w:t>
+            </w:r>
+            <w:r>
+              <w:rPr>
+                <w:rFonts w:ascii="Consolas" w:cs="Consolas" w:eastAsia="Consolas" w:hAnsi="Consolas"/>
+                <w:sz w:val="20"/>
+                <w:szCs w:val="20"/>
+              </w:rPr>
+              <w:t xml:space="preserve">fee_lovelace</w:t>
+            </w:r>
+            <w:r>
+              <w:rPr>
+                <w:rFonts w:ascii="Times New Roman" w:cs="Times New Roman" w:eastAsia="Times New Roman" w:hAnsi="Times New Roman"/>
+                <w:sz w:val="20"/>
+                <w:szCs w:val="20"/>
+              </w:rPr>
+              <w:t xml:space="preserve"> — the same objects</w:t>
+            </w:r>
+          </w:p>
+        </w:tc>
+        <w:tc>
+          <w:tcPr>
+            <w:tcW w:type="dxa" w:w="2007"/>
+            <w:tcBorders>
+              <w:top w:val="single" w:color="808080" w:sz="4"/>
+              <w:left w:val="single" w:color="808080" w:sz="4"/>
+              <w:bottom w:val="single" w:color="808080" w:sz="4"/>
+              <w:right w:val="single" w:color="808080" w:sz="4"/>
+            </w:tcBorders>
+            <w:tcMar>
+              <w:top w:type="dxa" w:w="40"/>
+              <w:left w:type="dxa" w:w="80"/>
+              <w:bottom w:type="dxa" w:w="40"/>
+              <w:right w:type="dxa" w:w="80"/>
+            </w:tcMar>
+          </w:tcPr>
+          <w:p>
+            <w:pPr>
+              <w:spacing w:after="0"/>
+            </w:pPr>
+            <w:r>
+              <w:rPr>
+                <w:rFonts w:ascii="Times New Roman" w:cs="Times New Roman" w:eastAsia="Times New Roman" w:hAnsi="Times New Roman"/>
+                <w:sz w:val="20"/>
+                <w:szCs w:val="20"/>
+              </w:rPr>
+              <w:t xml:space="preserve">Pass</w:t>
+            </w:r>
+          </w:p>
+        </w:tc>
+      </w:tr>
+      <w:tr>
+        <w:tc>
+          <w:tcPr>
+            <w:tcW w:type="dxa" w:w="902"/>
+            <w:tcBorders>
+              <w:top w:val="single" w:color="808080" w:sz="4"/>
+              <w:left w:val="single" w:color="808080" w:sz="4"/>
+              <w:bottom w:val="single" w:color="808080" w:sz="4"/>
+              <w:right w:val="single" w:color="808080" w:sz="4"/>
+            </w:tcBorders>
+            <w:tcMar>
+              <w:top w:type="dxa" w:w="40"/>
+              <w:left w:type="dxa" w:w="80"/>
+              <w:bottom w:type="dxa" w:w="40"/>
+              <w:right w:type="dxa" w:w="80"/>
+            </w:tcMar>
+          </w:tcPr>
+          <w:p>
+            <w:pPr>
+              <w:spacing w:after="0"/>
+            </w:pPr>
+            <w:r>
+              <w:rPr>
+                <w:rFonts w:ascii="Times New Roman" w:cs="Times New Roman" w:eastAsia="Times New Roman" w:hAnsi="Times New Roman"/>
+                <w:sz w:val="20"/>
+                <w:szCs w:val="20"/>
+              </w:rPr>
+              <w:t xml:space="preserve">—</w:t>
+            </w:r>
+          </w:p>
+        </w:tc>
+        <w:tc>
+          <w:tcPr>
+            <w:tcW w:type="dxa" w:w="6117"/>
+            <w:tcBorders>
+              <w:top w:val="single" w:color="808080" w:sz="4"/>
+              <w:left w:val="single" w:color="808080" w:sz="4"/>
+              <w:bottom w:val="single" w:color="808080" w:sz="4"/>
+              <w:right w:val="single" w:color="808080" w:sz="4"/>
+            </w:tcBorders>
+            <w:tcMar>
+              <w:top w:type="dxa" w:w="40"/>
+              <w:left w:type="dxa" w:w="80"/>
+              <w:bottom w:type="dxa" w:w="40"/>
+              <w:right w:type="dxa" w:w="80"/>
+            </w:tcMar>
+          </w:tcPr>
+          <w:p>
+            <w:pPr>
+              <w:spacing w:after="0"/>
+            </w:pPr>
+            <w:r>
+              <w:rPr>
+                <w:rFonts w:ascii="Times New Roman" w:cs="Times New Roman" w:eastAsia="Times New Roman" w:hAnsi="Times New Roman"/>
+                <w:sz w:val="20"/>
+                <w:szCs w:val="20"/>
+              </w:rPr>
+              <w:t xml:space="preserve">Property test: 200 random mixes of buy and sell orders never break the pool invariant</w:t>
+            </w:r>
+          </w:p>
+        </w:tc>
+        <w:tc>
+          <w:tcPr>
+            <w:tcW w:type="dxa" w:w="2007"/>
+            <w:tcBorders>
+              <w:top w:val="single" w:color="808080" w:sz="4"/>
+              <w:left w:val="single" w:color="808080" w:sz="4"/>
+              <w:bottom w:val="single" w:color="808080" w:sz="4"/>
+              <w:right w:val="single" w:color="808080" w:sz="4"/>
+            </w:tcBorders>
+            <w:tcMar>
+              <w:top w:type="dxa" w:w="40"/>
+              <w:left w:type="dxa" w:w="80"/>
+              <w:bottom w:type="dxa" w:w="40"/>
+              <w:right w:type="dxa" w:w="80"/>
+            </w:tcMar>
+          </w:tcPr>
+          <w:p>
+            <w:pPr>
+              <w:spacing w:after="0"/>
+            </w:pPr>
+            <w:r>
+              <w:rPr>
+                <w:rFonts w:ascii="Times New Roman" w:cs="Times New Roman" w:eastAsia="Times New Roman" w:hAnsi="Times New Roman"/>
+                <w:sz w:val="20"/>
+                <w:szCs w:val="20"/>
+              </w:rPr>
+              <w:t xml:space="preserve">Pass</w:t>
+            </w:r>
+          </w:p>
+        </w:tc>
+      </w:tr>
+      <w:tr>
+        <w:tc>
+          <w:tcPr>
+            <w:tcW w:type="dxa" w:w="902"/>
+            <w:tcBorders>
+              <w:top w:val="single" w:color="808080" w:sz="4"/>
+              <w:left w:val="single" w:color="808080" w:sz="4"/>
+              <w:bottom w:val="single" w:color="808080" w:sz="4"/>
+              <w:right w:val="single" w:color="808080" w:sz="4"/>
+            </w:tcBorders>
+            <w:tcMar>
+              <w:top w:type="dxa" w:w="40"/>
+              <w:left w:type="dxa" w:w="80"/>
+              <w:bottom w:type="dxa" w:w="40"/>
+              <w:right w:type="dxa" w:w="80"/>
+            </w:tcMar>
+          </w:tcPr>
+          <w:p>
+            <w:pPr>
+              <w:spacing w:after="0"/>
+            </w:pPr>
+            <w:r>
+              <w:rPr>
+                <w:rFonts w:ascii="Times New Roman" w:cs="Times New Roman" w:eastAsia="Times New Roman" w:hAnsi="Times New Roman"/>
+                <w:sz w:val="20"/>
+                <w:szCs w:val="20"/>
+              </w:rPr>
+              <w:t xml:space="preserve">—</w:t>
+            </w:r>
+          </w:p>
+        </w:tc>
+        <w:tc>
+          <w:tcPr>
+            <w:tcW w:type="dxa" w:w="6117"/>
+            <w:tcBorders>
+              <w:top w:val="single" w:color="808080" w:sz="4"/>
+              <w:left w:val="single" w:color="808080" w:sz="4"/>
+              <w:bottom w:val="single" w:color="808080" w:sz="4"/>
+              <w:right w:val="single" w:color="808080" w:sz="4"/>
+            </w:tcBorders>
+            <w:tcMar>
+              <w:top w:type="dxa" w:w="40"/>
+              <w:left w:type="dxa" w:w="80"/>
+              <w:bottom w:type="dxa" w:w="40"/>
+              <w:right w:type="dxa" w:w="80"/>
+            </w:tcMar>
+          </w:tcPr>
+          <w:p>
+            <w:pPr>
+              <w:spacing w:after="0"/>
+            </w:pPr>
+            <w:r>
+              <w:rPr>
+                <w:rFonts w:ascii="Times New Roman" w:cs="Times New Roman" w:eastAsia="Times New Roman" w:hAnsi="Times New Roman"/>
+                <w:sz w:val="20"/>
+                <w:szCs w:val="20"/>
+              </w:rPr>
+              <w:t xml:space="preserve">A built batch satisfies the order validator’s fee rule for the fee it actually pays</w:t>
+            </w:r>
+          </w:p>
+        </w:tc>
+        <w:tc>
+          <w:tcPr>
+            <w:tcW w:type="dxa" w:w="2007"/>
+            <w:tcBorders>
+              <w:top w:val="single" w:color="808080" w:sz="4"/>
+              <w:left w:val="single" w:color="808080" w:sz="4"/>
+              <w:bottom w:val="single" w:color="808080" w:sz="4"/>
+              <w:right w:val="single" w:color="808080" w:sz="4"/>
+            </w:tcBorders>
+            <w:tcMar>
+              <w:top w:type="dxa" w:w="40"/>
+              <w:left w:type="dxa" w:w="80"/>
+              <w:bottom w:type="dxa" w:w="40"/>
+              <w:right w:type="dxa" w:w="80"/>
+            </w:tcMar>
+          </w:tcPr>
+          <w:p>
+            <w:pPr>
+              <w:spacing w:after="0"/>
+            </w:pPr>
+            <w:r>
+              <w:rPr>
+                <w:rFonts w:ascii="Times New Roman" w:cs="Times New Roman" w:eastAsia="Times New Roman" w:hAnsi="Times New Roman"/>
+                <w:sz w:val="20"/>
+                <w:szCs w:val="20"/>
+              </w:rPr>
+              <w:t xml:space="preserve">Pass</w:t>
+            </w:r>
+          </w:p>
+        </w:tc>
+      </w:tr>
+      <w:tr>
+        <w:tc>
+          <w:tcPr>
+            <w:tcW w:type="dxa" w:w="902"/>
+            <w:tcBorders>
+              <w:top w:val="single" w:color="808080" w:sz="4"/>
+              <w:left w:val="single" w:color="808080" w:sz="4"/>
+              <w:bottom w:val="single" w:color="808080" w:sz="4"/>
+              <w:right w:val="single" w:color="808080" w:sz="4"/>
+            </w:tcBorders>
+            <w:tcMar>
+              <w:top w:type="dxa" w:w="40"/>
+              <w:left w:type="dxa" w:w="80"/>
+              <w:bottom w:type="dxa" w:w="40"/>
+              <w:right w:type="dxa" w:w="80"/>
+            </w:tcMar>
+          </w:tcPr>
+          <w:p>
+            <w:pPr>
+              <w:spacing w:after="0"/>
+            </w:pPr>
+            <w:r>
+              <w:rPr>
+                <w:rFonts w:ascii="Times New Roman" w:cs="Times New Roman" w:eastAsia="Times New Roman" w:hAnsi="Times New Roman"/>
+                <w:sz w:val="20"/>
+                <w:szCs w:val="20"/>
+              </w:rPr>
+              <w:t xml:space="preserve">P7-5</w:t>
+            </w:r>
+          </w:p>
+        </w:tc>
+        <w:tc>
+          <w:tcPr>
+            <w:tcW w:type="dxa" w:w="6117"/>
+            <w:tcBorders>
+              <w:top w:val="single" w:color="808080" w:sz="4"/>
+              <w:left w:val="single" w:color="808080" w:sz="4"/>
+              <w:bottom w:val="single" w:color="808080" w:sz="4"/>
+              <w:right w:val="single" w:color="808080" w:sz="4"/>
+            </w:tcBorders>
+            <w:tcMar>
+              <w:top w:type="dxa" w:w="40"/>
+              <w:left w:type="dxa" w:w="80"/>
+              <w:bottom w:type="dxa" w:w="40"/>
+              <w:right w:type="dxa" w:w="80"/>
+            </w:tcMar>
+          </w:tcPr>
+          <w:p>
+            <w:pPr>
+              <w:spacing w:after="0"/>
+            </w:pPr>
+            <w:r>
+              <w:rPr>
+                <w:rFonts w:ascii="Times New Roman" w:cs="Times New Roman" w:eastAsia="Times New Roman" w:hAnsi="Times New Roman"/>
+                <w:sz w:val="20"/>
+                <w:szCs w:val="20"/>
+              </w:rPr>
+              <w:t xml:space="preserve">Keys are refused inside the repository and never overwritten; the secret scan blocks a real generated key file</w:t>
+            </w:r>
+          </w:p>
+        </w:tc>
+        <w:tc>
+          <w:tcPr>
+            <w:tcW w:type="dxa" w:w="2007"/>
+            <w:tcBorders>
+              <w:top w:val="single" w:color="808080" w:sz="4"/>
+              <w:left w:val="single" w:color="808080" w:sz="4"/>
+              <w:bottom w:val="single" w:color="808080" w:sz="4"/>
+              <w:right w:val="single" w:color="808080" w:sz="4"/>
+            </w:tcBorders>
+            <w:tcMar>
+              <w:top w:type="dxa" w:w="40"/>
+              <w:left w:type="dxa" w:w="80"/>
+              <w:bottom w:type="dxa" w:w="40"/>
+              <w:right w:type="dxa" w:w="80"/>
+            </w:tcMar>
+          </w:tcPr>
+          <w:p>
+            <w:pPr>
+              <w:spacing w:after="0"/>
+            </w:pPr>
+            <w:r>
+              <w:rPr>
+                <w:rFonts w:ascii="Times New Roman" w:cs="Times New Roman" w:eastAsia="Times New Roman" w:hAnsi="Times New Roman"/>
+                <w:sz w:val="20"/>
+                <w:szCs w:val="20"/>
+              </w:rPr>
+              <w:t xml:space="preserve">Pass</w:t>
+            </w:r>
+          </w:p>
+        </w:tc>
+      </w:tr>
+      <w:tr>
+        <w:tc>
+          <w:tcPr>
+            <w:tcW w:type="dxa" w:w="902"/>
+            <w:tcBorders>
+              <w:top w:val="single" w:color="808080" w:sz="4"/>
+              <w:left w:val="single" w:color="808080" w:sz="4"/>
+              <w:bottom w:val="single" w:color="808080" w:sz="4"/>
+              <w:right w:val="single" w:color="808080" w:sz="4"/>
+            </w:tcBorders>
+            <w:tcMar>
+              <w:top w:type="dxa" w:w="40"/>
+              <w:left w:type="dxa" w:w="80"/>
+              <w:bottom w:type="dxa" w:w="40"/>
+              <w:right w:type="dxa" w:w="80"/>
+            </w:tcMar>
+          </w:tcPr>
+          <w:p>
+            <w:pPr>
+              <w:spacing w:after="0"/>
+            </w:pPr>
+            <w:r>
+              <w:rPr>
+                <w:rFonts w:ascii="Times New Roman" w:cs="Times New Roman" w:eastAsia="Times New Roman" w:hAnsi="Times New Roman"/>
+                <w:sz w:val="20"/>
+                <w:szCs w:val="20"/>
+              </w:rPr>
+              <w:t xml:space="preserve">P7-8</w:t>
+            </w:r>
+          </w:p>
+        </w:tc>
+        <w:tc>
+          <w:tcPr>
+            <w:tcW w:type="dxa" w:w="6117"/>
+            <w:tcBorders>
+              <w:top w:val="single" w:color="808080" w:sz="4"/>
+              <w:left w:val="single" w:color="808080" w:sz="4"/>
+              <w:bottom w:val="single" w:color="808080" w:sz="4"/>
+              <w:right w:val="single" w:color="808080" w:sz="4"/>
+            </w:tcBorders>
+            <w:tcMar>
+              <w:top w:type="dxa" w:w="40"/>
+              <w:left w:type="dxa" w:w="80"/>
+              <w:bottom w:type="dxa" w:w="40"/>
+              <w:right w:type="dxa" w:w="80"/>
+            </w:tcMar>
+          </w:tcPr>
+          <w:p>
+            <w:pPr>
+              <w:spacing w:after="0"/>
+            </w:pPr>
+            <w:r>
+              <w:rPr>
+                <w:rFonts w:ascii="Times New Roman" w:cs="Times New Roman" w:eastAsia="Times New Roman" w:hAnsi="Times New Roman"/>
+                <w:sz w:val="20"/>
+                <w:szCs w:val="20"/>
+              </w:rPr>
+              <w:t xml:space="preserve">Live loop: one decision per block, none while locked, expiry retried, rejection counted, stale API view, clean shutdown</w:t>
+            </w:r>
+          </w:p>
+        </w:tc>
+        <w:tc>
+          <w:tcPr>
+            <w:tcW w:type="dxa" w:w="2007"/>
+            <w:tcBorders>
+              <w:top w:val="single" w:color="808080" w:sz="4"/>
+              <w:left w:val="single" w:color="808080" w:sz="4"/>
+              <w:bottom w:val="single" w:color="808080" w:sz="4"/>
+              <w:right w:val="single" w:color="808080" w:sz="4"/>
+            </w:tcBorders>
+            <w:tcMar>
+              <w:top w:type="dxa" w:w="40"/>
+              <w:left w:type="dxa" w:w="80"/>
+              <w:bottom w:type="dxa" w:w="40"/>
+              <w:right w:type="dxa" w:w="80"/>
+            </w:tcMar>
+          </w:tcPr>
+          <w:p>
+            <w:pPr>
+              <w:spacing w:after="0"/>
+            </w:pPr>
+            <w:r>
+              <w:rPr>
+                <w:rFonts w:ascii="Times New Roman" w:cs="Times New Roman" w:eastAsia="Times New Roman" w:hAnsi="Times New Roman"/>
+                <w:sz w:val="20"/>
+                <w:szCs w:val="20"/>
+              </w:rPr>
+              <w:t xml:space="preserve">Pass</w:t>
+            </w:r>
+          </w:p>
+        </w:tc>
+      </w:tr>
+      <w:tr>
+        <w:tc>
+          <w:tcPr>
+            <w:tcW w:type="dxa" w:w="902"/>
+            <w:tcBorders>
+              <w:top w:val="single" w:color="808080" w:sz="4"/>
+              <w:left w:val="single" w:color="808080" w:sz="4"/>
+              <w:bottom w:val="single" w:color="808080" w:sz="4"/>
+              <w:right w:val="single" w:color="808080" w:sz="4"/>
+            </w:tcBorders>
+            <w:tcMar>
+              <w:top w:type="dxa" w:w="40"/>
+              <w:left w:type="dxa" w:w="80"/>
+              <w:bottom w:type="dxa" w:w="40"/>
+              <w:right w:type="dxa" w:w="80"/>
+            </w:tcMar>
+          </w:tcPr>
+          <w:p>
+            <w:pPr>
+              <w:spacing w:after="0"/>
+            </w:pPr>
+            <w:r>
+              <w:rPr>
+                <w:rFonts w:ascii="Times New Roman" w:cs="Times New Roman" w:eastAsia="Times New Roman" w:hAnsi="Times New Roman"/>
+                <w:sz w:val="20"/>
+                <w:szCs w:val="20"/>
+              </w:rPr>
+              <w:t xml:space="preserve">T-O6</w:t>
+            </w:r>
+          </w:p>
+        </w:tc>
+        <w:tc>
+          <w:tcPr>
+            <w:tcW w:type="dxa" w:w="6117"/>
+            <w:tcBorders>
+              <w:top w:val="single" w:color="808080" w:sz="4"/>
+              <w:left w:val="single" w:color="808080" w:sz="4"/>
+              <w:bottom w:val="single" w:color="808080" w:sz="4"/>
+              <w:right w:val="single" w:color="808080" w:sz="4"/>
+            </w:tcBorders>
+            <w:tcMar>
+              <w:top w:type="dxa" w:w="40"/>
+              <w:left w:type="dxa" w:w="80"/>
+              <w:bottom w:type="dxa" w:w="40"/>
+              <w:right w:type="dxa" w:w="80"/>
+            </w:tcMar>
+          </w:tcPr>
+          <w:p>
+            <w:pPr>
+              <w:spacing w:after="0"/>
+            </w:pPr>
+            <w:r>
+              <w:rPr>
+                <w:rFonts w:ascii="Times New Roman" w:cs="Times New Roman" w:eastAsia="Times New Roman" w:hAnsi="Times New Roman"/>
+                <w:sz w:val="20"/>
+                <w:szCs w:val="20"/>
+              </w:rPr>
+              <w:t xml:space="preserve">One end-to-end swap settles on preprod</w:t>
+            </w:r>
+          </w:p>
+        </w:tc>
+        <w:tc>
+          <w:tcPr>
+            <w:tcW w:type="dxa" w:w="2007"/>
+            <w:tcBorders>
+              <w:top w:val="single" w:color="808080" w:sz="4"/>
+              <w:left w:val="single" w:color="808080" w:sz="4"/>
+              <w:bottom w:val="single" w:color="808080" w:sz="4"/>
+              <w:right w:val="single" w:color="808080" w:sz="4"/>
+            </w:tcBorders>
+            <w:tcMar>
+              <w:top w:type="dxa" w:w="40"/>
+              <w:left w:type="dxa" w:w="80"/>
+              <w:bottom w:type="dxa" w:w="40"/>
+              <w:right w:type="dxa" w:w="80"/>
+            </w:tcMar>
+          </w:tcPr>
+          <w:p>
+            <w:pPr>
+              <w:spacing w:after="0"/>
+            </w:pPr>
+            <w:r>
+              <w:rPr>
+                <w:rFonts w:ascii="Times New Roman" w:cs="Times New Roman" w:eastAsia="Times New Roman" w:hAnsi="Times New Roman"/>
+                <w:sz w:val="20"/>
+                <w:szCs w:val="20"/>
+                <w:highlight w:val="yellow"/>
+                <w:highlightCs w:val="yellow"/>
+              </w:rPr>
+              <w:t xml:space="preserve">PENDING: requires deployment</w:t>
+            </w:r>
+          </w:p>
+        </w:tc>
+      </w:tr>
+    </w:tbl>
+    <w:p>
+      <w:pPr>
+        <w:spacing w:after="160"/>
+      </w:pPr>
+    </w:p>
+    <w:p>
+      <w:pPr>
+        <w:pStyle w:val="Heading2"/>
+      </w:pPr>
+      <w:r>
+        <w:t xml:space="preserve">7.6 Defects Found by Testing</w:t>
+      </w:r>
+    </w:p>
+    <w:p>
+      <w:pPr>
+        <w:keepNext/>
+        <w:spacing w:after="200" w:before="60"/>
+        <w:jc w:val="center"/>
+      </w:pPr>
+      <w:r>
+        <w:rPr>
+          <w:rFonts w:ascii="Times New Roman" w:cs="Times New Roman" w:eastAsia="Times New Roman" w:hAnsi="Times New Roman"/>
+          <w:b/>
+          <w:bCs/>
+          <w:sz w:val="22"/>
+          <w:szCs w:val="22"/>
+        </w:rPr>
+        <w:t xml:space="preserve">Table 7.6: </w:t>
       </w:r>
       <w:r>
         <w:rPr>
@@ -21754,7 +25369,7 @@
         <w:pStyle w:val="Heading2"/>
       </w:pPr>
       <w:r>
-        <w:t xml:space="preserve">7.6 Regression Guards for Corrected Assumptions</w:t>
+        <w:t xml:space="preserve">7.7 Regression Guards for Corrected Assumptions</w:t>
       </w:r>
     </w:p>
     <w:p>
@@ -21771,7 +25386,7 @@
           <w:sz w:val="22"/>
           <w:szCs w:val="22"/>
         </w:rPr>
-        <w:t xml:space="preserve">Table 7.6: </w:t>
+        <w:t xml:space="preserve">Table 7.7: </w:t>
       </w:r>
       <w:r>
         <w:rPr>
@@ -22330,7 +25945,7 @@
                 <w:sz w:val="20"/>
                 <w:szCs w:val="20"/>
               </w:rPr>
-              <w:t xml:space="preserve">T-O5</w:t>
+              <w:t xml:space="preserve">T-O5 in the order validator’s Aiken tests</w:t>
             </w:r>
           </w:p>
         </w:tc>
@@ -22360,7 +25975,7 @@
                 <w:sz w:val="20"/>
                 <w:szCs w:val="20"/>
               </w:rPr>
-              <w:t xml:space="preserve">Optional Phase 7</w:t>
+              <w:t xml:space="preserve">Live</w:t>
             </w:r>
           </w:p>
         </w:tc>
@@ -40787,7 +44402,99 @@
         <w:pStyle w:val="Heading2"/>
       </w:pPr>
       <w:r>
-        <w:t xml:space="preserve">8.12 Threats to Validity</w:t>
+        <w:t xml:space="preserve">8.12 On-Chain Demonstration</w:t>
+      </w:r>
+    </w:p>
+    <w:p>
+      <w:pPr>
+        <w:pBdr>
+          <w:top w:val="single" w:color="1F4E79" w:sz="4" w:space="6"/>
+          <w:left w:val="single" w:color="1F4E79" w:sz="12" w:space="6"/>
+        </w:pBdr>
+        <w:shd w:fill="EAF1F8" w:color="auto" w:val="clear"/>
+        <w:spacing w:after="0" w:line="312"/>
+        <w:ind w:left="200" w:right="200"/>
+        <w:jc w:val="both"/>
+      </w:pPr>
+      <w:r>
+        <w:rPr>
+          <w:rFonts w:ascii="Times New Roman" w:cs="Times New Roman" w:eastAsia="Times New Roman" w:hAnsi="Times New Roman"/>
+          <w:b/>
+          <w:bCs/>
+          <w:color w:val="1F4E79"/>
+        </w:rPr>
+        <w:t xml:space="preserve">Status</w:t>
+      </w:r>
+    </w:p>
+    <w:p>
+      <w:pPr>
+        <w:pBdr>
+          <w:bottom w:val="single" w:color="1F4E79" w:sz="4" w:space="6"/>
+          <w:left w:val="single" w:color="1F4E79" w:sz="12" w:space="6"/>
+        </w:pBdr>
+        <w:shd w:fill="EAF1F8" w:color="auto" w:val="clear"/>
+        <w:spacing w:after="0" w:line="312"/>
+        <w:ind w:left="200" w:right="200"/>
+        <w:jc w:val="both"/>
+      </w:pPr>
+      <w:r>
+        <w:rPr>
+          <w:rFonts w:ascii="Times New Roman" w:cs="Times New Roman" w:eastAsia="Times New Roman" w:hAnsi="Times New Roman"/>
+        </w:rPr>
+        <w:t xml:space="preserve">The on-chain DEX, the transaction builders and the live batcher are </w:t>
+      </w:r>
+      <w:r>
+        <w:rPr>
+          <w:rFonts w:ascii="Times New Roman" w:cs="Times New Roman" w:eastAsia="Times New Roman" w:hAnsi="Times New Roman"/>
+          <w:b/>
+          <w:bCs/>
+        </w:rPr>
+        <w:t xml:space="preserve">built and verified offline</w:t>
+      </w:r>
+      <w:r>
+        <w:rPr>
+          <w:rFonts w:ascii="Times New Roman" w:cs="Times New Roman" w:eastAsia="Times New Roman" w:hAnsi="Times New Roman"/>
+        </w:rPr>
+        <w:t xml:space="preserve"> (Sections 5.11, 6.11–6.13, 7.5). They have </w:t>
+      </w:r>
+      <w:r>
+        <w:rPr>
+          <w:rFonts w:ascii="Times New Roman" w:cs="Times New Roman" w:eastAsia="Times New Roman" w:hAnsi="Times New Roman"/>
+          <w:b/>
+          <w:bCs/>
+        </w:rPr>
+        <w:t xml:space="preserve">not yet been deployed to preprod</w:t>
+      </w:r>
+      <w:r>
+        <w:rPr>
+          <w:rFonts w:ascii="Times New Roman" w:cs="Times New Roman" w:eastAsia="Times New Roman" w:hAnsi="Times New Roman"/>
+        </w:rPr>
+        <w:t xml:space="preserve">: deployment needs a Blockfrost preprod project and faucet-funded keys provided by the team, and each submission is made only with explicit approval. </w:t>
+      </w:r>
+      <w:r>
+        <w:rPr>
+          <w:rFonts w:ascii="Times New Roman" w:cs="Times New Roman" w:eastAsia="Times New Roman" w:hAnsi="Times New Roman"/>
+          <w:highlight w:val="yellow"/>
+          <w:highlightCs w:val="yellow"/>
+        </w:rPr>
+        <w:t xml:space="preserve">PENDING: deployment transaction hash, end-to-end swap transaction hash (T-O6), and the D4 estimator calibration</w:t>
+      </w:r>
+    </w:p>
+    <w:p>
+      <w:pPr>
+        <w:spacing w:after="120"/>
+      </w:pPr>
+    </w:p>
+    <w:p>
+      <w:pPr>
+        <w:spacing w:after="120" w:line="336"/>
+        <w:jc w:val="both"/>
+      </w:pPr>
+      <w:r>
+        <w:rPr>
+          <w:rFonts w:ascii="Times New Roman" w:cs="Times New Roman" w:eastAsia="Times New Roman" w:hAnsi="Times New Roman"/>
+        </w:rPr>
+        <w:t xml:space="preserve">The demonstration is scripted as five steps, each a dry run until explicitly submitted: deploy the pool and mint its NFT; run the batcher in shadow mode to confirm its decisions on live chain state; place an order from a separate user key; run the batcher live until that order settles; and compare estimated with actual transaction size and execution units from the D4 log.</w:t>
       </w:r>
     </w:p>
     <w:p>
@@ -40805,6 +44512,422 @@
           <w:szCs w:val="22"/>
         </w:rPr>
         <w:t xml:space="preserve">Table 8.17: </w:t>
+      </w:r>
+      <w:r>
+        <w:rPr>
+          <w:rFonts w:ascii="Times New Roman" w:cs="Times New Roman" w:eastAsia="Times New Roman" w:hAnsi="Times New Roman"/>
+          <w:i/>
+          <w:iCs/>
+          <w:sz w:val="22"/>
+          <w:szCs w:val="22"/>
+        </w:rPr>
+        <w:t xml:space="preserve">Phase 7 exit criteria</w:t>
+      </w:r>
+    </w:p>
+    <w:tbl>
+      <w:tblPr>
+        <w:tblW w:type="dxa" w:w="9026"/>
+        <w:tblBorders>
+          <w:top w:val="single" w:color="auto" w:sz="4"/>
+          <w:left w:val="single" w:color="auto" w:sz="4"/>
+          <w:bottom w:val="single" w:color="auto" w:sz="4"/>
+          <w:right w:val="single" w:color="auto" w:sz="4"/>
+          <w:insideH w:val="single" w:color="auto" w:sz="4"/>
+          <w:insideV w:val="single" w:color="auto" w:sz="4"/>
+        </w:tblBorders>
+      </w:tblPr>
+      <w:tblGrid>
+        <w:gridCol w:w="6017"/>
+        <w:gridCol w:w="3009"/>
+      </w:tblGrid>
+      <w:tr>
+        <w:trPr>
+          <w:tblHeader/>
+        </w:trPr>
+        <w:tc>
+          <w:tcPr>
+            <w:tcW w:type="dxa" w:w="6017"/>
+            <w:tcBorders>
+              <w:top w:val="single" w:color="808080" w:sz="4"/>
+              <w:left w:val="single" w:color="808080" w:sz="4"/>
+              <w:bottom w:val="single" w:color="808080" w:sz="4"/>
+              <w:right w:val="single" w:color="808080" w:sz="4"/>
+            </w:tcBorders>
+            <w:shd w:fill="D9E2F3" w:color="auto" w:val="clear"/>
+            <w:tcMar>
+              <w:top w:type="dxa" w:w="40"/>
+              <w:left w:type="dxa" w:w="80"/>
+              <w:bottom w:type="dxa" w:w="40"/>
+              <w:right w:type="dxa" w:w="80"/>
+            </w:tcMar>
+          </w:tcPr>
+          <w:p>
+            <w:pPr>
+              <w:spacing w:after="0"/>
+            </w:pPr>
+            <w:r>
+              <w:rPr>
+                <w:rFonts w:ascii="Times New Roman" w:cs="Times New Roman" w:eastAsia="Times New Roman" w:hAnsi="Times New Roman"/>
+                <w:b/>
+                <w:bCs/>
+                <w:sz w:val="20"/>
+                <w:szCs w:val="20"/>
+              </w:rPr>
+              <w:t xml:space="preserve">Criterion</w:t>
+            </w:r>
+          </w:p>
+        </w:tc>
+        <w:tc>
+          <w:tcPr>
+            <w:tcW w:type="dxa" w:w="3009"/>
+            <w:tcBorders>
+              <w:top w:val="single" w:color="808080" w:sz="4"/>
+              <w:left w:val="single" w:color="808080" w:sz="4"/>
+              <w:bottom w:val="single" w:color="808080" w:sz="4"/>
+              <w:right w:val="single" w:color="808080" w:sz="4"/>
+            </w:tcBorders>
+            <w:shd w:fill="D9E2F3" w:color="auto" w:val="clear"/>
+            <w:tcMar>
+              <w:top w:type="dxa" w:w="40"/>
+              <w:left w:type="dxa" w:w="80"/>
+              <w:bottom w:type="dxa" w:w="40"/>
+              <w:right w:type="dxa" w:w="80"/>
+            </w:tcMar>
+          </w:tcPr>
+          <w:p>
+            <w:pPr>
+              <w:spacing w:after="0"/>
+            </w:pPr>
+            <w:r>
+              <w:rPr>
+                <w:rFonts w:ascii="Times New Roman" w:cs="Times New Roman" w:eastAsia="Times New Roman" w:hAnsi="Times New Roman"/>
+                <w:b/>
+                <w:bCs/>
+                <w:sz w:val="20"/>
+                <w:szCs w:val="20"/>
+              </w:rPr>
+              <w:t xml:space="preserve">Status</w:t>
+            </w:r>
+          </w:p>
+        </w:tc>
+      </w:tr>
+      <w:tr>
+        <w:tc>
+          <w:tcPr>
+            <w:tcW w:type="dxa" w:w="6017"/>
+            <w:tcBorders>
+              <w:top w:val="single" w:color="808080" w:sz="4"/>
+              <w:left w:val="single" w:color="808080" w:sz="4"/>
+              <w:bottom w:val="single" w:color="808080" w:sz="4"/>
+              <w:right w:val="single" w:color="808080" w:sz="4"/>
+            </w:tcBorders>
+            <w:tcMar>
+              <w:top w:type="dxa" w:w="40"/>
+              <w:left w:type="dxa" w:w="80"/>
+              <w:bottom w:type="dxa" w:w="40"/>
+              <w:right w:type="dxa" w:w="80"/>
+            </w:tcMar>
+          </w:tcPr>
+          <w:p>
+            <w:pPr>
+              <w:spacing w:after="0"/>
+            </w:pPr>
+            <w:r>
+              <w:rPr>
+                <w:rFonts w:ascii="Times New Roman" w:cs="Times New Roman" w:eastAsia="Times New Roman" w:hAnsi="Times New Roman"/>
+                <w:sz w:val="20"/>
+                <w:szCs w:val="20"/>
+              </w:rPr>
+              <w:t xml:space="preserve">T-O1 … T-O5, including the security tests T-O2 and T-O3</w:t>
+            </w:r>
+          </w:p>
+        </w:tc>
+        <w:tc>
+          <w:tcPr>
+            <w:tcW w:type="dxa" w:w="3009"/>
+            <w:tcBorders>
+              <w:top w:val="single" w:color="808080" w:sz="4"/>
+              <w:left w:val="single" w:color="808080" w:sz="4"/>
+              <w:bottom w:val="single" w:color="808080" w:sz="4"/>
+              <w:right w:val="single" w:color="808080" w:sz="4"/>
+            </w:tcBorders>
+            <w:tcMar>
+              <w:top w:type="dxa" w:w="40"/>
+              <w:left w:type="dxa" w:w="80"/>
+              <w:bottom w:type="dxa" w:w="40"/>
+              <w:right w:type="dxa" w:w="80"/>
+            </w:tcMar>
+          </w:tcPr>
+          <w:p>
+            <w:pPr>
+              <w:spacing w:after="0"/>
+            </w:pPr>
+            <w:r>
+              <w:rPr>
+                <w:rFonts w:ascii="Times New Roman" w:cs="Times New Roman" w:eastAsia="Times New Roman" w:hAnsi="Times New Roman"/>
+                <w:sz w:val="20"/>
+                <w:szCs w:val="20"/>
+              </w:rPr>
+              <w:t xml:space="preserve">Pass — Aiken unit tests</w:t>
+            </w:r>
+          </w:p>
+        </w:tc>
+      </w:tr>
+      <w:tr>
+        <w:tc>
+          <w:tcPr>
+            <w:tcW w:type="dxa" w:w="6017"/>
+            <w:tcBorders>
+              <w:top w:val="single" w:color="808080" w:sz="4"/>
+              <w:left w:val="single" w:color="808080" w:sz="4"/>
+              <w:bottom w:val="single" w:color="808080" w:sz="4"/>
+              <w:right w:val="single" w:color="808080" w:sz="4"/>
+            </w:tcBorders>
+            <w:tcMar>
+              <w:top w:type="dxa" w:w="40"/>
+              <w:left w:type="dxa" w:w="80"/>
+              <w:bottom w:type="dxa" w:w="40"/>
+              <w:right w:type="dxa" w:w="80"/>
+            </w:tcMar>
+          </w:tcPr>
+          <w:p>
+            <w:pPr>
+              <w:spacing w:after="0"/>
+            </w:pPr>
+            <w:r>
+              <w:rPr>
+                <w:rFonts w:ascii="Times New Roman" w:cs="Times New Roman" w:eastAsia="Times New Roman" w:hAnsi="Times New Roman"/>
+                <w:sz w:val="20"/>
+                <w:szCs w:val="20"/>
+              </w:rPr>
+              <w:t xml:space="preserve">T-O6 — one swap settles on preprod, transaction hash recorded</w:t>
+            </w:r>
+          </w:p>
+        </w:tc>
+        <w:tc>
+          <w:tcPr>
+            <w:tcW w:type="dxa" w:w="3009"/>
+            <w:tcBorders>
+              <w:top w:val="single" w:color="808080" w:sz="4"/>
+              <w:left w:val="single" w:color="808080" w:sz="4"/>
+              <w:bottom w:val="single" w:color="808080" w:sz="4"/>
+              <w:right w:val="single" w:color="808080" w:sz="4"/>
+            </w:tcBorders>
+            <w:tcMar>
+              <w:top w:type="dxa" w:w="40"/>
+              <w:left w:type="dxa" w:w="80"/>
+              <w:bottom w:type="dxa" w:w="40"/>
+              <w:right w:type="dxa" w:w="80"/>
+            </w:tcMar>
+          </w:tcPr>
+          <w:p>
+            <w:pPr>
+              <w:spacing w:after="0"/>
+            </w:pPr>
+            <w:r>
+              <w:rPr>
+                <w:rFonts w:ascii="Times New Roman" w:cs="Times New Roman" w:eastAsia="Times New Roman" w:hAnsi="Times New Roman"/>
+                <w:sz w:val="20"/>
+                <w:szCs w:val="20"/>
+                <w:highlight w:val="yellow"/>
+                <w:highlightCs w:val="yellow"/>
+              </w:rPr>
+              <w:t xml:space="preserve">PENDING</w:t>
+            </w:r>
+          </w:p>
+        </w:tc>
+      </w:tr>
+      <w:tr>
+        <w:tc>
+          <w:tcPr>
+            <w:tcW w:type="dxa" w:w="6017"/>
+            <w:tcBorders>
+              <w:top w:val="single" w:color="808080" w:sz="4"/>
+              <w:left w:val="single" w:color="808080" w:sz="4"/>
+              <w:bottom w:val="single" w:color="808080" w:sz="4"/>
+              <w:right w:val="single" w:color="808080" w:sz="4"/>
+            </w:tcBorders>
+            <w:tcMar>
+              <w:top w:type="dxa" w:w="40"/>
+              <w:left w:type="dxa" w:w="80"/>
+              <w:bottom w:type="dxa" w:w="40"/>
+              <w:right w:type="dxa" w:w="80"/>
+            </w:tcMar>
+          </w:tcPr>
+          <w:p>
+            <w:pPr>
+              <w:spacing w:after="0"/>
+            </w:pPr>
+            <w:r>
+              <w:rPr>
+                <w:rFonts w:ascii="Times New Roman" w:cs="Times New Roman" w:eastAsia="Times New Roman" w:hAnsi="Times New Roman"/>
+                <w:sz w:val="20"/>
+                <w:szCs w:val="20"/>
+              </w:rPr>
+              <w:t xml:space="preserve">Estimator within ±5 % on size and ±10 % on execution units against D4</w:t>
+            </w:r>
+          </w:p>
+        </w:tc>
+        <w:tc>
+          <w:tcPr>
+            <w:tcW w:type="dxa" w:w="3009"/>
+            <w:tcBorders>
+              <w:top w:val="single" w:color="808080" w:sz="4"/>
+              <w:left w:val="single" w:color="808080" w:sz="4"/>
+              <w:bottom w:val="single" w:color="808080" w:sz="4"/>
+              <w:right w:val="single" w:color="808080" w:sz="4"/>
+            </w:tcBorders>
+            <w:tcMar>
+              <w:top w:type="dxa" w:w="40"/>
+              <w:left w:type="dxa" w:w="80"/>
+              <w:bottom w:type="dxa" w:w="40"/>
+              <w:right w:type="dxa" w:w="80"/>
+            </w:tcMar>
+          </w:tcPr>
+          <w:p>
+            <w:pPr>
+              <w:spacing w:after="0"/>
+            </w:pPr>
+            <w:r>
+              <w:rPr>
+                <w:rFonts w:ascii="Times New Roman" w:cs="Times New Roman" w:eastAsia="Times New Roman" w:hAnsi="Times New Roman"/>
+                <w:sz w:val="20"/>
+                <w:szCs w:val="20"/>
+                <w:highlight w:val="yellow"/>
+                <w:highlightCs w:val="yellow"/>
+              </w:rPr>
+              <w:t xml:space="preserve">PENDING</w:t>
+            </w:r>
+          </w:p>
+        </w:tc>
+      </w:tr>
+      <w:tr>
+        <w:tc>
+          <w:tcPr>
+            <w:tcW w:type="dxa" w:w="6017"/>
+            <w:tcBorders>
+              <w:top w:val="single" w:color="808080" w:sz="4"/>
+              <w:left w:val="single" w:color="808080" w:sz="4"/>
+              <w:bottom w:val="single" w:color="808080" w:sz="4"/>
+              <w:right w:val="single" w:color="808080" w:sz="4"/>
+            </w:tcBorders>
+            <w:tcMar>
+              <w:top w:type="dxa" w:w="40"/>
+              <w:left w:type="dxa" w:w="80"/>
+              <w:bottom w:type="dxa" w:w="40"/>
+              <w:right w:type="dxa" w:w="80"/>
+            </w:tcMar>
+          </w:tcPr>
+          <w:p>
+            <w:pPr>
+              <w:spacing w:after="0"/>
+            </w:pPr>
+            <w:r>
+              <w:rPr>
+                <w:rFonts w:ascii="Consolas" w:cs="Consolas" w:eastAsia="Consolas" w:hAnsi="Consolas"/>
+                <w:sz w:val="20"/>
+                <w:szCs w:val="20"/>
+              </w:rPr>
+              <w:t xml:space="preserve">07-CONSTRAINTS-COST-MODEL.md</w:t>
+            </w:r>
+            <w:r>
+              <w:rPr>
+                <w:rFonts w:ascii="Times New Roman" w:cs="Times New Roman" w:eastAsia="Times New Roman" w:hAnsi="Times New Roman"/>
+                <w:sz w:val="20"/>
+                <w:szCs w:val="20"/>
+              </w:rPr>
+              <w:t xml:space="preserve"> §4 per-order costs updated from measurement</w:t>
+            </w:r>
+          </w:p>
+        </w:tc>
+        <w:tc>
+          <w:tcPr>
+            <w:tcW w:type="dxa" w:w="3009"/>
+            <w:tcBorders>
+              <w:top w:val="single" w:color="808080" w:sz="4"/>
+              <w:left w:val="single" w:color="808080" w:sz="4"/>
+              <w:bottom w:val="single" w:color="808080" w:sz="4"/>
+              <w:right w:val="single" w:color="808080" w:sz="4"/>
+            </w:tcBorders>
+            <w:tcMar>
+              <w:top w:type="dxa" w:w="40"/>
+              <w:left w:type="dxa" w:w="80"/>
+              <w:bottom w:type="dxa" w:w="40"/>
+              <w:right w:type="dxa" w:w="80"/>
+            </w:tcMar>
+          </w:tcPr>
+          <w:p>
+            <w:pPr>
+              <w:spacing w:after="0"/>
+            </w:pPr>
+            <w:r>
+              <w:rPr>
+                <w:rFonts w:ascii="Times New Roman" w:cs="Times New Roman" w:eastAsia="Times New Roman" w:hAnsi="Times New Roman"/>
+                <w:sz w:val="20"/>
+                <w:szCs w:val="20"/>
+                <w:highlight w:val="yellow"/>
+                <w:highlightCs w:val="yellow"/>
+              </w:rPr>
+              <w:t xml:space="preserve">PENDING</w:t>
+            </w:r>
+          </w:p>
+        </w:tc>
+      </w:tr>
+    </w:tbl>
+    <w:p>
+      <w:pPr>
+        <w:spacing w:after="160"/>
+      </w:pPr>
+    </w:p>
+    <w:p>
+      <w:pPr>
+        <w:spacing w:after="120" w:line="336"/>
+        <w:jc w:val="both"/>
+      </w:pPr>
+      <w:r>
+        <w:rPr>
+          <w:rFonts w:ascii="Times New Roman" w:cs="Times New Roman" w:eastAsia="Times New Roman" w:hAnsi="Times New Roman"/>
+        </w:rPr>
+        <w:t xml:space="preserve">Two outcomes of the calibration can be anticipated. The fee replay (V4) already found the fee formula under-estimating script-bearing transactions by a median of 29 %, and a DEX batch is script-bearing. And ADR-006 recorded a cost of its own design: computing </w:t>
+      </w:r>
+      <w:r>
+        <w:rPr>
+          <w:rFonts w:ascii="Consolas" w:cs="Consolas" w:eastAsia="Consolas" w:hAnsi="Consolas"/>
+          <w:sz w:val="20"/>
+          <w:szCs w:val="20"/>
+        </w:rPr>
+        <w:t xml:space="preserve">fee / n</w:t>
+      </w:r>
+      <w:r>
+        <w:rPr>
+          <w:rFonts w:ascii="Times New Roman" w:cs="Times New Roman" w:eastAsia="Times New Roman" w:hAnsi="Times New Roman"/>
+        </w:rPr>
+        <w:t xml:space="preserve"> on chain consumes execution units, which slightly lowers the Gate A cap. Both will be measured rather than assumed, and the per-order estimates used throughout the simulator revised if they fall outside tolerance.</w:t>
+      </w:r>
+    </w:p>
+    <w:p>
+      <w:pPr>
+        <w:pStyle w:val="Heading2"/>
+      </w:pPr>
+      <w:r>
+        <w:t xml:space="preserve">8.13 Threats to Validity</w:t>
+      </w:r>
+    </w:p>
+    <w:p>
+      <w:pPr>
+        <w:keepNext/>
+        <w:spacing w:after="200" w:before="60"/>
+        <w:jc w:val="center"/>
+      </w:pPr>
+      <w:r>
+        <w:rPr>
+          <w:rFonts w:ascii="Times New Roman" w:cs="Times New Roman" w:eastAsia="Times New Roman" w:hAnsi="Times New Roman"/>
+          <w:b/>
+          <w:bCs/>
+          <w:sz w:val="22"/>
+          <w:szCs w:val="22"/>
+        </w:rPr>
+        <w:t xml:space="preserve">Table 8.18: </w:t>
       </w:r>
       <w:r>
         <w:rPr>
@@ -41851,6 +45974,30 @@
           <w:rFonts w:ascii="Times New Roman" w:cs="Times New Roman" w:eastAsia="Times New Roman" w:hAnsi="Times New Roman"/>
         </w:rPr>
         <w:t xml:space="preserve"> with run manifests, checksummed data and pre-registered non-parametric statistics.</w:t>
+      </w:r>
+    </w:p>
+    <w:p>
+      <w:pPr>
+        <w:pStyle w:val="ListParagraph"/>
+        <w:numPr>
+          <w:ilvl w:val="0"/>
+          <w:numId w:val="4"/>
+        </w:numPr>
+        <w:spacing w:after="60" w:line="312"/>
+      </w:pPr>
+      <w:r>
+        <w:rPr>
+          <w:rFonts w:ascii="Times New Roman" w:cs="Times New Roman" w:eastAsia="Times New Roman" w:hAnsi="Times New Roman"/>
+          <w:b/>
+          <w:bCs/>
+        </w:rPr>
+        <w:t xml:space="preserve">A minimal on-chain DEX whose validator enforces a pass-through batcher fee</w:t>
+      </w:r>
+      <w:r>
+        <w:rPr>
+          <w:rFonts w:ascii="Times New Roman" w:cs="Times New Roman" w:eastAsia="Times New Roman" w:hAnsi="Times New Roman"/>
+        </w:rPr>
+        <w:t xml:space="preserve">, so amortization reaches users, with each user’s slippage floor and batcher authorisation checked by the ledger; and a live batcher that reuses the simulator’s own decision rules, with a shadow mode for watching a policy on live traffic before it submits.</w:t>
       </w:r>
     </w:p>
     <w:p>
@@ -42710,13 +46857,13 @@
           <w:b/>
           <w:bCs/>
         </w:rPr>
-        <w:t xml:space="preserve">No latency gain over greedy</w:t>
-      </w:r>
-      <w:r>
-        <w:rPr>
-          <w:rFonts w:ascii="Times New Roman" w:cs="Times New Roman" w:eastAsia="Times New Roman" w:hAnsi="Times New Roman"/>
-        </w:rPr>
-        <w:t xml:space="preserve"> — on the current chain no adaptive policy beat greedy on tail latency; the benefit is cost and fairness at a stated latency price.</w:t>
+        <w:t xml:space="preserve">The live demonstration has not yet run on preprod</w:t>
+      </w:r>
+      <w:r>
+        <w:rPr>
+          <w:rFonts w:ascii="Times New Roman" w:cs="Times New Roman" w:eastAsia="Times New Roman" w:hAnsi="Times New Roman"/>
+        </w:rPr>
+        <w:t xml:space="preserve"> — the validators, transaction builders and live batcher are built and tested offline; deployment, the end-to-end swap and the estimator calibration remain.</w:t>
       </w:r>
     </w:p>
     <w:p>
@@ -42734,21 +46881,13 @@
           <w:b/>
           <w:bCs/>
         </w:rPr>
-        <w:t xml:space="preserve">Replay of the recent past</w:t>
-      </w:r>
-      <w:r>
-        <w:rPr>
-          <w:rFonts w:ascii="Times New Roman" w:cs="Times New Roman" w:eastAsia="Times New Roman" w:hAnsi="Times New Roman"/>
-        </w:rPr>
-        <w:t xml:space="preserve"> — Ouroboros Leios and changing activity will alter block dynamics.</w:t>
-      </w:r>
-    </w:p>
-    <w:p>
-      <w:pPr>
-        <w:pStyle w:val="Heading2"/>
-      </w:pPr>
-      <w:r>
-        <w:t xml:space="preserve">9.4 Future Work</w:t>
+        <w:t xml:space="preserve">No latency gain over greedy</w:t>
+      </w:r>
+      <w:r>
+        <w:rPr>
+          <w:rFonts w:ascii="Times New Roman" w:cs="Times New Roman" w:eastAsia="Times New Roman" w:hAnsi="Times New Roman"/>
+        </w:rPr>
+        <w:t xml:space="preserve"> — on the current chain no adaptive policy beat greedy on tail latency; the benefit is cost and fairness at a stated latency price.</w:t>
       </w:r>
     </w:p>
     <w:p>
@@ -42763,8 +46902,24 @@
       <w:r>
         <w:rPr>
           <w:rFonts w:ascii="Times New Roman" w:cs="Times New Roman" w:eastAsia="Times New Roman" w:hAnsi="Times New Roman"/>
-        </w:rPr>
-        <w:t xml:space="preserve">Checkpoint selection across all three arrival rates, the full 2M-step training budget, and seed ensembling to remove the heavy-load failure of a single seed.</w:t>
+          <w:b/>
+          <w:bCs/>
+        </w:rPr>
+        <w:t xml:space="preserve">Replay of the recent past</w:t>
+      </w:r>
+      <w:r>
+        <w:rPr>
+          <w:rFonts w:ascii="Times New Roman" w:cs="Times New Roman" w:eastAsia="Times New Roman" w:hAnsi="Times New Roman"/>
+        </w:rPr>
+        <w:t xml:space="preserve"> — Ouroboros Leios and changing activity will alter block dynamics.</w:t>
+      </w:r>
+    </w:p>
+    <w:p>
+      <w:pPr>
+        <w:pStyle w:val="Heading2"/>
+      </w:pPr>
+      <w:r>
+        <w:t xml:space="preserve">9.4 Future Work</w:t>
       </w:r>
     </w:p>
     <w:p>
@@ -42780,7 +46935,7 @@
         <w:rPr>
           <w:rFonts w:ascii="Times New Roman" w:cs="Times New Roman" w:eastAsia="Times New Roman" w:hAnsi="Times New Roman"/>
         </w:rPr>
-        <w:t xml:space="preserve">Transaction chaining, relaxing the pool lock (simulator assumption A3).</w:t>
+        <w:t xml:space="preserve">Checkpoint selection across all three arrival rates, the full 2M-step training budget, and seed ensembling to remove the heavy-load failure of a single seed.</w:t>
       </w:r>
     </w:p>
     <w:p>
@@ -42796,7 +46951,7 @@
         <w:rPr>
           <w:rFonts w:ascii="Times New Roman" w:cs="Times New Roman" w:eastAsia="Times New Roman" w:hAnsi="Times New Roman"/>
         </w:rPr>
-        <w:t xml:space="preserve">Joint, end-to-end training of forecaster and policy, or giving the agent raw history instead of a forecast.</w:t>
+        <w:t xml:space="preserve">Transaction chaining, relaxing the pool lock (simulator assumption A3).</w:t>
       </w:r>
     </w:p>
     <w:p>
@@ -42812,7 +46967,7 @@
         <w:rPr>
           <w:rFonts w:ascii="Times New Roman" w:cs="Times New Roman" w:eastAsia="Times New Roman" w:hAnsi="Times New Roman"/>
         </w:rPr>
-        <w:t xml:space="preserve">Multi-pool scheduling across a DEX.</w:t>
+        <w:t xml:space="preserve">Joint, end-to-end training of forecaster and policy, or giving the agent raw history instead of a forecast.</w:t>
       </w:r>
     </w:p>
     <w:p>
@@ -42828,7 +46983,7 @@
         <w:rPr>
           <w:rFonts w:ascii="Times New Roman" w:cs="Times New Roman" w:eastAsia="Times New Roman" w:hAnsi="Times New Roman"/>
         </w:rPr>
-        <w:t xml:space="preserve">Fairness-aware and MEV-resistant order selection.</w:t>
+        <w:t xml:space="preserve">Multi-pool scheduling across a DEX.</w:t>
       </w:r>
     </w:p>
     <w:p>
@@ -42844,7 +46999,7 @@
         <w:rPr>
           <w:rFonts w:ascii="Times New Roman" w:cs="Times New Roman" w:eastAsia="Times New Roman" w:hAnsi="Times New Roman"/>
         </w:rPr>
-        <w:t xml:space="preserve">Re-evaluation under Ouroboros Leios block dynamics, and on a historical window with sustained congestion.</w:t>
+        <w:t xml:space="preserve">Fairness-aware and MEV-resistant order selection.</w:t>
       </w:r>
     </w:p>
     <w:p>
@@ -42860,7 +47015,7 @@
         <w:rPr>
           <w:rFonts w:ascii="Times New Roman" w:cs="Times New Roman" w:eastAsia="Times New Roman" w:hAnsi="Times New Roman"/>
         </w:rPr>
-        <w:t xml:space="preserve">Heterogeneous order costs, already supported by the dataset schema.</w:t>
+        <w:t xml:space="preserve">Re-evaluation under Ouroboros Leios block dynamics, and on a historical window with sustained congestion.</w:t>
       </w:r>
     </w:p>
     <w:p>
@@ -42876,7 +47031,55 @@
         <w:rPr>
           <w:rFonts w:ascii="Times New Roman" w:cs="Times New Roman" w:eastAsia="Times New Roman" w:hAnsi="Times New Roman"/>
         </w:rPr>
-        <w:t xml:space="preserve">Calibration against preprod transactions, including the reference-script fee term, and the live on-chain demonstration.</w:t>
+        <w:t xml:space="preserve">Heterogeneous order costs, already supported by the dataset schema.</w:t>
+      </w:r>
+    </w:p>
+    <w:p>
+      <w:pPr>
+        <w:pStyle w:val="ListParagraph"/>
+        <w:numPr>
+          <w:ilvl w:val="0"/>
+          <w:numId w:val="2"/>
+        </w:numPr>
+        <w:spacing w:after="60" w:line="312"/>
+      </w:pPr>
+      <w:r>
+        <w:rPr>
+          <w:rFonts w:ascii="Times New Roman" w:cs="Times New Roman" w:eastAsia="Times New Roman" w:hAnsi="Times New Roman"/>
+        </w:rPr>
+        <w:t xml:space="preserve">Deploy to preprod, settle the end-to-end swap, and calibrate the estimator from D4, folding in the reference-script fee term.</w:t>
+      </w:r>
+    </w:p>
+    <w:p>
+      <w:pPr>
+        <w:pStyle w:val="ListParagraph"/>
+        <w:numPr>
+          <w:ilvl w:val="0"/>
+          <w:numId w:val="2"/>
+        </w:numPr>
+        <w:spacing w:after="60" w:line="312"/>
+      </w:pPr>
+      <w:r>
+        <w:rPr>
+          <w:rFonts w:ascii="Times New Roman" w:cs="Times New Roman" w:eastAsia="Times New Roman" w:hAnsi="Times New Roman"/>
+        </w:rPr>
+        <w:t xml:space="preserve">Reference scripts for the validators, removing roughly 1.8 KB of script bytes from every batch transaction and so raising the Gate A cap.</w:t>
+      </w:r>
+    </w:p>
+    <w:p>
+      <w:pPr>
+        <w:pStyle w:val="ListParagraph"/>
+        <w:numPr>
+          <w:ilvl w:val="0"/>
+          <w:numId w:val="2"/>
+        </w:numPr>
+        <w:spacing w:after="60" w:line="312"/>
+      </w:pPr>
+      <w:r>
+        <w:rPr>
+          <w:rFonts w:ascii="Times New Roman" w:cs="Times New Roman" w:eastAsia="Times New Roman" w:hAnsi="Times New Roman"/>
+        </w:rPr>
+        <w:t xml:space="preserve">The LightGBM forecaster in the live loop, which ablation A2 found lets P2 buy larger batches more cheaply than a naive forecast.</w:t>
       </w:r>
     </w:p>
     <w:p>

</xml_diff>

<commit_message>
Deploy the DEX to preprod and fix reading Blockfrost's raw datums
Deployment tx 555ee19b...767372 was included in block 5178709 at slot
133767575. The pool is verified on chain with 100 tADA, 1,000,000 TEAM11 and
the POOL NFT, and its datum matches the recorded deployment.

The first live read found that Blockfrost returns inline datums as RawCBOR,
which read_orders treated as undecodable, so every real order would have been
skipped. datum_bytes now handles it, with a regression test that batches over
RawCBOR datums. Report section 8.12 records the deployment.
</commit_message>
<xml_diff>
--- a/docs/report/Team11_Project_Report_Draft.docx
+++ b/docs/report/Team11_Project_Report_Draft.docx
@@ -695,7 +695,7 @@
         <w:rPr>
           <w:rFonts w:ascii="Times New Roman" w:cs="Times New Roman" w:eastAsia="Times New Roman" w:hAnsi="Times New Roman"/>
         </w:rPr>
-        <w:t xml:space="preserve">, so the amortization the policies optimise reaches users rather than the operator, together with a live batcher that runs the simulator’s decision loop against the chain. Both are built and tested offline. </w:t>
+        <w:t xml:space="preserve">, so the amortization the policies optimise reaches users rather than the operator, together with a live batcher that runs the simulator’s decision loop against the chain. The DEX is deployed on preprod. </w:t>
       </w:r>
       <w:r>
         <w:rPr>
@@ -703,7 +703,7 @@
           <w:highlight w:val="yellow"/>
           <w:highlightCs w:val="yellow"/>
         </w:rPr>
-        <w:t xml:space="preserve">PENDING: preprod deployment and the end-to-end swap</w:t>
+        <w:t xml:space="preserve">PENDING: the end-to-end swap</w:t>
       </w:r>
     </w:p>
     <w:p>
@@ -44440,36 +44440,16 @@
       <w:r>
         <w:rPr>
           <w:rFonts w:ascii="Times New Roman" w:cs="Times New Roman" w:eastAsia="Times New Roman" w:hAnsi="Times New Roman"/>
-        </w:rPr>
-        <w:t xml:space="preserve">The on-chain DEX, the transaction builders and the live batcher are </w:t>
-      </w:r>
-      <w:r>
-        <w:rPr>
-          <w:rFonts w:ascii="Times New Roman" w:cs="Times New Roman" w:eastAsia="Times New Roman" w:hAnsi="Times New Roman"/>
           <w:b/>
           <w:bCs/>
         </w:rPr>
-        <w:t xml:space="preserve">built and verified offline</w:t>
-      </w:r>
-      <w:r>
-        <w:rPr>
-          <w:rFonts w:ascii="Times New Roman" w:cs="Times New Roman" w:eastAsia="Times New Roman" w:hAnsi="Times New Roman"/>
-        </w:rPr>
-        <w:t xml:space="preserve"> (Sections 5.11, 6.11–6.13, 7.5). They have </w:t>
-      </w:r>
-      <w:r>
-        <w:rPr>
-          <w:rFonts w:ascii="Times New Roman" w:cs="Times New Roman" w:eastAsia="Times New Roman" w:hAnsi="Times New Roman"/>
-          <w:b/>
-          <w:bCs/>
-        </w:rPr>
-        <w:t xml:space="preserve">not yet been deployed to preprod</w:t>
-      </w:r>
-      <w:r>
-        <w:rPr>
-          <w:rFonts w:ascii="Times New Roman" w:cs="Times New Roman" w:eastAsia="Times New Roman" w:hAnsi="Times New Roman"/>
-        </w:rPr>
-        <w:t xml:space="preserve">: deployment needs a Blockfrost preprod project and faucet-funded keys provided by the team, and each submission is made only with explicit approval. </w:t>
+        <w:t xml:space="preserve">The DEX is deployed on the Cardano preprod test network.</w:t>
+      </w:r>
+      <w:r>
+        <w:rPr>
+          <w:rFonts w:ascii="Times New Roman" w:cs="Times New Roman" w:eastAsia="Times New Roman" w:hAnsi="Times New Roman"/>
+        </w:rPr>
+        <w:t xml:space="preserve"> The deployment transaction was included on 15 September 2026, and the pool was verified on chain against the deployment record. Each submission is made only with the team’s explicit approval. </w:t>
       </w:r>
       <w:r>
         <w:rPr>
@@ -44477,25 +44457,13 @@
           <w:highlight w:val="yellow"/>
           <w:highlightCs w:val="yellow"/>
         </w:rPr>
-        <w:t xml:space="preserve">PENDING: deployment transaction hash, end-to-end swap transaction hash (T-O6), and the D4 estimator calibration</w:t>
+        <w:t xml:space="preserve">PENDING: end-to-end swap transaction hash (T-O6) and the D4 estimator calibration</w:t>
       </w:r>
     </w:p>
     <w:p>
       <w:pPr>
         <w:spacing w:after="120"/>
       </w:pPr>
-    </w:p>
-    <w:p>
-      <w:pPr>
-        <w:spacing w:after="120" w:line="336"/>
-        <w:jc w:val="both"/>
-      </w:pPr>
-      <w:r>
-        <w:rPr>
-          <w:rFonts w:ascii="Times New Roman" w:cs="Times New Roman" w:eastAsia="Times New Roman" w:hAnsi="Times New Roman"/>
-        </w:rPr>
-        <w:t xml:space="preserve">The demonstration is scripted as five steps, each a dry run until explicitly submitted: deploy the pool and mint its NFT; run the batcher in shadow mode to confirm its decisions on live chain state; place an order from a separate user key; run the batcher live until that order settles; and compare estimated with actual transaction size and execution units from the D4 log.</w:t>
-      </w:r>
     </w:p>
     <w:p>
       <w:pPr>
@@ -44512,6 +44480,592 @@
           <w:szCs w:val="22"/>
         </w:rPr>
         <w:t xml:space="preserve">Table 8.17: </w:t>
+      </w:r>
+      <w:r>
+        <w:rPr>
+          <w:rFonts w:ascii="Times New Roman" w:cs="Times New Roman" w:eastAsia="Times New Roman" w:hAnsi="Times New Roman"/>
+          <w:i/>
+          <w:iCs/>
+          <w:sz w:val="22"/>
+          <w:szCs w:val="22"/>
+        </w:rPr>
+        <w:t xml:space="preserve">Preprod deployment</w:t>
+      </w:r>
+    </w:p>
+    <w:tbl>
+      <w:tblPr>
+        <w:tblW w:type="dxa" w:w="9026"/>
+        <w:tblBorders>
+          <w:top w:val="single" w:color="auto" w:sz="4"/>
+          <w:left w:val="single" w:color="auto" w:sz="4"/>
+          <w:bottom w:val="single" w:color="auto" w:sz="4"/>
+          <w:right w:val="single" w:color="auto" w:sz="4"/>
+          <w:insideH w:val="single" w:color="auto" w:sz="4"/>
+          <w:insideV w:val="single" w:color="auto" w:sz="4"/>
+        </w:tblBorders>
+      </w:tblPr>
+      <w:tblGrid>
+        <w:gridCol w:w="2607"/>
+        <w:gridCol w:w="6419"/>
+      </w:tblGrid>
+      <w:tr>
+        <w:trPr>
+          <w:tblHeader/>
+        </w:trPr>
+        <w:tc>
+          <w:tcPr>
+            <w:tcW w:type="dxa" w:w="2607"/>
+            <w:tcBorders>
+              <w:top w:val="single" w:color="808080" w:sz="4"/>
+              <w:left w:val="single" w:color="808080" w:sz="4"/>
+              <w:bottom w:val="single" w:color="808080" w:sz="4"/>
+              <w:right w:val="single" w:color="808080" w:sz="4"/>
+            </w:tcBorders>
+            <w:shd w:fill="D9E2F3" w:color="auto" w:val="clear"/>
+            <w:tcMar>
+              <w:top w:type="dxa" w:w="40"/>
+              <w:left w:type="dxa" w:w="80"/>
+              <w:bottom w:type="dxa" w:w="40"/>
+              <w:right w:type="dxa" w:w="80"/>
+            </w:tcMar>
+          </w:tcPr>
+          <w:p>
+            <w:pPr>
+              <w:spacing w:after="0"/>
+            </w:pPr>
+            <w:r>
+              <w:rPr>
+                <w:rFonts w:ascii="Times New Roman" w:cs="Times New Roman" w:eastAsia="Times New Roman" w:hAnsi="Times New Roman"/>
+                <w:b/>
+                <w:bCs/>
+                <w:sz w:val="20"/>
+                <w:szCs w:val="20"/>
+              </w:rPr>
+              <w:t xml:space="preserve">Item</w:t>
+            </w:r>
+          </w:p>
+        </w:tc>
+        <w:tc>
+          <w:tcPr>
+            <w:tcW w:type="dxa" w:w="6419"/>
+            <w:tcBorders>
+              <w:top w:val="single" w:color="808080" w:sz="4"/>
+              <w:left w:val="single" w:color="808080" w:sz="4"/>
+              <w:bottom w:val="single" w:color="808080" w:sz="4"/>
+              <w:right w:val="single" w:color="808080" w:sz="4"/>
+            </w:tcBorders>
+            <w:shd w:fill="D9E2F3" w:color="auto" w:val="clear"/>
+            <w:tcMar>
+              <w:top w:type="dxa" w:w="40"/>
+              <w:left w:type="dxa" w:w="80"/>
+              <w:bottom w:type="dxa" w:w="40"/>
+              <w:right w:type="dxa" w:w="80"/>
+            </w:tcMar>
+          </w:tcPr>
+          <w:p>
+            <w:pPr>
+              <w:spacing w:after="0"/>
+            </w:pPr>
+            <w:r>
+              <w:rPr>
+                <w:rFonts w:ascii="Times New Roman" w:cs="Times New Roman" w:eastAsia="Times New Roman" w:hAnsi="Times New Roman"/>
+                <w:b/>
+                <w:bCs/>
+                <w:sz w:val="20"/>
+                <w:szCs w:val="20"/>
+              </w:rPr>
+              <w:t xml:space="preserve">Value</w:t>
+            </w:r>
+          </w:p>
+        </w:tc>
+      </w:tr>
+      <w:tr>
+        <w:tc>
+          <w:tcPr>
+            <w:tcW w:type="dxa" w:w="2607"/>
+            <w:tcBorders>
+              <w:top w:val="single" w:color="808080" w:sz="4"/>
+              <w:left w:val="single" w:color="808080" w:sz="4"/>
+              <w:bottom w:val="single" w:color="808080" w:sz="4"/>
+              <w:right w:val="single" w:color="808080" w:sz="4"/>
+            </w:tcBorders>
+            <w:tcMar>
+              <w:top w:type="dxa" w:w="40"/>
+              <w:left w:type="dxa" w:w="80"/>
+              <w:bottom w:type="dxa" w:w="40"/>
+              <w:right w:type="dxa" w:w="80"/>
+            </w:tcMar>
+          </w:tcPr>
+          <w:p>
+            <w:pPr>
+              <w:spacing w:after="0"/>
+            </w:pPr>
+            <w:r>
+              <w:rPr>
+                <w:rFonts w:ascii="Times New Roman" w:cs="Times New Roman" w:eastAsia="Times New Roman" w:hAnsi="Times New Roman"/>
+                <w:sz w:val="20"/>
+                <w:szCs w:val="20"/>
+              </w:rPr>
+              <w:t xml:space="preserve">Deployment transaction</w:t>
+            </w:r>
+          </w:p>
+        </w:tc>
+        <w:tc>
+          <w:tcPr>
+            <w:tcW w:type="dxa" w:w="6419"/>
+            <w:tcBorders>
+              <w:top w:val="single" w:color="808080" w:sz="4"/>
+              <w:left w:val="single" w:color="808080" w:sz="4"/>
+              <w:bottom w:val="single" w:color="808080" w:sz="4"/>
+              <w:right w:val="single" w:color="808080" w:sz="4"/>
+            </w:tcBorders>
+            <w:tcMar>
+              <w:top w:type="dxa" w:w="40"/>
+              <w:left w:type="dxa" w:w="80"/>
+              <w:bottom w:type="dxa" w:w="40"/>
+              <w:right w:type="dxa" w:w="80"/>
+            </w:tcMar>
+          </w:tcPr>
+          <w:p>
+            <w:pPr>
+              <w:spacing w:after="0"/>
+            </w:pPr>
+            <w:r>
+              <w:rPr>
+                <w:rFonts w:ascii="Consolas" w:cs="Consolas" w:eastAsia="Consolas" w:hAnsi="Consolas"/>
+                <w:sz w:val="20"/>
+                <w:szCs w:val="20"/>
+              </w:rPr>
+              <w:t xml:space="preserve">555ee19bd06d2151931035039dac883b560d9f93bb35b3fd1efa24a30f767372</w:t>
+            </w:r>
+          </w:p>
+        </w:tc>
+      </w:tr>
+      <w:tr>
+        <w:tc>
+          <w:tcPr>
+            <w:tcW w:type="dxa" w:w="2607"/>
+            <w:tcBorders>
+              <w:top w:val="single" w:color="808080" w:sz="4"/>
+              <w:left w:val="single" w:color="808080" w:sz="4"/>
+              <w:bottom w:val="single" w:color="808080" w:sz="4"/>
+              <w:right w:val="single" w:color="808080" w:sz="4"/>
+            </w:tcBorders>
+            <w:tcMar>
+              <w:top w:type="dxa" w:w="40"/>
+              <w:left w:type="dxa" w:w="80"/>
+              <w:bottom w:type="dxa" w:w="40"/>
+              <w:right w:type="dxa" w:w="80"/>
+            </w:tcMar>
+          </w:tcPr>
+          <w:p>
+            <w:pPr>
+              <w:spacing w:after="0"/>
+            </w:pPr>
+            <w:r>
+              <w:rPr>
+                <w:rFonts w:ascii="Times New Roman" w:cs="Times New Roman" w:eastAsia="Times New Roman" w:hAnsi="Times New Roman"/>
+                <w:sz w:val="20"/>
+                <w:szCs w:val="20"/>
+              </w:rPr>
+              <w:t xml:space="preserve">Block / slot</w:t>
+            </w:r>
+          </w:p>
+        </w:tc>
+        <w:tc>
+          <w:tcPr>
+            <w:tcW w:type="dxa" w:w="6419"/>
+            <w:tcBorders>
+              <w:top w:val="single" w:color="808080" w:sz="4"/>
+              <w:left w:val="single" w:color="808080" w:sz="4"/>
+              <w:bottom w:val="single" w:color="808080" w:sz="4"/>
+              <w:right w:val="single" w:color="808080" w:sz="4"/>
+            </w:tcBorders>
+            <w:tcMar>
+              <w:top w:type="dxa" w:w="40"/>
+              <w:left w:type="dxa" w:w="80"/>
+              <w:bottom w:type="dxa" w:w="40"/>
+              <w:right w:type="dxa" w:w="80"/>
+            </w:tcMar>
+          </w:tcPr>
+          <w:p>
+            <w:pPr>
+              <w:spacing w:after="0"/>
+            </w:pPr>
+            <w:r>
+              <w:rPr>
+                <w:rFonts w:ascii="Times New Roman" w:cs="Times New Roman" w:eastAsia="Times New Roman" w:hAnsi="Times New Roman"/>
+                <w:sz w:val="20"/>
+                <w:szCs w:val="20"/>
+              </w:rPr>
+              <w:t xml:space="preserve">5,178,709 / 133,767,575</w:t>
+            </w:r>
+          </w:p>
+        </w:tc>
+      </w:tr>
+      <w:tr>
+        <w:tc>
+          <w:tcPr>
+            <w:tcW w:type="dxa" w:w="2607"/>
+            <w:tcBorders>
+              <w:top w:val="single" w:color="808080" w:sz="4"/>
+              <w:left w:val="single" w:color="808080" w:sz="4"/>
+              <w:bottom w:val="single" w:color="808080" w:sz="4"/>
+              <w:right w:val="single" w:color="808080" w:sz="4"/>
+            </w:tcBorders>
+            <w:tcMar>
+              <w:top w:type="dxa" w:w="40"/>
+              <w:left w:type="dxa" w:w="80"/>
+              <w:bottom w:type="dxa" w:w="40"/>
+              <w:right w:type="dxa" w:w="80"/>
+            </w:tcMar>
+          </w:tcPr>
+          <w:p>
+            <w:pPr>
+              <w:spacing w:after="0"/>
+            </w:pPr>
+            <w:r>
+              <w:rPr>
+                <w:rFonts w:ascii="Times New Roman" w:cs="Times New Roman" w:eastAsia="Times New Roman" w:hAnsi="Times New Roman"/>
+                <w:sz w:val="20"/>
+                <w:szCs w:val="20"/>
+              </w:rPr>
+              <w:t xml:space="preserve">Network fee</w:t>
+            </w:r>
+          </w:p>
+        </w:tc>
+        <w:tc>
+          <w:tcPr>
+            <w:tcW w:type="dxa" w:w="6419"/>
+            <w:tcBorders>
+              <w:top w:val="single" w:color="808080" w:sz="4"/>
+              <w:left w:val="single" w:color="808080" w:sz="4"/>
+              <w:bottom w:val="single" w:color="808080" w:sz="4"/>
+              <w:right w:val="single" w:color="808080" w:sz="4"/>
+            </w:tcBorders>
+            <w:tcMar>
+              <w:top w:type="dxa" w:w="40"/>
+              <w:left w:type="dxa" w:w="80"/>
+              <w:bottom w:type="dxa" w:w="40"/>
+              <w:right w:type="dxa" w:w="80"/>
+            </w:tcMar>
+          </w:tcPr>
+          <w:p>
+            <w:pPr>
+              <w:spacing w:after="0"/>
+            </w:pPr>
+            <w:r>
+              <w:rPr>
+                <w:rFonts w:ascii="Times New Roman" w:cs="Times New Roman" w:eastAsia="Times New Roman" w:hAnsi="Times New Roman"/>
+                <w:sz w:val="20"/>
+                <w:szCs w:val="20"/>
+              </w:rPr>
+              <w:t xml:space="preserve">181,913 lovelace (0.18 tADA), 603 bytes</w:t>
+            </w:r>
+          </w:p>
+        </w:tc>
+      </w:tr>
+      <w:tr>
+        <w:tc>
+          <w:tcPr>
+            <w:tcW w:type="dxa" w:w="2607"/>
+            <w:tcBorders>
+              <w:top w:val="single" w:color="808080" w:sz="4"/>
+              <w:left w:val="single" w:color="808080" w:sz="4"/>
+              <w:bottom w:val="single" w:color="808080" w:sz="4"/>
+              <w:right w:val="single" w:color="808080" w:sz="4"/>
+            </w:tcBorders>
+            <w:tcMar>
+              <w:top w:type="dxa" w:w="40"/>
+              <w:left w:type="dxa" w:w="80"/>
+              <w:bottom w:type="dxa" w:w="40"/>
+              <w:right w:type="dxa" w:w="80"/>
+            </w:tcMar>
+          </w:tcPr>
+          <w:p>
+            <w:pPr>
+              <w:spacing w:after="0"/>
+            </w:pPr>
+            <w:r>
+              <w:rPr>
+                <w:rFonts w:ascii="Times New Roman" w:cs="Times New Roman" w:eastAsia="Times New Roman" w:hAnsi="Times New Roman"/>
+                <w:sz w:val="20"/>
+                <w:szCs w:val="20"/>
+              </w:rPr>
+              <w:t xml:space="preserve">Minted</w:t>
+            </w:r>
+          </w:p>
+        </w:tc>
+        <w:tc>
+          <w:tcPr>
+            <w:tcW w:type="dxa" w:w="6419"/>
+            <w:tcBorders>
+              <w:top w:val="single" w:color="808080" w:sz="4"/>
+              <w:left w:val="single" w:color="808080" w:sz="4"/>
+              <w:bottom w:val="single" w:color="808080" w:sz="4"/>
+              <w:right w:val="single" w:color="808080" w:sz="4"/>
+            </w:tcBorders>
+            <w:tcMar>
+              <w:top w:type="dxa" w:w="40"/>
+              <w:left w:type="dxa" w:w="80"/>
+              <w:bottom w:type="dxa" w:w="40"/>
+              <w:right w:type="dxa" w:w="80"/>
+            </w:tcMar>
+          </w:tcPr>
+          <w:p>
+            <w:pPr>
+              <w:spacing w:after="0"/>
+            </w:pPr>
+            <w:r>
+              <w:rPr>
+                <w:rFonts w:ascii="Times New Roman" w:cs="Times New Roman" w:eastAsia="Times New Roman" w:hAnsi="Times New Roman"/>
+                <w:sz w:val="20"/>
+                <w:szCs w:val="20"/>
+              </w:rPr>
+              <w:t xml:space="preserve">10,000,000 TEAM11 and one POOL NFT; minting closed after slot 133,774,747</w:t>
+            </w:r>
+          </w:p>
+        </w:tc>
+      </w:tr>
+      <w:tr>
+        <w:tc>
+          <w:tcPr>
+            <w:tcW w:type="dxa" w:w="2607"/>
+            <w:tcBorders>
+              <w:top w:val="single" w:color="808080" w:sz="4"/>
+              <w:left w:val="single" w:color="808080" w:sz="4"/>
+              <w:bottom w:val="single" w:color="808080" w:sz="4"/>
+              <w:right w:val="single" w:color="808080" w:sz="4"/>
+            </w:tcBorders>
+            <w:tcMar>
+              <w:top w:type="dxa" w:w="40"/>
+              <w:left w:type="dxa" w:w="80"/>
+              <w:bottom w:type="dxa" w:w="40"/>
+              <w:right w:type="dxa" w:w="80"/>
+            </w:tcMar>
+          </w:tcPr>
+          <w:p>
+            <w:pPr>
+              <w:spacing w:after="0"/>
+            </w:pPr>
+            <w:r>
+              <w:rPr>
+                <w:rFonts w:ascii="Times New Roman" w:cs="Times New Roman" w:eastAsia="Times New Roman" w:hAnsi="Times New Roman"/>
+                <w:sz w:val="20"/>
+                <w:szCs w:val="20"/>
+              </w:rPr>
+              <w:t xml:space="preserve">Pool, verified on chain</w:t>
+            </w:r>
+          </w:p>
+        </w:tc>
+        <w:tc>
+          <w:tcPr>
+            <w:tcW w:type="dxa" w:w="6419"/>
+            <w:tcBorders>
+              <w:top w:val="single" w:color="808080" w:sz="4"/>
+              <w:left w:val="single" w:color="808080" w:sz="4"/>
+              <w:bottom w:val="single" w:color="808080" w:sz="4"/>
+              <w:right w:val="single" w:color="808080" w:sz="4"/>
+            </w:tcBorders>
+            <w:tcMar>
+              <w:top w:type="dxa" w:w="40"/>
+              <w:left w:type="dxa" w:w="80"/>
+              <w:bottom w:type="dxa" w:w="40"/>
+              <w:right w:type="dxa" w:w="80"/>
+            </w:tcMar>
+          </w:tcPr>
+          <w:p>
+            <w:pPr>
+              <w:spacing w:after="0"/>
+            </w:pPr>
+            <w:r>
+              <w:rPr>
+                <w:rFonts w:ascii="Times New Roman" w:cs="Times New Roman" w:eastAsia="Times New Roman" w:hAnsi="Times New Roman"/>
+                <w:sz w:val="20"/>
+                <w:szCs w:val="20"/>
+              </w:rPr>
+              <w:t xml:space="preserve">100 tADA + 1,000,000 TEAM11 + 1 POOL NFT, inline datum equal to the recorded deployment (fee 30 bps)</w:t>
+            </w:r>
+          </w:p>
+        </w:tc>
+      </w:tr>
+      <w:tr>
+        <w:tc>
+          <w:tcPr>
+            <w:tcW w:type="dxa" w:w="2607"/>
+            <w:tcBorders>
+              <w:top w:val="single" w:color="808080" w:sz="4"/>
+              <w:left w:val="single" w:color="808080" w:sz="4"/>
+              <w:bottom w:val="single" w:color="808080" w:sz="4"/>
+              <w:right w:val="single" w:color="808080" w:sz="4"/>
+            </w:tcBorders>
+            <w:tcMar>
+              <w:top w:type="dxa" w:w="40"/>
+              <w:left w:type="dxa" w:w="80"/>
+              <w:bottom w:type="dxa" w:w="40"/>
+              <w:right w:type="dxa" w:w="80"/>
+            </w:tcMar>
+          </w:tcPr>
+          <w:p>
+            <w:pPr>
+              <w:spacing w:after="0"/>
+            </w:pPr>
+            <w:r>
+              <w:rPr>
+                <w:rFonts w:ascii="Times New Roman" w:cs="Times New Roman" w:eastAsia="Times New Roman" w:hAnsi="Times New Roman"/>
+                <w:sz w:val="20"/>
+                <w:szCs w:val="20"/>
+              </w:rPr>
+              <w:t xml:space="preserve">Pool script hash</w:t>
+            </w:r>
+          </w:p>
+        </w:tc>
+        <w:tc>
+          <w:tcPr>
+            <w:tcW w:type="dxa" w:w="6419"/>
+            <w:tcBorders>
+              <w:top w:val="single" w:color="808080" w:sz="4"/>
+              <w:left w:val="single" w:color="808080" w:sz="4"/>
+              <w:bottom w:val="single" w:color="808080" w:sz="4"/>
+              <w:right w:val="single" w:color="808080" w:sz="4"/>
+            </w:tcBorders>
+            <w:tcMar>
+              <w:top w:type="dxa" w:w="40"/>
+              <w:left w:type="dxa" w:w="80"/>
+              <w:bottom w:type="dxa" w:w="40"/>
+              <w:right w:type="dxa" w:w="80"/>
+            </w:tcMar>
+          </w:tcPr>
+          <w:p>
+            <w:pPr>
+              <w:spacing w:after="0"/>
+            </w:pPr>
+            <w:r>
+              <w:rPr>
+                <w:rFonts w:ascii="Consolas" w:cs="Consolas" w:eastAsia="Consolas" w:hAnsi="Consolas"/>
+                <w:sz w:val="20"/>
+                <w:szCs w:val="20"/>
+              </w:rPr>
+              <w:t xml:space="preserve">2c9aee89dbbc6c7e30f720c2e0e76d7850b1eaf1bb5b53a517a96475</w:t>
+            </w:r>
+          </w:p>
+        </w:tc>
+      </w:tr>
+      <w:tr>
+        <w:tc>
+          <w:tcPr>
+            <w:tcW w:type="dxa" w:w="2607"/>
+            <w:tcBorders>
+              <w:top w:val="single" w:color="808080" w:sz="4"/>
+              <w:left w:val="single" w:color="808080" w:sz="4"/>
+              <w:bottom w:val="single" w:color="808080" w:sz="4"/>
+              <w:right w:val="single" w:color="808080" w:sz="4"/>
+            </w:tcBorders>
+            <w:tcMar>
+              <w:top w:type="dxa" w:w="40"/>
+              <w:left w:type="dxa" w:w="80"/>
+              <w:bottom w:type="dxa" w:w="40"/>
+              <w:right w:type="dxa" w:w="80"/>
+            </w:tcMar>
+          </w:tcPr>
+          <w:p>
+            <w:pPr>
+              <w:spacing w:after="0"/>
+            </w:pPr>
+            <w:r>
+              <w:rPr>
+                <w:rFonts w:ascii="Times New Roman" w:cs="Times New Roman" w:eastAsia="Times New Roman" w:hAnsi="Times New Roman"/>
+                <w:sz w:val="20"/>
+                <w:szCs w:val="20"/>
+              </w:rPr>
+              <w:t xml:space="preserve">Order script hash</w:t>
+            </w:r>
+          </w:p>
+        </w:tc>
+        <w:tc>
+          <w:tcPr>
+            <w:tcW w:type="dxa" w:w="6419"/>
+            <w:tcBorders>
+              <w:top w:val="single" w:color="808080" w:sz="4"/>
+              <w:left w:val="single" w:color="808080" w:sz="4"/>
+              <w:bottom w:val="single" w:color="808080" w:sz="4"/>
+              <w:right w:val="single" w:color="808080" w:sz="4"/>
+            </w:tcBorders>
+            <w:tcMar>
+              <w:top w:type="dxa" w:w="40"/>
+              <w:left w:type="dxa" w:w="80"/>
+              <w:bottom w:type="dxa" w:w="40"/>
+              <w:right w:type="dxa" w:w="80"/>
+            </w:tcMar>
+          </w:tcPr>
+          <w:p>
+            <w:pPr>
+              <w:spacing w:after="0"/>
+            </w:pPr>
+            <w:r>
+              <w:rPr>
+                <w:rFonts w:ascii="Consolas" w:cs="Consolas" w:eastAsia="Consolas" w:hAnsi="Consolas"/>
+                <w:sz w:val="20"/>
+                <w:szCs w:val="20"/>
+              </w:rPr>
+              <w:t xml:space="preserve">1676fbd256ca880594c30dc1e024439748dca693788786ac54f98567</w:t>
+            </w:r>
+          </w:p>
+        </w:tc>
+      </w:tr>
+    </w:tbl>
+    <w:p>
+      <w:pPr>
+        <w:spacing w:after="160"/>
+      </w:pPr>
+    </w:p>
+    <w:p>
+      <w:pPr>
+        <w:spacing w:after="120" w:line="336"/>
+        <w:jc w:val="both"/>
+      </w:pPr>
+      <w:r>
+        <w:rPr>
+          <w:rFonts w:ascii="Times New Roman" w:cs="Times New Roman" w:eastAsia="Times New Roman" w:hAnsi="Times New Roman"/>
+          <w:b/>
+          <w:bCs/>
+        </w:rPr>
+        <w:t xml:space="preserve">The first live read found a defect the offline tests could not.</w:t>
+      </w:r>
+      <w:r>
+        <w:rPr>
+          <w:rFonts w:ascii="Times New Roman" w:cs="Times New Roman" w:eastAsia="Times New Roman" w:hAnsi="Times New Roman"/>
+        </w:rPr>
+        <w:t xml:space="preserve"> Blockfrost returns inline datums as raw CBOR bytes, whereas locally built outputs carry typed Plutus data. The order reader handled only the latter, so every real order would have been treated as undecodable and silently skipped: the live batcher would have watched an apparently empty queue indefinitely. It was caught while verifying the deployed pool’s datum, before any order was placed, fixed, and pinned with a regression test that feeds the builders datums in the form Blockfrost delivers them.</w:t>
+      </w:r>
+    </w:p>
+    <w:p>
+      <w:pPr>
+        <w:spacing w:after="120" w:line="336"/>
+        <w:jc w:val="both"/>
+      </w:pPr>
+      <w:r>
+        <w:rPr>
+          <w:rFonts w:ascii="Times New Roman" w:cs="Times New Roman" w:eastAsia="Times New Roman" w:hAnsi="Times New Roman"/>
+        </w:rPr>
+        <w:t xml:space="preserve">The demonstration is scripted as five steps, each a dry run until explicitly submitted: deploy the pool and mint its NFT; run the batcher in shadow mode to confirm its decisions on live chain state; place an order from a separate user key; run the batcher live until that order settles; and compare estimated with actual transaction size and execution units from the D4 log.</w:t>
+      </w:r>
+    </w:p>
+    <w:p>
+      <w:pPr>
+        <w:keepNext/>
+        <w:spacing w:after="200" w:before="60"/>
+        <w:jc w:val="center"/>
+      </w:pPr>
+      <w:r>
+        <w:rPr>
+          <w:rFonts w:ascii="Times New Roman" w:cs="Times New Roman" w:eastAsia="Times New Roman" w:hAnsi="Times New Roman"/>
+          <w:b/>
+          <w:bCs/>
+          <w:sz w:val="22"/>
+          <w:szCs w:val="22"/>
+        </w:rPr>
+        <w:t xml:space="preserve">Table 8.18: </w:t>
       </w:r>
       <w:r>
         <w:rPr>
@@ -44927,7 +45481,7 @@
           <w:sz w:val="22"/>
           <w:szCs w:val="22"/>
         </w:rPr>
-        <w:t xml:space="preserve">Table 8.18: </w:t>
+        <w:t xml:space="preserve">Table 8.19: </w:t>
       </w:r>
       <w:r>
         <w:rPr>
@@ -46857,13 +47411,13 @@
           <w:b/>
           <w:bCs/>
         </w:rPr>
-        <w:t xml:space="preserve">The live demonstration has not yet run on preprod</w:t>
-      </w:r>
-      <w:r>
-        <w:rPr>
-          <w:rFonts w:ascii="Times New Roman" w:cs="Times New Roman" w:eastAsia="Times New Roman" w:hAnsi="Times New Roman"/>
-        </w:rPr>
-        <w:t xml:space="preserve"> — the validators, transaction builders and live batcher are built and tested offline; deployment, the end-to-end swap and the estimator calibration remain.</w:t>
+        <w:t xml:space="preserve">The live demonstration is incomplete</w:t>
+      </w:r>
+      <w:r>
+        <w:rPr>
+          <w:rFonts w:ascii="Times New Roman" w:cs="Times New Roman" w:eastAsia="Times New Roman" w:hAnsi="Times New Roman"/>
+        </w:rPr>
+        <w:t xml:space="preserve"> — the DEX is deployed on preprod, but the end-to-end swap and the estimator calibration against D4 remain.</w:t>
       </w:r>
     </w:p>
     <w:p>

</xml_diff>

<commit_message>
Record the first end-to-end swap on preprod (T-O6) and the first D4 row
A user order to sell 10 tADA for at least 85,000 TEAM11 was batched by the
live P2 batcher: batch b5201c0a...c73af1, submitted at slot 133785075 and
included at 133785125. Verified on chain: the user received 90,661 TEAM11 and
3.679758 tADA, the pool moved to 110 tADA / 909,339 TEAM11 with its NFT, and
no orders remain.

The first D4 row shows execution units over-estimated about fivefold (safe)
and size under-estimated 3.4-fold (unsafe; inline scripts are not modelled).
The +/-5 % / +/-10 % criterion is not met on one sample. The report records the
swap, both live defects and the calibration; the experiment record is in
experiments/phase7-preprod-demo.
</commit_message>
<xml_diff>
--- a/docs/report/Team11_Project_Report_Draft.docx
+++ b/docs/report/Team11_Project_Report_Draft.docx
@@ -695,15 +695,7 @@
         <w:rPr>
           <w:rFonts w:ascii="Times New Roman" w:cs="Times New Roman" w:eastAsia="Times New Roman" w:hAnsi="Times New Roman"/>
         </w:rPr>
-        <w:t xml:space="preserve">, so the amortization the policies optimise reaches users rather than the operator, together with a live batcher that runs the simulator’s decision loop against the chain. The DEX is deployed on preprod. </w:t>
-      </w:r>
-      <w:r>
-        <w:rPr>
-          <w:rFonts w:ascii="Times New Roman" w:cs="Times New Roman" w:eastAsia="Times New Roman" w:hAnsi="Times New Roman"/>
-          <w:highlight w:val="yellow"/>
-          <w:highlightCs w:val="yellow"/>
-        </w:rPr>
-        <w:t xml:space="preserve">PENDING: the end-to-end swap</w:t>
+        <w:t xml:space="preserve">, so the amortization the policies optimise reaches users rather than the operator, together with a live batcher that runs the simulator’s decision loop against the chain. The DEX is deployed on preprod, where the live batcher has settled its first end-to-end swap.</w:t>
       </w:r>
     </w:p>
     <w:p>
@@ -18406,7 +18398,21 @@
         <w:rPr>
           <w:rFonts w:ascii="Times New Roman" w:cs="Times New Roman" w:eastAsia="Times New Roman" w:hAnsi="Times New Roman"/>
         </w:rPr>
-        <w:t xml:space="preserve"> carries; if the built fee came in lower, users would have been overcharged and the batch rejected. The builder therefore settles the fee before returning:</w:t>
+        <w:t xml:space="preserve"> carries; if the built fee came in lower, users would have been overcharged and the batch rejected. Settling the fee after the build is not enough on its own, as the first live batch showed (Section 8.12): the node evaluates the scripts </w:t>
+      </w:r>
+      <w:r>
+        <w:rPr>
+          <w:rFonts w:ascii="Times New Roman" w:cs="Times New Roman" w:eastAsia="Times New Roman" w:hAnsi="Times New Roman"/>
+          <w:i/>
+          <w:iCs/>
+        </w:rPr>
+        <w:t xml:space="preserve">during</w:t>
+      </w:r>
+      <w:r>
+        <w:rPr>
+          <w:rFonts w:ascii="Times New Roman" w:cs="Times New Roman" w:eastAsia="Times New Roman" w:hAnsi="Times New Roman"/>
+        </w:rPr>
+        <w:t xml:space="preserve"> the build, against a fee not yet known. The builder therefore works in two passes — a probe that charges margins only, valid at any fee, to obtain execution units; then a final build with those units fixed, charging users for the fee the transaction really carries:</w:t>
       </w:r>
     </w:p>
     <w:p>
@@ -18421,7 +18427,7 @@
           <w:sz w:val="16"/>
           <w:szCs w:val="16"/>
         </w:rPr>
-        <w:t xml:space="preserve">plan = plan_batch(queued, x, y, deployment.fee_bps)</w:t>
+        <w:t xml:space="preserve">probe_plan = plan_batch(queued, x, y, deployment.fee_bps, network_fee=0)  # margins only</w:t>
       </w:r>
     </w:p>
     <w:p>
@@ -18436,7 +18442,7 @@
           <w:sz w:val="16"/>
           <w:szCs w:val="16"/>
         </w:rPr>
-        <w:t xml:space="preserve">for _ in range(MAX_FEE_ROUNDS):</w:t>
+        <w:t xml:space="preserve">probe = _assemble(context, batcher_skey, deployment, scripts, pool_utxo, by_ref, probe_plan, ttl)</w:t>
       </w:r>
     </w:p>
     <w:p>
@@ -18451,7 +18457,67 @@
           <w:sz w:val="16"/>
           <w:szCs w:val="16"/>
         </w:rPr>
-        <w:t xml:space="preserve">    tx = _assemble(context, batcher_skey, deployment, scripts, pool_utxo, by_ref, plan, ttl)</w:t>
+        <w:t xml:space="preserve">units = _probe_units(probe)                  # the node evaluates exactly once, here</w:t>
+      </w:r>
+    </w:p>
+    <w:p>
+      <w:pPr>
+        <w:shd w:fill="F4F4F4" w:color="auto" w:val="clear"/>
+        <w:spacing w:after="0" w:line="240"/>
+        <w:ind w:left="200"/>
+      </w:pPr>
+      <w:r>
+        <w:rPr>
+          <w:rFonts w:ascii="Consolas" w:cs="Consolas" w:eastAsia="Consolas" w:hAnsi="Consolas"/>
+          <w:sz w:val="16"/>
+          <w:szCs w:val="16"/>
+        </w:rPr>
+        <w:t xml:space="preserve"> </w:t>
+      </w:r>
+    </w:p>
+    <w:p>
+      <w:pPr>
+        <w:shd w:fill="F4F4F4" w:color="auto" w:val="clear"/>
+        <w:spacing w:after="0" w:line="240"/>
+        <w:ind w:left="200"/>
+      </w:pPr>
+      <w:r>
+        <w:rPr>
+          <w:rFonts w:ascii="Consolas" w:cs="Consolas" w:eastAsia="Consolas" w:hAnsi="Consolas"/>
+          <w:sz w:val="16"/>
+          <w:szCs w:val="16"/>
+        </w:rPr>
+        <w:t xml:space="preserve">plan = plan_batch(queued, x, y, deployment.fee_bps, network_fee=probe.transaction_body.fee)</w:t>
+      </w:r>
+    </w:p>
+    <w:p>
+      <w:pPr>
+        <w:shd w:fill="F4F4F4" w:color="auto" w:val="clear"/>
+        <w:spacing w:after="0" w:line="240"/>
+        <w:ind w:left="200"/>
+      </w:pPr>
+      <w:r>
+        <w:rPr>
+          <w:rFonts w:ascii="Consolas" w:cs="Consolas" w:eastAsia="Consolas" w:hAnsi="Consolas"/>
+          <w:sz w:val="16"/>
+          <w:szCs w:val="16"/>
+        </w:rPr>
+        <w:t xml:space="preserve">for _ in range(MAX_FEE_ROUNDS):</w:t>
+      </w:r>
+    </w:p>
+    <w:p>
+      <w:pPr>
+        <w:shd w:fill="F4F4F4" w:color="auto" w:val="clear"/>
+        <w:spacing w:after="0" w:line="240"/>
+        <w:ind w:left="200"/>
+      </w:pPr>
+      <w:r>
+        <w:rPr>
+          <w:rFonts w:ascii="Consolas" w:cs="Consolas" w:eastAsia="Consolas" w:hAnsi="Consolas"/>
+          <w:sz w:val="16"/>
+          <w:szCs w:val="16"/>
+        </w:rPr>
+        <w:t xml:space="preserve">    tx = _assemble(context, batcher_skey, deployment, scripts, pool_utxo, by_ref, plan, ttl, units)</w:t>
       </w:r>
     </w:p>
     <w:p>
@@ -24544,10 +24610,24 @@
                 <w:rFonts w:ascii="Times New Roman" w:cs="Times New Roman" w:eastAsia="Times New Roman" w:hAnsi="Times New Roman"/>
                 <w:sz w:val="20"/>
                 <w:szCs w:val="20"/>
-                <w:highlight w:val="yellow"/>
-                <w:highlightCs w:val="yellow"/>
-              </w:rPr>
-              <w:t xml:space="preserve">PENDING: requires deployment</w:t>
+              </w:rPr>
+              <w:t xml:space="preserve">Pass — batch </w:t>
+            </w:r>
+            <w:r>
+              <w:rPr>
+                <w:rFonts w:ascii="Consolas" w:cs="Consolas" w:eastAsia="Consolas" w:hAnsi="Consolas"/>
+                <w:sz w:val="20"/>
+                <w:szCs w:val="20"/>
+              </w:rPr>
+              <w:t xml:space="preserve">b5201c0a…c73af1</w:t>
+            </w:r>
+            <w:r>
+              <w:rPr>
+                <w:rFonts w:ascii="Times New Roman" w:cs="Times New Roman" w:eastAsia="Times New Roman" w:hAnsi="Times New Roman"/>
+                <w:sz w:val="20"/>
+                <w:szCs w:val="20"/>
+              </w:rPr>
+              <w:t xml:space="preserve">, verified on chain</w:t>
             </w:r>
           </w:p>
         </w:tc>
@@ -25354,6 +25434,190 @@
                 <w:szCs w:val="20"/>
               </w:rPr>
               <w:t xml:space="preserve">Anchored rule; test that no source file is ignored</w:t>
+            </w:r>
+          </w:p>
+        </w:tc>
+      </w:tr>
+      <w:tr>
+        <w:tc>
+          <w:tcPr>
+            <w:tcW w:type="dxa" w:w="3008"/>
+            <w:tcBorders>
+              <w:top w:val="single" w:color="808080" w:sz="4"/>
+              <w:left w:val="single" w:color="808080" w:sz="4"/>
+              <w:bottom w:val="single" w:color="808080" w:sz="4"/>
+              <w:right w:val="single" w:color="808080" w:sz="4"/>
+            </w:tcBorders>
+            <w:tcMar>
+              <w:top w:type="dxa" w:w="40"/>
+              <w:left w:type="dxa" w:w="80"/>
+              <w:bottom w:type="dxa" w:w="40"/>
+              <w:right w:type="dxa" w:w="80"/>
+            </w:tcMar>
+          </w:tcPr>
+          <w:p>
+            <w:pPr>
+              <w:spacing w:after="0"/>
+            </w:pPr>
+            <w:r>
+              <w:rPr>
+                <w:rFonts w:ascii="Times New Roman" w:cs="Times New Roman" w:eastAsia="Times New Roman" w:hAnsi="Times New Roman"/>
+                <w:sz w:val="20"/>
+                <w:szCs w:val="20"/>
+              </w:rPr>
+              <w:t xml:space="preserve">Live: Blockfrost’s raw-CBOR datums unreadable</w:t>
+            </w:r>
+          </w:p>
+        </w:tc>
+        <w:tc>
+          <w:tcPr>
+            <w:tcW w:type="dxa" w:w="3008"/>
+            <w:tcBorders>
+              <w:top w:val="single" w:color="808080" w:sz="4"/>
+              <w:left w:val="single" w:color="808080" w:sz="4"/>
+              <w:bottom w:val="single" w:color="808080" w:sz="4"/>
+              <w:right w:val="single" w:color="808080" w:sz="4"/>
+            </w:tcBorders>
+            <w:tcMar>
+              <w:top w:type="dxa" w:w="40"/>
+              <w:left w:type="dxa" w:w="80"/>
+              <w:bottom w:type="dxa" w:w="40"/>
+              <w:right w:type="dxa" w:w="80"/>
+            </w:tcMar>
+          </w:tcPr>
+          <w:p>
+            <w:pPr>
+              <w:spacing w:after="0"/>
+            </w:pPr>
+            <w:r>
+              <w:rPr>
+                <w:rFonts w:ascii="Times New Roman" w:cs="Times New Roman" w:eastAsia="Times New Roman" w:hAnsi="Times New Roman"/>
+                <w:sz w:val="20"/>
+                <w:szCs w:val="20"/>
+              </w:rPr>
+              <w:t xml:space="preserve">Every real order silently skipped</w:t>
+            </w:r>
+          </w:p>
+        </w:tc>
+        <w:tc>
+          <w:tcPr>
+            <w:tcW w:type="dxa" w:w="3010"/>
+            <w:tcBorders>
+              <w:top w:val="single" w:color="808080" w:sz="4"/>
+              <w:left w:val="single" w:color="808080" w:sz="4"/>
+              <w:bottom w:val="single" w:color="808080" w:sz="4"/>
+              <w:right w:val="single" w:color="808080" w:sz="4"/>
+            </w:tcBorders>
+            <w:tcMar>
+              <w:top w:type="dxa" w:w="40"/>
+              <w:left w:type="dxa" w:w="80"/>
+              <w:bottom w:type="dxa" w:w="40"/>
+              <w:right w:type="dxa" w:w="80"/>
+            </w:tcMar>
+          </w:tcPr>
+          <w:p>
+            <w:pPr>
+              <w:spacing w:after="0"/>
+            </w:pPr>
+            <w:r>
+              <w:rPr>
+                <w:rFonts w:ascii="Times New Roman" w:cs="Times New Roman" w:eastAsia="Times New Roman" w:hAnsi="Times New Roman"/>
+                <w:sz w:val="20"/>
+                <w:szCs w:val="20"/>
+              </w:rPr>
+              <w:t xml:space="preserve">Accept raw CBOR; regression test with datums as Blockfrost returns them</w:t>
+            </w:r>
+          </w:p>
+        </w:tc>
+      </w:tr>
+      <w:tr>
+        <w:tc>
+          <w:tcPr>
+            <w:tcW w:type="dxa" w:w="3008"/>
+            <w:tcBorders>
+              <w:top w:val="single" w:color="808080" w:sz="4"/>
+              <w:left w:val="single" w:color="808080" w:sz="4"/>
+              <w:bottom w:val="single" w:color="808080" w:sz="4"/>
+              <w:right w:val="single" w:color="808080" w:sz="4"/>
+            </w:tcBorders>
+            <w:tcMar>
+              <w:top w:type="dxa" w:w="40"/>
+              <w:left w:type="dxa" w:w="80"/>
+              <w:bottom w:type="dxa" w:w="40"/>
+              <w:right w:type="dxa" w:w="80"/>
+            </w:tcMar>
+          </w:tcPr>
+          <w:p>
+            <w:pPr>
+              <w:spacing w:after="0"/>
+            </w:pPr>
+            <w:r>
+              <w:rPr>
+                <w:rFonts w:ascii="Times New Roman" w:cs="Times New Roman" w:eastAsia="Times New Roman" w:hAnsi="Times New Roman"/>
+                <w:sz w:val="20"/>
+                <w:szCs w:val="20"/>
+              </w:rPr>
+              <w:t xml:space="preserve">Live: users charged for the estimated fee</w:t>
+            </w:r>
+          </w:p>
+        </w:tc>
+        <w:tc>
+          <w:tcPr>
+            <w:tcW w:type="dxa" w:w="3008"/>
+            <w:tcBorders>
+              <w:top w:val="single" w:color="808080" w:sz="4"/>
+              <w:left w:val="single" w:color="808080" w:sz="4"/>
+              <w:bottom w:val="single" w:color="808080" w:sz="4"/>
+              <w:right w:val="single" w:color="808080" w:sz="4"/>
+            </w:tcBorders>
+            <w:tcMar>
+              <w:top w:type="dxa" w:w="40"/>
+              <w:left w:type="dxa" w:w="80"/>
+              <w:bottom w:type="dxa" w:w="40"/>
+              <w:right w:type="dxa" w:w="80"/>
+            </w:tcMar>
+          </w:tcPr>
+          <w:p>
+            <w:pPr>
+              <w:spacing w:after="0"/>
+            </w:pPr>
+            <w:r>
+              <w:rPr>
+                <w:rFonts w:ascii="Times New Roman" w:cs="Times New Roman" w:eastAsia="Times New Roman" w:hAnsi="Times New Roman"/>
+                <w:sz w:val="20"/>
+                <w:szCs w:val="20"/>
+              </w:rPr>
+              <w:t xml:space="preserve">First batch rejected by order.ak during evaluation</w:t>
+            </w:r>
+          </w:p>
+        </w:tc>
+        <w:tc>
+          <w:tcPr>
+            <w:tcW w:type="dxa" w:w="3010"/>
+            <w:tcBorders>
+              <w:top w:val="single" w:color="808080" w:sz="4"/>
+              <w:left w:val="single" w:color="808080" w:sz="4"/>
+              <w:bottom w:val="single" w:color="808080" w:sz="4"/>
+              <w:right w:val="single" w:color="808080" w:sz="4"/>
+            </w:tcBorders>
+            <w:tcMar>
+              <w:top w:type="dxa" w:w="40"/>
+              <w:left w:type="dxa" w:w="80"/>
+              <w:bottom w:type="dxa" w:w="40"/>
+              <w:right w:type="dxa" w:w="80"/>
+            </w:tcMar>
+          </w:tcPr>
+          <w:p>
+            <w:pPr>
+              <w:spacing w:after="0"/>
+            </w:pPr>
+            <w:r>
+              <w:rPr>
+                <w:rFonts w:ascii="Times New Roman" w:cs="Times New Roman" w:eastAsia="Times New Roman" w:hAnsi="Times New Roman"/>
+                <w:sz w:val="20"/>
+                <w:szCs w:val="20"/>
+              </w:rPr>
+              <w:t xml:space="preserve">Two-pass build; fake chain enforcing the fee rule during evaluation</w:t>
             </w:r>
           </w:p>
         </w:tc>
@@ -44443,21 +44707,13 @@
           <w:b/>
           <w:bCs/>
         </w:rPr>
-        <w:t xml:space="preserve">The DEX is deployed on the Cardano preprod test network.</w:t>
-      </w:r>
-      <w:r>
-        <w:rPr>
-          <w:rFonts w:ascii="Times New Roman" w:cs="Times New Roman" w:eastAsia="Times New Roman" w:hAnsi="Times New Roman"/>
-        </w:rPr>
-        <w:t xml:space="preserve"> The deployment transaction was included on 15 September 2026, and the pool was verified on chain against the deployment record. Each submission is made only with the team’s explicit approval. </w:t>
-      </w:r>
-      <w:r>
-        <w:rPr>
-          <w:rFonts w:ascii="Times New Roman" w:cs="Times New Roman" w:eastAsia="Times New Roman" w:hAnsi="Times New Roman"/>
-          <w:highlight w:val="yellow"/>
-          <w:highlightCs w:val="yellow"/>
-        </w:rPr>
-        <w:t xml:space="preserve">PENDING: end-to-end swap transaction hash (T-O6) and the D4 estimator calibration</w:t>
+        <w:t xml:space="preserve">The DEX is deployed on the Cardano preprod test network and has settled its first end-to-end swap (T-O6).</w:t>
+      </w:r>
+      <w:r>
+        <w:rPr>
+          <w:rFonts w:ascii="Times New Roman" w:cs="Times New Roman" w:eastAsia="Times New Roman" w:hAnsi="Times New Roman"/>
+        </w:rPr>
+        <w:t xml:space="preserve"> A user order was placed from a separate key, the live batcher running P2 found it on chain, submitted a batch, held the pool lock until inclusion, and stopped cleanly; the result was verified on chain. Every submission was made only with the team’s explicit approval. The D4 calibration rests on this single one-order batch and is reported as a first measurement, not a calibration.</w:t>
       </w:r>
     </w:p>
     <w:p>
@@ -45041,18 +45297,6 @@
     </w:p>
     <w:p>
       <w:pPr>
-        <w:spacing w:after="120" w:line="336"/>
-        <w:jc w:val="both"/>
-      </w:pPr>
-      <w:r>
-        <w:rPr>
-          <w:rFonts w:ascii="Times New Roman" w:cs="Times New Roman" w:eastAsia="Times New Roman" w:hAnsi="Times New Roman"/>
-        </w:rPr>
-        <w:t xml:space="preserve">The demonstration is scripted as five steps, each a dry run until explicitly submitted: deploy the pool and mint its NFT; run the batcher in shadow mode to confirm its decisions on live chain state; place an order from a separate user key; run the batcher live until that order settles; and compare estimated with actual transaction size and execution units from the D4 log.</w:t>
-      </w:r>
-    </w:p>
-    <w:p>
-      <w:pPr>
         <w:keepNext/>
         <w:spacing w:after="200" w:before="60"/>
         <w:jc w:val="center"/>
@@ -45066,6 +45310,706 @@
           <w:szCs w:val="22"/>
         </w:rPr>
         <w:t xml:space="preserve">Table 8.18: </w:t>
+      </w:r>
+      <w:r>
+        <w:rPr>
+          <w:rFonts w:ascii="Times New Roman" w:cs="Times New Roman" w:eastAsia="Times New Roman" w:hAnsi="Times New Roman"/>
+          <w:i/>
+          <w:iCs/>
+          <w:sz w:val="22"/>
+          <w:szCs w:val="22"/>
+        </w:rPr>
+        <w:t xml:space="preserve">The first end-to-end swap on preprod, verified on chain</w:t>
+      </w:r>
+    </w:p>
+    <w:tbl>
+      <w:tblPr>
+        <w:tblW w:type="dxa" w:w="9026"/>
+        <w:tblBorders>
+          <w:top w:val="single" w:color="auto" w:sz="4"/>
+          <w:left w:val="single" w:color="auto" w:sz="4"/>
+          <w:bottom w:val="single" w:color="auto" w:sz="4"/>
+          <w:right w:val="single" w:color="auto" w:sz="4"/>
+          <w:insideH w:val="single" w:color="auto" w:sz="4"/>
+          <w:insideV w:val="single" w:color="auto" w:sz="4"/>
+        </w:tblBorders>
+      </w:tblPr>
+      <w:tblGrid>
+        <w:gridCol w:w="2607"/>
+        <w:gridCol w:w="6419"/>
+      </w:tblGrid>
+      <w:tr>
+        <w:trPr>
+          <w:tblHeader/>
+        </w:trPr>
+        <w:tc>
+          <w:tcPr>
+            <w:tcW w:type="dxa" w:w="2607"/>
+            <w:tcBorders>
+              <w:top w:val="single" w:color="808080" w:sz="4"/>
+              <w:left w:val="single" w:color="808080" w:sz="4"/>
+              <w:bottom w:val="single" w:color="808080" w:sz="4"/>
+              <w:right w:val="single" w:color="808080" w:sz="4"/>
+            </w:tcBorders>
+            <w:shd w:fill="D9E2F3" w:color="auto" w:val="clear"/>
+            <w:tcMar>
+              <w:top w:type="dxa" w:w="40"/>
+              <w:left w:type="dxa" w:w="80"/>
+              <w:bottom w:type="dxa" w:w="40"/>
+              <w:right w:type="dxa" w:w="80"/>
+            </w:tcMar>
+          </w:tcPr>
+          <w:p>
+            <w:pPr>
+              <w:spacing w:after="0"/>
+            </w:pPr>
+            <w:r>
+              <w:rPr>
+                <w:rFonts w:ascii="Times New Roman" w:cs="Times New Roman" w:eastAsia="Times New Roman" w:hAnsi="Times New Roman"/>
+                <w:b/>
+                <w:bCs/>
+                <w:sz w:val="20"/>
+                <w:szCs w:val="20"/>
+              </w:rPr>
+              <w:t xml:space="preserve">Item</w:t>
+            </w:r>
+          </w:p>
+        </w:tc>
+        <w:tc>
+          <w:tcPr>
+            <w:tcW w:type="dxa" w:w="6419"/>
+            <w:tcBorders>
+              <w:top w:val="single" w:color="808080" w:sz="4"/>
+              <w:left w:val="single" w:color="808080" w:sz="4"/>
+              <w:bottom w:val="single" w:color="808080" w:sz="4"/>
+              <w:right w:val="single" w:color="808080" w:sz="4"/>
+            </w:tcBorders>
+            <w:shd w:fill="D9E2F3" w:color="auto" w:val="clear"/>
+            <w:tcMar>
+              <w:top w:type="dxa" w:w="40"/>
+              <w:left w:type="dxa" w:w="80"/>
+              <w:bottom w:type="dxa" w:w="40"/>
+              <w:right w:type="dxa" w:w="80"/>
+            </w:tcMar>
+          </w:tcPr>
+          <w:p>
+            <w:pPr>
+              <w:spacing w:after="0"/>
+            </w:pPr>
+            <w:r>
+              <w:rPr>
+                <w:rFonts w:ascii="Times New Roman" w:cs="Times New Roman" w:eastAsia="Times New Roman" w:hAnsi="Times New Roman"/>
+                <w:b/>
+                <w:bCs/>
+                <w:sz w:val="20"/>
+                <w:szCs w:val="20"/>
+              </w:rPr>
+              <w:t xml:space="preserve">Value</w:t>
+            </w:r>
+          </w:p>
+        </w:tc>
+      </w:tr>
+      <w:tr>
+        <w:tc>
+          <w:tcPr>
+            <w:tcW w:type="dxa" w:w="2607"/>
+            <w:tcBorders>
+              <w:top w:val="single" w:color="808080" w:sz="4"/>
+              <w:left w:val="single" w:color="808080" w:sz="4"/>
+              <w:bottom w:val="single" w:color="808080" w:sz="4"/>
+              <w:right w:val="single" w:color="808080" w:sz="4"/>
+            </w:tcBorders>
+            <w:tcMar>
+              <w:top w:type="dxa" w:w="40"/>
+              <w:left w:type="dxa" w:w="80"/>
+              <w:bottom w:type="dxa" w:w="40"/>
+              <w:right w:type="dxa" w:w="80"/>
+            </w:tcMar>
+          </w:tcPr>
+          <w:p>
+            <w:pPr>
+              <w:spacing w:after="0"/>
+            </w:pPr>
+            <w:r>
+              <w:rPr>
+                <w:rFonts w:ascii="Times New Roman" w:cs="Times New Roman" w:eastAsia="Times New Roman" w:hAnsi="Times New Roman"/>
+                <w:sz w:val="20"/>
+                <w:szCs w:val="20"/>
+              </w:rPr>
+              <w:t xml:space="preserve">Order transaction</w:t>
+            </w:r>
+          </w:p>
+        </w:tc>
+        <w:tc>
+          <w:tcPr>
+            <w:tcW w:type="dxa" w:w="6419"/>
+            <w:tcBorders>
+              <w:top w:val="single" w:color="808080" w:sz="4"/>
+              <w:left w:val="single" w:color="808080" w:sz="4"/>
+              <w:bottom w:val="single" w:color="808080" w:sz="4"/>
+              <w:right w:val="single" w:color="808080" w:sz="4"/>
+            </w:tcBorders>
+            <w:tcMar>
+              <w:top w:type="dxa" w:w="40"/>
+              <w:left w:type="dxa" w:w="80"/>
+              <w:bottom w:type="dxa" w:w="40"/>
+              <w:right w:type="dxa" w:w="80"/>
+            </w:tcMar>
+          </w:tcPr>
+          <w:p>
+            <w:pPr>
+              <w:spacing w:after="0"/>
+            </w:pPr>
+            <w:r>
+              <w:rPr>
+                <w:rFonts w:ascii="Consolas" w:cs="Consolas" w:eastAsia="Consolas" w:hAnsi="Consolas"/>
+                <w:sz w:val="20"/>
+                <w:szCs w:val="20"/>
+              </w:rPr>
+              <w:t xml:space="preserve">6ffd8101fa74be32c6729f255b7f29e5f6b11edab050d3fc0f07c220a525ac41</w:t>
+            </w:r>
+          </w:p>
+        </w:tc>
+      </w:tr>
+      <w:tr>
+        <w:tc>
+          <w:tcPr>
+            <w:tcW w:type="dxa" w:w="2607"/>
+            <w:tcBorders>
+              <w:top w:val="single" w:color="808080" w:sz="4"/>
+              <w:left w:val="single" w:color="808080" w:sz="4"/>
+              <w:bottom w:val="single" w:color="808080" w:sz="4"/>
+              <w:right w:val="single" w:color="808080" w:sz="4"/>
+            </w:tcBorders>
+            <w:tcMar>
+              <w:top w:type="dxa" w:w="40"/>
+              <w:left w:type="dxa" w:w="80"/>
+              <w:bottom w:type="dxa" w:w="40"/>
+              <w:right w:type="dxa" w:w="80"/>
+            </w:tcMar>
+          </w:tcPr>
+          <w:p>
+            <w:pPr>
+              <w:spacing w:after="0"/>
+            </w:pPr>
+            <w:r>
+              <w:rPr>
+                <w:rFonts w:ascii="Times New Roman" w:cs="Times New Roman" w:eastAsia="Times New Roman" w:hAnsi="Times New Roman"/>
+                <w:sz w:val="20"/>
+                <w:szCs w:val="20"/>
+              </w:rPr>
+              <w:t xml:space="preserve">Order</w:t>
+            </w:r>
+          </w:p>
+        </w:tc>
+        <w:tc>
+          <w:tcPr>
+            <w:tcW w:type="dxa" w:w="6419"/>
+            <w:tcBorders>
+              <w:top w:val="single" w:color="808080" w:sz="4"/>
+              <w:left w:val="single" w:color="808080" w:sz="4"/>
+              <w:bottom w:val="single" w:color="808080" w:sz="4"/>
+              <w:right w:val="single" w:color="808080" w:sz="4"/>
+            </w:tcBorders>
+            <w:tcMar>
+              <w:top w:type="dxa" w:w="40"/>
+              <w:left w:type="dxa" w:w="80"/>
+              <w:bottom w:type="dxa" w:w="40"/>
+              <w:right w:type="dxa" w:w="80"/>
+            </w:tcMar>
+          </w:tcPr>
+          <w:p>
+            <w:pPr>
+              <w:spacing w:after="0"/>
+            </w:pPr>
+            <w:r>
+              <w:rPr>
+                <w:rFonts w:ascii="Times New Roman" w:cs="Times New Roman" w:eastAsia="Times New Roman" w:hAnsi="Times New Roman"/>
+                <w:sz w:val="20"/>
+                <w:szCs w:val="20"/>
+              </w:rPr>
+              <w:t xml:space="preserve">Sell 10 tADA for at least 85,000 TEAM11; margin 1 tADA; 15 tADA locked</w:t>
+            </w:r>
+          </w:p>
+        </w:tc>
+      </w:tr>
+      <w:tr>
+        <w:tc>
+          <w:tcPr>
+            <w:tcW w:type="dxa" w:w="2607"/>
+            <w:tcBorders>
+              <w:top w:val="single" w:color="808080" w:sz="4"/>
+              <w:left w:val="single" w:color="808080" w:sz="4"/>
+              <w:bottom w:val="single" w:color="808080" w:sz="4"/>
+              <w:right w:val="single" w:color="808080" w:sz="4"/>
+            </w:tcBorders>
+            <w:tcMar>
+              <w:top w:type="dxa" w:w="40"/>
+              <w:left w:type="dxa" w:w="80"/>
+              <w:bottom w:type="dxa" w:w="40"/>
+              <w:right w:type="dxa" w:w="80"/>
+            </w:tcMar>
+          </w:tcPr>
+          <w:p>
+            <w:pPr>
+              <w:spacing w:after="0"/>
+            </w:pPr>
+            <w:r>
+              <w:rPr>
+                <w:rFonts w:ascii="Times New Roman" w:cs="Times New Roman" w:eastAsia="Times New Roman" w:hAnsi="Times New Roman"/>
+                <w:sz w:val="20"/>
+                <w:szCs w:val="20"/>
+              </w:rPr>
+              <w:t xml:space="preserve">Batch transaction</w:t>
+            </w:r>
+          </w:p>
+        </w:tc>
+        <w:tc>
+          <w:tcPr>
+            <w:tcW w:type="dxa" w:w="6419"/>
+            <w:tcBorders>
+              <w:top w:val="single" w:color="808080" w:sz="4"/>
+              <w:left w:val="single" w:color="808080" w:sz="4"/>
+              <w:bottom w:val="single" w:color="808080" w:sz="4"/>
+              <w:right w:val="single" w:color="808080" w:sz="4"/>
+            </w:tcBorders>
+            <w:tcMar>
+              <w:top w:type="dxa" w:w="40"/>
+              <w:left w:type="dxa" w:w="80"/>
+              <w:bottom w:type="dxa" w:w="40"/>
+              <w:right w:type="dxa" w:w="80"/>
+            </w:tcMar>
+          </w:tcPr>
+          <w:p>
+            <w:pPr>
+              <w:spacing w:after="0"/>
+            </w:pPr>
+            <w:r>
+              <w:rPr>
+                <w:rFonts w:ascii="Consolas" w:cs="Consolas" w:eastAsia="Consolas" w:hAnsi="Consolas"/>
+                <w:sz w:val="20"/>
+                <w:szCs w:val="20"/>
+              </w:rPr>
+              <w:t xml:space="preserve">b5201c0a0843f5e258a7c9d9dba4b9b7cb66f88f1c0810baa2e6ad7337c73af1</w:t>
+            </w:r>
+          </w:p>
+        </w:tc>
+      </w:tr>
+      <w:tr>
+        <w:tc>
+          <w:tcPr>
+            <w:tcW w:type="dxa" w:w="2607"/>
+            <w:tcBorders>
+              <w:top w:val="single" w:color="808080" w:sz="4"/>
+              <w:left w:val="single" w:color="808080" w:sz="4"/>
+              <w:bottom w:val="single" w:color="808080" w:sz="4"/>
+              <w:right w:val="single" w:color="808080" w:sz="4"/>
+            </w:tcBorders>
+            <w:tcMar>
+              <w:top w:type="dxa" w:w="40"/>
+              <w:left w:type="dxa" w:w="80"/>
+              <w:bottom w:type="dxa" w:w="40"/>
+              <w:right w:type="dxa" w:w="80"/>
+            </w:tcMar>
+          </w:tcPr>
+          <w:p>
+            <w:pPr>
+              <w:spacing w:after="0"/>
+            </w:pPr>
+            <w:r>
+              <w:rPr>
+                <w:rFonts w:ascii="Times New Roman" w:cs="Times New Roman" w:eastAsia="Times New Roman" w:hAnsi="Times New Roman"/>
+                <w:sz w:val="20"/>
+                <w:szCs w:val="20"/>
+              </w:rPr>
+              <w:t xml:space="preserve">Submitted → included</w:t>
+            </w:r>
+          </w:p>
+        </w:tc>
+        <w:tc>
+          <w:tcPr>
+            <w:tcW w:type="dxa" w:w="6419"/>
+            <w:tcBorders>
+              <w:top w:val="single" w:color="808080" w:sz="4"/>
+              <w:left w:val="single" w:color="808080" w:sz="4"/>
+              <w:bottom w:val="single" w:color="808080" w:sz="4"/>
+              <w:right w:val="single" w:color="808080" w:sz="4"/>
+            </w:tcBorders>
+            <w:tcMar>
+              <w:top w:type="dxa" w:w="40"/>
+              <w:left w:type="dxa" w:w="80"/>
+              <w:bottom w:type="dxa" w:w="40"/>
+              <w:right w:type="dxa" w:w="80"/>
+            </w:tcMar>
+          </w:tcPr>
+          <w:p>
+            <w:pPr>
+              <w:spacing w:after="0"/>
+            </w:pPr>
+            <w:r>
+              <w:rPr>
+                <w:rFonts w:ascii="Times New Roman" w:cs="Times New Roman" w:eastAsia="Times New Roman" w:hAnsi="Times New Roman"/>
+                <w:sz w:val="20"/>
+                <w:szCs w:val="20"/>
+              </w:rPr>
+              <w:t xml:space="preserve">slot 133,785,075 → slot 133,785,125 (block 5,179,501): 50 slots with the pool locked</w:t>
+            </w:r>
+          </w:p>
+        </w:tc>
+      </w:tr>
+      <w:tr>
+        <w:tc>
+          <w:tcPr>
+            <w:tcW w:type="dxa" w:w="2607"/>
+            <w:tcBorders>
+              <w:top w:val="single" w:color="808080" w:sz="4"/>
+              <w:left w:val="single" w:color="808080" w:sz="4"/>
+              <w:bottom w:val="single" w:color="808080" w:sz="4"/>
+              <w:right w:val="single" w:color="808080" w:sz="4"/>
+            </w:tcBorders>
+            <w:tcMar>
+              <w:top w:type="dxa" w:w="40"/>
+              <w:left w:type="dxa" w:w="80"/>
+              <w:bottom w:type="dxa" w:w="40"/>
+              <w:right w:type="dxa" w:w="80"/>
+            </w:tcMar>
+          </w:tcPr>
+          <w:p>
+            <w:pPr>
+              <w:spacing w:after="0"/>
+            </w:pPr>
+            <w:r>
+              <w:rPr>
+                <w:rFonts w:ascii="Times New Roman" w:cs="Times New Roman" w:eastAsia="Times New Roman" w:hAnsi="Times New Roman"/>
+                <w:sz w:val="20"/>
+                <w:szCs w:val="20"/>
+              </w:rPr>
+              <w:t xml:space="preserve">Network fee</w:t>
+            </w:r>
+          </w:p>
+        </w:tc>
+        <w:tc>
+          <w:tcPr>
+            <w:tcW w:type="dxa" w:w="6419"/>
+            <w:tcBorders>
+              <w:top w:val="single" w:color="808080" w:sz="4"/>
+              <w:left w:val="single" w:color="808080" w:sz="4"/>
+              <w:bottom w:val="single" w:color="808080" w:sz="4"/>
+              <w:right w:val="single" w:color="808080" w:sz="4"/>
+            </w:tcBorders>
+            <w:tcMar>
+              <w:top w:type="dxa" w:w="40"/>
+              <w:left w:type="dxa" w:w="80"/>
+              <w:bottom w:type="dxa" w:w="40"/>
+              <w:right w:type="dxa" w:w="80"/>
+            </w:tcMar>
+          </w:tcPr>
+          <w:p>
+            <w:pPr>
+              <w:spacing w:after="0"/>
+            </w:pPr>
+            <w:r>
+              <w:rPr>
+                <w:rFonts w:ascii="Times New Roman" w:cs="Times New Roman" w:eastAsia="Times New Roman" w:hAnsi="Times New Roman"/>
+                <w:sz w:val="20"/>
+                <w:szCs w:val="20"/>
+              </w:rPr>
+              <w:t xml:space="preserve">322,697 lovelace, 2,681 bytes</w:t>
+            </w:r>
+          </w:p>
+        </w:tc>
+      </w:tr>
+      <w:tr>
+        <w:tc>
+          <w:tcPr>
+            <w:tcW w:type="dxa" w:w="2607"/>
+            <w:tcBorders>
+              <w:top w:val="single" w:color="808080" w:sz="4"/>
+              <w:left w:val="single" w:color="808080" w:sz="4"/>
+              <w:bottom w:val="single" w:color="808080" w:sz="4"/>
+              <w:right w:val="single" w:color="808080" w:sz="4"/>
+            </w:tcBorders>
+            <w:tcMar>
+              <w:top w:type="dxa" w:w="40"/>
+              <w:left w:type="dxa" w:w="80"/>
+              <w:bottom w:type="dxa" w:w="40"/>
+              <w:right w:type="dxa" w:w="80"/>
+            </w:tcMar>
+          </w:tcPr>
+          <w:p>
+            <w:pPr>
+              <w:spacing w:after="0"/>
+            </w:pPr>
+            <w:r>
+              <w:rPr>
+                <w:rFonts w:ascii="Times New Roman" w:cs="Times New Roman" w:eastAsia="Times New Roman" w:hAnsi="Times New Roman"/>
+                <w:sz w:val="20"/>
+                <w:szCs w:val="20"/>
+              </w:rPr>
+              <w:t xml:space="preserve">User received</w:t>
+            </w:r>
+          </w:p>
+        </w:tc>
+        <w:tc>
+          <w:tcPr>
+            <w:tcW w:type="dxa" w:w="6419"/>
+            <w:tcBorders>
+              <w:top w:val="single" w:color="808080" w:sz="4"/>
+              <w:left w:val="single" w:color="808080" w:sz="4"/>
+              <w:bottom w:val="single" w:color="808080" w:sz="4"/>
+              <w:right w:val="single" w:color="808080" w:sz="4"/>
+            </w:tcBorders>
+            <w:tcMar>
+              <w:top w:type="dxa" w:w="40"/>
+              <w:left w:type="dxa" w:w="80"/>
+              <w:bottom w:type="dxa" w:w="40"/>
+              <w:right w:type="dxa" w:w="80"/>
+            </w:tcMar>
+          </w:tcPr>
+          <w:p>
+            <w:pPr>
+              <w:spacing w:after="0"/>
+            </w:pPr>
+            <w:r>
+              <w:rPr>
+                <w:rFonts w:ascii="Times New Roman" w:cs="Times New Roman" w:eastAsia="Times New Roman" w:hAnsi="Times New Roman"/>
+                <w:sz w:val="20"/>
+                <w:szCs w:val="20"/>
+              </w:rPr>
+              <w:t xml:space="preserve">90,661 TEAM11 and 3.679758 tADA, in an output tagged with the order’s reference</w:t>
+            </w:r>
+          </w:p>
+        </w:tc>
+      </w:tr>
+      <w:tr>
+        <w:tc>
+          <w:tcPr>
+            <w:tcW w:type="dxa" w:w="2607"/>
+            <w:tcBorders>
+              <w:top w:val="single" w:color="808080" w:sz="4"/>
+              <w:left w:val="single" w:color="808080" w:sz="4"/>
+              <w:bottom w:val="single" w:color="808080" w:sz="4"/>
+              <w:right w:val="single" w:color="808080" w:sz="4"/>
+            </w:tcBorders>
+            <w:tcMar>
+              <w:top w:type="dxa" w:w="40"/>
+              <w:left w:type="dxa" w:w="80"/>
+              <w:bottom w:type="dxa" w:w="40"/>
+              <w:right w:type="dxa" w:w="80"/>
+            </w:tcMar>
+          </w:tcPr>
+          <w:p>
+            <w:pPr>
+              <w:spacing w:after="0"/>
+            </w:pPr>
+            <w:r>
+              <w:rPr>
+                <w:rFonts w:ascii="Times New Roman" w:cs="Times New Roman" w:eastAsia="Times New Roman" w:hAnsi="Times New Roman"/>
+                <w:sz w:val="20"/>
+                <w:szCs w:val="20"/>
+              </w:rPr>
+              <w:t xml:space="preserve">User’s charge</w:t>
+            </w:r>
+          </w:p>
+        </w:tc>
+        <w:tc>
+          <w:tcPr>
+            <w:tcW w:type="dxa" w:w="6419"/>
+            <w:tcBorders>
+              <w:top w:val="single" w:color="808080" w:sz="4"/>
+              <w:left w:val="single" w:color="808080" w:sz="4"/>
+              <w:bottom w:val="single" w:color="808080" w:sz="4"/>
+              <w:right w:val="single" w:color="808080" w:sz="4"/>
+            </w:tcBorders>
+            <w:tcMar>
+              <w:top w:type="dxa" w:w="40"/>
+              <w:left w:type="dxa" w:w="80"/>
+              <w:bottom w:type="dxa" w:w="40"/>
+              <w:right w:type="dxa" w:w="80"/>
+            </w:tcMar>
+          </w:tcPr>
+          <w:p>
+            <w:pPr>
+              <w:spacing w:after="0"/>
+            </w:pPr>
+            <w:r>
+              <w:rPr>
+                <w:rFonts w:ascii="Times New Roman" w:cs="Times New Roman" w:eastAsia="Times New Roman" w:hAnsi="Times New Roman"/>
+                <w:sz w:val="20"/>
+                <w:szCs w:val="20"/>
+              </w:rPr>
+              <w:t xml:space="preserve">1 tADA margin + 0.320242 tADA fee share (n = 1) — at or below the 322,697-lovelace fee the transaction carries, as </w:t>
+            </w:r>
+            <w:r>
+              <w:rPr>
+                <w:rFonts w:ascii="Consolas" w:cs="Consolas" w:eastAsia="Consolas" w:hAnsi="Consolas"/>
+                <w:sz w:val="20"/>
+                <w:szCs w:val="20"/>
+              </w:rPr>
+              <w:t xml:space="preserve">order.ak</w:t>
+            </w:r>
+            <w:r>
+              <w:rPr>
+                <w:rFonts w:ascii="Times New Roman" w:cs="Times New Roman" w:eastAsia="Times New Roman" w:hAnsi="Times New Roman"/>
+                <w:sz w:val="20"/>
+                <w:szCs w:val="20"/>
+              </w:rPr>
+              <w:t xml:space="preserve"> requires</w:t>
+            </w:r>
+          </w:p>
+        </w:tc>
+      </w:tr>
+      <w:tr>
+        <w:tc>
+          <w:tcPr>
+            <w:tcW w:type="dxa" w:w="2607"/>
+            <w:tcBorders>
+              <w:top w:val="single" w:color="808080" w:sz="4"/>
+              <w:left w:val="single" w:color="808080" w:sz="4"/>
+              <w:bottom w:val="single" w:color="808080" w:sz="4"/>
+              <w:right w:val="single" w:color="808080" w:sz="4"/>
+            </w:tcBorders>
+            <w:tcMar>
+              <w:top w:type="dxa" w:w="40"/>
+              <w:left w:type="dxa" w:w="80"/>
+              <w:bottom w:type="dxa" w:w="40"/>
+              <w:right w:type="dxa" w:w="80"/>
+            </w:tcMar>
+          </w:tcPr>
+          <w:p>
+            <w:pPr>
+              <w:spacing w:after="0"/>
+            </w:pPr>
+            <w:r>
+              <w:rPr>
+                <w:rFonts w:ascii="Times New Roman" w:cs="Times New Roman" w:eastAsia="Times New Roman" w:hAnsi="Times New Roman"/>
+                <w:sz w:val="20"/>
+                <w:szCs w:val="20"/>
+              </w:rPr>
+              <w:t xml:space="preserve">Pool after</w:t>
+            </w:r>
+          </w:p>
+        </w:tc>
+        <w:tc>
+          <w:tcPr>
+            <w:tcW w:type="dxa" w:w="6419"/>
+            <w:tcBorders>
+              <w:top w:val="single" w:color="808080" w:sz="4"/>
+              <w:left w:val="single" w:color="808080" w:sz="4"/>
+              <w:bottom w:val="single" w:color="808080" w:sz="4"/>
+              <w:right w:val="single" w:color="808080" w:sz="4"/>
+            </w:tcBorders>
+            <w:tcMar>
+              <w:top w:type="dxa" w:w="40"/>
+              <w:left w:type="dxa" w:w="80"/>
+              <w:bottom w:type="dxa" w:w="40"/>
+              <w:right w:type="dxa" w:w="80"/>
+            </w:tcMar>
+          </w:tcPr>
+          <w:p>
+            <w:pPr>
+              <w:spacing w:after="0"/>
+            </w:pPr>
+            <w:r>
+              <w:rPr>
+                <w:rFonts w:ascii="Times New Roman" w:cs="Times New Roman" w:eastAsia="Times New Roman" w:hAnsi="Times New Roman"/>
+                <w:sz w:val="20"/>
+                <w:szCs w:val="20"/>
+              </w:rPr>
+              <w:t xml:space="preserve">110 tADA and 909,339 TEAM11, NFT carried; no orders left at the order script</w:t>
+            </w:r>
+          </w:p>
+        </w:tc>
+      </w:tr>
+    </w:tbl>
+    <w:p>
+      <w:pPr>
+        <w:spacing w:after="160"/>
+      </w:pPr>
+    </w:p>
+    <w:p>
+      <w:pPr>
+        <w:spacing w:after="120" w:line="336"/>
+        <w:jc w:val="both"/>
+      </w:pPr>
+      <w:r>
+        <w:rPr>
+          <w:rFonts w:ascii="Times New Roman" w:cs="Times New Roman" w:eastAsia="Times New Roman" w:hAnsi="Times New Roman"/>
+          <w:b/>
+          <w:bCs/>
+        </w:rPr>
+        <w:t xml:space="preserve">The first live batch then found a second defect</w:t>
+      </w:r>
+      <w:r>
+        <w:rPr>
+          <w:rFonts w:ascii="Times New Roman" w:cs="Times New Roman" w:eastAsia="Times New Roman" w:hAnsi="Times New Roman"/>
+        </w:rPr>
+        <w:t xml:space="preserve"> — and the order validator caught it. The batch was planned with the estimator’s fee of 406,931 lovelace, but the real fee was 320,242; users were therefore overcharged, and </w:t>
+      </w:r>
+      <w:r>
+        <w:rPr>
+          <w:rFonts w:ascii="Consolas" w:cs="Consolas" w:eastAsia="Consolas" w:hAnsi="Consolas"/>
+          <w:sz w:val="20"/>
+          <w:szCs w:val="20"/>
+        </w:rPr>
+        <w:t xml:space="preserve">order.ak</w:t>
+      </w:r>
+      <w:r>
+        <w:rPr>
+          <w:rFonts w:ascii="Times New Roman" w:cs="Times New Roman" w:eastAsia="Times New Roman" w:hAnsi="Times New Roman"/>
+        </w:rPr>
+        <w:t xml:space="preserve"> refused the transaction during the node’s script evaluation. The fee-settling loop of Section 6.12 could not recover, because evaluation happens </w:t>
+      </w:r>
+      <w:r>
+        <w:rPr>
+          <w:rFonts w:ascii="Times New Roman" w:cs="Times New Roman" w:eastAsia="Times New Roman" w:hAnsi="Times New Roman"/>
+          <w:i/>
+          <w:iCs/>
+        </w:rPr>
+        <w:t xml:space="preserve">inside</w:t>
+      </w:r>
+      <w:r>
+        <w:rPr>
+          <w:rFonts w:ascii="Times New Roman" w:cs="Times New Roman" w:eastAsia="Times New Roman" w:hAnsi="Times New Roman"/>
+        </w:rPr>
+        <w:t xml:space="preserve"> the build, before any fee is known. Nothing was submitted: the order stayed safely at its script. The builder now works in two passes — a probe charging margins only, which is valid at any fee, to obtain execution units, then a final build with those units fixed and users charged for the real fee — and the daemon logs a failed build instead of stopping. A fake chain that enforces the fee rule during evaluation reproduces the failure and pins the fix. </w:t>
+      </w:r>
+      <w:r>
+        <w:rPr>
+          <w:rFonts w:ascii="Times New Roman" w:cs="Times New Roman" w:eastAsia="Times New Roman" w:hAnsi="Times New Roman"/>
+          <w:b/>
+          <w:bCs/>
+        </w:rPr>
+        <w:t xml:space="preserve">The validator doing exactly its job against the project’s own batcher is the clearest evidence in the report that the batcher is untrusted for correctness by design.</w:t>
+      </w:r>
+    </w:p>
+    <w:p>
+      <w:pPr>
+        <w:spacing w:after="120" w:line="336"/>
+        <w:jc w:val="both"/>
+      </w:pPr>
+      <w:r>
+        <w:rPr>
+          <w:rFonts w:ascii="Times New Roman" w:cs="Times New Roman" w:eastAsia="Times New Roman" w:hAnsi="Times New Roman"/>
+        </w:rPr>
+        <w:t xml:space="preserve">The demonstration is scripted as five steps, each a dry run until explicitly submitted: deploy the pool and mint its NFT; run the batcher in shadow mode to confirm its decisions on live chain state; place an order from a separate user key; run the batcher live until that order settles; and compare estimated with actual transaction size and execution units from the D4 log.</w:t>
+      </w:r>
+    </w:p>
+    <w:p>
+      <w:pPr>
+        <w:keepNext/>
+        <w:spacing w:after="200" w:before="60"/>
+        <w:jc w:val="center"/>
+      </w:pPr>
+      <w:r>
+        <w:rPr>
+          <w:rFonts w:ascii="Times New Roman" w:cs="Times New Roman" w:eastAsia="Times New Roman" w:hAnsi="Times New Roman"/>
+          <w:b/>
+          <w:bCs/>
+          <w:sz w:val="22"/>
+          <w:szCs w:val="22"/>
+        </w:rPr>
+        <w:t xml:space="preserve">Table 8.19: </w:t>
       </w:r>
       <w:r>
         <w:rPr>
@@ -45283,10 +46227,8 @@
                 <w:rFonts w:ascii="Times New Roman" w:cs="Times New Roman" w:eastAsia="Times New Roman" w:hAnsi="Times New Roman"/>
                 <w:sz w:val="20"/>
                 <w:szCs w:val="20"/>
-                <w:highlight w:val="yellow"/>
-                <w:highlightCs w:val="yellow"/>
-              </w:rPr>
-              <w:t xml:space="preserve">PENDING</w:t>
+              </w:rPr>
+              <w:t xml:space="preserve">Pass</w:t>
             </w:r>
           </w:p>
         </w:tc>
@@ -45347,10 +46289,8 @@
                 <w:rFonts w:ascii="Times New Roman" w:cs="Times New Roman" w:eastAsia="Times New Roman" w:hAnsi="Times New Roman"/>
                 <w:sz w:val="20"/>
                 <w:szCs w:val="20"/>
-                <w:highlight w:val="yellow"/>
-                <w:highlightCs w:val="yellow"/>
-              </w:rPr>
-              <w:t xml:space="preserve">PENDING</w:t>
+              </w:rPr>
+              <w:t xml:space="preserve">Not met on the one sample — see the calibration table below</w:t>
             </w:r>
           </w:p>
         </w:tc>
@@ -45419,10 +46359,8 @@
                 <w:rFonts w:ascii="Times New Roman" w:cs="Times New Roman" w:eastAsia="Times New Roman" w:hAnsi="Times New Roman"/>
                 <w:sz w:val="20"/>
                 <w:szCs w:val="20"/>
-                <w:highlight w:val="yellow"/>
-                <w:highlightCs w:val="yellow"/>
-              </w:rPr>
-              <w:t xml:space="preserve">PENDING</w:t>
+              </w:rPr>
+              <w:t xml:space="preserve">Not yet — needs multi-order batches</w:t>
             </w:r>
           </w:p>
         </w:tc>
@@ -45432,40 +46370,6 @@
       <w:pPr>
         <w:spacing w:after="160"/>
       </w:pPr>
-    </w:p>
-    <w:p>
-      <w:pPr>
-        <w:spacing w:after="120" w:line="336"/>
-        <w:jc w:val="both"/>
-      </w:pPr>
-      <w:r>
-        <w:rPr>
-          <w:rFonts w:ascii="Times New Roman" w:cs="Times New Roman" w:eastAsia="Times New Roman" w:hAnsi="Times New Roman"/>
-        </w:rPr>
-        <w:t xml:space="preserve">Two outcomes of the calibration can be anticipated. The fee replay (V4) already found the fee formula under-estimating script-bearing transactions by a median of 29 %, and a DEX batch is script-bearing. And ADR-006 recorded a cost of its own design: computing </w:t>
-      </w:r>
-      <w:r>
-        <w:rPr>
-          <w:rFonts w:ascii="Consolas" w:cs="Consolas" w:eastAsia="Consolas" w:hAnsi="Consolas"/>
-          <w:sz w:val="20"/>
-          <w:szCs w:val="20"/>
-        </w:rPr>
-        <w:t xml:space="preserve">fee / n</w:t>
-      </w:r>
-      <w:r>
-        <w:rPr>
-          <w:rFonts w:ascii="Times New Roman" w:cs="Times New Roman" w:eastAsia="Times New Roman" w:hAnsi="Times New Roman"/>
-        </w:rPr>
-        <w:t xml:space="preserve"> on chain consumes execution units, which slightly lowers the Gate A cap. Both will be measured rather than assumed, and the per-order estimates used throughout the simulator revised if they fall outside tolerance.</w:t>
-      </w:r>
-    </w:p>
-    <w:p>
-      <w:pPr>
-        <w:pStyle w:val="Heading2"/>
-      </w:pPr>
-      <w:r>
-        <w:t xml:space="preserve">8.13 Threats to Validity</w:t>
-      </w:r>
     </w:p>
     <w:p>
       <w:pPr>
@@ -45481,7 +46385,773 @@
           <w:sz w:val="22"/>
           <w:szCs w:val="22"/>
         </w:rPr>
-        <w:t xml:space="preserve">Table 8.19: </w:t>
+        <w:t xml:space="preserve">Table 8.20: </w:t>
+      </w:r>
+      <w:r>
+        <w:rPr>
+          <w:rFonts w:ascii="Times New Roman" w:cs="Times New Roman" w:eastAsia="Times New Roman" w:hAnsi="Times New Roman"/>
+          <w:i/>
+          <w:iCs/>
+          <w:sz w:val="22"/>
+          <w:szCs w:val="22"/>
+        </w:rPr>
+        <w:t xml:space="preserve">First estimator calibration against D4 — one batch, n = 1</w:t>
+      </w:r>
+    </w:p>
+    <w:tbl>
+      <w:tblPr>
+        <w:tblW w:type="dxa" w:w="9026"/>
+        <w:tblBorders>
+          <w:top w:val="single" w:color="auto" w:sz="4"/>
+          <w:left w:val="single" w:color="auto" w:sz="4"/>
+          <w:bottom w:val="single" w:color="auto" w:sz="4"/>
+          <w:right w:val="single" w:color="auto" w:sz="4"/>
+          <w:insideH w:val="single" w:color="auto" w:sz="4"/>
+          <w:insideV w:val="single" w:color="auto" w:sz="4"/>
+        </w:tblBorders>
+      </w:tblPr>
+      <w:tblGrid>
+        <w:gridCol w:w="2406"/>
+        <w:gridCol w:w="2206"/>
+        <w:gridCol w:w="2206"/>
+        <w:gridCol w:w="2208"/>
+      </w:tblGrid>
+      <w:tr>
+        <w:trPr>
+          <w:tblHeader/>
+        </w:trPr>
+        <w:tc>
+          <w:tcPr>
+            <w:tcW w:type="dxa" w:w="2406"/>
+            <w:tcBorders>
+              <w:top w:val="single" w:color="808080" w:sz="4"/>
+              <w:left w:val="single" w:color="808080" w:sz="4"/>
+              <w:bottom w:val="single" w:color="808080" w:sz="4"/>
+              <w:right w:val="single" w:color="808080" w:sz="4"/>
+            </w:tcBorders>
+            <w:shd w:fill="D9E2F3" w:color="auto" w:val="clear"/>
+            <w:tcMar>
+              <w:top w:type="dxa" w:w="40"/>
+              <w:left w:type="dxa" w:w="80"/>
+              <w:bottom w:type="dxa" w:w="40"/>
+              <w:right w:type="dxa" w:w="80"/>
+            </w:tcMar>
+          </w:tcPr>
+          <w:p>
+            <w:pPr>
+              <w:spacing w:after="0"/>
+            </w:pPr>
+            <w:r>
+              <w:rPr>
+                <w:rFonts w:ascii="Times New Roman" w:cs="Times New Roman" w:eastAsia="Times New Roman" w:hAnsi="Times New Roman"/>
+                <w:b/>
+                <w:bCs/>
+                <w:sz w:val="20"/>
+                <w:szCs w:val="20"/>
+              </w:rPr>
+              <w:t xml:space="preserve">Quantity</w:t>
+            </w:r>
+          </w:p>
+        </w:tc>
+        <w:tc>
+          <w:tcPr>
+            <w:tcW w:type="dxa" w:w="2206"/>
+            <w:tcBorders>
+              <w:top w:val="single" w:color="808080" w:sz="4"/>
+              <w:left w:val="single" w:color="808080" w:sz="4"/>
+              <w:bottom w:val="single" w:color="808080" w:sz="4"/>
+              <w:right w:val="single" w:color="808080" w:sz="4"/>
+            </w:tcBorders>
+            <w:shd w:fill="D9E2F3" w:color="auto" w:val="clear"/>
+            <w:tcMar>
+              <w:top w:type="dxa" w:w="40"/>
+              <w:left w:type="dxa" w:w="80"/>
+              <w:bottom w:type="dxa" w:w="40"/>
+              <w:right w:type="dxa" w:w="80"/>
+            </w:tcMar>
+          </w:tcPr>
+          <w:p>
+            <w:pPr>
+              <w:spacing w:after="0"/>
+            </w:pPr>
+            <w:r>
+              <w:rPr>
+                <w:rFonts w:ascii="Times New Roman" w:cs="Times New Roman" w:eastAsia="Times New Roman" w:hAnsi="Times New Roman"/>
+                <w:b/>
+                <w:bCs/>
+                <w:sz w:val="20"/>
+                <w:szCs w:val="20"/>
+              </w:rPr>
+              <w:t xml:space="preserve">Estimated</w:t>
+            </w:r>
+          </w:p>
+        </w:tc>
+        <w:tc>
+          <w:tcPr>
+            <w:tcW w:type="dxa" w:w="2206"/>
+            <w:tcBorders>
+              <w:top w:val="single" w:color="808080" w:sz="4"/>
+              <w:left w:val="single" w:color="808080" w:sz="4"/>
+              <w:bottom w:val="single" w:color="808080" w:sz="4"/>
+              <w:right w:val="single" w:color="808080" w:sz="4"/>
+            </w:tcBorders>
+            <w:shd w:fill="D9E2F3" w:color="auto" w:val="clear"/>
+            <w:tcMar>
+              <w:top w:type="dxa" w:w="40"/>
+              <w:left w:type="dxa" w:w="80"/>
+              <w:bottom w:type="dxa" w:w="40"/>
+              <w:right w:type="dxa" w:w="80"/>
+            </w:tcMar>
+          </w:tcPr>
+          <w:p>
+            <w:pPr>
+              <w:spacing w:after="0"/>
+            </w:pPr>
+            <w:r>
+              <w:rPr>
+                <w:rFonts w:ascii="Times New Roman" w:cs="Times New Roman" w:eastAsia="Times New Roman" w:hAnsi="Times New Roman"/>
+                <w:b/>
+                <w:bCs/>
+                <w:sz w:val="20"/>
+                <w:szCs w:val="20"/>
+              </w:rPr>
+              <w:t xml:space="preserve">Actual</w:t>
+            </w:r>
+          </w:p>
+        </w:tc>
+        <w:tc>
+          <w:tcPr>
+            <w:tcW w:type="dxa" w:w="2208"/>
+            <w:tcBorders>
+              <w:top w:val="single" w:color="808080" w:sz="4"/>
+              <w:left w:val="single" w:color="808080" w:sz="4"/>
+              <w:bottom w:val="single" w:color="808080" w:sz="4"/>
+              <w:right w:val="single" w:color="808080" w:sz="4"/>
+            </w:tcBorders>
+            <w:shd w:fill="D9E2F3" w:color="auto" w:val="clear"/>
+            <w:tcMar>
+              <w:top w:type="dxa" w:w="40"/>
+              <w:left w:type="dxa" w:w="80"/>
+              <w:bottom w:type="dxa" w:w="40"/>
+              <w:right w:type="dxa" w:w="80"/>
+            </w:tcMar>
+          </w:tcPr>
+          <w:p>
+            <w:pPr>
+              <w:spacing w:after="0"/>
+            </w:pPr>
+            <w:r>
+              <w:rPr>
+                <w:rFonts w:ascii="Times New Roman" w:cs="Times New Roman" w:eastAsia="Times New Roman" w:hAnsi="Times New Roman"/>
+                <w:b/>
+                <w:bCs/>
+                <w:sz w:val="20"/>
+                <w:szCs w:val="20"/>
+              </w:rPr>
+              <w:t xml:space="preserve">Error</w:t>
+            </w:r>
+          </w:p>
+        </w:tc>
+      </w:tr>
+      <w:tr>
+        <w:tc>
+          <w:tcPr>
+            <w:tcW w:type="dxa" w:w="2406"/>
+            <w:tcBorders>
+              <w:top w:val="single" w:color="808080" w:sz="4"/>
+              <w:left w:val="single" w:color="808080" w:sz="4"/>
+              <w:bottom w:val="single" w:color="808080" w:sz="4"/>
+              <w:right w:val="single" w:color="808080" w:sz="4"/>
+            </w:tcBorders>
+            <w:tcMar>
+              <w:top w:type="dxa" w:w="40"/>
+              <w:left w:type="dxa" w:w="80"/>
+              <w:bottom w:type="dxa" w:w="40"/>
+              <w:right w:type="dxa" w:w="80"/>
+            </w:tcMar>
+          </w:tcPr>
+          <w:p>
+            <w:pPr>
+              <w:spacing w:after="0"/>
+            </w:pPr>
+            <w:r>
+              <w:rPr>
+                <w:rFonts w:ascii="Times New Roman" w:cs="Times New Roman" w:eastAsia="Times New Roman" w:hAnsi="Times New Roman"/>
+                <w:sz w:val="20"/>
+                <w:szCs w:val="20"/>
+              </w:rPr>
+              <w:t xml:space="preserve">Transaction size</w:t>
+            </w:r>
+          </w:p>
+        </w:tc>
+        <w:tc>
+          <w:tcPr>
+            <w:tcW w:type="dxa" w:w="2206"/>
+            <w:tcBorders>
+              <w:top w:val="single" w:color="808080" w:sz="4"/>
+              <w:left w:val="single" w:color="808080" w:sz="4"/>
+              <w:bottom w:val="single" w:color="808080" w:sz="4"/>
+              <w:right w:val="single" w:color="808080" w:sz="4"/>
+            </w:tcBorders>
+            <w:tcMar>
+              <w:top w:type="dxa" w:w="40"/>
+              <w:left w:type="dxa" w:w="80"/>
+              <w:bottom w:type="dxa" w:w="40"/>
+              <w:right w:type="dxa" w:w="80"/>
+            </w:tcMar>
+          </w:tcPr>
+          <w:p>
+            <w:pPr>
+              <w:spacing w:after="0"/>
+            </w:pPr>
+            <w:r>
+              <w:rPr>
+                <w:rFonts w:ascii="Times New Roman" w:cs="Times New Roman" w:eastAsia="Times New Roman" w:hAnsi="Times New Roman"/>
+                <w:sz w:val="20"/>
+                <w:szCs w:val="20"/>
+              </w:rPr>
+              <w:t xml:space="preserve">800 B</w:t>
+            </w:r>
+          </w:p>
+        </w:tc>
+        <w:tc>
+          <w:tcPr>
+            <w:tcW w:type="dxa" w:w="2206"/>
+            <w:tcBorders>
+              <w:top w:val="single" w:color="808080" w:sz="4"/>
+              <w:left w:val="single" w:color="808080" w:sz="4"/>
+              <w:bottom w:val="single" w:color="808080" w:sz="4"/>
+              <w:right w:val="single" w:color="808080" w:sz="4"/>
+            </w:tcBorders>
+            <w:tcMar>
+              <w:top w:type="dxa" w:w="40"/>
+              <w:left w:type="dxa" w:w="80"/>
+              <w:bottom w:type="dxa" w:w="40"/>
+              <w:right w:type="dxa" w:w="80"/>
+            </w:tcMar>
+          </w:tcPr>
+          <w:p>
+            <w:pPr>
+              <w:spacing w:after="0"/>
+            </w:pPr>
+            <w:r>
+              <w:rPr>
+                <w:rFonts w:ascii="Times New Roman" w:cs="Times New Roman" w:eastAsia="Times New Roman" w:hAnsi="Times New Roman"/>
+                <w:sz w:val="20"/>
+                <w:szCs w:val="20"/>
+              </w:rPr>
+              <w:t xml:space="preserve">2,682 B</w:t>
+            </w:r>
+          </w:p>
+        </w:tc>
+        <w:tc>
+          <w:tcPr>
+            <w:tcW w:type="dxa" w:w="2208"/>
+            <w:tcBorders>
+              <w:top w:val="single" w:color="808080" w:sz="4"/>
+              <w:left w:val="single" w:color="808080" w:sz="4"/>
+              <w:bottom w:val="single" w:color="808080" w:sz="4"/>
+              <w:right w:val="single" w:color="808080" w:sz="4"/>
+            </w:tcBorders>
+            <w:tcMar>
+              <w:top w:type="dxa" w:w="40"/>
+              <w:left w:type="dxa" w:w="80"/>
+              <w:bottom w:type="dxa" w:w="40"/>
+              <w:right w:type="dxa" w:w="80"/>
+            </w:tcMar>
+          </w:tcPr>
+          <w:p>
+            <w:pPr>
+              <w:spacing w:after="0"/>
+            </w:pPr>
+            <w:r>
+              <w:rPr>
+                <w:rFonts w:ascii="Times New Roman" w:cs="Times New Roman" w:eastAsia="Times New Roman" w:hAnsi="Times New Roman"/>
+                <w:sz w:val="20"/>
+                <w:szCs w:val="20"/>
+              </w:rPr>
+              <w:t xml:space="preserve">actual 3.4× the estimate</w:t>
+            </w:r>
+          </w:p>
+        </w:tc>
+      </w:tr>
+      <w:tr>
+        <w:tc>
+          <w:tcPr>
+            <w:tcW w:type="dxa" w:w="2406"/>
+            <w:tcBorders>
+              <w:top w:val="single" w:color="808080" w:sz="4"/>
+              <w:left w:val="single" w:color="808080" w:sz="4"/>
+              <w:bottom w:val="single" w:color="808080" w:sz="4"/>
+              <w:right w:val="single" w:color="808080" w:sz="4"/>
+            </w:tcBorders>
+            <w:tcMar>
+              <w:top w:type="dxa" w:w="40"/>
+              <w:left w:type="dxa" w:w="80"/>
+              <w:bottom w:type="dxa" w:w="40"/>
+              <w:right w:type="dxa" w:w="80"/>
+            </w:tcMar>
+          </w:tcPr>
+          <w:p>
+            <w:pPr>
+              <w:spacing w:after="0"/>
+            </w:pPr>
+            <w:r>
+              <w:rPr>
+                <w:rFonts w:ascii="Times New Roman" w:cs="Times New Roman" w:eastAsia="Times New Roman" w:hAnsi="Times New Roman"/>
+                <w:sz w:val="20"/>
+                <w:szCs w:val="20"/>
+              </w:rPr>
+              <w:t xml:space="preserve">Execution memory</w:t>
+            </w:r>
+          </w:p>
+        </w:tc>
+        <w:tc>
+          <w:tcPr>
+            <w:tcW w:type="dxa" w:w="2206"/>
+            <w:tcBorders>
+              <w:top w:val="single" w:color="808080" w:sz="4"/>
+              <w:left w:val="single" w:color="808080" w:sz="4"/>
+              <w:bottom w:val="single" w:color="808080" w:sz="4"/>
+              <w:right w:val="single" w:color="808080" w:sz="4"/>
+            </w:tcBorders>
+            <w:tcMar>
+              <w:top w:type="dxa" w:w="40"/>
+              <w:left w:type="dxa" w:w="80"/>
+              <w:bottom w:type="dxa" w:w="40"/>
+              <w:right w:type="dxa" w:w="80"/>
+            </w:tcMar>
+          </w:tcPr>
+          <w:p>
+            <w:pPr>
+              <w:spacing w:after="0"/>
+            </w:pPr>
+            <w:r>
+              <w:rPr>
+                <w:rFonts w:ascii="Times New Roman" w:cs="Times New Roman" w:eastAsia="Times New Roman" w:hAnsi="Times New Roman"/>
+                <w:sz w:val="20"/>
+                <w:szCs w:val="20"/>
+              </w:rPr>
+              <w:t xml:space="preserve">2,500,000</w:t>
+            </w:r>
+          </w:p>
+        </w:tc>
+        <w:tc>
+          <w:tcPr>
+            <w:tcW w:type="dxa" w:w="2206"/>
+            <w:tcBorders>
+              <w:top w:val="single" w:color="808080" w:sz="4"/>
+              <w:left w:val="single" w:color="808080" w:sz="4"/>
+              <w:bottom w:val="single" w:color="808080" w:sz="4"/>
+              <w:right w:val="single" w:color="808080" w:sz="4"/>
+            </w:tcBorders>
+            <w:tcMar>
+              <w:top w:type="dxa" w:w="40"/>
+              <w:left w:type="dxa" w:w="80"/>
+              <w:bottom w:type="dxa" w:w="40"/>
+              <w:right w:type="dxa" w:w="80"/>
+            </w:tcMar>
+          </w:tcPr>
+          <w:p>
+            <w:pPr>
+              <w:spacing w:after="0"/>
+            </w:pPr>
+            <w:r>
+              <w:rPr>
+                <w:rFonts w:ascii="Times New Roman" w:cs="Times New Roman" w:eastAsia="Times New Roman" w:hAnsi="Times New Roman"/>
+                <w:sz w:val="20"/>
+                <w:szCs w:val="20"/>
+              </w:rPr>
+              <w:t xml:space="preserve">473,756</w:t>
+            </w:r>
+          </w:p>
+        </w:tc>
+        <w:tc>
+          <w:tcPr>
+            <w:tcW w:type="dxa" w:w="2208"/>
+            <w:tcBorders>
+              <w:top w:val="single" w:color="808080" w:sz="4"/>
+              <w:left w:val="single" w:color="808080" w:sz="4"/>
+              <w:bottom w:val="single" w:color="808080" w:sz="4"/>
+              <w:right w:val="single" w:color="808080" w:sz="4"/>
+            </w:tcBorders>
+            <w:tcMar>
+              <w:top w:type="dxa" w:w="40"/>
+              <w:left w:type="dxa" w:w="80"/>
+              <w:bottom w:type="dxa" w:w="40"/>
+              <w:right w:type="dxa" w:w="80"/>
+            </w:tcMar>
+          </w:tcPr>
+          <w:p>
+            <w:pPr>
+              <w:spacing w:after="0"/>
+            </w:pPr>
+            <w:r>
+              <w:rPr>
+                <w:rFonts w:ascii="Times New Roman" w:cs="Times New Roman" w:eastAsia="Times New Roman" w:hAnsi="Times New Roman"/>
+                <w:sz w:val="20"/>
+                <w:szCs w:val="20"/>
+              </w:rPr>
+              <w:t xml:space="preserve">estimate 5.3× the actual</w:t>
+            </w:r>
+          </w:p>
+        </w:tc>
+      </w:tr>
+      <w:tr>
+        <w:tc>
+          <w:tcPr>
+            <w:tcW w:type="dxa" w:w="2406"/>
+            <w:tcBorders>
+              <w:top w:val="single" w:color="808080" w:sz="4"/>
+              <w:left w:val="single" w:color="808080" w:sz="4"/>
+              <w:bottom w:val="single" w:color="808080" w:sz="4"/>
+              <w:right w:val="single" w:color="808080" w:sz="4"/>
+            </w:tcBorders>
+            <w:tcMar>
+              <w:top w:type="dxa" w:w="40"/>
+              <w:left w:type="dxa" w:w="80"/>
+              <w:bottom w:type="dxa" w:w="40"/>
+              <w:right w:type="dxa" w:w="80"/>
+            </w:tcMar>
+          </w:tcPr>
+          <w:p>
+            <w:pPr>
+              <w:spacing w:after="0"/>
+            </w:pPr>
+            <w:r>
+              <w:rPr>
+                <w:rFonts w:ascii="Times New Roman" w:cs="Times New Roman" w:eastAsia="Times New Roman" w:hAnsi="Times New Roman"/>
+                <w:sz w:val="20"/>
+                <w:szCs w:val="20"/>
+              </w:rPr>
+              <w:t xml:space="preserve">Execution steps</w:t>
+            </w:r>
+          </w:p>
+        </w:tc>
+        <w:tc>
+          <w:tcPr>
+            <w:tcW w:type="dxa" w:w="2206"/>
+            <w:tcBorders>
+              <w:top w:val="single" w:color="808080" w:sz="4"/>
+              <w:left w:val="single" w:color="808080" w:sz="4"/>
+              <w:bottom w:val="single" w:color="808080" w:sz="4"/>
+              <w:right w:val="single" w:color="808080" w:sz="4"/>
+            </w:tcBorders>
+            <w:tcMar>
+              <w:top w:type="dxa" w:w="40"/>
+              <w:left w:type="dxa" w:w="80"/>
+              <w:bottom w:type="dxa" w:w="40"/>
+              <w:right w:type="dxa" w:w="80"/>
+            </w:tcMar>
+          </w:tcPr>
+          <w:p>
+            <w:pPr>
+              <w:spacing w:after="0"/>
+            </w:pPr>
+            <w:r>
+              <w:rPr>
+                <w:rFonts w:ascii="Times New Roman" w:cs="Times New Roman" w:eastAsia="Times New Roman" w:hAnsi="Times New Roman"/>
+                <w:sz w:val="20"/>
+                <w:szCs w:val="20"/>
+              </w:rPr>
+              <w:t xml:space="preserve">1,000,000,000</w:t>
+            </w:r>
+          </w:p>
+        </w:tc>
+        <w:tc>
+          <w:tcPr>
+            <w:tcW w:type="dxa" w:w="2206"/>
+            <w:tcBorders>
+              <w:top w:val="single" w:color="808080" w:sz="4"/>
+              <w:left w:val="single" w:color="808080" w:sz="4"/>
+              <w:bottom w:val="single" w:color="808080" w:sz="4"/>
+              <w:right w:val="single" w:color="808080" w:sz="4"/>
+            </w:tcBorders>
+            <w:tcMar>
+              <w:top w:type="dxa" w:w="40"/>
+              <w:left w:type="dxa" w:w="80"/>
+              <w:bottom w:type="dxa" w:w="40"/>
+              <w:right w:type="dxa" w:w="80"/>
+            </w:tcMar>
+          </w:tcPr>
+          <w:p>
+            <w:pPr>
+              <w:spacing w:after="0"/>
+            </w:pPr>
+            <w:r>
+              <w:rPr>
+                <w:rFonts w:ascii="Times New Roman" w:cs="Times New Roman" w:eastAsia="Times New Roman" w:hAnsi="Times New Roman"/>
+                <w:sz w:val="20"/>
+                <w:szCs w:val="20"/>
+              </w:rPr>
+              <w:t xml:space="preserve">166,037,580</w:t>
+            </w:r>
+          </w:p>
+        </w:tc>
+        <w:tc>
+          <w:tcPr>
+            <w:tcW w:type="dxa" w:w="2208"/>
+            <w:tcBorders>
+              <w:top w:val="single" w:color="808080" w:sz="4"/>
+              <w:left w:val="single" w:color="808080" w:sz="4"/>
+              <w:bottom w:val="single" w:color="808080" w:sz="4"/>
+              <w:right w:val="single" w:color="808080" w:sz="4"/>
+            </w:tcBorders>
+            <w:tcMar>
+              <w:top w:type="dxa" w:w="40"/>
+              <w:left w:type="dxa" w:w="80"/>
+              <w:bottom w:type="dxa" w:w="40"/>
+              <w:right w:type="dxa" w:w="80"/>
+            </w:tcMar>
+          </w:tcPr>
+          <w:p>
+            <w:pPr>
+              <w:spacing w:after="0"/>
+            </w:pPr>
+            <w:r>
+              <w:rPr>
+                <w:rFonts w:ascii="Times New Roman" w:cs="Times New Roman" w:eastAsia="Times New Roman" w:hAnsi="Times New Roman"/>
+                <w:sz w:val="20"/>
+                <w:szCs w:val="20"/>
+              </w:rPr>
+              <w:t xml:space="preserve">estimate 6.0× the actual</w:t>
+            </w:r>
+          </w:p>
+        </w:tc>
+      </w:tr>
+      <w:tr>
+        <w:tc>
+          <w:tcPr>
+            <w:tcW w:type="dxa" w:w="2406"/>
+            <w:tcBorders>
+              <w:top w:val="single" w:color="808080" w:sz="4"/>
+              <w:left w:val="single" w:color="808080" w:sz="4"/>
+              <w:bottom w:val="single" w:color="808080" w:sz="4"/>
+              <w:right w:val="single" w:color="808080" w:sz="4"/>
+            </w:tcBorders>
+            <w:tcMar>
+              <w:top w:type="dxa" w:w="40"/>
+              <w:left w:type="dxa" w:w="80"/>
+              <w:bottom w:type="dxa" w:w="40"/>
+              <w:right w:type="dxa" w:w="80"/>
+            </w:tcMar>
+          </w:tcPr>
+          <w:p>
+            <w:pPr>
+              <w:spacing w:after="0"/>
+            </w:pPr>
+            <w:r>
+              <w:rPr>
+                <w:rFonts w:ascii="Times New Roman" w:cs="Times New Roman" w:eastAsia="Times New Roman" w:hAnsi="Times New Roman"/>
+                <w:sz w:val="20"/>
+                <w:szCs w:val="20"/>
+              </w:rPr>
+              <w:t xml:space="preserve">Network fee</w:t>
+            </w:r>
+          </w:p>
+        </w:tc>
+        <w:tc>
+          <w:tcPr>
+            <w:tcW w:type="dxa" w:w="2206"/>
+            <w:tcBorders>
+              <w:top w:val="single" w:color="808080" w:sz="4"/>
+              <w:left w:val="single" w:color="808080" w:sz="4"/>
+              <w:bottom w:val="single" w:color="808080" w:sz="4"/>
+              <w:right w:val="single" w:color="808080" w:sz="4"/>
+            </w:tcBorders>
+            <w:tcMar>
+              <w:top w:type="dxa" w:w="40"/>
+              <w:left w:type="dxa" w:w="80"/>
+              <w:bottom w:type="dxa" w:w="40"/>
+              <w:right w:type="dxa" w:w="80"/>
+            </w:tcMar>
+          </w:tcPr>
+          <w:p>
+            <w:pPr>
+              <w:spacing w:after="0"/>
+            </w:pPr>
+            <w:r>
+              <w:rPr>
+                <w:rFonts w:ascii="Times New Roman" w:cs="Times New Roman" w:eastAsia="Times New Roman" w:hAnsi="Times New Roman"/>
+                <w:sz w:val="20"/>
+                <w:szCs w:val="20"/>
+              </w:rPr>
+              <w:t xml:space="preserve">406,931 lovelace</w:t>
+            </w:r>
+          </w:p>
+        </w:tc>
+        <w:tc>
+          <w:tcPr>
+            <w:tcW w:type="dxa" w:w="2206"/>
+            <w:tcBorders>
+              <w:top w:val="single" w:color="808080" w:sz="4"/>
+              <w:left w:val="single" w:color="808080" w:sz="4"/>
+              <w:bottom w:val="single" w:color="808080" w:sz="4"/>
+              <w:right w:val="single" w:color="808080" w:sz="4"/>
+            </w:tcBorders>
+            <w:tcMar>
+              <w:top w:type="dxa" w:w="40"/>
+              <w:left w:type="dxa" w:w="80"/>
+              <w:bottom w:type="dxa" w:w="40"/>
+              <w:right w:type="dxa" w:w="80"/>
+            </w:tcMar>
+          </w:tcPr>
+          <w:p>
+            <w:pPr>
+              <w:spacing w:after="0"/>
+            </w:pPr>
+            <w:r>
+              <w:rPr>
+                <w:rFonts w:ascii="Times New Roman" w:cs="Times New Roman" w:eastAsia="Times New Roman" w:hAnsi="Times New Roman"/>
+                <w:sz w:val="20"/>
+                <w:szCs w:val="20"/>
+              </w:rPr>
+              <w:t xml:space="preserve">322,697 lovelace</w:t>
+            </w:r>
+          </w:p>
+        </w:tc>
+        <w:tc>
+          <w:tcPr>
+            <w:tcW w:type="dxa" w:w="2208"/>
+            <w:tcBorders>
+              <w:top w:val="single" w:color="808080" w:sz="4"/>
+              <w:left w:val="single" w:color="808080" w:sz="4"/>
+              <w:bottom w:val="single" w:color="808080" w:sz="4"/>
+              <w:right w:val="single" w:color="808080" w:sz="4"/>
+            </w:tcBorders>
+            <w:tcMar>
+              <w:top w:type="dxa" w:w="40"/>
+              <w:left w:type="dxa" w:w="80"/>
+              <w:bottom w:type="dxa" w:w="40"/>
+              <w:right w:type="dxa" w:w="80"/>
+            </w:tcMar>
+          </w:tcPr>
+          <w:p>
+            <w:pPr>
+              <w:spacing w:after="0"/>
+            </w:pPr>
+            <w:r>
+              <w:rPr>
+                <w:rFonts w:ascii="Times New Roman" w:cs="Times New Roman" w:eastAsia="Times New Roman" w:hAnsi="Times New Roman"/>
+                <w:sz w:val="20"/>
+                <w:szCs w:val="20"/>
+              </w:rPr>
+              <w:t xml:space="preserve">estimate 26 % high</w:t>
+            </w:r>
+          </w:p>
+        </w:tc>
+      </w:tr>
+    </w:tbl>
+    <w:p>
+      <w:pPr>
+        <w:spacing w:after="160"/>
+      </w:pPr>
+    </w:p>
+    <w:p>
+      <w:pPr>
+        <w:spacing w:after="120" w:line="336"/>
+        <w:jc w:val="both"/>
+      </w:pPr>
+      <w:r>
+        <w:rPr>
+          <w:rFonts w:ascii="Times New Roman" w:cs="Times New Roman" w:eastAsia="Times New Roman" w:hAnsi="Times New Roman"/>
+        </w:rPr>
+        <w:t xml:space="preserve">The ±5 % / ±10 % criterion is </w:t>
+      </w:r>
+      <w:r>
+        <w:rPr>
+          <w:rFonts w:ascii="Times New Roman" w:cs="Times New Roman" w:eastAsia="Times New Roman" w:hAnsi="Times New Roman"/>
+          <w:b/>
+          <w:bCs/>
+        </w:rPr>
+        <w:t xml:space="preserve">not met</w:t>
+      </w:r>
+      <w:r>
+        <w:rPr>
+          <w:rFonts w:ascii="Times New Roman" w:cs="Times New Roman" w:eastAsia="Times New Roman" w:hAnsi="Times New Roman"/>
+        </w:rPr>
+        <w:t xml:space="preserve">, and one one-order batch could not calibrate per-order costs even if it were — the flat and marginal components cannot be separated from a single </w:t>
+      </w:r>
+      <w:r>
+        <w:rPr>
+          <w:rFonts w:ascii="Consolas" w:cs="Consolas" w:eastAsia="Consolas" w:hAnsi="Consolas"/>
+          <w:sz w:val="20"/>
+          <w:szCs w:val="20"/>
+        </w:rPr>
+        <w:t xml:space="preserve">n</w:t>
+      </w:r>
+      <w:r>
+        <w:rPr>
+          <w:rFonts w:ascii="Times New Roman" w:cs="Times New Roman" w:eastAsia="Times New Roman" w:hAnsi="Times New Roman"/>
+        </w:rPr>
+        <w:t xml:space="preserve">. The direction of each error is nonetheless informative. </w:t>
+      </w:r>
+      <w:r>
+        <w:rPr>
+          <w:rFonts w:ascii="Times New Roman" w:cs="Times New Roman" w:eastAsia="Times New Roman" w:hAnsi="Times New Roman"/>
+          <w:b/>
+          <w:bCs/>
+        </w:rPr>
+        <w:t xml:space="preserve">Execution units are over-estimated about fivefold</w:t>
+      </w:r>
+      <w:r>
+        <w:rPr>
+          <w:rFonts w:ascii="Times New Roman" w:cs="Times New Roman" w:eastAsia="Times New Roman" w:hAnsi="Times New Roman"/>
+        </w:rPr>
+        <w:t xml:space="preserve">, the safe direction for Gate A: the simulator’s cap of 24 orders is conservative on memory, which ADR-006 had feared the on-chain </w:t>
+      </w:r>
+      <w:r>
+        <w:rPr>
+          <w:rFonts w:ascii="Consolas" w:cs="Consolas" w:eastAsia="Consolas" w:hAnsi="Consolas"/>
+          <w:sz w:val="20"/>
+          <w:szCs w:val="20"/>
+        </w:rPr>
+        <w:t xml:space="preserve">fee / n</w:t>
+      </w:r>
+      <w:r>
+        <w:rPr>
+          <w:rFonts w:ascii="Times New Roman" w:cs="Times New Roman" w:eastAsia="Times New Roman" w:hAnsi="Times New Roman"/>
+        </w:rPr>
+        <w:t xml:space="preserve"> computation would tighten. </w:t>
+      </w:r>
+      <w:r>
+        <w:rPr>
+          <w:rFonts w:ascii="Times New Roman" w:cs="Times New Roman" w:eastAsia="Times New Roman" w:hAnsi="Times New Roman"/>
+          <w:b/>
+          <w:bCs/>
+        </w:rPr>
+        <w:t xml:space="preserve">Size is under-estimated 3.4-fold</w:t>
+      </w:r>
+      <w:r>
+        <w:rPr>
+          <w:rFonts w:ascii="Times New Roman" w:cs="Times New Roman" w:eastAsia="Times New Roman" w:hAnsi="Times New Roman"/>
+        </w:rPr>
+        <w:t xml:space="preserve">, the unsafe direction — ablation A5 showed a 5 % size under-estimate already invalidates one heavy-rate batch in twelve. The cause is known: the estimator models order and pool bytes but not the roughly 1.8 KB of validator scripts attached to every batch, nor the batcher’s fee input and change output. Referencing the scripts from an on-chain UTxO instead of attaching them removes most of the gap, and multi-order live batches are then needed to fit the marginal cost per order. Until that is done, live batch sizes should be capped with the A5 safety margin.</w:t>
+      </w:r>
+    </w:p>
+    <w:p>
+      <w:pPr>
+        <w:pStyle w:val="Heading2"/>
+      </w:pPr>
+      <w:r>
+        <w:t xml:space="preserve">8.13 Threats to Validity</w:t>
+      </w:r>
+    </w:p>
+    <w:p>
+      <w:pPr>
+        <w:keepNext/>
+        <w:spacing w:after="200" w:before="60"/>
+        <w:jc w:val="center"/>
+      </w:pPr>
+      <w:r>
+        <w:rPr>
+          <w:rFonts w:ascii="Times New Roman" w:cs="Times New Roman" w:eastAsia="Times New Roman" w:hAnsi="Times New Roman"/>
+          <w:b/>
+          <w:bCs/>
+          <w:sz w:val="22"/>
+          <w:szCs w:val="22"/>
+        </w:rPr>
+        <w:t xml:space="preserve">Table 8.21: </w:t>
       </w:r>
       <w:r>
         <w:rPr>
@@ -47411,13 +49081,13 @@
           <w:b/>
           <w:bCs/>
         </w:rPr>
-        <w:t xml:space="preserve">The live demonstration is incomplete</w:t>
-      </w:r>
-      <w:r>
-        <w:rPr>
-          <w:rFonts w:ascii="Times New Roman" w:cs="Times New Roman" w:eastAsia="Times New Roman" w:hAnsi="Times New Roman"/>
-        </w:rPr>
-        <w:t xml:space="preserve"> — the DEX is deployed on preprod, but the end-to-end swap and the estimator calibration against D4 remain.</w:t>
+        <w:t xml:space="preserve">One live batch is not a calibration</w:t>
+      </w:r>
+      <w:r>
+        <w:rPr>
+          <w:rFonts w:ascii="Times New Roman" w:cs="Times New Roman" w:eastAsia="Times New Roman" w:hAnsi="Times New Roman"/>
+        </w:rPr>
+        <w:t xml:space="preserve"> — the end-to-end swap settled on preprod, but a single one-order batch cannot separate flat from per-order costs, and the estimator under-estimates transaction size 3.4-fold while scripts are attached inline.</w:t>
       </w:r>
     </w:p>
     <w:p>
@@ -47601,7 +49271,7 @@
         <w:rPr>
           <w:rFonts w:ascii="Times New Roman" w:cs="Times New Roman" w:eastAsia="Times New Roman" w:hAnsi="Times New Roman"/>
         </w:rPr>
-        <w:t xml:space="preserve">Deploy to preprod, settle the end-to-end swap, and calibrate the estimator from D4, folding in the reference-script fee term.</w:t>
+        <w:t xml:space="preserve">Calibrate the estimator from multi-order live batches on preprod, separating flat from per-order size and execution costs, and fold in the reference-script fee term.</w:t>
       </w:r>
     </w:p>
     <w:p>

</xml_diff>

<commit_message>
Add the presentation dashboard to the report
New section 6.14 describes the dashboard: its rule that every figure is recomputed from committed artefacts or read from the chain, a table of the four views and their sources of truth, the standard-library localhost-only server and its failure codes, and the dependency-free front end with its title sequence, motion and recorded palettes. New section 7.8 records the fourteen automated dashboard tests and the ten end-to-end demonstration scenarios with their results. Four dashboard defects join the defects table, the test counts in 7.1 are corrected to 356 tests in 27 files at 93.9 percent coverage, and the dashboard is listed among the contributions. The runbook and the TODO are updated to match, including the answer to open question Q3.
</commit_message>
<xml_diff>
--- a/docs/report/Team11_Project_Report_Draft.docx
+++ b/docs/report/Team11_Project_Report_Draft.docx
@@ -18799,6 +18799,688 @@
     </w:p>
     <w:p>
       <w:pPr>
+        <w:pStyle w:val="Heading2"/>
+      </w:pPr>
+      <w:r>
+        <w:t xml:space="preserve">6.14 The Presentation Dashboard</w:t>
+      </w:r>
+    </w:p>
+    <w:p>
+      <w:pPr>
+        <w:spacing w:after="120" w:line="336"/>
+        <w:jc w:val="both"/>
+      </w:pPr>
+      <w:r>
+        <w:rPr>
+          <w:rFonts w:ascii="Times New Roman" w:cs="Times New Roman" w:eastAsia="Times New Roman" w:hAnsi="Times New Roman"/>
+        </w:rPr>
+        <w:t xml:space="preserve">FR-15 asked for a local dashboard of the decision loop. </w:t>
+      </w:r>
+      <w:r>
+        <w:rPr>
+          <w:rFonts w:ascii="Consolas" w:cs="Consolas" w:eastAsia="Consolas" w:hAnsi="Consolas"/>
+          <w:sz w:val="20"/>
+          <w:szCs w:val="20"/>
+        </w:rPr>
+        <w:t xml:space="preserve">src/batcher/dashboard/</w:t>
+      </w:r>
+      <w:r>
+        <w:rPr>
+          <w:rFonts w:ascii="Times New Roman" w:cs="Times New Roman" w:eastAsia="Times New Roman" w:hAnsi="Times New Roman"/>
+        </w:rPr>
+        <w:t xml:space="preserve"> provides it as a small read-only web application, served by </w:t>
+      </w:r>
+      <w:r>
+        <w:rPr>
+          <w:rFonts w:ascii="Consolas" w:cs="Consolas" w:eastAsia="Consolas" w:hAnsi="Consolas"/>
+          <w:sz w:val="20"/>
+          <w:szCs w:val="20"/>
+        </w:rPr>
+        <w:t xml:space="preserve">scripts/dashboard.py</w:t>
+      </w:r>
+      <w:r>
+        <w:rPr>
+          <w:rFonts w:ascii="Times New Roman" w:cs="Times New Roman" w:eastAsia="Times New Roman" w:hAnsi="Times New Roman"/>
+        </w:rPr>
+        <w:t xml:space="preserve"> on the loopback interface. Its design rule is that </w:t>
+      </w:r>
+      <w:r>
+        <w:rPr>
+          <w:rFonts w:ascii="Times New Roman" w:cs="Times New Roman" w:eastAsia="Times New Roman" w:hAnsi="Times New Roman"/>
+          <w:b/>
+          <w:bCs/>
+        </w:rPr>
+        <w:t xml:space="preserve">the page stores no results of its own</w:t>
+      </w:r>
+      <w:r>
+        <w:rPr>
+          <w:rFonts w:ascii="Times New Roman" w:cs="Times New Roman" w:eastAsia="Times New Roman" w:hAnsi="Times New Roman"/>
+        </w:rPr>
+        <w:t xml:space="preserve">: every figure it shows is either recomputed at request time from the committed experiment artefacts, replayed through the simulator itself, or read from the chain. A number that changes in the repository therefore changes on the screen, and a number cannot be quietly edited into the presentation.</w:t>
+      </w:r>
+    </w:p>
+    <w:p>
+      <w:pPr>
+        <w:keepNext/>
+        <w:spacing w:after="200" w:before="60"/>
+        <w:jc w:val="center"/>
+      </w:pPr>
+      <w:r>
+        <w:rPr>
+          <w:rFonts w:ascii="Times New Roman" w:cs="Times New Roman" w:eastAsia="Times New Roman" w:hAnsi="Times New Roman"/>
+          <w:b/>
+          <w:bCs/>
+          <w:sz w:val="22"/>
+          <w:szCs w:val="22"/>
+        </w:rPr>
+        <w:t xml:space="preserve">Table 6.1: </w:t>
+      </w:r>
+      <w:r>
+        <w:rPr>
+          <w:rFonts w:ascii="Times New Roman" w:cs="Times New Roman" w:eastAsia="Times New Roman" w:hAnsi="Times New Roman"/>
+          <w:i/>
+          <w:iCs/>
+          <w:sz w:val="22"/>
+          <w:szCs w:val="22"/>
+        </w:rPr>
+        <w:t xml:space="preserve">What each view shows, and where its numbers come from</w:t>
+      </w:r>
+    </w:p>
+    <w:tbl>
+      <w:tblPr>
+        <w:tblW w:type="dxa" w:w="9026"/>
+        <w:tblBorders>
+          <w:top w:val="single" w:color="auto" w:sz="4"/>
+          <w:left w:val="single" w:color="auto" w:sz="4"/>
+          <w:bottom w:val="single" w:color="auto" w:sz="4"/>
+          <w:right w:val="single" w:color="auto" w:sz="4"/>
+          <w:insideH w:val="single" w:color="auto" w:sz="4"/>
+          <w:insideV w:val="single" w:color="auto" w:sz="4"/>
+        </w:tblBorders>
+      </w:tblPr>
+      <w:tblGrid>
+        <w:gridCol w:w="1504"/>
+        <w:gridCol w:w="4212"/>
+        <w:gridCol w:w="3310"/>
+      </w:tblGrid>
+      <w:tr>
+        <w:trPr>
+          <w:tblHeader/>
+        </w:trPr>
+        <w:tc>
+          <w:tcPr>
+            <w:tcW w:type="dxa" w:w="1504"/>
+            <w:tcBorders>
+              <w:top w:val="single" w:color="808080" w:sz="4"/>
+              <w:left w:val="single" w:color="808080" w:sz="4"/>
+              <w:bottom w:val="single" w:color="808080" w:sz="4"/>
+              <w:right w:val="single" w:color="808080" w:sz="4"/>
+            </w:tcBorders>
+            <w:shd w:fill="D9E2F3" w:color="auto" w:val="clear"/>
+            <w:tcMar>
+              <w:top w:type="dxa" w:w="40"/>
+              <w:left w:type="dxa" w:w="80"/>
+              <w:bottom w:type="dxa" w:w="40"/>
+              <w:right w:type="dxa" w:w="80"/>
+            </w:tcMar>
+          </w:tcPr>
+          <w:p>
+            <w:pPr>
+              <w:spacing w:after="0"/>
+            </w:pPr>
+            <w:r>
+              <w:rPr>
+                <w:rFonts w:ascii="Times New Roman" w:cs="Times New Roman" w:eastAsia="Times New Roman" w:hAnsi="Times New Roman"/>
+                <w:b/>
+                <w:bCs/>
+                <w:sz w:val="20"/>
+                <w:szCs w:val="20"/>
+              </w:rPr>
+              <w:t xml:space="preserve">View</w:t>
+            </w:r>
+          </w:p>
+        </w:tc>
+        <w:tc>
+          <w:tcPr>
+            <w:tcW w:type="dxa" w:w="4212"/>
+            <w:tcBorders>
+              <w:top w:val="single" w:color="808080" w:sz="4"/>
+              <w:left w:val="single" w:color="808080" w:sz="4"/>
+              <w:bottom w:val="single" w:color="808080" w:sz="4"/>
+              <w:right w:val="single" w:color="808080" w:sz="4"/>
+            </w:tcBorders>
+            <w:shd w:fill="D9E2F3" w:color="auto" w:val="clear"/>
+            <w:tcMar>
+              <w:top w:type="dxa" w:w="40"/>
+              <w:left w:type="dxa" w:w="80"/>
+              <w:bottom w:type="dxa" w:w="40"/>
+              <w:right w:type="dxa" w:w="80"/>
+            </w:tcMar>
+          </w:tcPr>
+          <w:p>
+            <w:pPr>
+              <w:spacing w:after="0"/>
+            </w:pPr>
+            <w:r>
+              <w:rPr>
+                <w:rFonts w:ascii="Times New Roman" w:cs="Times New Roman" w:eastAsia="Times New Roman" w:hAnsi="Times New Roman"/>
+                <w:b/>
+                <w:bCs/>
+                <w:sz w:val="20"/>
+                <w:szCs w:val="20"/>
+              </w:rPr>
+              <w:t xml:space="preserve">Shows</w:t>
+            </w:r>
+          </w:p>
+        </w:tc>
+        <w:tc>
+          <w:tcPr>
+            <w:tcW w:type="dxa" w:w="3310"/>
+            <w:tcBorders>
+              <w:top w:val="single" w:color="808080" w:sz="4"/>
+              <w:left w:val="single" w:color="808080" w:sz="4"/>
+              <w:bottom w:val="single" w:color="808080" w:sz="4"/>
+              <w:right w:val="single" w:color="808080" w:sz="4"/>
+            </w:tcBorders>
+            <w:shd w:fill="D9E2F3" w:color="auto" w:val="clear"/>
+            <w:tcMar>
+              <w:top w:type="dxa" w:w="40"/>
+              <w:left w:type="dxa" w:w="80"/>
+              <w:bottom w:type="dxa" w:w="40"/>
+              <w:right w:type="dxa" w:w="80"/>
+            </w:tcMar>
+          </w:tcPr>
+          <w:p>
+            <w:pPr>
+              <w:spacing w:after="0"/>
+            </w:pPr>
+            <w:r>
+              <w:rPr>
+                <w:rFonts w:ascii="Times New Roman" w:cs="Times New Roman" w:eastAsia="Times New Roman" w:hAnsi="Times New Roman"/>
+                <w:b/>
+                <w:bCs/>
+                <w:sz w:val="20"/>
+                <w:szCs w:val="20"/>
+              </w:rPr>
+              <w:t xml:space="preserve">Source of truth</w:t>
+            </w:r>
+          </w:p>
+        </w:tc>
+      </w:tr>
+      <w:tr>
+        <w:tc>
+          <w:tcPr>
+            <w:tcW w:type="dxa" w:w="1504"/>
+            <w:tcBorders>
+              <w:top w:val="single" w:color="808080" w:sz="4"/>
+              <w:left w:val="single" w:color="808080" w:sz="4"/>
+              <w:bottom w:val="single" w:color="808080" w:sz="4"/>
+              <w:right w:val="single" w:color="808080" w:sz="4"/>
+            </w:tcBorders>
+            <w:tcMar>
+              <w:top w:type="dxa" w:w="40"/>
+              <w:left w:type="dxa" w:w="80"/>
+              <w:bottom w:type="dxa" w:w="40"/>
+              <w:right w:type="dxa" w:w="80"/>
+            </w:tcMar>
+          </w:tcPr>
+          <w:p>
+            <w:pPr>
+              <w:spacing w:after="0"/>
+            </w:pPr>
+            <w:r>
+              <w:rPr>
+                <w:rFonts w:ascii="Times New Roman" w:cs="Times New Roman" w:eastAsia="Times New Roman" w:hAnsi="Times New Roman"/>
+                <w:sz w:val="20"/>
+                <w:szCs w:val="20"/>
+              </w:rPr>
+              <w:t xml:space="preserve">Overview</w:t>
+            </w:r>
+          </w:p>
+        </w:tc>
+        <w:tc>
+          <w:tcPr>
+            <w:tcW w:type="dxa" w:w="4212"/>
+            <w:tcBorders>
+              <w:top w:val="single" w:color="808080" w:sz="4"/>
+              <w:left w:val="single" w:color="808080" w:sz="4"/>
+              <w:bottom w:val="single" w:color="808080" w:sz="4"/>
+              <w:right w:val="single" w:color="808080" w:sz="4"/>
+            </w:tcBorders>
+            <w:tcMar>
+              <w:top w:type="dxa" w:w="40"/>
+              <w:left w:type="dxa" w:w="80"/>
+              <w:bottom w:type="dxa" w:w="40"/>
+              <w:right w:type="dxa" w:w="80"/>
+            </w:tcMar>
+          </w:tcPr>
+          <w:p>
+            <w:pPr>
+              <w:spacing w:after="0"/>
+            </w:pPr>
+            <w:r>
+              <w:rPr>
+                <w:rFonts w:ascii="Times New Roman" w:cs="Times New Roman" w:eastAsia="Times New Roman" w:hAnsi="Times New Roman"/>
+                <w:sz w:val="20"/>
+                <w:szCs w:val="20"/>
+              </w:rPr>
+              <w:t xml:space="preserve">The problem, the measured chain, the policies compared and the outcome</w:t>
+            </w:r>
+          </w:p>
+        </w:tc>
+        <w:tc>
+          <w:tcPr>
+            <w:tcW w:type="dxa" w:w="3310"/>
+            <w:tcBorders>
+              <w:top w:val="single" w:color="808080" w:sz="4"/>
+              <w:left w:val="single" w:color="808080" w:sz="4"/>
+              <w:bottom w:val="single" w:color="808080" w:sz="4"/>
+              <w:right w:val="single" w:color="808080" w:sz="4"/>
+            </w:tcBorders>
+            <w:tcMar>
+              <w:top w:type="dxa" w:w="40"/>
+              <w:left w:type="dxa" w:w="80"/>
+              <w:bottom w:type="dxa" w:w="40"/>
+              <w:right w:type="dxa" w:w="80"/>
+            </w:tcMar>
+          </w:tcPr>
+          <w:p>
+            <w:pPr>
+              <w:spacing w:after="0"/>
+            </w:pPr>
+            <w:r>
+              <w:rPr>
+                <w:rFonts w:ascii="Times New Roman" w:cs="Times New Roman" w:eastAsia="Times New Roman" w:hAnsi="Times New Roman"/>
+                <w:sz w:val="20"/>
+                <w:szCs w:val="20"/>
+              </w:rPr>
+              <w:t xml:space="preserve">Figures quoted from Chapters 4 and 8</w:t>
+            </w:r>
+          </w:p>
+        </w:tc>
+      </w:tr>
+      <w:tr>
+        <w:tc>
+          <w:tcPr>
+            <w:tcW w:type="dxa" w:w="1504"/>
+            <w:tcBorders>
+              <w:top w:val="single" w:color="808080" w:sz="4"/>
+              <w:left w:val="single" w:color="808080" w:sz="4"/>
+              <w:bottom w:val="single" w:color="808080" w:sz="4"/>
+              <w:right w:val="single" w:color="808080" w:sz="4"/>
+            </w:tcBorders>
+            <w:tcMar>
+              <w:top w:type="dxa" w:w="40"/>
+              <w:left w:type="dxa" w:w="80"/>
+              <w:bottom w:type="dxa" w:w="40"/>
+              <w:right w:type="dxa" w:w="80"/>
+            </w:tcMar>
+          </w:tcPr>
+          <w:p>
+            <w:pPr>
+              <w:spacing w:after="0"/>
+            </w:pPr>
+            <w:r>
+              <w:rPr>
+                <w:rFonts w:ascii="Times New Roman" w:cs="Times New Roman" w:eastAsia="Times New Roman" w:hAnsi="Times New Roman"/>
+                <w:sz w:val="20"/>
+                <w:szCs w:val="20"/>
+              </w:rPr>
+              <w:t xml:space="preserve">Simulator</w:t>
+            </w:r>
+          </w:p>
+        </w:tc>
+        <w:tc>
+          <w:tcPr>
+            <w:tcW w:type="dxa" w:w="4212"/>
+            <w:tcBorders>
+              <w:top w:val="single" w:color="808080" w:sz="4"/>
+              <w:left w:val="single" w:color="808080" w:sz="4"/>
+              <w:bottom w:val="single" w:color="808080" w:sz="4"/>
+              <w:right w:val="single" w:color="808080" w:sz="4"/>
+            </w:tcBorders>
+            <w:tcMar>
+              <w:top w:type="dxa" w:w="40"/>
+              <w:left w:type="dxa" w:w="80"/>
+              <w:bottom w:type="dxa" w:w="40"/>
+              <w:right w:type="dxa" w:w="80"/>
+            </w:tcMar>
+          </w:tcPr>
+          <w:p>
+            <w:pPr>
+              <w:spacing w:after="0"/>
+            </w:pPr>
+            <w:r>
+              <w:rPr>
+                <w:rFonts w:ascii="Times New Roman" w:cs="Times New Roman" w:eastAsia="Times New Roman" w:hAnsi="Times New Roman"/>
+                <w:sz w:val="20"/>
+                <w:szCs w:val="20"/>
+              </w:rPr>
+              <w:t xml:space="preserve">One held-out day replayed block by block: queue depth, pool lock, both gate limits, the decision and its reason, and running metrics</w:t>
+            </w:r>
+          </w:p>
+        </w:tc>
+        <w:tc>
+          <w:tcPr>
+            <w:tcW w:type="dxa" w:w="3310"/>
+            <w:tcBorders>
+              <w:top w:val="single" w:color="808080" w:sz="4"/>
+              <w:left w:val="single" w:color="808080" w:sz="4"/>
+              <w:bottom w:val="single" w:color="808080" w:sz="4"/>
+              <w:right w:val="single" w:color="808080" w:sz="4"/>
+            </w:tcBorders>
+            <w:tcMar>
+              <w:top w:type="dxa" w:w="40"/>
+              <w:left w:type="dxa" w:w="80"/>
+              <w:bottom w:type="dxa" w:w="40"/>
+              <w:right w:type="dxa" w:w="80"/>
+            </w:tcMar>
+          </w:tcPr>
+          <w:p>
+            <w:pPr>
+              <w:spacing w:after="0"/>
+            </w:pPr>
+            <w:r>
+              <w:rPr>
+                <w:rFonts w:ascii="Consolas" w:cs="Consolas" w:eastAsia="Consolas" w:hAnsi="Consolas"/>
+                <w:sz w:val="20"/>
+                <w:szCs w:val="20"/>
+              </w:rPr>
+              <w:t xml:space="preserve">run_episode</w:t>
+            </w:r>
+            <w:r>
+              <w:rPr>
+                <w:rFonts w:ascii="Times New Roman" w:cs="Times New Roman" w:eastAsia="Times New Roman" w:hAnsi="Times New Roman"/>
+                <w:sz w:val="20"/>
+                <w:szCs w:val="20"/>
+              </w:rPr>
+              <w:t xml:space="preserve"> on the same test episodes, seed 42, with the trained LightGBM forecaster</w:t>
+            </w:r>
+          </w:p>
+        </w:tc>
+      </w:tr>
+      <w:tr>
+        <w:tc>
+          <w:tcPr>
+            <w:tcW w:type="dxa" w:w="1504"/>
+            <w:tcBorders>
+              <w:top w:val="single" w:color="808080" w:sz="4"/>
+              <w:left w:val="single" w:color="808080" w:sz="4"/>
+              <w:bottom w:val="single" w:color="808080" w:sz="4"/>
+              <w:right w:val="single" w:color="808080" w:sz="4"/>
+            </w:tcBorders>
+            <w:tcMar>
+              <w:top w:type="dxa" w:w="40"/>
+              <w:left w:type="dxa" w:w="80"/>
+              <w:bottom w:type="dxa" w:w="40"/>
+              <w:right w:type="dxa" w:w="80"/>
+            </w:tcMar>
+          </w:tcPr>
+          <w:p>
+            <w:pPr>
+              <w:spacing w:after="0"/>
+            </w:pPr>
+            <w:r>
+              <w:rPr>
+                <w:rFonts w:ascii="Times New Roman" w:cs="Times New Roman" w:eastAsia="Times New Roman" w:hAnsi="Times New Roman"/>
+                <w:sz w:val="20"/>
+                <w:szCs w:val="20"/>
+              </w:rPr>
+              <w:t xml:space="preserve">Results</w:t>
+            </w:r>
+          </w:p>
+        </w:tc>
+        <w:tc>
+          <w:tcPr>
+            <w:tcW w:type="dxa" w:w="4212"/>
+            <w:tcBorders>
+              <w:top w:val="single" w:color="808080" w:sz="4"/>
+              <w:left w:val="single" w:color="808080" w:sz="4"/>
+              <w:bottom w:val="single" w:color="808080" w:sz="4"/>
+              <w:right w:val="single" w:color="808080" w:sz="4"/>
+            </w:tcBorders>
+            <w:tcMar>
+              <w:top w:type="dxa" w:w="40"/>
+              <w:left w:type="dxa" w:w="80"/>
+              <w:bottom w:type="dxa" w:w="40"/>
+              <w:right w:type="dxa" w:w="80"/>
+            </w:tcMar>
+          </w:tcPr>
+          <w:p>
+            <w:pPr>
+              <w:spacing w:after="0"/>
+            </w:pPr>
+            <w:r>
+              <w:rPr>
+                <w:rFonts w:ascii="Times New Roman" w:cs="Times New Roman" w:eastAsia="Times New Roman" w:hAnsi="Times New Roman"/>
+                <w:sz w:val="20"/>
+                <w:szCs w:val="20"/>
+              </w:rPr>
+              <w:t xml:space="preserve">Median metrics with 95 % confidence intervals for every policy and arrival rate, the trade-off scatter and the latency distribution</w:t>
+            </w:r>
+          </w:p>
+        </w:tc>
+        <w:tc>
+          <w:tcPr>
+            <w:tcW w:type="dxa" w:w="3310"/>
+            <w:tcBorders>
+              <w:top w:val="single" w:color="808080" w:sz="4"/>
+              <w:left w:val="single" w:color="808080" w:sz="4"/>
+              <w:bottom w:val="single" w:color="808080" w:sz="4"/>
+              <w:right w:val="single" w:color="808080" w:sz="4"/>
+            </w:tcBorders>
+            <w:tcMar>
+              <w:top w:type="dxa" w:w="40"/>
+              <w:left w:type="dxa" w:w="80"/>
+              <w:bottom w:type="dxa" w:w="40"/>
+              <w:right w:type="dxa" w:w="80"/>
+            </w:tcMar>
+          </w:tcPr>
+          <w:p>
+            <w:pPr>
+              <w:spacing w:after="0"/>
+            </w:pPr>
+            <w:r>
+              <w:rPr>
+                <w:rFonts w:ascii="Consolas" w:cs="Consolas" w:eastAsia="Consolas" w:hAnsi="Consolas"/>
+                <w:sz w:val="20"/>
+                <w:szCs w:val="20"/>
+              </w:rPr>
+              <w:t xml:space="preserve">experiments/phase6-final-evaluation/episode_metrics.parquet</w:t>
+            </w:r>
+            <w:r>
+              <w:rPr>
+                <w:rFonts w:ascii="Times New Roman" w:cs="Times New Roman" w:eastAsia="Times New Roman" w:hAnsi="Times New Roman"/>
+                <w:sz w:val="20"/>
+                <w:szCs w:val="20"/>
+              </w:rPr>
+              <w:t xml:space="preserve">, re-aggregated per request</w:t>
+            </w:r>
+          </w:p>
+        </w:tc>
+      </w:tr>
+      <w:tr>
+        <w:tc>
+          <w:tcPr>
+            <w:tcW w:type="dxa" w:w="1504"/>
+            <w:tcBorders>
+              <w:top w:val="single" w:color="808080" w:sz="4"/>
+              <w:left w:val="single" w:color="808080" w:sz="4"/>
+              <w:bottom w:val="single" w:color="808080" w:sz="4"/>
+              <w:right w:val="single" w:color="808080" w:sz="4"/>
+            </w:tcBorders>
+            <w:tcMar>
+              <w:top w:type="dxa" w:w="40"/>
+              <w:left w:type="dxa" w:w="80"/>
+              <w:bottom w:type="dxa" w:w="40"/>
+              <w:right w:type="dxa" w:w="80"/>
+            </w:tcMar>
+          </w:tcPr>
+          <w:p>
+            <w:pPr>
+              <w:spacing w:after="0"/>
+            </w:pPr>
+            <w:r>
+              <w:rPr>
+                <w:rFonts w:ascii="Times New Roman" w:cs="Times New Roman" w:eastAsia="Times New Roman" w:hAnsi="Times New Roman"/>
+                <w:sz w:val="20"/>
+                <w:szCs w:val="20"/>
+              </w:rPr>
+              <w:t xml:space="preserve">Live</w:t>
+            </w:r>
+          </w:p>
+        </w:tc>
+        <w:tc>
+          <w:tcPr>
+            <w:tcW w:type="dxa" w:w="4212"/>
+            <w:tcBorders>
+              <w:top w:val="single" w:color="808080" w:sz="4"/>
+              <w:left w:val="single" w:color="808080" w:sz="4"/>
+              <w:bottom w:val="single" w:color="808080" w:sz="4"/>
+              <w:right w:val="single" w:color="808080" w:sz="4"/>
+            </w:tcBorders>
+            <w:tcMar>
+              <w:top w:type="dxa" w:w="40"/>
+              <w:left w:type="dxa" w:w="80"/>
+              <w:bottom w:type="dxa" w:w="40"/>
+              <w:right w:type="dxa" w:w="80"/>
+            </w:tcMar>
+          </w:tcPr>
+          <w:p>
+            <w:pPr>
+              <w:spacing w:after="0"/>
+            </w:pPr>
+            <w:r>
+              <w:rPr>
+                <w:rFonts w:ascii="Times New Roman" w:cs="Times New Roman" w:eastAsia="Times New Roman" w:hAnsi="Times New Roman"/>
+                <w:sz w:val="20"/>
+                <w:szCs w:val="20"/>
+              </w:rPr>
+              <w:t xml:space="preserve">The deployed pool, the waiting order queue, the recorded end-to-end swap and the contract addresses</w:t>
+            </w:r>
+          </w:p>
+        </w:tc>
+        <w:tc>
+          <w:tcPr>
+            <w:tcW w:type="dxa" w:w="3310"/>
+            <w:tcBorders>
+              <w:top w:val="single" w:color="808080" w:sz="4"/>
+              <w:left w:val="single" w:color="808080" w:sz="4"/>
+              <w:bottom w:val="single" w:color="808080" w:sz="4"/>
+              <w:right w:val="single" w:color="808080" w:sz="4"/>
+            </w:tcBorders>
+            <w:tcMar>
+              <w:top w:type="dxa" w:w="40"/>
+              <w:left w:type="dxa" w:w="80"/>
+              <w:bottom w:type="dxa" w:w="40"/>
+              <w:right w:type="dxa" w:w="80"/>
+            </w:tcMar>
+          </w:tcPr>
+          <w:p>
+            <w:pPr>
+              <w:spacing w:after="0"/>
+            </w:pPr>
+            <w:r>
+              <w:rPr>
+                <w:rFonts w:ascii="Times New Roman" w:cs="Times New Roman" w:eastAsia="Times New Roman" w:hAnsi="Times New Roman"/>
+                <w:sz w:val="20"/>
+                <w:szCs w:val="20"/>
+              </w:rPr>
+              <w:t xml:space="preserve">Blockfrost through the same chain adapter the live batcher uses, plus the Phase 7 manifest</w:t>
+            </w:r>
+          </w:p>
+        </w:tc>
+      </w:tr>
+    </w:tbl>
+    <w:p>
+      <w:pPr>
+        <w:spacing w:after="160"/>
+      </w:pPr>
+    </w:p>
+    <w:p>
+      <w:pPr>
+        <w:spacing w:after="120" w:line="336"/>
+        <w:jc w:val="both"/>
+      </w:pPr>
+      <w:r>
+        <w:rPr>
+          <w:rFonts w:ascii="Times New Roman" w:cs="Times New Roman" w:eastAsia="Times New Roman" w:hAnsi="Times New Roman"/>
+        </w:rPr>
+        <w:t xml:space="preserve">The server is standard library only: a threading HTTP server, four JSON routes and a fixed list of static files. It refuses to bind anything but the loopback interface, so the dashboard cannot be exposed on a network by configuration; it declines a port already in use rather than silently sharing it; unknown paths and attempts to escape the static directory return 404; a request made before the dataset has finished loading returns 503 with the loading message, and a malformed replay request returns 400. The episode library reads D1 in a background thread, so the page answers immediately and reports its own progress.</w:t>
+      </w:r>
+    </w:p>
+    <w:p>
+      <w:pPr>
+        <w:spacing w:after="120" w:line="336"/>
+        <w:jc w:val="both"/>
+      </w:pPr>
+      <w:r>
+        <w:rPr>
+          <w:rFonts w:ascii="Times New Roman" w:cs="Times New Roman" w:eastAsia="Times New Roman" w:hAnsi="Times New Roman"/>
+        </w:rPr>
+        <w:t xml:space="preserve">The browser side is plain JavaScript with SVG and canvas — no framework, no build step and no content delivery network — so the Simulator and Results views work with no internet connection and only the Live view needs one. The interface opens with a short generated title sequence that can be skipped with a button, Enter, Space or Escape; the pages themselves use decoded headings, counted-up figures, reveal-on-scroll cards and a background of light strands that changes shape as the page scrolls. All of it is suppressed for viewers whose system asks for reduced motion, and the palette tokens are recorded in </w:t>
+      </w:r>
+      <w:r>
+        <w:rPr>
+          <w:rFonts w:ascii="Consolas" w:cs="Consolas" w:eastAsia="Consolas" w:hAnsi="Consolas"/>
+          <w:sz w:val="20"/>
+          <w:szCs w:val="20"/>
+        </w:rPr>
+        <w:t xml:space="preserve">docs/design/palettes.md</w:t>
+      </w:r>
+      <w:r>
+        <w:rPr>
+          <w:rFonts w:ascii="Times New Roman" w:cs="Times New Roman" w:eastAsia="Times New Roman" w:hAnsi="Times New Roman"/>
+        </w:rPr>
+        <w:t xml:space="preserve"> so the look can be restored or replaced without hunting through the stylesheet.</w:t>
+      </w:r>
+    </w:p>
+    <w:p>
+      <w:pPr>
+        <w:pBdr>
+          <w:top w:val="single" w:color="1F4E79" w:sz="4" w:space="6"/>
+          <w:left w:val="single" w:color="1F4E79" w:sz="12" w:space="6"/>
+        </w:pBdr>
+        <w:shd w:fill="EAF1F8" w:color="auto" w:val="clear"/>
+        <w:spacing w:after="0" w:line="312"/>
+        <w:ind w:left="200" w:right="200"/>
+        <w:jc w:val="both"/>
+      </w:pPr>
+      <w:r>
+        <w:rPr>
+          <w:rFonts w:ascii="Times New Roman" w:cs="Times New Roman" w:eastAsia="Times New Roman" w:hAnsi="Times New Roman"/>
+          <w:b/>
+          <w:bCs/>
+          <w:color w:val="1F4E79"/>
+        </w:rPr>
+        <w:t xml:space="preserve">Why the dashboard recomputes instead of storing</w:t>
+      </w:r>
+    </w:p>
+    <w:p>
+      <w:pPr>
+        <w:pBdr>
+          <w:bottom w:val="single" w:color="1F4E79" w:sz="4" w:space="6"/>
+          <w:left w:val="single" w:color="1F4E79" w:sz="12" w:space="6"/>
+        </w:pBdr>
+        <w:shd w:fill="EAF1F8" w:color="auto" w:val="clear"/>
+        <w:spacing w:after="0" w:line="312"/>
+        <w:ind w:left="200" w:right="200"/>
+        <w:jc w:val="both"/>
+      </w:pPr>
+      <w:r>
+        <w:rPr>
+          <w:rFonts w:ascii="Times New Roman" w:cs="Times New Roman" w:eastAsia="Times New Roman" w:hAnsi="Times New Roman"/>
+        </w:rPr>
+        <w:t xml:space="preserve">It is the only artefact in the project a viewer can operate, and therefore the most likely place for a number to drift away from the evidence. Its agreement with Table 8.4 is asserted by a test that fails if either side moves.</w:t>
+      </w:r>
+    </w:p>
+    <w:p>
+      <w:pPr>
+        <w:spacing w:after="120"/>
+      </w:pPr>
+    </w:p>
+    <w:p>
+      <w:pPr>
         <w:pStyle w:val="Heading1"/>
         <w:pageBreakBefore/>
       </w:pPr>
@@ -18845,7 +19527,7 @@
           <w:b/>
           <w:bCs/>
         </w:rPr>
-        <w:t xml:space="preserve">339 Python tests in 26 files</w:t>
+        <w:t xml:space="preserve">356 Python tests in 27 files</w:t>
       </w:r>
       <w:r>
         <w:rPr>
@@ -18865,7 +19547,7 @@
         <w:rPr>
           <w:rFonts w:ascii="Times New Roman" w:cs="Times New Roman" w:eastAsia="Times New Roman" w:hAnsi="Times New Roman"/>
         </w:rPr>
-        <w:t xml:space="preserve"> for the validators; the Python suite runs on every push in GitHub Actions and enforces a minimum of 90 % line coverage, and measured coverage is 94.6 %.</w:t>
+        <w:t xml:space="preserve"> for the validators; the Python suite runs on every push in GitHub Actions and enforces a minimum of 90 % line coverage, and measured coverage is 93.9 %.</w:t>
       </w:r>
     </w:p>
     <w:p>
@@ -25622,6 +26304,374 @@
           </w:p>
         </w:tc>
       </w:tr>
+      <w:tr>
+        <w:tc>
+          <w:tcPr>
+            <w:tcW w:type="dxa" w:w="3008"/>
+            <w:tcBorders>
+              <w:top w:val="single" w:color="808080" w:sz="4"/>
+              <w:left w:val="single" w:color="808080" w:sz="4"/>
+              <w:bottom w:val="single" w:color="808080" w:sz="4"/>
+              <w:right w:val="single" w:color="808080" w:sz="4"/>
+            </w:tcBorders>
+            <w:tcMar>
+              <w:top w:type="dxa" w:w="40"/>
+              <w:left w:type="dxa" w:w="80"/>
+              <w:bottom w:type="dxa" w:w="40"/>
+              <w:right w:type="dxa" w:w="80"/>
+            </w:tcMar>
+          </w:tcPr>
+          <w:p>
+            <w:pPr>
+              <w:spacing w:after="0"/>
+            </w:pPr>
+            <w:r>
+              <w:rPr>
+                <w:rFonts w:ascii="Times New Roman" w:cs="Times New Roman" w:eastAsia="Times New Roman" w:hAnsi="Times New Roman"/>
+                <w:sz w:val="20"/>
+                <w:szCs w:val="20"/>
+              </w:rPr>
+              <w:t xml:space="preserve">Dashboard: pool-lock tile counted locked decisions, not slots</w:t>
+            </w:r>
+          </w:p>
+        </w:tc>
+        <w:tc>
+          <w:tcPr>
+            <w:tcW w:type="dxa" w:w="3008"/>
+            <w:tcBorders>
+              <w:top w:val="single" w:color="808080" w:sz="4"/>
+              <w:left w:val="single" w:color="808080" w:sz="4"/>
+              <w:bottom w:val="single" w:color="808080" w:sz="4"/>
+              <w:right w:val="single" w:color="808080" w:sz="4"/>
+            </w:tcBorders>
+            <w:tcMar>
+              <w:top w:type="dxa" w:w="40"/>
+              <w:left w:type="dxa" w:w="80"/>
+              <w:bottom w:type="dxa" w:w="40"/>
+              <w:right w:type="dxa" w:w="80"/>
+            </w:tcMar>
+          </w:tcPr>
+          <w:p>
+            <w:pPr>
+              <w:spacing w:after="0"/>
+            </w:pPr>
+            <w:r>
+              <w:rPr>
+                <w:rFonts w:ascii="Times New Roman" w:cs="Times New Roman" w:eastAsia="Times New Roman" w:hAnsi="Times New Roman"/>
+                <w:sz w:val="20"/>
+                <w:szCs w:val="20"/>
+              </w:rPr>
+              <w:t xml:space="preserve">Lock occupancy displayed as 0 % instead of 49 %</w:t>
+            </w:r>
+          </w:p>
+        </w:tc>
+        <w:tc>
+          <w:tcPr>
+            <w:tcW w:type="dxa" w:w="3010"/>
+            <w:tcBorders>
+              <w:top w:val="single" w:color="808080" w:sz="4"/>
+              <w:left w:val="single" w:color="808080" w:sz="4"/>
+              <w:bottom w:val="single" w:color="808080" w:sz="4"/>
+              <w:right w:val="single" w:color="808080" w:sz="4"/>
+            </w:tcBorders>
+            <w:tcMar>
+              <w:top w:type="dxa" w:w="40"/>
+              <w:left w:type="dxa" w:w="80"/>
+              <w:bottom w:type="dxa" w:w="40"/>
+              <w:right w:type="dxa" w:w="80"/>
+            </w:tcMar>
+          </w:tcPr>
+          <w:p>
+            <w:pPr>
+              <w:spacing w:after="0"/>
+            </w:pPr>
+            <w:r>
+              <w:rPr>
+                <w:rFonts w:ascii="Times New Roman" w:cs="Times New Roman" w:eastAsia="Times New Roman" w:hAnsi="Times New Roman"/>
+                <w:sz w:val="20"/>
+                <w:szCs w:val="20"/>
+              </w:rPr>
+              <w:t xml:space="preserve">Cumulative locked slots; agrees with the recorded lock occupancy of 0.486</w:t>
+            </w:r>
+          </w:p>
+        </w:tc>
+      </w:tr>
+      <w:tr>
+        <w:tc>
+          <w:tcPr>
+            <w:tcW w:type="dxa" w:w="3008"/>
+            <w:tcBorders>
+              <w:top w:val="single" w:color="808080" w:sz="4"/>
+              <w:left w:val="single" w:color="808080" w:sz="4"/>
+              <w:bottom w:val="single" w:color="808080" w:sz="4"/>
+              <w:right w:val="single" w:color="808080" w:sz="4"/>
+            </w:tcBorders>
+            <w:tcMar>
+              <w:top w:type="dxa" w:w="40"/>
+              <w:left w:type="dxa" w:w="80"/>
+              <w:bottom w:type="dxa" w:w="40"/>
+              <w:right w:type="dxa" w:w="80"/>
+            </w:tcMar>
+          </w:tcPr>
+          <w:p>
+            <w:pPr>
+              <w:spacing w:after="0"/>
+            </w:pPr>
+            <w:r>
+              <w:rPr>
+                <w:rFonts w:ascii="Times New Roman" w:cs="Times New Roman" w:eastAsia="Times New Roman" w:hAnsi="Times New Roman"/>
+                <w:sz w:val="20"/>
+                <w:szCs w:val="20"/>
+              </w:rPr>
+              <w:t xml:space="preserve">Dashboard: the replay view gave up after one failed request</w:t>
+            </w:r>
+          </w:p>
+        </w:tc>
+        <w:tc>
+          <w:tcPr>
+            <w:tcW w:type="dxa" w:w="3008"/>
+            <w:tcBorders>
+              <w:top w:val="single" w:color="808080" w:sz="4"/>
+              <w:left w:val="single" w:color="808080" w:sz="4"/>
+              <w:bottom w:val="single" w:color="808080" w:sz="4"/>
+              <w:right w:val="single" w:color="808080" w:sz="4"/>
+            </w:tcBorders>
+            <w:tcMar>
+              <w:top w:type="dxa" w:w="40"/>
+              <w:left w:type="dxa" w:w="80"/>
+              <w:bottom w:type="dxa" w:w="40"/>
+              <w:right w:type="dxa" w:w="80"/>
+            </w:tcMar>
+          </w:tcPr>
+          <w:p>
+            <w:pPr>
+              <w:spacing w:after="0"/>
+            </w:pPr>
+            <w:r>
+              <w:rPr>
+                <w:rFonts w:ascii="Times New Roman" w:cs="Times New Roman" w:eastAsia="Times New Roman" w:hAnsi="Times New Roman"/>
+                <w:sz w:val="20"/>
+                <w:szCs w:val="20"/>
+              </w:rPr>
+              <w:t xml:space="preserve">Simulator view stuck on “server unreachable” after a restart</w:t>
+            </w:r>
+          </w:p>
+        </w:tc>
+        <w:tc>
+          <w:tcPr>
+            <w:tcW w:type="dxa" w:w="3010"/>
+            <w:tcBorders>
+              <w:top w:val="single" w:color="808080" w:sz="4"/>
+              <w:left w:val="single" w:color="808080" w:sz="4"/>
+              <w:bottom w:val="single" w:color="808080" w:sz="4"/>
+              <w:right w:val="single" w:color="808080" w:sz="4"/>
+            </w:tcBorders>
+            <w:tcMar>
+              <w:top w:type="dxa" w:w="40"/>
+              <w:left w:type="dxa" w:w="80"/>
+              <w:bottom w:type="dxa" w:w="40"/>
+              <w:right w:type="dxa" w:w="80"/>
+            </w:tcMar>
+          </w:tcPr>
+          <w:p>
+            <w:pPr>
+              <w:spacing w:after="0"/>
+            </w:pPr>
+            <w:r>
+              <w:rPr>
+                <w:rFonts w:ascii="Times New Roman" w:cs="Times New Roman" w:eastAsia="Times New Roman" w:hAnsi="Times New Roman"/>
+                <w:sz w:val="20"/>
+                <w:szCs w:val="20"/>
+              </w:rPr>
+              <w:t xml:space="preserve">Retry with backoff; Load disabled until the data is ready</w:t>
+            </w:r>
+          </w:p>
+        </w:tc>
+      </w:tr>
+      <w:tr>
+        <w:tc>
+          <w:tcPr>
+            <w:tcW w:type="dxa" w:w="3008"/>
+            <w:tcBorders>
+              <w:top w:val="single" w:color="808080" w:sz="4"/>
+              <w:left w:val="single" w:color="808080" w:sz="4"/>
+              <w:bottom w:val="single" w:color="808080" w:sz="4"/>
+              <w:right w:val="single" w:color="808080" w:sz="4"/>
+            </w:tcBorders>
+            <w:tcMar>
+              <w:top w:type="dxa" w:w="40"/>
+              <w:left w:type="dxa" w:w="80"/>
+              <w:bottom w:type="dxa" w:w="40"/>
+              <w:right w:type="dxa" w:w="80"/>
+            </w:tcMar>
+          </w:tcPr>
+          <w:p>
+            <w:pPr>
+              <w:spacing w:after="0"/>
+            </w:pPr>
+            <w:r>
+              <w:rPr>
+                <w:rFonts w:ascii="Times New Roman" w:cs="Times New Roman" w:eastAsia="Times New Roman" w:hAnsi="Times New Roman"/>
+                <w:sz w:val="20"/>
+                <w:szCs w:val="20"/>
+              </w:rPr>
+              <w:t xml:space="preserve">Dashboard: a second server silently shared the port on Windows</w:t>
+            </w:r>
+          </w:p>
+        </w:tc>
+        <w:tc>
+          <w:tcPr>
+            <w:tcW w:type="dxa" w:w="3008"/>
+            <w:tcBorders>
+              <w:top w:val="single" w:color="808080" w:sz="4"/>
+              <w:left w:val="single" w:color="808080" w:sz="4"/>
+              <w:bottom w:val="single" w:color="808080" w:sz="4"/>
+              <w:right w:val="single" w:color="808080" w:sz="4"/>
+            </w:tcBorders>
+            <w:tcMar>
+              <w:top w:type="dxa" w:w="40"/>
+              <w:left w:type="dxa" w:w="80"/>
+              <w:bottom w:type="dxa" w:w="40"/>
+              <w:right w:type="dxa" w:w="80"/>
+            </w:tcMar>
+          </w:tcPr>
+          <w:p>
+            <w:pPr>
+              <w:spacing w:after="0"/>
+            </w:pPr>
+            <w:r>
+              <w:rPr>
+                <w:rFonts w:ascii="Times New Roman" w:cs="Times New Roman" w:eastAsia="Times New Roman" w:hAnsi="Times New Roman"/>
+                <w:sz w:val="20"/>
+                <w:szCs w:val="20"/>
+              </w:rPr>
+              <w:t xml:space="preserve">Requests split between two processes, stale figures on screen</w:t>
+            </w:r>
+          </w:p>
+        </w:tc>
+        <w:tc>
+          <w:tcPr>
+            <w:tcW w:type="dxa" w:w="3010"/>
+            <w:tcBorders>
+              <w:top w:val="single" w:color="808080" w:sz="4"/>
+              <w:left w:val="single" w:color="808080" w:sz="4"/>
+              <w:bottom w:val="single" w:color="808080" w:sz="4"/>
+              <w:right w:val="single" w:color="808080" w:sz="4"/>
+            </w:tcBorders>
+            <w:tcMar>
+              <w:top w:type="dxa" w:w="40"/>
+              <w:left w:type="dxa" w:w="80"/>
+              <w:bottom w:type="dxa" w:w="40"/>
+              <w:right w:type="dxa" w:w="80"/>
+            </w:tcMar>
+          </w:tcPr>
+          <w:p>
+            <w:pPr>
+              <w:spacing w:after="0"/>
+            </w:pPr>
+            <w:r>
+              <w:rPr>
+                <w:rFonts w:ascii="Times New Roman" w:cs="Times New Roman" w:eastAsia="Times New Roman" w:hAnsi="Times New Roman"/>
+                <w:sz w:val="20"/>
+                <w:szCs w:val="20"/>
+              </w:rPr>
+              <w:t xml:space="preserve">Exclusive bind, message naming a free port, regression test</w:t>
+            </w:r>
+          </w:p>
+        </w:tc>
+      </w:tr>
+      <w:tr>
+        <w:tc>
+          <w:tcPr>
+            <w:tcW w:type="dxa" w:w="3008"/>
+            <w:tcBorders>
+              <w:top w:val="single" w:color="808080" w:sz="4"/>
+              <w:left w:val="single" w:color="808080" w:sz="4"/>
+              <w:bottom w:val="single" w:color="808080" w:sz="4"/>
+              <w:right w:val="single" w:color="808080" w:sz="4"/>
+            </w:tcBorders>
+            <w:tcMar>
+              <w:top w:type="dxa" w:w="40"/>
+              <w:left w:type="dxa" w:w="80"/>
+              <w:bottom w:type="dxa" w:w="40"/>
+              <w:right w:type="dxa" w:w="80"/>
+            </w:tcMar>
+          </w:tcPr>
+          <w:p>
+            <w:pPr>
+              <w:spacing w:after="0"/>
+            </w:pPr>
+            <w:r>
+              <w:rPr>
+                <w:rFonts w:ascii="Times New Roman" w:cs="Times New Roman" w:eastAsia="Times New Roman" w:hAnsi="Times New Roman"/>
+                <w:sz w:val="20"/>
+                <w:szCs w:val="20"/>
+              </w:rPr>
+              <w:t xml:space="preserve">Title sequence dismissed by a reload’s repeated Enter key</w:t>
+            </w:r>
+          </w:p>
+        </w:tc>
+        <w:tc>
+          <w:tcPr>
+            <w:tcW w:type="dxa" w:w="3008"/>
+            <w:tcBorders>
+              <w:top w:val="single" w:color="808080" w:sz="4"/>
+              <w:left w:val="single" w:color="808080" w:sz="4"/>
+              <w:bottom w:val="single" w:color="808080" w:sz="4"/>
+              <w:right w:val="single" w:color="808080" w:sz="4"/>
+            </w:tcBorders>
+            <w:tcMar>
+              <w:top w:type="dxa" w:w="40"/>
+              <w:left w:type="dxa" w:w="80"/>
+              <w:bottom w:type="dxa" w:w="40"/>
+              <w:right w:type="dxa" w:w="80"/>
+            </w:tcMar>
+          </w:tcPr>
+          <w:p>
+            <w:pPr>
+              <w:spacing w:after="0"/>
+            </w:pPr>
+            <w:r>
+              <w:rPr>
+                <w:rFonts w:ascii="Times New Roman" w:cs="Times New Roman" w:eastAsia="Times New Roman" w:hAnsi="Times New Roman"/>
+                <w:sz w:val="20"/>
+                <w:szCs w:val="20"/>
+              </w:rPr>
+              <w:t xml:space="preserve">Opening sequence vanished instantly when reloading from the address bar</w:t>
+            </w:r>
+          </w:p>
+        </w:tc>
+        <w:tc>
+          <w:tcPr>
+            <w:tcW w:type="dxa" w:w="3010"/>
+            <w:tcBorders>
+              <w:top w:val="single" w:color="808080" w:sz="4"/>
+              <w:left w:val="single" w:color="808080" w:sz="4"/>
+              <w:bottom w:val="single" w:color="808080" w:sz="4"/>
+              <w:right w:val="single" w:color="808080" w:sz="4"/>
+            </w:tcBorders>
+            <w:tcMar>
+              <w:top w:type="dxa" w:w="40"/>
+              <w:left w:type="dxa" w:w="80"/>
+              <w:bottom w:type="dxa" w:w="40"/>
+              <w:right w:type="dxa" w:w="80"/>
+            </w:tcMar>
+          </w:tcPr>
+          <w:p>
+            <w:pPr>
+              <w:spacing w:after="0"/>
+            </w:pPr>
+            <w:r>
+              <w:rPr>
+                <w:rFonts w:ascii="Times New Roman" w:cs="Times New Roman" w:eastAsia="Times New Roman" w:hAnsi="Times New Roman"/>
+                <w:sz w:val="20"/>
+                <w:szCs w:val="20"/>
+              </w:rPr>
+              <w:t xml:space="preserve">Held keys ignored, and all keys ignored for its first 1.2 s</w:t>
+            </w:r>
+          </w:p>
+        </w:tc>
+      </w:tr>
     </w:tbl>
     <w:p>
       <w:pPr>
@@ -26424,6 +27474,1142 @@
                 <w:szCs w:val="20"/>
               </w:rPr>
               <w:t xml:space="preserve">Live</w:t>
+            </w:r>
+          </w:p>
+        </w:tc>
+      </w:tr>
+    </w:tbl>
+    <w:p>
+      <w:pPr>
+        <w:spacing w:after="160"/>
+      </w:pPr>
+    </w:p>
+    <w:p>
+      <w:pPr>
+        <w:pStyle w:val="Heading2"/>
+      </w:pPr>
+      <w:r>
+        <w:t xml:space="preserve">7.8 Dashboard Tests and Demonstration Scenarios</w:t>
+      </w:r>
+    </w:p>
+    <w:p>
+      <w:pPr>
+        <w:spacing w:after="120" w:line="336"/>
+        <w:jc w:val="both"/>
+      </w:pPr>
+      <w:r>
+        <w:rPr>
+          <w:rFonts w:ascii="Times New Roman" w:cs="Times New Roman" w:eastAsia="Times New Roman" w:hAnsi="Times New Roman"/>
+        </w:rPr>
+        <w:t xml:space="preserve">The dashboard is tested on two levels. Fourteen automated tests in </w:t>
+      </w:r>
+      <w:r>
+        <w:rPr>
+          <w:rFonts w:ascii="Consolas" w:cs="Consolas" w:eastAsia="Consolas" w:hAnsi="Consolas"/>
+          <w:sz w:val="20"/>
+          <w:szCs w:val="20"/>
+        </w:rPr>
+        <w:t xml:space="preserve">tests/test_dashboard.py</w:t>
+      </w:r>
+      <w:r>
+        <w:rPr>
+          <w:rFonts w:ascii="Times New Roman" w:cs="Times New Roman" w:eastAsia="Times New Roman" w:hAnsi="Times New Roman"/>
+        </w:rPr>
+        <w:t xml:space="preserve"> cover the data it serves and the server that serves it: that a replay payload is exactly the simulator’s own decision log, that no submission is shown while the pool is held, that the per-block gate never exceeds the per-transaction gate, that every payload is strict JSON, that the comparison view reproduces the median tail latency of Table 8.4, that the latency distribution is monotone, that the live view reads a pool and a queue from a fake chain, and that the server answers 503 while loading, 400 for a malformed request and 404 for anything outside its static directory, refuses a non-loopback address and refuses a port already in use.</w:t>
+      </w:r>
+    </w:p>
+    <w:p>
+      <w:pPr>
+        <w:spacing w:after="120" w:line="336"/>
+        <w:jc w:val="both"/>
+      </w:pPr>
+      <w:r>
+        <w:rPr>
+          <w:rFonts w:ascii="Times New Roman" w:cs="Times New Roman" w:eastAsia="Times New Roman" w:hAnsi="Times New Roman"/>
+        </w:rPr>
+        <w:t xml:space="preserve">Because a demonstration fails in ways a unit test cannot see, ten end-to-end scenarios were also exercised against the running dashboard. Nine passed outright; the tenth could be confirmed only by inspection, because the operating system’s reduced-motion setting cannot be toggled from the test harness.</w:t>
+      </w:r>
+    </w:p>
+    <w:p>
+      <w:pPr>
+        <w:keepNext/>
+        <w:spacing w:after="200" w:before="60"/>
+        <w:jc w:val="center"/>
+      </w:pPr>
+      <w:r>
+        <w:rPr>
+          <w:rFonts w:ascii="Times New Roman" w:cs="Times New Roman" w:eastAsia="Times New Roman" w:hAnsi="Times New Roman"/>
+          <w:b/>
+          <w:bCs/>
+          <w:sz w:val="22"/>
+          <w:szCs w:val="22"/>
+        </w:rPr>
+        <w:t xml:space="preserve">Table 7.8: </w:t>
+      </w:r>
+      <w:r>
+        <w:rPr>
+          <w:rFonts w:ascii="Times New Roman" w:cs="Times New Roman" w:eastAsia="Times New Roman" w:hAnsi="Times New Roman"/>
+          <w:i/>
+          <w:iCs/>
+          <w:sz w:val="22"/>
+          <w:szCs w:val="22"/>
+        </w:rPr>
+        <w:t xml:space="preserve">Demonstration scenarios exercised against the running dashboard</w:t>
+      </w:r>
+    </w:p>
+    <w:tbl>
+      <w:tblPr>
+        <w:tblW w:type="dxa" w:w="9026"/>
+        <w:tblBorders>
+          <w:top w:val="single" w:color="auto" w:sz="4"/>
+          <w:left w:val="single" w:color="auto" w:sz="4"/>
+          <w:bottom w:val="single" w:color="auto" w:sz="4"/>
+          <w:right w:val="single" w:color="auto" w:sz="4"/>
+          <w:insideH w:val="single" w:color="auto" w:sz="4"/>
+          <w:insideV w:val="single" w:color="auto" w:sz="4"/>
+        </w:tblBorders>
+      </w:tblPr>
+      <w:tblGrid>
+        <w:gridCol w:w="1905"/>
+        <w:gridCol w:w="5415"/>
+        <w:gridCol w:w="1706"/>
+      </w:tblGrid>
+      <w:tr>
+        <w:trPr>
+          <w:tblHeader/>
+        </w:trPr>
+        <w:tc>
+          <w:tcPr>
+            <w:tcW w:type="dxa" w:w="1905"/>
+            <w:tcBorders>
+              <w:top w:val="single" w:color="808080" w:sz="4"/>
+              <w:left w:val="single" w:color="808080" w:sz="4"/>
+              <w:bottom w:val="single" w:color="808080" w:sz="4"/>
+              <w:right w:val="single" w:color="808080" w:sz="4"/>
+            </w:tcBorders>
+            <w:shd w:fill="D9E2F3" w:color="auto" w:val="clear"/>
+            <w:tcMar>
+              <w:top w:type="dxa" w:w="40"/>
+              <w:left w:type="dxa" w:w="80"/>
+              <w:bottom w:type="dxa" w:w="40"/>
+              <w:right w:type="dxa" w:w="80"/>
+            </w:tcMar>
+          </w:tcPr>
+          <w:p>
+            <w:pPr>
+              <w:spacing w:after="0"/>
+            </w:pPr>
+            <w:r>
+              <w:rPr>
+                <w:rFonts w:ascii="Times New Roman" w:cs="Times New Roman" w:eastAsia="Times New Roman" w:hAnsi="Times New Roman"/>
+                <w:b/>
+                <w:bCs/>
+                <w:sz w:val="20"/>
+                <w:szCs w:val="20"/>
+              </w:rPr>
+              <w:t xml:space="preserve">Scenario</w:t>
+            </w:r>
+          </w:p>
+        </w:tc>
+        <w:tc>
+          <w:tcPr>
+            <w:tcW w:type="dxa" w:w="5415"/>
+            <w:tcBorders>
+              <w:top w:val="single" w:color="808080" w:sz="4"/>
+              <w:left w:val="single" w:color="808080" w:sz="4"/>
+              <w:bottom w:val="single" w:color="808080" w:sz="4"/>
+              <w:right w:val="single" w:color="808080" w:sz="4"/>
+            </w:tcBorders>
+            <w:shd w:fill="D9E2F3" w:color="auto" w:val="clear"/>
+            <w:tcMar>
+              <w:top w:type="dxa" w:w="40"/>
+              <w:left w:type="dxa" w:w="80"/>
+              <w:bottom w:type="dxa" w:w="40"/>
+              <w:right w:type="dxa" w:w="80"/>
+            </w:tcMar>
+          </w:tcPr>
+          <w:p>
+            <w:pPr>
+              <w:spacing w:after="0"/>
+            </w:pPr>
+            <w:r>
+              <w:rPr>
+                <w:rFonts w:ascii="Times New Roman" w:cs="Times New Roman" w:eastAsia="Times New Roman" w:hAnsi="Times New Roman"/>
+                <w:b/>
+                <w:bCs/>
+                <w:sz w:val="20"/>
+                <w:szCs w:val="20"/>
+              </w:rPr>
+              <w:t xml:space="preserve">What was checked</w:t>
+            </w:r>
+          </w:p>
+        </w:tc>
+        <w:tc>
+          <w:tcPr>
+            <w:tcW w:type="dxa" w:w="1706"/>
+            <w:tcBorders>
+              <w:top w:val="single" w:color="808080" w:sz="4"/>
+              <w:left w:val="single" w:color="808080" w:sz="4"/>
+              <w:bottom w:val="single" w:color="808080" w:sz="4"/>
+              <w:right w:val="single" w:color="808080" w:sz="4"/>
+            </w:tcBorders>
+            <w:shd w:fill="D9E2F3" w:color="auto" w:val="clear"/>
+            <w:tcMar>
+              <w:top w:type="dxa" w:w="40"/>
+              <w:left w:type="dxa" w:w="80"/>
+              <w:bottom w:type="dxa" w:w="40"/>
+              <w:right w:type="dxa" w:w="80"/>
+            </w:tcMar>
+          </w:tcPr>
+          <w:p>
+            <w:pPr>
+              <w:spacing w:after="0"/>
+            </w:pPr>
+            <w:r>
+              <w:rPr>
+                <w:rFonts w:ascii="Times New Roman" w:cs="Times New Roman" w:eastAsia="Times New Roman" w:hAnsi="Times New Roman"/>
+                <w:b/>
+                <w:bCs/>
+                <w:sz w:val="20"/>
+                <w:szCs w:val="20"/>
+              </w:rPr>
+              <w:t xml:space="preserve">Result</w:t>
+            </w:r>
+          </w:p>
+        </w:tc>
+      </w:tr>
+      <w:tr>
+        <w:tc>
+          <w:tcPr>
+            <w:tcW w:type="dxa" w:w="1905"/>
+            <w:tcBorders>
+              <w:top w:val="single" w:color="808080" w:sz="4"/>
+              <w:left w:val="single" w:color="808080" w:sz="4"/>
+              <w:bottom w:val="single" w:color="808080" w:sz="4"/>
+              <w:right w:val="single" w:color="808080" w:sz="4"/>
+            </w:tcBorders>
+            <w:tcMar>
+              <w:top w:type="dxa" w:w="40"/>
+              <w:left w:type="dxa" w:w="80"/>
+              <w:bottom w:type="dxa" w:w="40"/>
+              <w:right w:type="dxa" w:w="80"/>
+            </w:tcMar>
+          </w:tcPr>
+          <w:p>
+            <w:pPr>
+              <w:spacing w:after="0"/>
+            </w:pPr>
+            <w:r>
+              <w:rPr>
+                <w:rFonts w:ascii="Times New Roman" w:cs="Times New Roman" w:eastAsia="Times New Roman" w:hAnsi="Times New Roman"/>
+                <w:sz w:val="20"/>
+                <w:szCs w:val="20"/>
+              </w:rPr>
+              <w:t xml:space="preserve">Cold start</w:t>
+            </w:r>
+          </w:p>
+        </w:tc>
+        <w:tc>
+          <w:tcPr>
+            <w:tcW w:type="dxa" w:w="5415"/>
+            <w:tcBorders>
+              <w:top w:val="single" w:color="808080" w:sz="4"/>
+              <w:left w:val="single" w:color="808080" w:sz="4"/>
+              <w:bottom w:val="single" w:color="808080" w:sz="4"/>
+              <w:right w:val="single" w:color="808080" w:sz="4"/>
+            </w:tcBorders>
+            <w:tcMar>
+              <w:top w:type="dxa" w:w="40"/>
+              <w:left w:type="dxa" w:w="80"/>
+              <w:bottom w:type="dxa" w:w="40"/>
+              <w:right w:type="dxa" w:w="80"/>
+            </w:tcMar>
+          </w:tcPr>
+          <w:p>
+            <w:pPr>
+              <w:spacing w:after="0"/>
+            </w:pPr>
+            <w:r>
+              <w:rPr>
+                <w:rFonts w:ascii="Times New Roman" w:cs="Times New Roman" w:eastAsia="Times New Roman" w:hAnsi="Times New Roman"/>
+                <w:sz w:val="20"/>
+                <w:szCs w:val="20"/>
+              </w:rPr>
+              <w:t xml:space="preserve">Server boots, the title sequence plays, the site takes over with its text visible</w:t>
+            </w:r>
+          </w:p>
+        </w:tc>
+        <w:tc>
+          <w:tcPr>
+            <w:tcW w:type="dxa" w:w="1706"/>
+            <w:tcBorders>
+              <w:top w:val="single" w:color="808080" w:sz="4"/>
+              <w:left w:val="single" w:color="808080" w:sz="4"/>
+              <w:bottom w:val="single" w:color="808080" w:sz="4"/>
+              <w:right w:val="single" w:color="808080" w:sz="4"/>
+            </w:tcBorders>
+            <w:tcMar>
+              <w:top w:type="dxa" w:w="40"/>
+              <w:left w:type="dxa" w:w="80"/>
+              <w:bottom w:type="dxa" w:w="40"/>
+              <w:right w:type="dxa" w:w="80"/>
+            </w:tcMar>
+          </w:tcPr>
+          <w:p>
+            <w:pPr>
+              <w:spacing w:after="0"/>
+            </w:pPr>
+            <w:r>
+              <w:rPr>
+                <w:rFonts w:ascii="Times New Roman" w:cs="Times New Roman" w:eastAsia="Times New Roman" w:hAnsi="Times New Roman"/>
+                <w:sz w:val="20"/>
+                <w:szCs w:val="20"/>
+              </w:rPr>
+              <w:t xml:space="preserve">Pass</w:t>
+            </w:r>
+          </w:p>
+        </w:tc>
+      </w:tr>
+      <w:tr>
+        <w:tc>
+          <w:tcPr>
+            <w:tcW w:type="dxa" w:w="1905"/>
+            <w:tcBorders>
+              <w:top w:val="single" w:color="808080" w:sz="4"/>
+              <w:left w:val="single" w:color="808080" w:sz="4"/>
+              <w:bottom w:val="single" w:color="808080" w:sz="4"/>
+              <w:right w:val="single" w:color="808080" w:sz="4"/>
+            </w:tcBorders>
+            <w:tcMar>
+              <w:top w:type="dxa" w:w="40"/>
+              <w:left w:type="dxa" w:w="80"/>
+              <w:bottom w:type="dxa" w:w="40"/>
+              <w:right w:type="dxa" w:w="80"/>
+            </w:tcMar>
+          </w:tcPr>
+          <w:p>
+            <w:pPr>
+              <w:spacing w:after="0"/>
+            </w:pPr>
+            <w:r>
+              <w:rPr>
+                <w:rFonts w:ascii="Times New Roman" w:cs="Times New Roman" w:eastAsia="Times New Roman" w:hAnsi="Times New Roman"/>
+                <w:sz w:val="20"/>
+                <w:szCs w:val="20"/>
+              </w:rPr>
+              <w:t xml:space="preserve">Reload behaviour</w:t>
+            </w:r>
+          </w:p>
+        </w:tc>
+        <w:tc>
+          <w:tcPr>
+            <w:tcW w:type="dxa" w:w="5415"/>
+            <w:tcBorders>
+              <w:top w:val="single" w:color="808080" w:sz="4"/>
+              <w:left w:val="single" w:color="808080" w:sz="4"/>
+              <w:bottom w:val="single" w:color="808080" w:sz="4"/>
+              <w:right w:val="single" w:color="808080" w:sz="4"/>
+            </w:tcBorders>
+            <w:tcMar>
+              <w:top w:type="dxa" w:w="40"/>
+              <w:left w:type="dxa" w:w="80"/>
+              <w:bottom w:type="dxa" w:w="40"/>
+              <w:right w:type="dxa" w:w="80"/>
+            </w:tcMar>
+          </w:tcPr>
+          <w:p>
+            <w:pPr>
+              <w:spacing w:after="0"/>
+            </w:pPr>
+            <w:r>
+              <w:rPr>
+                <w:rFonts w:ascii="Times New Roman" w:cs="Times New Roman" w:eastAsia="Times New Roman" w:hAnsi="Times New Roman"/>
+                <w:sz w:val="20"/>
+                <w:szCs w:val="20"/>
+              </w:rPr>
+              <w:t xml:space="preserve">The sequence plays on every reload and survives a held Enter key; a direct </w:t>
+            </w:r>
+            <w:r>
+              <w:rPr>
+                <w:rFonts w:ascii="Consolas" w:cs="Consolas" w:eastAsia="Consolas" w:hAnsi="Consolas"/>
+                <w:sz w:val="20"/>
+                <w:szCs w:val="20"/>
+              </w:rPr>
+              <w:t xml:space="preserve">#page</w:t>
+            </w:r>
+            <w:r>
+              <w:rPr>
+                <w:rFonts w:ascii="Times New Roman" w:cs="Times New Roman" w:eastAsia="Times New Roman" w:hAnsi="Times New Roman"/>
+                <w:sz w:val="20"/>
+                <w:szCs w:val="20"/>
+              </w:rPr>
+              <w:t xml:space="preserve"> link loads with that page behind it</w:t>
+            </w:r>
+          </w:p>
+        </w:tc>
+        <w:tc>
+          <w:tcPr>
+            <w:tcW w:type="dxa" w:w="1706"/>
+            <w:tcBorders>
+              <w:top w:val="single" w:color="808080" w:sz="4"/>
+              <w:left w:val="single" w:color="808080" w:sz="4"/>
+              <w:bottom w:val="single" w:color="808080" w:sz="4"/>
+              <w:right w:val="single" w:color="808080" w:sz="4"/>
+            </w:tcBorders>
+            <w:tcMar>
+              <w:top w:type="dxa" w:w="40"/>
+              <w:left w:type="dxa" w:w="80"/>
+              <w:bottom w:type="dxa" w:w="40"/>
+              <w:right w:type="dxa" w:w="80"/>
+            </w:tcMar>
+          </w:tcPr>
+          <w:p>
+            <w:pPr>
+              <w:spacing w:after="0"/>
+            </w:pPr>
+            <w:r>
+              <w:rPr>
+                <w:rFonts w:ascii="Times New Roman" w:cs="Times New Roman" w:eastAsia="Times New Roman" w:hAnsi="Times New Roman"/>
+                <w:sz w:val="20"/>
+                <w:szCs w:val="20"/>
+              </w:rPr>
+              <w:t xml:space="preserve">Pass</w:t>
+            </w:r>
+          </w:p>
+        </w:tc>
+      </w:tr>
+      <w:tr>
+        <w:tc>
+          <w:tcPr>
+            <w:tcW w:type="dxa" w:w="1905"/>
+            <w:tcBorders>
+              <w:top w:val="single" w:color="808080" w:sz="4"/>
+              <w:left w:val="single" w:color="808080" w:sz="4"/>
+              <w:bottom w:val="single" w:color="808080" w:sz="4"/>
+              <w:right w:val="single" w:color="808080" w:sz="4"/>
+            </w:tcBorders>
+            <w:tcMar>
+              <w:top w:type="dxa" w:w="40"/>
+              <w:left w:type="dxa" w:w="80"/>
+              <w:bottom w:type="dxa" w:w="40"/>
+              <w:right w:type="dxa" w:w="80"/>
+            </w:tcMar>
+          </w:tcPr>
+          <w:p>
+            <w:pPr>
+              <w:spacing w:after="0"/>
+            </w:pPr>
+            <w:r>
+              <w:rPr>
+                <w:rFonts w:ascii="Times New Roman" w:cs="Times New Roman" w:eastAsia="Times New Roman" w:hAnsi="Times New Roman"/>
+                <w:sz w:val="20"/>
+                <w:szCs w:val="20"/>
+              </w:rPr>
+              <w:t xml:space="preserve">Skip paths</w:t>
+            </w:r>
+          </w:p>
+        </w:tc>
+        <w:tc>
+          <w:tcPr>
+            <w:tcW w:type="dxa" w:w="5415"/>
+            <w:tcBorders>
+              <w:top w:val="single" w:color="808080" w:sz="4"/>
+              <w:left w:val="single" w:color="808080" w:sz="4"/>
+              <w:bottom w:val="single" w:color="808080" w:sz="4"/>
+              <w:right w:val="single" w:color="808080" w:sz="4"/>
+            </w:tcBorders>
+            <w:tcMar>
+              <w:top w:type="dxa" w:w="40"/>
+              <w:left w:type="dxa" w:w="80"/>
+              <w:bottom w:type="dxa" w:w="40"/>
+              <w:right w:type="dxa" w:w="80"/>
+            </w:tcMar>
+          </w:tcPr>
+          <w:p>
+            <w:pPr>
+              <w:spacing w:after="0"/>
+            </w:pPr>
+            <w:r>
+              <w:rPr>
+                <w:rFonts w:ascii="Times New Roman" w:cs="Times New Roman" w:eastAsia="Times New Roman" w:hAnsi="Times New Roman"/>
+                <w:sz w:val="20"/>
+                <w:szCs w:val="20"/>
+              </w:rPr>
+              <w:t xml:space="preserve">Skip button, Enter, Space and Escape, and replaying the sequence from the footer</w:t>
+            </w:r>
+          </w:p>
+        </w:tc>
+        <w:tc>
+          <w:tcPr>
+            <w:tcW w:type="dxa" w:w="1706"/>
+            <w:tcBorders>
+              <w:top w:val="single" w:color="808080" w:sz="4"/>
+              <w:left w:val="single" w:color="808080" w:sz="4"/>
+              <w:bottom w:val="single" w:color="808080" w:sz="4"/>
+              <w:right w:val="single" w:color="808080" w:sz="4"/>
+            </w:tcBorders>
+            <w:tcMar>
+              <w:top w:type="dxa" w:w="40"/>
+              <w:left w:type="dxa" w:w="80"/>
+              <w:bottom w:type="dxa" w:w="40"/>
+              <w:right w:type="dxa" w:w="80"/>
+            </w:tcMar>
+          </w:tcPr>
+          <w:p>
+            <w:pPr>
+              <w:spacing w:after="0"/>
+            </w:pPr>
+            <w:r>
+              <w:rPr>
+                <w:rFonts w:ascii="Times New Roman" w:cs="Times New Roman" w:eastAsia="Times New Roman" w:hAnsi="Times New Roman"/>
+                <w:sz w:val="20"/>
+                <w:szCs w:val="20"/>
+              </w:rPr>
+              <w:t xml:space="preserve">Pass</w:t>
+            </w:r>
+          </w:p>
+        </w:tc>
+      </w:tr>
+      <w:tr>
+        <w:tc>
+          <w:tcPr>
+            <w:tcW w:type="dxa" w:w="1905"/>
+            <w:tcBorders>
+              <w:top w:val="single" w:color="808080" w:sz="4"/>
+              <w:left w:val="single" w:color="808080" w:sz="4"/>
+              <w:bottom w:val="single" w:color="808080" w:sz="4"/>
+              <w:right w:val="single" w:color="808080" w:sz="4"/>
+            </w:tcBorders>
+            <w:tcMar>
+              <w:top w:type="dxa" w:w="40"/>
+              <w:left w:type="dxa" w:w="80"/>
+              <w:bottom w:type="dxa" w:w="40"/>
+              <w:right w:type="dxa" w:w="80"/>
+            </w:tcMar>
+          </w:tcPr>
+          <w:p>
+            <w:pPr>
+              <w:spacing w:after="0"/>
+            </w:pPr>
+            <w:r>
+              <w:rPr>
+                <w:rFonts w:ascii="Times New Roman" w:cs="Times New Roman" w:eastAsia="Times New Roman" w:hAnsi="Times New Roman"/>
+                <w:sz w:val="20"/>
+                <w:szCs w:val="20"/>
+              </w:rPr>
+              <w:t xml:space="preserve">Simulator replay</w:t>
+            </w:r>
+          </w:p>
+        </w:tc>
+        <w:tc>
+          <w:tcPr>
+            <w:tcW w:type="dxa" w:w="5415"/>
+            <w:tcBorders>
+              <w:top w:val="single" w:color="808080" w:sz="4"/>
+              <w:left w:val="single" w:color="808080" w:sz="4"/>
+              <w:bottom w:val="single" w:color="808080" w:sz="4"/>
+              <w:right w:val="single" w:color="808080" w:sz="4"/>
+            </w:tcBorders>
+            <w:tcMar>
+              <w:top w:type="dxa" w:w="40"/>
+              <w:left w:type="dxa" w:w="80"/>
+              <w:bottom w:type="dxa" w:w="40"/>
+              <w:right w:type="dxa" w:w="80"/>
+            </w:tcMar>
+          </w:tcPr>
+          <w:p>
+            <w:pPr>
+              <w:spacing w:after="0"/>
+            </w:pPr>
+            <w:r>
+              <w:rPr>
+                <w:rFonts w:ascii="Times New Roman" w:cs="Times New Roman" w:eastAsia="Times New Roman" w:hAnsi="Times New Roman"/>
+                <w:sz w:val="20"/>
+                <w:szCs w:val="20"/>
+              </w:rPr>
+              <w:t xml:space="preserve">Catalogue of 5 policies × 3 rates × 100 days; P2 (N=4) on test-000 ends at 125 s tail latency, 0.128 ADA per user, 49 % locked and 0 expired; play, pause, step and scrub by button and keyboard</w:t>
+            </w:r>
+          </w:p>
+        </w:tc>
+        <w:tc>
+          <w:tcPr>
+            <w:tcW w:type="dxa" w:w="1706"/>
+            <w:tcBorders>
+              <w:top w:val="single" w:color="808080" w:sz="4"/>
+              <w:left w:val="single" w:color="808080" w:sz="4"/>
+              <w:bottom w:val="single" w:color="808080" w:sz="4"/>
+              <w:right w:val="single" w:color="808080" w:sz="4"/>
+            </w:tcBorders>
+            <w:tcMar>
+              <w:top w:type="dxa" w:w="40"/>
+              <w:left w:type="dxa" w:w="80"/>
+              <w:bottom w:type="dxa" w:w="40"/>
+              <w:right w:type="dxa" w:w="80"/>
+            </w:tcMar>
+          </w:tcPr>
+          <w:p>
+            <w:pPr>
+              <w:spacing w:after="0"/>
+            </w:pPr>
+            <w:r>
+              <w:rPr>
+                <w:rFonts w:ascii="Times New Roman" w:cs="Times New Roman" w:eastAsia="Times New Roman" w:hAnsi="Times New Roman"/>
+                <w:sz w:val="20"/>
+                <w:szCs w:val="20"/>
+              </w:rPr>
+              <w:t xml:space="preserve">Pass</w:t>
+            </w:r>
+          </w:p>
+        </w:tc>
+      </w:tr>
+      <w:tr>
+        <w:tc>
+          <w:tcPr>
+            <w:tcW w:type="dxa" w:w="1905"/>
+            <w:tcBorders>
+              <w:top w:val="single" w:color="808080" w:sz="4"/>
+              <w:left w:val="single" w:color="808080" w:sz="4"/>
+              <w:bottom w:val="single" w:color="808080" w:sz="4"/>
+              <w:right w:val="single" w:color="808080" w:sz="4"/>
+            </w:tcBorders>
+            <w:tcMar>
+              <w:top w:type="dxa" w:w="40"/>
+              <w:left w:type="dxa" w:w="80"/>
+              <w:bottom w:type="dxa" w:w="40"/>
+              <w:right w:type="dxa" w:w="80"/>
+            </w:tcMar>
+          </w:tcPr>
+          <w:p>
+            <w:pPr>
+              <w:spacing w:after="0"/>
+            </w:pPr>
+            <w:r>
+              <w:rPr>
+                <w:rFonts w:ascii="Times New Roman" w:cs="Times New Roman" w:eastAsia="Times New Roman" w:hAnsi="Times New Roman"/>
+                <w:sz w:val="20"/>
+                <w:szCs w:val="20"/>
+              </w:rPr>
+              <w:t xml:space="preserve">Results correctness</w:t>
+            </w:r>
+          </w:p>
+        </w:tc>
+        <w:tc>
+          <w:tcPr>
+            <w:tcW w:type="dxa" w:w="5415"/>
+            <w:tcBorders>
+              <w:top w:val="single" w:color="808080" w:sz="4"/>
+              <w:left w:val="single" w:color="808080" w:sz="4"/>
+              <w:bottom w:val="single" w:color="808080" w:sz="4"/>
+              <w:right w:val="single" w:color="808080" w:sz="4"/>
+            </w:tcBorders>
+            <w:tcMar>
+              <w:top w:type="dxa" w:w="40"/>
+              <w:left w:type="dxa" w:w="80"/>
+              <w:bottom w:type="dxa" w:w="40"/>
+              <w:right w:type="dxa" w:w="80"/>
+            </w:tcMar>
+          </w:tcPr>
+          <w:p>
+            <w:pPr>
+              <w:spacing w:after="0"/>
+            </w:pPr>
+            <w:r>
+              <w:rPr>
+                <w:rFonts w:ascii="Times New Roman" w:cs="Times New Roman" w:eastAsia="Times New Roman" w:hAnsi="Times New Roman"/>
+                <w:sz w:val="20"/>
+                <w:szCs w:val="20"/>
+              </w:rPr>
+              <w:t xml:space="preserve">Highlights and table match the recorded evaluation: greedy 119 s / 0.157 ADA, P2 125 s / 0.128 ADA, P3 159 s / 0.090 ADA, and E1 at 1,203 s under heavy load</w:t>
+            </w:r>
+          </w:p>
+        </w:tc>
+        <w:tc>
+          <w:tcPr>
+            <w:tcW w:type="dxa" w:w="1706"/>
+            <w:tcBorders>
+              <w:top w:val="single" w:color="808080" w:sz="4"/>
+              <w:left w:val="single" w:color="808080" w:sz="4"/>
+              <w:bottom w:val="single" w:color="808080" w:sz="4"/>
+              <w:right w:val="single" w:color="808080" w:sz="4"/>
+            </w:tcBorders>
+            <w:tcMar>
+              <w:top w:type="dxa" w:w="40"/>
+              <w:left w:type="dxa" w:w="80"/>
+              <w:bottom w:type="dxa" w:w="40"/>
+              <w:right w:type="dxa" w:w="80"/>
+            </w:tcMar>
+          </w:tcPr>
+          <w:p>
+            <w:pPr>
+              <w:spacing w:after="0"/>
+            </w:pPr>
+            <w:r>
+              <w:rPr>
+                <w:rFonts w:ascii="Times New Roman" w:cs="Times New Roman" w:eastAsia="Times New Roman" w:hAnsi="Times New Roman"/>
+                <w:sz w:val="20"/>
+                <w:szCs w:val="20"/>
+              </w:rPr>
+              <w:t xml:space="preserve">Pass</w:t>
+            </w:r>
+          </w:p>
+        </w:tc>
+      </w:tr>
+      <w:tr>
+        <w:tc>
+          <w:tcPr>
+            <w:tcW w:type="dxa" w:w="1905"/>
+            <w:tcBorders>
+              <w:top w:val="single" w:color="808080" w:sz="4"/>
+              <w:left w:val="single" w:color="808080" w:sz="4"/>
+              <w:bottom w:val="single" w:color="808080" w:sz="4"/>
+              <w:right w:val="single" w:color="808080" w:sz="4"/>
+            </w:tcBorders>
+            <w:tcMar>
+              <w:top w:type="dxa" w:w="40"/>
+              <w:left w:type="dxa" w:w="80"/>
+              <w:bottom w:type="dxa" w:w="40"/>
+              <w:right w:type="dxa" w:w="80"/>
+            </w:tcMar>
+          </w:tcPr>
+          <w:p>
+            <w:pPr>
+              <w:spacing w:after="0"/>
+            </w:pPr>
+            <w:r>
+              <w:rPr>
+                <w:rFonts w:ascii="Times New Roman" w:cs="Times New Roman" w:eastAsia="Times New Roman" w:hAnsi="Times New Roman"/>
+                <w:sz w:val="20"/>
+                <w:szCs w:val="20"/>
+              </w:rPr>
+              <w:t xml:space="preserve">Live view, online</w:t>
+            </w:r>
+          </w:p>
+        </w:tc>
+        <w:tc>
+          <w:tcPr>
+            <w:tcW w:type="dxa" w:w="5415"/>
+            <w:tcBorders>
+              <w:top w:val="single" w:color="808080" w:sz="4"/>
+              <w:left w:val="single" w:color="808080" w:sz="4"/>
+              <w:bottom w:val="single" w:color="808080" w:sz="4"/>
+              <w:right w:val="single" w:color="808080" w:sz="4"/>
+            </w:tcBorders>
+            <w:tcMar>
+              <w:top w:type="dxa" w:w="40"/>
+              <w:left w:type="dxa" w:w="80"/>
+              <w:bottom w:type="dxa" w:w="40"/>
+              <w:right w:type="dxa" w:w="80"/>
+            </w:tcMar>
+          </w:tcPr>
+          <w:p>
+            <w:pPr>
+              <w:spacing w:after="0"/>
+            </w:pPr>
+            <w:r>
+              <w:rPr>
+                <w:rFonts w:ascii="Times New Roman" w:cs="Times New Roman" w:eastAsia="Times New Roman" w:hAnsi="Times New Roman"/>
+                <w:sz w:val="20"/>
+                <w:szCs w:val="20"/>
+              </w:rPr>
+              <w:t xml:space="preserve">Pool of 110.00 tADA and 909,339 TEAM11 carrying its NFT, empty queue, four swap transactions with explorer links, working refresh</w:t>
+            </w:r>
+          </w:p>
+        </w:tc>
+        <w:tc>
+          <w:tcPr>
+            <w:tcW w:type="dxa" w:w="1706"/>
+            <w:tcBorders>
+              <w:top w:val="single" w:color="808080" w:sz="4"/>
+              <w:left w:val="single" w:color="808080" w:sz="4"/>
+              <w:bottom w:val="single" w:color="808080" w:sz="4"/>
+              <w:right w:val="single" w:color="808080" w:sz="4"/>
+            </w:tcBorders>
+            <w:tcMar>
+              <w:top w:type="dxa" w:w="40"/>
+              <w:left w:type="dxa" w:w="80"/>
+              <w:bottom w:type="dxa" w:w="40"/>
+              <w:right w:type="dxa" w:w="80"/>
+            </w:tcMar>
+          </w:tcPr>
+          <w:p>
+            <w:pPr>
+              <w:spacing w:after="0"/>
+            </w:pPr>
+            <w:r>
+              <w:rPr>
+                <w:rFonts w:ascii="Times New Roman" w:cs="Times New Roman" w:eastAsia="Times New Roman" w:hAnsi="Times New Roman"/>
+                <w:sz w:val="20"/>
+                <w:szCs w:val="20"/>
+              </w:rPr>
+              <w:t xml:space="preserve">Pass</w:t>
+            </w:r>
+          </w:p>
+        </w:tc>
+      </w:tr>
+      <w:tr>
+        <w:tc>
+          <w:tcPr>
+            <w:tcW w:type="dxa" w:w="1905"/>
+            <w:tcBorders>
+              <w:top w:val="single" w:color="808080" w:sz="4"/>
+              <w:left w:val="single" w:color="808080" w:sz="4"/>
+              <w:bottom w:val="single" w:color="808080" w:sz="4"/>
+              <w:right w:val="single" w:color="808080" w:sz="4"/>
+            </w:tcBorders>
+            <w:tcMar>
+              <w:top w:type="dxa" w:w="40"/>
+              <w:left w:type="dxa" w:w="80"/>
+              <w:bottom w:type="dxa" w:w="40"/>
+              <w:right w:type="dxa" w:w="80"/>
+            </w:tcMar>
+          </w:tcPr>
+          <w:p>
+            <w:pPr>
+              <w:spacing w:after="0"/>
+            </w:pPr>
+            <w:r>
+              <w:rPr>
+                <w:rFonts w:ascii="Times New Roman" w:cs="Times New Roman" w:eastAsia="Times New Roman" w:hAnsi="Times New Roman"/>
+                <w:sz w:val="20"/>
+                <w:szCs w:val="20"/>
+              </w:rPr>
+              <w:t xml:space="preserve">Live view, offline</w:t>
+            </w:r>
+          </w:p>
+        </w:tc>
+        <w:tc>
+          <w:tcPr>
+            <w:tcW w:type="dxa" w:w="5415"/>
+            <w:tcBorders>
+              <w:top w:val="single" w:color="808080" w:sz="4"/>
+              <w:left w:val="single" w:color="808080" w:sz="4"/>
+              <w:bottom w:val="single" w:color="808080" w:sz="4"/>
+              <w:right w:val="single" w:color="808080" w:sz="4"/>
+            </w:tcBorders>
+            <w:tcMar>
+              <w:top w:type="dxa" w:w="40"/>
+              <w:left w:type="dxa" w:w="80"/>
+              <w:bottom w:type="dxa" w:w="40"/>
+              <w:right w:type="dxa" w:w="80"/>
+            </w:tcMar>
+          </w:tcPr>
+          <w:p>
+            <w:pPr>
+              <w:spacing w:after="0"/>
+            </w:pPr>
+            <w:r>
+              <w:rPr>
+                <w:rFonts w:ascii="Times New Roman" w:cs="Times New Roman" w:eastAsia="Times New Roman" w:hAnsi="Times New Roman"/>
+                <w:sz w:val="20"/>
+                <w:szCs w:val="20"/>
+              </w:rPr>
+              <w:t xml:space="preserve">With an invalid project token the view reports the failure and still lists the four recorded transactions, as valid JSON</w:t>
+            </w:r>
+          </w:p>
+        </w:tc>
+        <w:tc>
+          <w:tcPr>
+            <w:tcW w:type="dxa" w:w="1706"/>
+            <w:tcBorders>
+              <w:top w:val="single" w:color="808080" w:sz="4"/>
+              <w:left w:val="single" w:color="808080" w:sz="4"/>
+              <w:bottom w:val="single" w:color="808080" w:sz="4"/>
+              <w:right w:val="single" w:color="808080" w:sz="4"/>
+            </w:tcBorders>
+            <w:tcMar>
+              <w:top w:type="dxa" w:w="40"/>
+              <w:left w:type="dxa" w:w="80"/>
+              <w:bottom w:type="dxa" w:w="40"/>
+              <w:right w:type="dxa" w:w="80"/>
+            </w:tcMar>
+          </w:tcPr>
+          <w:p>
+            <w:pPr>
+              <w:spacing w:after="0"/>
+            </w:pPr>
+            <w:r>
+              <w:rPr>
+                <w:rFonts w:ascii="Times New Roman" w:cs="Times New Roman" w:eastAsia="Times New Roman" w:hAnsi="Times New Roman"/>
+                <w:sz w:val="20"/>
+                <w:szCs w:val="20"/>
+              </w:rPr>
+              <w:t xml:space="preserve">Pass</w:t>
+            </w:r>
+          </w:p>
+        </w:tc>
+      </w:tr>
+      <w:tr>
+        <w:tc>
+          <w:tcPr>
+            <w:tcW w:type="dxa" w:w="1905"/>
+            <w:tcBorders>
+              <w:top w:val="single" w:color="808080" w:sz="4"/>
+              <w:left w:val="single" w:color="808080" w:sz="4"/>
+              <w:bottom w:val="single" w:color="808080" w:sz="4"/>
+              <w:right w:val="single" w:color="808080" w:sz="4"/>
+            </w:tcBorders>
+            <w:tcMar>
+              <w:top w:type="dxa" w:w="40"/>
+              <w:left w:type="dxa" w:w="80"/>
+              <w:bottom w:type="dxa" w:w="40"/>
+              <w:right w:type="dxa" w:w="80"/>
+            </w:tcMar>
+          </w:tcPr>
+          <w:p>
+            <w:pPr>
+              <w:spacing w:after="0"/>
+            </w:pPr>
+            <w:r>
+              <w:rPr>
+                <w:rFonts w:ascii="Times New Roman" w:cs="Times New Roman" w:eastAsia="Times New Roman" w:hAnsi="Times New Roman"/>
+                <w:sz w:val="20"/>
+                <w:szCs w:val="20"/>
+              </w:rPr>
+              <w:t xml:space="preserve">Server robustness</w:t>
+            </w:r>
+          </w:p>
+        </w:tc>
+        <w:tc>
+          <w:tcPr>
+            <w:tcW w:type="dxa" w:w="5415"/>
+            <w:tcBorders>
+              <w:top w:val="single" w:color="808080" w:sz="4"/>
+              <w:left w:val="single" w:color="808080" w:sz="4"/>
+              <w:bottom w:val="single" w:color="808080" w:sz="4"/>
+              <w:right w:val="single" w:color="808080" w:sz="4"/>
+            </w:tcBorders>
+            <w:tcMar>
+              <w:top w:type="dxa" w:w="40"/>
+              <w:left w:type="dxa" w:w="80"/>
+              <w:bottom w:type="dxa" w:w="40"/>
+              <w:right w:type="dxa" w:w="80"/>
+            </w:tcMar>
+          </w:tcPr>
+          <w:p>
+            <w:pPr>
+              <w:spacing w:after="0"/>
+            </w:pPr>
+            <w:r>
+              <w:rPr>
+                <w:rFonts w:ascii="Times New Roman" w:cs="Times New Roman" w:eastAsia="Times New Roman" w:hAnsi="Times New Roman"/>
+                <w:sz w:val="20"/>
+                <w:szCs w:val="20"/>
+              </w:rPr>
+              <w:t xml:space="preserve">Traversal and unknown paths 404, malformed replay 400, busy port refused with guidance, non-loopback bind refused</w:t>
+            </w:r>
+          </w:p>
+        </w:tc>
+        <w:tc>
+          <w:tcPr>
+            <w:tcW w:type="dxa" w:w="1706"/>
+            <w:tcBorders>
+              <w:top w:val="single" w:color="808080" w:sz="4"/>
+              <w:left w:val="single" w:color="808080" w:sz="4"/>
+              <w:bottom w:val="single" w:color="808080" w:sz="4"/>
+              <w:right w:val="single" w:color="808080" w:sz="4"/>
+            </w:tcBorders>
+            <w:tcMar>
+              <w:top w:type="dxa" w:w="40"/>
+              <w:left w:type="dxa" w:w="80"/>
+              <w:bottom w:type="dxa" w:w="40"/>
+              <w:right w:type="dxa" w:w="80"/>
+            </w:tcMar>
+          </w:tcPr>
+          <w:p>
+            <w:pPr>
+              <w:spacing w:after="0"/>
+            </w:pPr>
+            <w:r>
+              <w:rPr>
+                <w:rFonts w:ascii="Times New Roman" w:cs="Times New Roman" w:eastAsia="Times New Roman" w:hAnsi="Times New Roman"/>
+                <w:sz w:val="20"/>
+                <w:szCs w:val="20"/>
+              </w:rPr>
+              <w:t xml:space="preserve">Pass</w:t>
+            </w:r>
+          </w:p>
+        </w:tc>
+      </w:tr>
+      <w:tr>
+        <w:tc>
+          <w:tcPr>
+            <w:tcW w:type="dxa" w:w="1905"/>
+            <w:tcBorders>
+              <w:top w:val="single" w:color="808080" w:sz="4"/>
+              <w:left w:val="single" w:color="808080" w:sz="4"/>
+              <w:bottom w:val="single" w:color="808080" w:sz="4"/>
+              <w:right w:val="single" w:color="808080" w:sz="4"/>
+            </w:tcBorders>
+            <w:tcMar>
+              <w:top w:type="dxa" w:w="40"/>
+              <w:left w:type="dxa" w:w="80"/>
+              <w:bottom w:type="dxa" w:w="40"/>
+              <w:right w:type="dxa" w:w="80"/>
+            </w:tcMar>
+          </w:tcPr>
+          <w:p>
+            <w:pPr>
+              <w:spacing w:after="0"/>
+            </w:pPr>
+            <w:r>
+              <w:rPr>
+                <w:rFonts w:ascii="Times New Roman" w:cs="Times New Roman" w:eastAsia="Times New Roman" w:hAnsi="Times New Roman"/>
+                <w:sz w:val="20"/>
+                <w:szCs w:val="20"/>
+              </w:rPr>
+              <w:t xml:space="preserve">Phone and tablet</w:t>
+            </w:r>
+          </w:p>
+        </w:tc>
+        <w:tc>
+          <w:tcPr>
+            <w:tcW w:type="dxa" w:w="5415"/>
+            <w:tcBorders>
+              <w:top w:val="single" w:color="808080" w:sz="4"/>
+              <w:left w:val="single" w:color="808080" w:sz="4"/>
+              <w:bottom w:val="single" w:color="808080" w:sz="4"/>
+              <w:right w:val="single" w:color="808080" w:sz="4"/>
+            </w:tcBorders>
+            <w:tcMar>
+              <w:top w:type="dxa" w:w="40"/>
+              <w:left w:type="dxa" w:w="80"/>
+              <w:bottom w:type="dxa" w:w="40"/>
+              <w:right w:type="dxa" w:w="80"/>
+            </w:tcMar>
+          </w:tcPr>
+          <w:p>
+            <w:pPr>
+              <w:spacing w:after="0"/>
+            </w:pPr>
+            <w:r>
+              <w:rPr>
+                <w:rFonts w:ascii="Times New Roman" w:cs="Times New Roman" w:eastAsia="Times New Roman" w:hAnsi="Times New Roman"/>
+                <w:sz w:val="20"/>
+                <w:szCs w:val="20"/>
+              </w:rPr>
+              <w:t xml:space="preserve">At 375 px and 768 px nothing overflows on any view, the page never scrolls sideways, and the selected tab scrolls into view</w:t>
+            </w:r>
+          </w:p>
+        </w:tc>
+        <w:tc>
+          <w:tcPr>
+            <w:tcW w:type="dxa" w:w="1706"/>
+            <w:tcBorders>
+              <w:top w:val="single" w:color="808080" w:sz="4"/>
+              <w:left w:val="single" w:color="808080" w:sz="4"/>
+              <w:bottom w:val="single" w:color="808080" w:sz="4"/>
+              <w:right w:val="single" w:color="808080" w:sz="4"/>
+            </w:tcBorders>
+            <w:tcMar>
+              <w:top w:type="dxa" w:w="40"/>
+              <w:left w:type="dxa" w:w="80"/>
+              <w:bottom w:type="dxa" w:w="40"/>
+              <w:right w:type="dxa" w:w="80"/>
+            </w:tcMar>
+          </w:tcPr>
+          <w:p>
+            <w:pPr>
+              <w:spacing w:after="0"/>
+            </w:pPr>
+            <w:r>
+              <w:rPr>
+                <w:rFonts w:ascii="Times New Roman" w:cs="Times New Roman" w:eastAsia="Times New Roman" w:hAnsi="Times New Roman"/>
+                <w:sz w:val="20"/>
+                <w:szCs w:val="20"/>
+              </w:rPr>
+              <w:t xml:space="preserve">Pass</w:t>
+            </w:r>
+          </w:p>
+        </w:tc>
+      </w:tr>
+      <w:tr>
+        <w:tc>
+          <w:tcPr>
+            <w:tcW w:type="dxa" w:w="1905"/>
+            <w:tcBorders>
+              <w:top w:val="single" w:color="808080" w:sz="4"/>
+              <w:left w:val="single" w:color="808080" w:sz="4"/>
+              <w:bottom w:val="single" w:color="808080" w:sz="4"/>
+              <w:right w:val="single" w:color="808080" w:sz="4"/>
+            </w:tcBorders>
+            <w:tcMar>
+              <w:top w:type="dxa" w:w="40"/>
+              <w:left w:type="dxa" w:w="80"/>
+              <w:bottom w:type="dxa" w:w="40"/>
+              <w:right w:type="dxa" w:w="80"/>
+            </w:tcMar>
+          </w:tcPr>
+          <w:p>
+            <w:pPr>
+              <w:spacing w:after="0"/>
+            </w:pPr>
+            <w:r>
+              <w:rPr>
+                <w:rFonts w:ascii="Times New Roman" w:cs="Times New Roman" w:eastAsia="Times New Roman" w:hAnsi="Times New Roman"/>
+                <w:sz w:val="20"/>
+                <w:szCs w:val="20"/>
+              </w:rPr>
+              <w:t xml:space="preserve">Reduced motion</w:t>
+            </w:r>
+          </w:p>
+        </w:tc>
+        <w:tc>
+          <w:tcPr>
+            <w:tcW w:type="dxa" w:w="5415"/>
+            <w:tcBorders>
+              <w:top w:val="single" w:color="808080" w:sz="4"/>
+              <w:left w:val="single" w:color="808080" w:sz="4"/>
+              <w:bottom w:val="single" w:color="808080" w:sz="4"/>
+              <w:right w:val="single" w:color="808080" w:sz="4"/>
+            </w:tcBorders>
+            <w:tcMar>
+              <w:top w:type="dxa" w:w="40"/>
+              <w:left w:type="dxa" w:w="80"/>
+              <w:bottom w:type="dxa" w:w="40"/>
+              <w:right w:type="dxa" w:w="80"/>
+            </w:tcMar>
+          </w:tcPr>
+          <w:p>
+            <w:pPr>
+              <w:spacing w:after="0"/>
+            </w:pPr>
+            <w:r>
+              <w:rPr>
+                <w:rFonts w:ascii="Times New Roman" w:cs="Times New Roman" w:eastAsia="Times New Roman" w:hAnsi="Times New Roman"/>
+                <w:sz w:val="20"/>
+                <w:szCs w:val="20"/>
+              </w:rPr>
+              <w:t xml:space="preserve">Animation suppressed and the content still readable</w:t>
+            </w:r>
+          </w:p>
+        </w:tc>
+        <w:tc>
+          <w:tcPr>
+            <w:tcW w:type="dxa" w:w="1706"/>
+            <w:tcBorders>
+              <w:top w:val="single" w:color="808080" w:sz="4"/>
+              <w:left w:val="single" w:color="808080" w:sz="4"/>
+              <w:bottom w:val="single" w:color="808080" w:sz="4"/>
+              <w:right w:val="single" w:color="808080" w:sz="4"/>
+            </w:tcBorders>
+            <w:tcMar>
+              <w:top w:type="dxa" w:w="40"/>
+              <w:left w:type="dxa" w:w="80"/>
+              <w:bottom w:type="dxa" w:w="40"/>
+              <w:right w:type="dxa" w:w="80"/>
+            </w:tcMar>
+          </w:tcPr>
+          <w:p>
+            <w:pPr>
+              <w:spacing w:after="0"/>
+            </w:pPr>
+            <w:r>
+              <w:rPr>
+                <w:rFonts w:ascii="Times New Roman" w:cs="Times New Roman" w:eastAsia="Times New Roman" w:hAnsi="Times New Roman"/>
+                <w:sz w:val="20"/>
+                <w:szCs w:val="20"/>
+              </w:rPr>
+              <w:t xml:space="preserve">Verified by inspection</w:t>
             </w:r>
           </w:p>
         </w:tc>
@@ -48198,6 +50384,30 @@
           <w:rFonts w:ascii="Times New Roman" w:cs="Times New Roman" w:eastAsia="Times New Roman" w:hAnsi="Times New Roman"/>
         </w:rPr>
         <w:t xml:space="preserve"> with run manifests, checksummed data and pre-registered non-parametric statistics.</w:t>
+      </w:r>
+    </w:p>
+    <w:p>
+      <w:pPr>
+        <w:pStyle w:val="ListParagraph"/>
+        <w:numPr>
+          <w:ilvl w:val="0"/>
+          <w:numId w:val="4"/>
+        </w:numPr>
+        <w:spacing w:after="60" w:line="312"/>
+      </w:pPr>
+      <w:r>
+        <w:rPr>
+          <w:rFonts w:ascii="Times New Roman" w:cs="Times New Roman" w:eastAsia="Times New Roman" w:hAnsi="Times New Roman"/>
+          <w:b/>
+          <w:bCs/>
+        </w:rPr>
+        <w:t xml:space="preserve">A local, read-only dashboard</w:t>
+      </w:r>
+      <w:r>
+        <w:rPr>
+          <w:rFonts w:ascii="Times New Roman" w:cs="Times New Roman" w:eastAsia="Times New Roman" w:hAnsi="Times New Roman"/>
+        </w:rPr>
+        <w:t xml:space="preserve"> that replays a held-out day block by block, re-derives the comparison table from the committed evaluation and reads the deployed pool from preprod, so the work can be demonstrated without a single number being retyped (FR-15).</w:t>
       </w:r>
     </w:p>
     <w:p>

</xml_diff>

<commit_message>
Fit the dashboard section of the report on one page
Section 6.14 spilled a callout box onto an otherwise empty page before Chapter 7. The callout is folded into the opening paragraph and three sentences are tightened without dropping any fact, so the section fits on page 37 and the report is back to 66 pages. Checked on pages exported from Word.
</commit_message>
<xml_diff>
--- a/docs/report/Team11_Project_Report_Draft.docx
+++ b/docs/report/Team11_Project_Report_Draft.docx
@@ -18856,7 +18856,7 @@
         <w:rPr>
           <w:rFonts w:ascii="Times New Roman" w:cs="Times New Roman" w:eastAsia="Times New Roman" w:hAnsi="Times New Roman"/>
         </w:rPr>
-        <w:t xml:space="preserve">: every figure it shows is either recomputed at request time from the committed experiment artefacts, replayed through the simulator itself, or read from the chain. A number that changes in the repository therefore changes on the screen, and a number cannot be quietly edited into the presentation.</w:t>
+        <w:t xml:space="preserve">: every figure it shows is either recomputed at request time from the committed experiment artefacts, replayed through the simulator itself, or read from the chain. A number that changes in the repository therefore changes on the screen, and a number cannot be quietly edited into the presentation. Its agreement with Table 8.4 is asserted by a test that fails if either side moves.</w:t>
       </w:r>
     </w:p>
     <w:p>
@@ -19406,7 +19406,7 @@
         <w:rPr>
           <w:rFonts w:ascii="Times New Roman" w:cs="Times New Roman" w:eastAsia="Times New Roman" w:hAnsi="Times New Roman"/>
         </w:rPr>
-        <w:t xml:space="preserve">The server is standard library only: a threading HTTP server, four JSON routes and a fixed list of static files. It refuses to bind anything but the loopback interface, so the dashboard cannot be exposed on a network by configuration; it declines a port already in use rather than silently sharing it; unknown paths and attempts to escape the static directory return 404; a request made before the dataset has finished loading returns 503 with the loading message, and a malformed replay request returns 400. The episode library reads D1 in a background thread, so the page answers immediately and reports its own progress.</w:t>
+        <w:t xml:space="preserve">The server is standard library only: a threading HTTP server, four JSON routes and a fixed list of static files. It refuses to bind anything but the loopback interface, so the dashboard cannot be exposed on a network by configuration; it declines a port already in use rather than silently sharing it; unknown paths and attempts to escape the static directory return 404; a request made before the dataset has finished loading returns 503 with the loading message, and a malformed replay request returns 400. D1 loads in a background thread, so the page answers at once and reports its progress.</w:t>
       </w:r>
     </w:p>
     <w:p>
@@ -19418,7 +19418,7 @@
         <w:rPr>
           <w:rFonts w:ascii="Times New Roman" w:cs="Times New Roman" w:eastAsia="Times New Roman" w:hAnsi="Times New Roman"/>
         </w:rPr>
-        <w:t xml:space="preserve">The browser side is plain JavaScript with SVG and canvas — no framework, no build step and no content delivery network — so the Simulator and Results views work with no internet connection and only the Live view needs one. The interface opens with a short generated title sequence that can be skipped with a button, Enter, Space or Escape; the pages themselves use decoded headings, counted-up figures, reveal-on-scroll cards and a background of light strands that changes shape as the page scrolls. All of it is suppressed for viewers whose system asks for reduced motion, and the palette tokens are recorded in </w:t>
+        <w:t xml:space="preserve">The browser side is plain JavaScript with SVG and canvas — no framework, no build step and no content delivery network — so the Simulator and Results views work with no internet connection and only the Live view needs one. The interface opens with a short generated title sequence that can be skipped with a button, Enter, Space or Escape; the pages themselves use decoded headings, counted-up figures, reveal-on-scroll cards and a background of light strands that changes shape as the page scrolls. Motion is suppressed for viewers who request reduced motion, and the palette is recorded in </w:t>
       </w:r>
       <w:r>
         <w:rPr>
@@ -19432,52 +19432,8 @@
         <w:rPr>
           <w:rFonts w:ascii="Times New Roman" w:cs="Times New Roman" w:eastAsia="Times New Roman" w:hAnsi="Times New Roman"/>
         </w:rPr>
-        <w:t xml:space="preserve"> so the look can be restored or replaced without hunting through the stylesheet.</w:t>
-      </w:r>
-    </w:p>
-    <w:p>
-      <w:pPr>
-        <w:pBdr>
-          <w:top w:val="single" w:color="1F4E79" w:sz="4" w:space="6"/>
-          <w:left w:val="single" w:color="1F4E79" w:sz="12" w:space="6"/>
-        </w:pBdr>
-        <w:shd w:fill="EAF1F8" w:color="auto" w:val="clear"/>
-        <w:spacing w:after="0" w:line="312"/>
-        <w:ind w:left="200" w:right="200"/>
-        <w:jc w:val="both"/>
-      </w:pPr>
-      <w:r>
-        <w:rPr>
-          <w:rFonts w:ascii="Times New Roman" w:cs="Times New Roman" w:eastAsia="Times New Roman" w:hAnsi="Times New Roman"/>
-          <w:b/>
-          <w:bCs/>
-          <w:color w:val="1F4E79"/>
-        </w:rPr>
-        <w:t xml:space="preserve">Why the dashboard recomputes instead of storing</w:t>
-      </w:r>
-    </w:p>
-    <w:p>
-      <w:pPr>
-        <w:pBdr>
-          <w:bottom w:val="single" w:color="1F4E79" w:sz="4" w:space="6"/>
-          <w:left w:val="single" w:color="1F4E79" w:sz="12" w:space="6"/>
-        </w:pBdr>
-        <w:shd w:fill="EAF1F8" w:color="auto" w:val="clear"/>
-        <w:spacing w:after="0" w:line="312"/>
-        <w:ind w:left="200" w:right="200"/>
-        <w:jc w:val="both"/>
-      </w:pPr>
-      <w:r>
-        <w:rPr>
-          <w:rFonts w:ascii="Times New Roman" w:cs="Times New Roman" w:eastAsia="Times New Roman" w:hAnsi="Times New Roman"/>
-        </w:rPr>
-        <w:t xml:space="preserve">It is the only artefact in the project a viewer can operate, and therefore the most likely place for a number to drift away from the evidence. Its agreement with Table 8.4 is asserted by a test that fails if either side moves.</w:t>
-      </w:r>
-    </w:p>
-    <w:p>
-      <w:pPr>
-        <w:spacing w:after="120"/>
-      </w:pPr>
+        <w:t xml:space="preserve">.</w:t>
+      </w:r>
     </w:p>
     <w:p>
       <w:pPr>

</xml_diff>